<commit_message>
libro: 2a ronda de mejoras — filosofía operativa, literatura 2015-2025, falsabilidad y posicionamiento
Riesgo inductivo (Rudner/Douglas) en umbrales, Foucault en la ficha,
Popper con pruebas severas, testimonio (Coady/Lackey); recuadro meta-d',
debate Croskerry vs Norman/Monteiro, calibración de LLMs; sección de
falsabilidad de HII-D; posicionamiento en prefacio. 11 referencias nuevas,
glosario e índice ampliados. Recompilados docx y pdf (109 págs).

Co-Authored-By: Claude Fable 5 <noreply@anthropic.com>
Claude-Session: https://claude.ai/code/session_01SPkhDdVzUCxJwqq61ddeLW
</commit_message>
<xml_diff>
--- a/libro/Hechos_inferencias_incertidumbre_edicion_revisada.docx
+++ b/libro/Hechos_inferencias_incertidumbre_edicion_revisada.docx
@@ -567,7 +567,7 @@
         <w:rPr>
           <w:color w:val="8A8A8A"/>
         </w:rPr>
-        <w:t xml:space="preserve">55</w:t>
+        <w:t xml:space="preserve">56</w:t>
       </w:r>
     </w:p>
     <w:p>
@@ -587,7 +587,7 @@
         <w:rPr>
           <w:color w:val="8A8A8A"/>
         </w:rPr>
-        <w:t xml:space="preserve">60</w:t>
+        <w:t xml:space="preserve">61</w:t>
       </w:r>
     </w:p>
     <w:p>
@@ -607,7 +607,7 @@
         <w:rPr>
           <w:color w:val="8A8A8A"/>
         </w:rPr>
-        <w:t xml:space="preserve">61</w:t>
+        <w:t xml:space="preserve">62</w:t>
       </w:r>
     </w:p>
     <w:p>
@@ -627,7 +627,7 @@
         <w:rPr>
           <w:color w:val="8A8A8A"/>
         </w:rPr>
-        <w:t xml:space="preserve">62</w:t>
+        <w:t xml:space="preserve">63</w:t>
       </w:r>
     </w:p>
     <w:p>
@@ -647,7 +647,7 @@
         <w:rPr>
           <w:color w:val="8A8A8A"/>
         </w:rPr>
-        <w:t xml:space="preserve">65</w:t>
+        <w:t xml:space="preserve">66</w:t>
       </w:r>
     </w:p>
     <w:p>
@@ -667,7 +667,7 @@
         <w:rPr>
           <w:color w:val="8A8A8A"/>
         </w:rPr>
-        <w:t xml:space="preserve">68</w:t>
+        <w:t xml:space="preserve">70</w:t>
       </w:r>
     </w:p>
     <w:p>
@@ -687,7 +687,7 @@
         <w:rPr>
           <w:color w:val="8A8A8A"/>
         </w:rPr>
-        <w:t xml:space="preserve">73</w:t>
+        <w:t xml:space="preserve">76</w:t>
       </w:r>
     </w:p>
     <w:p>
@@ -707,7 +707,7 @@
         <w:rPr>
           <w:color w:val="8A8A8A"/>
         </w:rPr>
-        <w:t xml:space="preserve">80</w:t>
+        <w:t xml:space="preserve">83</w:t>
       </w:r>
     </w:p>
     <w:p>
@@ -727,7 +727,7 @@
         <w:rPr>
           <w:color w:val="8A8A8A"/>
         </w:rPr>
-        <w:t xml:space="preserve">83</w:t>
+        <w:t xml:space="preserve">87</w:t>
       </w:r>
     </w:p>
     <w:p>
@@ -747,7 +747,7 @@
         <w:rPr>
           <w:color w:val="8A8A8A"/>
         </w:rPr>
-        <w:t xml:space="preserve">85</w:t>
+        <w:t xml:space="preserve">89</w:t>
       </w:r>
     </w:p>
     <w:p>
@@ -767,7 +767,7 @@
         <w:rPr>
           <w:color w:val="8A8A8A"/>
         </w:rPr>
-        <w:t xml:space="preserve">87</w:t>
+        <w:t xml:space="preserve">91</w:t>
       </w:r>
     </w:p>
     <w:p>
@@ -787,7 +787,7 @@
         <w:rPr>
           <w:color w:val="8A8A8A"/>
         </w:rPr>
-        <w:t xml:space="preserve">89</w:t>
+        <w:t xml:space="preserve">93</w:t>
       </w:r>
     </w:p>
     <w:p>
@@ -807,7 +807,7 @@
         <w:rPr>
           <w:color w:val="8A8A8A"/>
         </w:rPr>
-        <w:t xml:space="preserve">91</w:t>
+        <w:t xml:space="preserve">95</w:t>
       </w:r>
     </w:p>
     <w:p>
@@ -827,7 +827,7 @@
         <w:rPr>
           <w:color w:val="8A8A8A"/>
         </w:rPr>
-        <w:t xml:space="preserve">93</w:t>
+        <w:t xml:space="preserve">98</w:t>
       </w:r>
     </w:p>
     <w:p>
@@ -847,7 +847,7 @@
         <w:rPr>
           <w:color w:val="8A8A8A"/>
         </w:rPr>
-        <w:t xml:space="preserve">95</w:t>
+        <w:t xml:space="preserve">100</w:t>
       </w:r>
     </w:p>
     <w:p>
@@ -924,6 +924,14 @@
       </w:pPr>
       <w:r>
         <w:t xml:space="preserve">Este no es un catálogo de sesgos cognitivos ni una historia exhaustiva de la filosofía de la medicina. Es un ensayo de integración dirigido a médicos que desean pensar con mayor precisión acerca de su propio pensamiento. Reúne aportes de la investigación sobre razonamiento clínico, metacognición, decisión bajo incertidumbre, lenguaje científico, seguridad diagnóstica y educación médica. Los pone en diálogo con Aristóteles, Peirce, Wittgenstein, Polanyi, Gadamer, Canguilhem, Foucault y otros autores que permiten comprender por qué observar, nombrar y decidir nunca son operaciones completamente separables.</w:t>
+      </w:r>
+    </w:p>
+    <w:p>
+      <w:pPr>
+        <w:pStyle w:val="BodyJ"/>
+      </w:pPr>
+      <w:r>
+        <w:t xml:space="preserve">Conviene decir desde el inicio en qué conversación entra este libro. Jerome Groopman mostró al gran público cómo piensan los médicos y dónde se tuercen sus atajos (Groopman, 2007); Pat Croskerry catalogó esos desvíos y propuso estrategias para contenerlos (Croskerry, 2003); Kathryn Montgomery demostró que el juicio clínico es un razonamiento práctico irreductible a la aplicación de reglas (Montgomery, 2006). Este ensayo se sitúa después de esas tres operaciones y propone la que falta: cómo escribir y decidir para que las capas del conocimiento clínico —lo observado, lo inferido, lo incierto, lo decidido— permanezcan visibles y auditables en el trabajo de cada día. No va de la teoría hacia la clínica, sino de la ficha, el pase de visita y la nota de evolución hacia la epistemología. Y está escrito en español a propósito: la reflexión sistemática sobre el razonamiento clínico apenas circula en nuestra lengua fuera de traducciones, y las palabras con que un equipo hispanohablante fija sus certezas merecen un examen hecho desde dentro.</w:t>
       </w:r>
     </w:p>
     <w:p>
@@ -2106,7 +2114,15 @@
         <w:pStyle w:val="BodyJ"/>
       </w:pPr>
       <w:r>
-        <w:t xml:space="preserve">Una prueba de resistencia útil contiene cuatro preguntas: ¿qué dato es más difícil de explicar con mi hipótesis?, ¿qué hallazgo esperaría y no está?, ¿qué explicación rival produciría una conducta diferente?, ¿qué nueva información haría cambiar mi jerarquía? Estas preguntas convierten el diagnóstico diferencial en una herramienta de falsación práctica, cercana al espíritu de Popper sin pretender que cada diagnóstico pueda refutarse de modo instantáneo (Popper, 1959).</w:t>
+        <w:t xml:space="preserve">Una prueba de resistencia útil contiene cuatro preguntas: ¿qué dato es más difícil de explicar con mi hipótesis?, ¿qué hallazgo esperaría y no está?, ¿qué explicación rival produciría una conducta diferente?, ¿qué nueva información haría cambiar mi jerarquía? Estas preguntas convierten el diagnóstico diferencial en una herramienta de falsación práctica.</w:t>
+      </w:r>
+    </w:p>
+    <w:p>
+      <w:pPr>
+        <w:pStyle w:val="BodyJ"/>
+      </w:pPr>
+      <w:r>
+        <w:t xml:space="preserve">La lección de Popper, bien leída, no es el eslogan de que toda hipótesis deba poder refutarse en el acto. Es una asimetría más fina: las confirmaciones valen poco cuando se obtienen buscando lo que la hipótesis predice cómodamente, y valen mucho cuando provienen de pruebas severas — aquellas que tenían una probabilidad real de desmentirla (Popper, 1959). En clínica, esto distingue dos maneras de pedir exámenes: el que confirma lo que ya se cree —otro marcador inflamatorio en quien ya fue etiquetado de infección— y el que somete la hipótesis a riesgo — el examen cuyo resultado obligaría a abandonar el diagnóstico si vuelve normal. Un diagnóstico que sólo acumula hallazgos "compatibles" no está corroborado; está mimado.</w:t>
       </w:r>
     </w:p>
     <w:p>
@@ -3693,6 +3709,22 @@
     </w:p>
     <w:p>
       <w:pPr>
+        <w:pStyle w:val="TallerHead"/>
+      </w:pPr>
+      <w:r>
+        <w:t xml:space="preserve">Caja de herramientas. Medir la metacognición: del porcentaje al meta-d′</w:t>
+      </w:r>
+    </w:p>
+    <w:p>
+      <w:pPr>
+        <w:pStyle w:val="BodyJ"/>
+      </w:pPr>
+      <w:r>
+        <w:t xml:space="preserve">La investigación contemporánea no se conforma con preguntar "qué tan seguro estás". Distingue y mide por separado tres cosas: el sesgo metacognitivo (la tendencia global a declarar confianzas altas o bajas), la calibración (si el 80% declarado corresponde a un 80% de aciertos reales) y la sensibilidad metacognitiva (si la confianza sube cuando aciertas y baja cuando te equivocas, independiente de su nivel absoluto). Para esta última existe un estándar: el meta-d′, que expresa cuánta de la información disponible para decidir aprovecha el observador al evaluar su propia decisión; dividido por la sensibilidad de la tarea (el llamado M-ratio), permite comparar personas y dominios (Maniscalco &amp; Lau, 2012; Fleming &amp; Lau, 2014). Dos hallazgos de esta literatura importan a la clínica: la sensibilidad metacognitiva varía sustancialmente entre individuos de igual desempeño, y tiene un componente parcialmente general junto a componentes específicos de dominio (Rouault et al., 2018) — ser buen juez de las propias respuestas en un ámbito no garantiza serlo en otro. La letra chica también importa: estas medidas exigen decenas de juicios comparables con desenlace conocido, exactamente lo que la práctica clínica no devuelve por sí sola. Esa es la justificación técnica del portafolio del Taller 5: no calcula un meta-d′ formal, pero construye la serie sin la cual ninguna medición —ni siquiera la intuitiva— es posible.</w:t>
+      </w:r>
+    </w:p>
+    <w:p>
+      <w:pPr>
         <w:pStyle w:val="Heading3"/>
         <w:spacing w:after="120" w:before="280"/>
       </w:pPr>
@@ -5375,6 +5407,57 @@
           <w:sz w:val="25"/>
           <w:szCs w:val="25"/>
         </w:rPr>
+        <w:t xml:space="preserve">El umbral es un juicio de valor: el riesgo inductivo</w:t>
+      </w:r>
+    </w:p>
+    <w:p>
+      <w:pPr>
+        <w:pStyle w:val="BodyJ"/>
+      </w:pPr>
+      <w:r>
+        <w:t xml:space="preserve">La estructura de umbrales tiene una fundamentación filosófica precisa que rara vez se nombra en medicina. Richard Rudner argumentó en 1953 que ningún científico acepta o rechaza una hipótesis por lógica pura: como la evidencia nunca es concluyente, decidir que </w:t>
+      </w:r>
+      <w:r>
+        <w:rPr>
+          <w:i/>
+          <w:iCs/>
+        </w:rPr>
+        <w:t xml:space="preserve">ya es suficiente</w:t>
+      </w:r>
+      <w:r>
+        <w:t xml:space="preserve"> exige ponderar qué tan grave sería equivocarse, y esa ponderación es un juicio de valor (Rudner, 1953). Heather Douglas llamó a esto riesgo inductivo y mostró que atraviesa toda la ciencia con consecuencias prácticas: cuánta evidencia exigimos antes de afirmar que un compuesto es tóxico depende de qué error —afirmar de más o afirmar de menos— produce más daño (Douglas, 2000).</w:t>
+      </w:r>
+    </w:p>
+    <w:p>
+      <w:pPr>
+        <w:pStyle w:val="BodyJ"/>
+      </w:pPr>
+      <w:r>
+        <w:t xml:space="preserve">La clínica es el caso extremo y más honesto de esta tesis. El umbral de Pauker y Kassirer es exactamente el riesgo inductivo vuelto aritmética: el punto donde "suficiente evidencia" queda definido por el costo de los dos errores posibles. Por eso "se descarta" nunca es una afirmación puramente epistémica: descartar una embolia con dímero negativo en un paciente de baja probabilidad no significa que la probabilidad sea cero, sino que el residuo de duda ya no justifica el daño esperado de seguir estudiando. Quien entiende esto deja de buscar un umbral "objetivo" escondido en las guías y empieza a hacer la pregunta correcta: ¿qué error estamos más dispuestos a tolerar en este paciente, y quién decidió eso?</w:t>
+      </w:r>
+    </w:p>
+    <w:p>
+      <w:pPr>
+        <w:pStyle w:val="BodyJ"/>
+      </w:pPr>
+      <w:r>
+        <w:t xml:space="preserve">Esta fundamentación tiene una consecuencia liberadora. Reconocer que hay valores dentro del umbral no corrompe la objetividad clínica; la localiza. Los hechos y las probabilidades se estiman con toda la disciplina de la Parte I; el punto de corte se delibera —con el paciente cuando es posible— y se declara. Lo indefendible no es que haya valores en la decisión: es esconderlos detrás de una retórica de pura evidencia.</w:t>
+      </w:r>
+    </w:p>
+    <w:p>
+      <w:pPr>
+        <w:pStyle w:val="Heading3"/>
+        <w:spacing w:after="120" w:before="280"/>
+      </w:pPr>
+      <w:r>
+        <w:rPr>
+          <w:rFonts w:ascii="Georgia" w:cs="Georgia" w:eastAsia="Georgia" w:hAnsi="Georgia"/>
+          <w:b/>
+          <w:bCs/>
+          <w:color w:val="2B2B2B"/>
+          <w:sz w:val="25"/>
+          <w:szCs w:val="25"/>
+        </w:rPr>
         <w:t xml:space="preserve">Tiempo y reversibilidad</w:t>
       </w:r>
     </w:p>
@@ -6061,23 +6144,23 @@
           <w:sz w:val="25"/>
           <w:szCs w:val="25"/>
         </w:rPr>
-        <w:t xml:space="preserve">El problema como unidad</w:t>
-      </w:r>
-    </w:p>
-    <w:p>
-      <w:pPr>
-        <w:pStyle w:val="BodyJ"/>
-      </w:pPr>
-      <w:r>
-        <w:t xml:space="preserve">La lista de problemas es más que una colección de diagnósticos. Puede incluir síndromes, hallazgos no explicados, riesgos y decisiones pendientes. "Anemia" puede ser un problema; "probable sangrado digestivo oculto" es una inferencia; "endoscopia pendiente" es una acción; "etiología no aclarada" es incertidumbre. Al separarlos, la ficha evita que una hipótesis adquiera estatus de hecho por repetición.</w:t>
-      </w:r>
-    </w:p>
-    <w:p>
-      <w:pPr>
-        <w:pStyle w:val="BodyJ"/>
-      </w:pPr>
-      <w:r>
-        <w:t xml:space="preserve">El copiado automático amenaza esta función. Una formulación inicial se reproduce durante días, aun cuando la evidencia cambió. El registro deja de representar el estado actual y se transforma en fósil narrativo. Cada evolución debería responder qué cambió en hechos, interpretación, incertidumbre y plan.</w:t>
+        <w:t xml:space="preserve">La ficha produce lo visible</w:t>
+      </w:r>
+    </w:p>
+    <w:p>
+      <w:pPr>
+        <w:pStyle w:val="BodyJ"/>
+      </w:pPr>
+      <w:r>
+        <w:t xml:space="preserve">Foucault mostró que la clínica moderna no nació simplemente de mirar mejor, sino de reorganizar qué era decible y registrable: el hospital, la autopsia y el registro crearon un espacio donde ciertos fenómenos pudieron convertirse en signos y otros ni siquiera podían formularse (Foucault, 1973). La ficha contemporánea hace hoy ese mismo trabajo, silenciosamente. Sus campos deciden qué existe institucionalmente: si la plantilla tiene casilla para "dolor EVA" pero no hay lugar para "esta vez el dolor era otro", la primera afirmación sobrevivirá en el registro y la segunda morirá en el pasillo. Lo que no cabe en el formulario no se pierde por descuido; se pierde por diseño.</w:t>
+      </w:r>
+    </w:p>
+    <w:p>
+      <w:pPr>
+        <w:pStyle w:val="BodyJ"/>
+      </w:pPr>
+      <w:r>
+        <w:t xml:space="preserve">Esta perspectiva cambia el estatuto del registro: no es una ventana neutra sobre el caso, sino un instrumento óptico con distorsiones propias. Los menús desplegables convierten un continuo en categorías administrativas; los campos obligatorios producen texto ritual; las frases autocompletadas homogeneizan descripciones que eran distintas. Nada de esto es neutral para el razonamiento, porque —como vimos en el capítulo 4— el equipo piensa con las representaciones que el artefacto le permite conservar. Una epistemología clínica operativa incluye, por eso, la crítica del formulario: preguntar qué vuelve visible, qué vuelve invisible y a quién sirve esa distribución. El médico no siempre puede rediseñar la plantilla; siempre puede saber qué le está haciendo a su percepción.</w:t>
       </w:r>
     </w:p>
     <w:p>
@@ -6094,167 +6177,23 @@
           <w:sz w:val="25"/>
           <w:szCs w:val="25"/>
         </w:rPr>
-        <w:t xml:space="preserve">La matriz HII-D</w:t>
-      </w:r>
-    </w:p>
-    <w:p>
-      <w:pPr>
-        <w:pStyle w:val="BodyJ"/>
-      </w:pPr>
-      <w:r>
-        <w:t xml:space="preserve">Puede aplicarse una secuencia simple:</w:t>
-      </w:r>
-    </w:p>
-    <w:p>
-      <w:pPr>
-        <w:pStyle w:val="BodyJ"/>
-        <w:numPr>
-          <w:ilvl w:val="0"/>
-          <w:numId w:val="6"/>
-        </w:numPr>
-      </w:pPr>
-      <w:r>
-        <w:rPr>
-          <w:b/>
-          <w:bCs/>
-        </w:rPr>
-        <w:t xml:space="preserve">H — Hechos</w:t>
-      </w:r>
-      <w:r>
-        <w:t xml:space="preserve">: datos relevantes, fuente, fecha y evolución.</w:t>
-      </w:r>
-    </w:p>
-    <w:p>
-      <w:pPr>
-        <w:pStyle w:val="BodyJ"/>
-        <w:numPr>
-          <w:ilvl w:val="0"/>
-          <w:numId w:val="6"/>
-        </w:numPr>
-      </w:pPr>
-      <w:r>
-        <w:rPr>
-          <w:b/>
-          <w:bCs/>
-        </w:rPr>
-        <w:t xml:space="preserve">I — Inferencias</w:t>
-      </w:r>
-      <w:r>
-        <w:t xml:space="preserve">: diagnóstico o mecanismo propuesto, con grado de respaldo.</w:t>
-      </w:r>
-    </w:p>
-    <w:p>
-      <w:pPr>
-        <w:pStyle w:val="BodyJ"/>
-        <w:numPr>
-          <w:ilvl w:val="0"/>
-          <w:numId w:val="6"/>
-        </w:numPr>
-      </w:pPr>
-      <w:r>
-        <w:rPr>
-          <w:b/>
-          <w:bCs/>
-        </w:rPr>
-        <w:t xml:space="preserve">I — Incertidumbre</w:t>
-      </w:r>
-      <w:r>
-        <w:t xml:space="preserve">: alternativas, límites de pruebas y preguntas abiertas.</w:t>
-      </w:r>
-    </w:p>
-    <w:p>
-      <w:pPr>
-        <w:pStyle w:val="BodyJ"/>
-        <w:numPr>
-          <w:ilvl w:val="0"/>
-          <w:numId w:val="6"/>
-        </w:numPr>
-      </w:pPr>
-      <w:r>
-        <w:rPr>
-          <w:b/>
-          <w:bCs/>
-        </w:rPr>
-        <w:t xml:space="preserve">D — Decisión</w:t>
-      </w:r>
-      <w:r>
-        <w:t xml:space="preserve">: conducta, razón, umbral y criterio de reevaluación.</w:t>
-      </w:r>
-    </w:p>
-    <w:p>
-      <w:pPr>
-        <w:pStyle w:val="BodyJ"/>
-      </w:pPr>
-      <w:r>
-        <w:t xml:space="preserve">No es necesario rotular cada párrafo. La estructura puede estar implícita, pero debe ser recuperable. En casos complejos, explicitarla reduce ambigüedad.</w:t>
-      </w:r>
-    </w:p>
-    <w:p>
-      <w:pPr>
-        <w:pStyle w:val="BodyJ"/>
-      </w:pPr>
-      <w:r>
-        <w:t xml:space="preserve">Ejemplo:</w:t>
-      </w:r>
-    </w:p>
-    <w:p>
-      <w:pPr>
-        <w:pStyle w:val="BodyJ"/>
-      </w:pPr>
-      <w:r>
-        <w:rPr>
-          <w:i/>
-          <w:iCs/>
-        </w:rPr>
-        <w:t xml:space="preserve">Hechos:</w:t>
-      </w:r>
-      <w:r>
-        <w:t xml:space="preserve"> paciente con vejiga neurogénica y sonda permanente; sonda recambiada; orina turbia, piuria y urocultivo positivo; afebril, estable, sin nuevo deterioro sistémico; marcadores inflamatorios elevados con neoplasia avanzada como explicación alternativa.</w:t>
-      </w:r>
-    </w:p>
-    <w:p>
-      <w:pPr>
-        <w:pStyle w:val="BodyJ"/>
-      </w:pPr>
-      <w:r>
-        <w:rPr>
-          <w:i/>
-          <w:iCs/>
-        </w:rPr>
-        <w:t xml:space="preserve">Inferencia:</w:t>
-      </w:r>
-      <w:r>
-        <w:t xml:space="preserve"> bacteriuria asociada a catéter, sin evidencia clínica suficiente de infección urinaria sintomática.</w:t>
-      </w:r>
-    </w:p>
-    <w:p>
-      <w:pPr>
-        <w:pStyle w:val="BodyJ"/>
-      </w:pPr>
-      <w:r>
-        <w:rPr>
-          <w:i/>
-          <w:iCs/>
-        </w:rPr>
-        <w:t xml:space="preserve">Incertidumbre:</w:t>
-      </w:r>
-      <w:r>
-        <w:t xml:space="preserve"> síntomas urinarios clásicos no evaluables; debe vigilarse aparición de fiebre, inestabilidad, espasticidad nueva u otro cambio autonómico o sistémico.</w:t>
-      </w:r>
-    </w:p>
-    <w:p>
-      <w:pPr>
-        <w:pStyle w:val="BodyJ"/>
-      </w:pPr>
-      <w:r>
-        <w:rPr>
-          <w:i/>
-          <w:iCs/>
-        </w:rPr>
-        <w:t xml:space="preserve">Decisión:</w:t>
-      </w:r>
-      <w:r>
-        <w:t xml:space="preserve"> no iniciar antibiótico por ahora; monitorización y reevaluación ante criterios clínicos, considerando que el antecedente de microorganismo multirresistente eleva el costo ecológico de tratamiento innecesario.</w:t>
+        <w:t xml:space="preserve">El problema como unidad</w:t>
+      </w:r>
+    </w:p>
+    <w:p>
+      <w:pPr>
+        <w:pStyle w:val="BodyJ"/>
+      </w:pPr>
+      <w:r>
+        <w:t xml:space="preserve">La lista de problemas es más que una colección de diagnósticos. Puede incluir síndromes, hallazgos no explicados, riesgos y decisiones pendientes. "Anemia" puede ser un problema; "probable sangrado digestivo oculto" es una inferencia; "endoscopia pendiente" es una acción; "etiología no aclarada" es incertidumbre. Al separarlos, la ficha evita que una hipótesis adquiera estatus de hecho por repetición.</w:t>
+      </w:r>
+    </w:p>
+    <w:p>
+      <w:pPr>
+        <w:pStyle w:val="BodyJ"/>
+      </w:pPr>
+      <w:r>
+        <w:t xml:space="preserve">El copiado automático amenaza esta función. Una formulación inicial se reproduce durante días, aun cuando la evidencia cambió. El registro deja de representar el estado actual y se transforma en fósil narrativo. Cada evolución debería responder qué cambió en hechos, interpretación, incertidumbre y plan.</w:t>
       </w:r>
     </w:p>
     <w:p>
@@ -6271,31 +6210,167 @@
           <w:sz w:val="25"/>
           <w:szCs w:val="25"/>
         </w:rPr>
-        <w:t xml:space="preserve">Frase medular</w:t>
-      </w:r>
-    </w:p>
-    <w:p>
-      <w:pPr>
-        <w:pStyle w:val="BodyJ"/>
-      </w:pPr>
-      <w:r>
-        <w:t xml:space="preserve">Después de ordenar el caso, conviene formular una frase medular. No reemplaza la evolución completa; ofrece una representación operativa. Debe incluir la naturaleza del evento, el elemento que cambia el riesgo y el límite principal de certeza.</w:t>
-      </w:r>
-    </w:p>
-    <w:p>
-      <w:pPr>
-        <w:pStyle w:val="BodyJ"/>
-      </w:pPr>
-      <w:r>
-        <w:t xml:space="preserve">En el caso anterior: "Bacteriuria y piuria tras recambio de sonda en paciente con colonización crónica probable, sin manifestaciones sistémicas que sostengan CAUTI; se prioriza vigilancia clínica para evitar exposición innecesaria a antibióticos de amplio espectro."</w:t>
-      </w:r>
-    </w:p>
-    <w:p>
-      <w:pPr>
-        <w:pStyle w:val="BodyJ"/>
-      </w:pPr>
-      <w:r>
-        <w:t xml:space="preserve">La frase contiene una inferencia y una conducta. No declara que la infección sea imposible. Explica por qué la evidencia actual no supera el umbral terapéutico.</w:t>
+        <w:t xml:space="preserve">La matriz HII-D</w:t>
+      </w:r>
+    </w:p>
+    <w:p>
+      <w:pPr>
+        <w:pStyle w:val="BodyJ"/>
+      </w:pPr>
+      <w:r>
+        <w:t xml:space="preserve">Puede aplicarse una secuencia simple:</w:t>
+      </w:r>
+    </w:p>
+    <w:p>
+      <w:pPr>
+        <w:pStyle w:val="BodyJ"/>
+        <w:numPr>
+          <w:ilvl w:val="0"/>
+          <w:numId w:val="6"/>
+        </w:numPr>
+      </w:pPr>
+      <w:r>
+        <w:rPr>
+          <w:b/>
+          <w:bCs/>
+        </w:rPr>
+        <w:t xml:space="preserve">H — Hechos</w:t>
+      </w:r>
+      <w:r>
+        <w:t xml:space="preserve">: datos relevantes, fuente, fecha y evolución.</w:t>
+      </w:r>
+    </w:p>
+    <w:p>
+      <w:pPr>
+        <w:pStyle w:val="BodyJ"/>
+        <w:numPr>
+          <w:ilvl w:val="0"/>
+          <w:numId w:val="6"/>
+        </w:numPr>
+      </w:pPr>
+      <w:r>
+        <w:rPr>
+          <w:b/>
+          <w:bCs/>
+        </w:rPr>
+        <w:t xml:space="preserve">I — Inferencias</w:t>
+      </w:r>
+      <w:r>
+        <w:t xml:space="preserve">: diagnóstico o mecanismo propuesto, con grado de respaldo.</w:t>
+      </w:r>
+    </w:p>
+    <w:p>
+      <w:pPr>
+        <w:pStyle w:val="BodyJ"/>
+        <w:numPr>
+          <w:ilvl w:val="0"/>
+          <w:numId w:val="6"/>
+        </w:numPr>
+      </w:pPr>
+      <w:r>
+        <w:rPr>
+          <w:b/>
+          <w:bCs/>
+        </w:rPr>
+        <w:t xml:space="preserve">I — Incertidumbre</w:t>
+      </w:r>
+      <w:r>
+        <w:t xml:space="preserve">: alternativas, límites de pruebas y preguntas abiertas.</w:t>
+      </w:r>
+    </w:p>
+    <w:p>
+      <w:pPr>
+        <w:pStyle w:val="BodyJ"/>
+        <w:numPr>
+          <w:ilvl w:val="0"/>
+          <w:numId w:val="6"/>
+        </w:numPr>
+      </w:pPr>
+      <w:r>
+        <w:rPr>
+          <w:b/>
+          <w:bCs/>
+        </w:rPr>
+        <w:t xml:space="preserve">D — Decisión</w:t>
+      </w:r>
+      <w:r>
+        <w:t xml:space="preserve">: conducta, razón, umbral y criterio de reevaluación.</w:t>
+      </w:r>
+    </w:p>
+    <w:p>
+      <w:pPr>
+        <w:pStyle w:val="BodyJ"/>
+      </w:pPr>
+      <w:r>
+        <w:t xml:space="preserve">No es necesario rotular cada párrafo. La estructura puede estar implícita, pero debe ser recuperable. En casos complejos, explicitarla reduce ambigüedad.</w:t>
+      </w:r>
+    </w:p>
+    <w:p>
+      <w:pPr>
+        <w:pStyle w:val="BodyJ"/>
+      </w:pPr>
+      <w:r>
+        <w:t xml:space="preserve">Ejemplo:</w:t>
+      </w:r>
+    </w:p>
+    <w:p>
+      <w:pPr>
+        <w:pStyle w:val="BodyJ"/>
+      </w:pPr>
+      <w:r>
+        <w:rPr>
+          <w:i/>
+          <w:iCs/>
+        </w:rPr>
+        <w:t xml:space="preserve">Hechos:</w:t>
+      </w:r>
+      <w:r>
+        <w:t xml:space="preserve"> paciente con vejiga neurogénica y sonda permanente; sonda recambiada; orina turbia, piuria y urocultivo positivo; afebril, estable, sin nuevo deterioro sistémico; marcadores inflamatorios elevados con neoplasia avanzada como explicación alternativa.</w:t>
+      </w:r>
+    </w:p>
+    <w:p>
+      <w:pPr>
+        <w:pStyle w:val="BodyJ"/>
+      </w:pPr>
+      <w:r>
+        <w:rPr>
+          <w:i/>
+          <w:iCs/>
+        </w:rPr>
+        <w:t xml:space="preserve">Inferencia:</w:t>
+      </w:r>
+      <w:r>
+        <w:t xml:space="preserve"> bacteriuria asociada a catéter, sin evidencia clínica suficiente de infección urinaria sintomática.</w:t>
+      </w:r>
+    </w:p>
+    <w:p>
+      <w:pPr>
+        <w:pStyle w:val="BodyJ"/>
+      </w:pPr>
+      <w:r>
+        <w:rPr>
+          <w:i/>
+          <w:iCs/>
+        </w:rPr>
+        <w:t xml:space="preserve">Incertidumbre:</w:t>
+      </w:r>
+      <w:r>
+        <w:t xml:space="preserve"> síntomas urinarios clásicos no evaluables; debe vigilarse aparición de fiebre, inestabilidad, espasticidad nueva u otro cambio autonómico o sistémico.</w:t>
+      </w:r>
+    </w:p>
+    <w:p>
+      <w:pPr>
+        <w:pStyle w:val="BodyJ"/>
+      </w:pPr>
+      <w:r>
+        <w:rPr>
+          <w:i/>
+          <w:iCs/>
+        </w:rPr>
+        <w:t xml:space="preserve">Decisión:</w:t>
+      </w:r>
+      <w:r>
+        <w:t xml:space="preserve"> no iniciar antibiótico por ahora; monitorización y reevaluación ante criterios clínicos, considerando que el antecedente de microorganismo multirresistente eleva el costo ecológico de tratamiento innecesario.</w:t>
       </w:r>
     </w:p>
     <w:p>
@@ -6312,6 +6387,47 @@
           <w:sz w:val="25"/>
           <w:szCs w:val="25"/>
         </w:rPr>
+        <w:t xml:space="preserve">Frase medular</w:t>
+      </w:r>
+    </w:p>
+    <w:p>
+      <w:pPr>
+        <w:pStyle w:val="BodyJ"/>
+      </w:pPr>
+      <w:r>
+        <w:t xml:space="preserve">Después de ordenar el caso, conviene formular una frase medular. No reemplaza la evolución completa; ofrece una representación operativa. Debe incluir la naturaleza del evento, el elemento que cambia el riesgo y el límite principal de certeza.</w:t>
+      </w:r>
+    </w:p>
+    <w:p>
+      <w:pPr>
+        <w:pStyle w:val="BodyJ"/>
+      </w:pPr>
+      <w:r>
+        <w:t xml:space="preserve">En el caso anterior: "Bacteriuria y piuria tras recambio de sonda en paciente con colonización crónica probable, sin manifestaciones sistémicas que sostengan CAUTI; se prioriza vigilancia clínica para evitar exposición innecesaria a antibióticos de amplio espectro."</w:t>
+      </w:r>
+    </w:p>
+    <w:p>
+      <w:pPr>
+        <w:pStyle w:val="BodyJ"/>
+      </w:pPr>
+      <w:r>
+        <w:t xml:space="preserve">La frase contiene una inferencia y una conducta. No declara que la infección sea imposible. Explica por qué la evidencia actual no supera el umbral terapéutico.</w:t>
+      </w:r>
+    </w:p>
+    <w:p>
+      <w:pPr>
+        <w:pStyle w:val="Heading3"/>
+        <w:spacing w:after="120" w:before="280"/>
+      </w:pPr>
+      <w:r>
+        <w:rPr>
+          <w:rFonts w:ascii="Georgia" w:cs="Georgia" w:eastAsia="Georgia" w:hAnsi="Georgia"/>
+          <w:b/>
+          <w:bCs/>
+          <w:color w:val="2B2B2B"/>
+          <w:sz w:val="25"/>
+          <w:szCs w:val="25"/>
+        </w:rPr>
         <w:t xml:space="preserve">Temporalidad y revisión</w:t>
       </w:r>
     </w:p>
@@ -7403,6 +7519,14 @@
         <w:pStyle w:val="BodyJ"/>
       </w:pPr>
       <w:r>
+        <w:t xml:space="preserve">Esa pregunta ya tiene datos. La evidencia disponible muestra que la confianza verbalizada de los grandes modelos —el "estoy bastante seguro" que escriben— tiende a la sobreconfianza sistemática y se calibra mal, aun cuando algunas señales internas del modelo discriminan mejor de lo que su prosa deja ver (Kadavath et al., 2022; Xiong et al., 2024). La implicación práctica es idéntica a la del capítulo 5, aplicada ahora a la máquina: preguntarle a un modelo cuán seguro está no sustituye la verificación, igual que la seguridad de un colega no sustituye sus razones. La calibración se demuestra con series de predicciones y desenlaces, no con tono.</w:t>
+      </w:r>
+    </w:p>
+    <w:p>
+      <w:pPr>
+        <w:pStyle w:val="BodyJ"/>
+      </w:pPr>
+      <w:r>
         <w:t xml:space="preserve">La OMS ha recomendado gobernanza, evaluación, transparencia y supervisión para modelos multimodales en salud, atendiendo riesgos de inexactitud, sesgo, privacidad y dependencia excesiva (World Health Organization, 2024). La supervisión humana no debe ser una firma ritual al final. Debe contar con tiempo, datos y autoridad para cuestionar.</w:t>
       </w:r>
     </w:p>
@@ -7638,6 +7762,14 @@
       </w:pPr>
       <w:r>
         <w:t xml:space="preserve">Miranda Fricker denominó injusticia epistémica al daño cometido contra alguien en su capacidad de sujeto de conocimiento (Fricker, 2007). En salud, Carel y Kidd mostraron cómo el testimonio de pacientes puede recibir menor credibilidad o carecer de categorías interpretativas adecuadas, y cómo la propia experiencia de enfermar agudiza esa vulnerabilidad epistémica (Carel &amp; Kidd, 2014; Kidd &amp; Carel, 2017). El enfermo posee un conocimiento de primera persona sobre dolor, cambio funcional, tolerancia, valores y trayectoria cotidiana que no puede ser sustituido por mediciones externas. Ese conocimiento tampoco es infalible, pero merece evaluación y no descarte reflejo.</w:t>
+      </w:r>
+    </w:p>
+    <w:p>
+      <w:pPr>
+        <w:pStyle w:val="BodyJ"/>
+      </w:pPr>
+      <w:r>
+        <w:t xml:space="preserve">La filosofía del testimonio ayuda a precisar qué significa "evaluar sin descartar". Contra la sospecha heredada del empirismo —que creerle a otro es siempre conocimiento de segunda categoría—, Coady mostró que el testimonio es una fuente básica de conocimiento, tan constitutiva como la percepción o la memoria: sin una confianza por defecto en lo que otros informan, ni la ciencia ni la vida cotidiana serían posibles (Coady, 1992). Lackey corrigió el exceso opuesto: la confianza por defecto no es un cheque en blanco; el oyente responsable mantiene una sensibilidad activa a las señales de error o engaño, y el conocimiento testimonial se logra cuando ambas condiciones —decir fiable y escuchar vigilante— se cumplen a la vez (Lackey, 2008). La anamnesis es exactamente ese contrato epistémico: el paciente aporta un informe que el médico no puede obtener por ninguna otra vía, y el médico aporta el examen de consistencia, forma temporal y relación con otros hallazgos. Ni credulidad ni auditoría hostil: recepción con estándares. La injusticia testimonial es, en estos términos, un fallo del segundo contratante: aplicar a ciertos hablantes un estándar de vigilancia que no se aplica a otros, por razones que nada tienen que ver con la fiabilidad de su informe.</w:t>
       </w:r>
     </w:p>
     <w:p>
@@ -8434,6 +8566,71 @@
           <w:sz w:val="25"/>
           <w:szCs w:val="25"/>
         </w:rPr>
+        <w:t xml:space="preserve">Qué evidencia me haría abandonar este método</w:t>
+      </w:r>
+    </w:p>
+    <w:p>
+      <w:pPr>
+        <w:pStyle w:val="BodyJ"/>
+      </w:pPr>
+      <w:r>
+        <w:t xml:space="preserve">Un libro que exige compromisos observables a cada hipótesis clínica debe formular los suyos. Estos son los míos.</w:t>
+      </w:r>
+    </w:p>
+    <w:p>
+      <w:pPr>
+        <w:pStyle w:val="BodyJ"/>
+      </w:pPr>
+      <w:r>
+        <w:t xml:space="preserve">Primero: si clínicos entrenados no logran un acuerdo razonable al clasificar las frases de una nota en hechos, inferencias e incertidumbre, la distinción central del método es subjetiva en la práctica, y HII-D debe reformularse o abandonarse. La trazabilidad que promete depende de que las capas sean reconocibles entre lectores, no sólo para quien escribe.</w:t>
+      </w:r>
+    </w:p>
+    <w:p>
+      <w:pPr>
+        <w:pStyle w:val="BodyJ"/>
+      </w:pPr>
+      <w:r>
+        <w:t xml:space="preserve">Segundo: si las notas escritas con esta disciplina no difieren de las convencionales en instrumentos estándar de calidad de registro, ni en la capacidad de otro clínico para reconstruir el razonamiento a partir de ellas, el método es cosmética con nombre propio.</w:t>
+      </w:r>
+    </w:p>
+    <w:p>
+      <w:pPr>
+        <w:pStyle w:val="BodyJ"/>
+      </w:pPr>
+      <w:r>
+        <w:t xml:space="preserve">Tercero: si un servicio que adopta el léxico de certeza no modifica en algunos meses ninguna conducta medible —ningún "se descarta" reconvertido, ningún criterio de reapertura agregado, ninguna vigilancia activada que antes no existía—, el léxico es un póster, no una herramienta.</w:t>
+      </w:r>
+    </w:p>
+    <w:p>
+      <w:pPr>
+        <w:pStyle w:val="BodyJ"/>
+      </w:pPr>
+      <w:r>
+        <w:t xml:space="preserve">Cuarto: si el tiempo que consume la versión completa supera de forma sostenida el beneficio detectable, la respuesta racional no es la fe sino la poda: quedarse con la versión de sesenta segundos, o con nada.</w:t>
+      </w:r>
+    </w:p>
+    <w:p>
+      <w:pPr>
+        <w:pStyle w:val="BodyJ"/>
+      </w:pPr>
+      <w:r>
+        <w:t xml:space="preserve">Formular estas condiciones no es un gesto retórico de modestia. Es la diferencia entre proponer una hipótesis y fundar una escuela. Prefiero lo primero: que el método quede expuesto a la misma reevaluación que le exige a cada diagnóstico, y que el mundo conserve, también aquí, la capacidad de corregirnos.</w:t>
+      </w:r>
+    </w:p>
+    <w:p>
+      <w:pPr>
+        <w:pStyle w:val="Heading3"/>
+        <w:spacing w:after="120" w:before="280"/>
+      </w:pPr>
+      <w:r>
+        <w:rPr>
+          <w:rFonts w:ascii="Georgia" w:cs="Georgia" w:eastAsia="Georgia" w:hAnsi="Georgia"/>
+          <w:b/>
+          <w:bCs/>
+          <w:color w:val="2B2B2B"/>
+          <w:sz w:val="25"/>
+          <w:szCs w:val="25"/>
+        </w:rPr>
         <w:t xml:space="preserve">Límites</w:t>
       </w:r>
     </w:p>
@@ -9654,6 +9851,39 @@
       </w:pPr>
       <w:r>
         <w:t xml:space="preserve">El docente puede pedir al aprendiz que marque cada frase como hecho, inferencia o incertidumbre. Luego puede comparar la versión inicial con una formulación experta, no para imponer estilo, sino para mostrar qué relaciones fueron seleccionadas. El feedback debe ser específico: "presentaste la bacteriuria como infección", "omitiste que la imagen sólo excluye complicación actual", "tu plan no indica qué te haría cambiar".</w:t>
+      </w:r>
+    </w:p>
+    <w:p>
+      <w:pPr>
+        <w:pStyle w:val="Heading3"/>
+        <w:spacing w:after="120" w:before="280"/>
+      </w:pPr>
+      <w:r>
+        <w:rPr>
+          <w:rFonts w:ascii="Georgia" w:cs="Georgia" w:eastAsia="Georgia" w:hAnsi="Georgia"/>
+          <w:b/>
+          <w:bCs/>
+          <w:color w:val="2B2B2B"/>
+          <w:sz w:val="25"/>
+          <w:szCs w:val="25"/>
+        </w:rPr>
+        <w:t xml:space="preserve">Un debate honesto: ¿se puede enseñar a pensar mejor?</w:t>
+      </w:r>
+    </w:p>
+    <w:p>
+      <w:pPr>
+        <w:pStyle w:val="BodyJ"/>
+      </w:pPr>
+      <w:r>
+        <w:t xml:space="preserve">Este libro toma posición en una controversia real de la educación médica, y conviene declararla. De un lado, Croskerry y su tradición sostienen que conocer los sesgos y entrenar estrategias de debiasing mejora el diagnóstico (Croskerry, 2003; Croskerry et al., 2013a, 2013b). Del otro, Norman, Monteiro y colegas han acumulado evidencia incómoda: la mayoría de los errores diagnósticos se asocia a déficits de conocimiento más que a fallas puras de proceso, los cursos de "pensamiento crítico" generalizable transfieren poco, y obligar a reflexionar sistemáticamente sobre casos fáciles no mejora la precisión y consume tiempo (Norman et al., 2017; Monteiro &amp; Norman, 2013; Monteiro et al., 2020).</w:t>
+      </w:r>
+    </w:p>
+    <w:p>
+      <w:pPr>
+        <w:pStyle w:val="BodyJ"/>
+      </w:pPr>
+      <w:r>
+        <w:t xml:space="preserve">La posición de este libro es intermedia, pero no equidistante. Con los escépticos: no existe una habilidad general de "pensar bien" que flote por encima del conocimiento; la representación rica del problema —illness scripts, experiencia con feedback— es la condición de todo lo demás, y ningún método, HII-D incluido, compensa no saber medicina. Contra el escepticismo total: de esa evidencia no se sigue que la única intervención posible sea enseñar más contenido. Lo que este libro propone no es vigilancia interna permanente ni listas universales —las versiones que la evidencia ha desinflado—, sino artefactos externos y selectivos: un lenguaje que obliga a graduar afirmaciones, una estructura de nota que conserva las capas, pausas activadas por disparadores definidos y circuitos de feedback que conviertan experiencia en calibración. Es una apuesta con compromisos observables (véase el capítulo 15): si estas herramientas no cambian conductas medibles, deben abandonarse como cualquier hipótesis mimada. Entre tanto, la controversia se enseña mejor de lo que se oculta: un residente que conoce el debate sabrá desconfiar por igual del catálogo de sesgos como solución universal y del nihilismo pedagógico como coartada.</w:t>
       </w:r>
     </w:p>
     <w:p>
@@ -12767,6 +12997,21 @@
           <w:b/>
           <w:bCs/>
         </w:rPr>
+        <w:t xml:space="preserve">Meta-d′ / M-ratio.</w:t>
+      </w:r>
+      <w:r>
+        <w:t xml:space="preserve"> Medida de sensibilidad metacognitiva basada en teoría de detección de señales: expresa cuánta de la información disponible para la decisión aprovecha el observador al evaluar sus propias respuestas; el cociente meta-d′/d′ (M-ratio) permite comparar entre personas y tareas (Maniscalco y Lau).</w:t>
+      </w:r>
+    </w:p>
+    <w:p>
+      <w:pPr>
+        <w:pStyle w:val="BodyJ"/>
+      </w:pPr>
+      <w:r>
+        <w:rPr>
+          <w:b/>
+          <w:bCs/>
+        </w:rPr>
         <w:t xml:space="preserve">Modalidad epistémica.</w:t>
       </w:r>
       <w:r>
@@ -12827,6 +13072,21 @@
           <w:b/>
           <w:bCs/>
         </w:rPr>
+        <w:t xml:space="preserve">Riesgo inductivo.</w:t>
+      </w:r>
+      <w:r>
+        <w:t xml:space="preserve"> Tesis de que aceptar o rechazar una hipótesis exige decidir cuánta evidencia es suficiente, y de que esa decisión depende del costo de cada error posible; fundamenta filosóficamente los umbrales de decisión clínica (Rudner; Douglas).</w:t>
+      </w:r>
+    </w:p>
+    <w:p>
+      <w:pPr>
+        <w:pStyle w:val="BodyJ"/>
+      </w:pPr>
+      <w:r>
+        <w:rPr>
+          <w:b/>
+          <w:bCs/>
+        </w:rPr>
         <w:t xml:space="preserve">Safety-netting (red de seguridad).</w:t>
       </w:r>
       <w:r>
@@ -12846,6 +13106,21 @@
       </w:r>
       <w:r>
         <w:t xml:space="preserve"> Capacidad de discriminar los propios aciertos de los propios errores mediante la confianza; distinta del sesgo metacognitivo (tendencia global a confiar mucho o poco).</w:t>
+      </w:r>
+    </w:p>
+    <w:p>
+      <w:pPr>
+        <w:pStyle w:val="BodyJ"/>
+      </w:pPr>
+      <w:r>
+        <w:rPr>
+          <w:b/>
+          <w:bCs/>
+        </w:rPr>
+        <w:t xml:space="preserve">Testimonio (epistemología del).</w:t>
+      </w:r>
+      <w:r>
+        <w:t xml:space="preserve"> Estudio del conocimiento obtenido mediante informes de otros. Coady defendió la confianza por defecto como condición de todo conocimiento compartido; Lackey añadió la vigilancia activa del oyente. La anamnesis es su caso clínico paradigmático.</w:t>
       </w:r>
     </w:p>
     <w:p>
@@ -13057,6 +13332,18 @@
         </w:numPr>
       </w:pPr>
       <w:r>
+        <w:t xml:space="preserve">Debate sobre la enseñanza del razonamiento (Croskerry vs. Norman/Monteiro) — 16</w:t>
+      </w:r>
+    </w:p>
+    <w:p>
+      <w:pPr>
+        <w:pStyle w:val="BodyJ"/>
+        <w:numPr>
+          <w:ilvl w:val="0"/>
+          <w:numId w:val="6"/>
+        </w:numPr>
+      </w:pPr>
+      <w:r>
         <w:t xml:space="preserve">Decisión compartida — 12, 14, Interludio III</w:t>
       </w:r>
     </w:p>
@@ -13129,6 +13416,18 @@
         </w:numPr>
       </w:pPr>
       <w:r>
+        <w:t xml:space="preserve">Falsabilidad del método HII-D — 15</w:t>
+      </w:r>
+    </w:p>
+    <w:p>
+      <w:pPr>
+        <w:pStyle w:val="BodyJ"/>
+        <w:numPr>
+          <w:ilvl w:val="0"/>
+          <w:numId w:val="6"/>
+        </w:numPr>
+      </w:pPr>
+      <w:r>
         <w:t xml:space="preserve">Evidencia poblacional y particularización — 9</w:t>
       </w:r>
     </w:p>
@@ -13153,6 +13452,18 @@
         </w:numPr>
       </w:pPr>
       <w:r>
+        <w:t xml:space="preserve">Ficha como dispositivo que produce lo visible (Foucault) — 11</w:t>
+      </w:r>
+    </w:p>
+    <w:p>
+      <w:pPr>
+        <w:pStyle w:val="BodyJ"/>
+        <w:numPr>
+          <w:ilvl w:val="0"/>
+          <w:numId w:val="6"/>
+        </w:numPr>
+      </w:pPr>
+      <w:r>
         <w:t xml:space="preserve">Fichas clínicas y plantillas — 11, 16, Ap C</w:t>
       </w:r>
     </w:p>
@@ -13309,6 +13620,18 @@
         </w:numPr>
       </w:pPr>
       <w:r>
+        <w:t xml:space="preserve">Meta-d′ y medición de la metacognición — 5</w:t>
+      </w:r>
+    </w:p>
+    <w:p>
+      <w:pPr>
+        <w:pStyle w:val="BodyJ"/>
+        <w:numPr>
+          <w:ilvl w:val="0"/>
+          <w:numId w:val="6"/>
+        </w:numPr>
+      </w:pPr>
+      <w:r>
         <w:t xml:space="preserve">Observación activa — 9, 10</w:t>
       </w:r>
     </w:p>
@@ -13369,6 +13692,18 @@
         </w:numPr>
       </w:pPr>
       <w:r>
+        <w:t xml:space="preserve">Pruebas severas (Popper) — 2</w:t>
+      </w:r>
+    </w:p>
+    <w:p>
+      <w:pPr>
+        <w:pStyle w:val="BodyJ"/>
+        <w:numPr>
+          <w:ilvl w:val="0"/>
+          <w:numId w:val="6"/>
+        </w:numPr>
+      </w:pPr>
+      <w:r>
         <w:t xml:space="preserve">Puntos de inflexión — 10, Interludio III</w:t>
       </w:r>
     </w:p>
@@ -13393,6 +13728,18 @@
         </w:numPr>
       </w:pPr>
       <w:r>
+        <w:t xml:space="preserve">Riesgo inductivo (Rudner, Douglas) — 9</w:t>
+      </w:r>
+    </w:p>
+    <w:p>
+      <w:pPr>
+        <w:pStyle w:val="BodyJ"/>
+        <w:numPr>
+          <w:ilvl w:val="0"/>
+          <w:numId w:val="6"/>
+        </w:numPr>
+      </w:pPr>
+      <w:r>
         <w:t xml:space="preserve">Safety-netting — 10, CC (viñetas 5 y 6)</w:t>
       </w:r>
     </w:p>
@@ -13429,7 +13776,7 @@
         </w:numPr>
       </w:pPr>
       <w:r>
-        <w:t xml:space="preserve">Testimonio del paciente — 1, 14</w:t>
+        <w:t xml:space="preserve">Testimonio del paciente — 1, 14; epistemología del testimonio (Coady, Lackey) — 14</w:t>
       </w:r>
     </w:p>
     <w:p>
@@ -13689,6 +14036,24 @@
         <w:pStyle w:val="BodyJ"/>
       </w:pPr>
       <w:r>
+        <w:t xml:space="preserve">Coady, C. A. J. (1992). </w:t>
+      </w:r>
+      <w:r>
+        <w:rPr>
+          <w:i/>
+          <w:iCs/>
+        </w:rPr>
+        <w:t xml:space="preserve">Testimony: A Philosophical Study</w:t>
+      </w:r>
+      <w:r>
+        <w:t xml:space="preserve">. Clarendon Press.</w:t>
+      </w:r>
+    </w:p>
+    <w:p>
+      <w:pPr>
+        <w:pStyle w:val="BodyJ"/>
+      </w:pPr>
+      <w:r>
         <w:t xml:space="preserve">Croskerry, P. (2003). The importance of cognitive errors in diagnosis and strategies to minimize them. </w:t>
       </w:r>
       <w:r>
@@ -13797,6 +14162,24 @@
         <w:pStyle w:val="BodyJ"/>
       </w:pPr>
       <w:r>
+        <w:t xml:space="preserve">Douglas, H. (2000). Inductive risk and values in science. </w:t>
+      </w:r>
+      <w:r>
+        <w:rPr>
+          <w:i/>
+          <w:iCs/>
+        </w:rPr>
+        <w:t xml:space="preserve">Philosophy of Science, 67</w:t>
+      </w:r>
+      <w:r>
+        <w:t xml:space="preserve">(4), 559–579.</w:t>
+      </w:r>
+    </w:p>
+    <w:p>
+      <w:pPr>
+        <w:pStyle w:val="BodyJ"/>
+      </w:pPr>
+      <w:r>
         <w:t xml:space="preserve">Dunlosky, J., &amp; Metcalfe, J. (2009). </w:t>
       </w:r>
       <w:r>
@@ -14175,6 +14558,24 @@
         <w:pStyle w:val="BodyJ"/>
       </w:pPr>
       <w:r>
+        <w:t xml:space="preserve">Groopman, J. (2007). </w:t>
+      </w:r>
+      <w:r>
+        <w:rPr>
+          <w:i/>
+          <w:iCs/>
+        </w:rPr>
+        <w:t xml:space="preserve">How Doctors Think</w:t>
+      </w:r>
+      <w:r>
+        <w:t xml:space="preserve">. Houghton Mifflin.</w:t>
+      </w:r>
+    </w:p>
+    <w:p>
+      <w:pPr>
+        <w:pStyle w:val="BodyJ"/>
+      </w:pPr>
+      <w:r>
         <w:t xml:space="preserve">Greenhalgh, T., &amp; Hurwitz, B. (Eds.). (1998). </w:t>
       </w:r>
       <w:r>
@@ -14337,6 +14738,24 @@
         <w:pStyle w:val="BodyJ"/>
       </w:pPr>
       <w:r>
+        <w:t xml:space="preserve">Kadavath, S., Conerly, T., Askell, A., Henighan, T., Drain, D., Perez, E., et al. (2022). Language models (mostly) know what they know. </w:t>
+      </w:r>
+      <w:r>
+        <w:rPr>
+          <w:i/>
+          <w:iCs/>
+        </w:rPr>
+        <w:t xml:space="preserve">arXiv preprint</w:t>
+      </w:r>
+      <w:r>
+        <w:t xml:space="preserve">, arXiv:2207.05221.</w:t>
+      </w:r>
+    </w:p>
+    <w:p>
+      <w:pPr>
+        <w:pStyle w:val="BodyJ"/>
+      </w:pPr>
+      <w:r>
         <w:t xml:space="preserve">Kahneman, D. (2011). </w:t>
       </w:r>
       <w:r>
@@ -14427,6 +14846,24 @@
         <w:pStyle w:val="BodyJ"/>
       </w:pPr>
       <w:r>
+        <w:t xml:space="preserve">Lackey, J. (2008). </w:t>
+      </w:r>
+      <w:r>
+        <w:rPr>
+          <w:i/>
+          <w:iCs/>
+        </w:rPr>
+        <w:t xml:space="preserve">Learning from Words: Testimony as a Source of Knowledge</w:t>
+      </w:r>
+      <w:r>
+        <w:t xml:space="preserve">. Oxford University Press.</w:t>
+      </w:r>
+    </w:p>
+    <w:p>
+      <w:pPr>
+        <w:pStyle w:val="BodyJ"/>
+      </w:pPr>
+      <w:r>
         <w:t xml:space="preserve">Lambe, K. A., O'Reilly, G., Kelly, B. D., &amp; Curristan, S. (2016). Dual-process cognitive interventions to enhance diagnostic reasoning: A systematic review. </w:t>
       </w:r>
       <w:r>
@@ -14481,6 +14918,24 @@
         <w:pStyle w:val="BodyJ"/>
       </w:pPr>
       <w:r>
+        <w:t xml:space="preserve">Maniscalco, B., &amp; Lau, H. (2012). A signal detection theoretic approach for estimating metacognitive sensitivity from confidence ratings. </w:t>
+      </w:r>
+      <w:r>
+        <w:rPr>
+          <w:i/>
+          <w:iCs/>
+        </w:rPr>
+        <w:t xml:space="preserve">Consciousness and Cognition, 21</w:t>
+      </w:r>
+      <w:r>
+        <w:t xml:space="preserve">(1), 422–430.</w:t>
+      </w:r>
+    </w:p>
+    <w:p>
+      <w:pPr>
+        <w:pStyle w:val="BodyJ"/>
+      </w:pPr>
+      <w:r>
         <w:t xml:space="preserve">Mann, K., Gordon, J., &amp; MacLeod, A. (2009). Reflection and reflective practice in health professions education: A systematic review. </w:t>
       </w:r>
       <w:r>
@@ -14517,6 +14972,42 @@
         <w:pStyle w:val="BodyJ"/>
       </w:pPr>
       <w:r>
+        <w:t xml:space="preserve">Monteiro, S., &amp; Norman, G. (2013). Diagnostic reasoning: Where we've been, where we're going. </w:t>
+      </w:r>
+      <w:r>
+        <w:rPr>
+          <w:i/>
+          <w:iCs/>
+        </w:rPr>
+        <w:t xml:space="preserve">Teaching and Learning in Medicine, 25</w:t>
+      </w:r>
+      <w:r>
+        <w:t xml:space="preserve">(Suppl 1), S26–S32.</w:t>
+      </w:r>
+    </w:p>
+    <w:p>
+      <w:pPr>
+        <w:pStyle w:val="BodyJ"/>
+      </w:pPr>
+      <w:r>
+        <w:t xml:space="preserve">Monteiro, S., Sherbino, J., Sibbald, M., &amp; Norman, G. (2020). Critical thinking, biases and dual processing: The enduring myth of generalisable skills. </w:t>
+      </w:r>
+      <w:r>
+        <w:rPr>
+          <w:i/>
+          <w:iCs/>
+        </w:rPr>
+        <w:t xml:space="preserve">Medical Education, 54</w:t>
+      </w:r>
+      <w:r>
+        <w:t xml:space="preserve">(1), 66–73.</w:t>
+      </w:r>
+    </w:p>
+    <w:p>
+      <w:pPr>
+        <w:pStyle w:val="BodyJ"/>
+      </w:pPr>
+      <w:r>
         <w:t xml:space="preserve">Montgomery, K. (2006). </w:t>
       </w:r>
       <w:r>
@@ -14769,6 +15260,42 @@
         <w:pStyle w:val="BodyJ"/>
       </w:pPr>
       <w:r>
+        <w:t xml:space="preserve">Rouault, M., McWilliams, A., Allen, M., &amp; Fleming, S. M. (2018). Human metacognition across domains: Insights from individual differences and neuroimaging. </w:t>
+      </w:r>
+      <w:r>
+        <w:rPr>
+          <w:i/>
+          <w:iCs/>
+        </w:rPr>
+        <w:t xml:space="preserve">Personality Neuroscience, 1</w:t>
+      </w:r>
+      <w:r>
+        <w:t xml:space="preserve">, e17.</w:t>
+      </w:r>
+    </w:p>
+    <w:p>
+      <w:pPr>
+        <w:pStyle w:val="BodyJ"/>
+      </w:pPr>
+      <w:r>
+        <w:t xml:space="preserve">Rudner, R. (1953). The scientist qua scientist makes value judgments. </w:t>
+      </w:r>
+      <w:r>
+        <w:rPr>
+          <w:i/>
+          <w:iCs/>
+        </w:rPr>
+        <w:t xml:space="preserve">Philosophy of Science, 20</w:t>
+      </w:r>
+      <w:r>
+        <w:t xml:space="preserve">(1), 1–6.</w:t>
+      </w:r>
+    </w:p>
+    <w:p>
+      <w:pPr>
+        <w:pStyle w:val="BodyJ"/>
+      </w:pPr>
+      <w:r>
         <w:t xml:space="preserve">Sackett, D. L., Rosenberg, W. M. C., Gray, J. A. M., Haynes, R. B., &amp; Richardson, W. S. (1996). Evidence based medicine: What it is and what it isn't. </w:t>
       </w:r>
       <w:r>
@@ -15032,6 +15559,24 @@
       </w:r>
       <w:r>
         <w:t xml:space="preserve">. World Health Organization.</w:t>
+      </w:r>
+    </w:p>
+    <w:p>
+      <w:pPr>
+        <w:pStyle w:val="BodyJ"/>
+      </w:pPr>
+      <w:r>
+        <w:t xml:space="preserve">Xiong, M., Hu, Z., Lu, X., Li, Y., Fu, J., He, J., &amp; Hooi, B. (2024). Can LLMs express their uncertainty? An empirical evaluation of confidence elicitation in LLMs. </w:t>
+      </w:r>
+      <w:r>
+        <w:rPr>
+          <w:i/>
+          <w:iCs/>
+        </w:rPr>
+        <w:t xml:space="preserve">Proceedings of ICLR 2024</w:t>
+      </w:r>
+      <w:r>
+        <w:t xml:space="preserve">.</w:t>
       </w:r>
     </w:p>
     <w:sectPr>

</xml_diff>

<commit_message>
libro: 3a ronda — diálogo hispanohablante con citas verificadas
Lifshitz (La nueva clínica), ANDROMEDA-SHOCK (Hernández et al. JAMA 2019),
Gérvas & Pérez Fernández (Sano y salvo), Tajer (El corazón enfermo),
Mamede et al. JAMA 2010, Novoa (terapia epistémica 2025), Alves de Lima
(devolución constructiva) y Riquelme et al. (portafolio, Rev Med Chile).
Todas verificadas por búsqueda web antes de citar. Recompilados docx/pdf.

Co-Authored-By: Claude Fable 5 <noreply@anthropic.com>
Claude-Session: https://claude.ai/code/session_01SPkhDdVzUCxJwqq61ddeLW
</commit_message>
<xml_diff>
--- a/libro/Hechos_inferencias_incertidumbre_edicion_revisada.docx
+++ b/libro/Hechos_inferencias_incertidumbre_edicion_revisada.docx
@@ -287,7 +287,7 @@
         <w:rPr>
           <w:color w:val="8A8A8A"/>
         </w:rPr>
-        <w:t xml:space="preserve">13</w:t>
+        <w:t xml:space="preserve">14</w:t>
       </w:r>
     </w:p>
     <w:p>
@@ -307,7 +307,7 @@
         <w:rPr>
           <w:color w:val="8A8A8A"/>
         </w:rPr>
-        <w:t xml:space="preserve">17</w:t>
+        <w:t xml:space="preserve">18</w:t>
       </w:r>
     </w:p>
     <w:p>
@@ -327,7 +327,7 @@
         <w:rPr>
           <w:color w:val="8A8A8A"/>
         </w:rPr>
-        <w:t xml:space="preserve">21</w:t>
+        <w:t xml:space="preserve">22</w:t>
       </w:r>
     </w:p>
     <w:p>
@@ -347,7 +347,7 @@
         <w:rPr>
           <w:color w:val="8A8A8A"/>
         </w:rPr>
-        <w:t xml:space="preserve">25</w:t>
+        <w:t xml:space="preserve">26</w:t>
       </w:r>
     </w:p>
     <w:p>
@@ -367,7 +367,7 @@
         <w:rPr>
           <w:color w:val="8A8A8A"/>
         </w:rPr>
-        <w:t xml:space="preserve">26</w:t>
+        <w:t xml:space="preserve">27</w:t>
       </w:r>
     </w:p>
     <w:p>
@@ -387,7 +387,7 @@
         <w:rPr>
           <w:color w:val="8A8A8A"/>
         </w:rPr>
-        <w:t xml:space="preserve">27</w:t>
+        <w:t xml:space="preserve">28</w:t>
       </w:r>
     </w:p>
     <w:p>
@@ -407,7 +407,7 @@
         <w:rPr>
           <w:color w:val="8A8A8A"/>
         </w:rPr>
-        <w:t xml:space="preserve">32</w:t>
+        <w:t xml:space="preserve">33</w:t>
       </w:r>
     </w:p>
     <w:p>
@@ -427,7 +427,7 @@
         <w:rPr>
           <w:color w:val="8A8A8A"/>
         </w:rPr>
-        <w:t xml:space="preserve">35</w:t>
+        <w:t xml:space="preserve">36</w:t>
       </w:r>
     </w:p>
     <w:p>
@@ -447,7 +447,7 @@
         <w:rPr>
           <w:color w:val="8A8A8A"/>
         </w:rPr>
-        <w:t xml:space="preserve">38</w:t>
+        <w:t xml:space="preserve">39</w:t>
       </w:r>
     </w:p>
     <w:p>
@@ -467,7 +467,7 @@
         <w:rPr>
           <w:color w:val="8A8A8A"/>
         </w:rPr>
-        <w:t xml:space="preserve">41</w:t>
+        <w:t xml:space="preserve">42</w:t>
       </w:r>
     </w:p>
     <w:p>
@@ -487,7 +487,7 @@
         <w:rPr>
           <w:color w:val="8A8A8A"/>
         </w:rPr>
-        <w:t xml:space="preserve">42</w:t>
+        <w:t xml:space="preserve">43</w:t>
       </w:r>
     </w:p>
     <w:p>
@@ -507,7 +507,7 @@
         <w:rPr>
           <w:color w:val="8A8A8A"/>
         </w:rPr>
-        <w:t xml:space="preserve">43</w:t>
+        <w:t xml:space="preserve">44</w:t>
       </w:r>
     </w:p>
     <w:p>
@@ -527,7 +527,7 @@
         <w:rPr>
           <w:color w:val="8A8A8A"/>
         </w:rPr>
-        <w:t xml:space="preserve">49</w:t>
+        <w:t xml:space="preserve">50</w:t>
       </w:r>
     </w:p>
     <w:p>
@@ -547,7 +547,7 @@
         <w:rPr>
           <w:color w:val="8A8A8A"/>
         </w:rPr>
-        <w:t xml:space="preserve">52</w:t>
+        <w:t xml:space="preserve">53</w:t>
       </w:r>
     </w:p>
     <w:p>
@@ -567,7 +567,7 @@
         <w:rPr>
           <w:color w:val="8A8A8A"/>
         </w:rPr>
-        <w:t xml:space="preserve">56</w:t>
+        <w:t xml:space="preserve">57</w:t>
       </w:r>
     </w:p>
     <w:p>
@@ -587,7 +587,7 @@
         <w:rPr>
           <w:color w:val="8A8A8A"/>
         </w:rPr>
-        <w:t xml:space="preserve">61</w:t>
+        <w:t xml:space="preserve">62</w:t>
       </w:r>
     </w:p>
     <w:p>
@@ -607,7 +607,7 @@
         <w:rPr>
           <w:color w:val="8A8A8A"/>
         </w:rPr>
-        <w:t xml:space="preserve">62</w:t>
+        <w:t xml:space="preserve">63</w:t>
       </w:r>
     </w:p>
     <w:p>
@@ -627,7 +627,7 @@
         <w:rPr>
           <w:color w:val="8A8A8A"/>
         </w:rPr>
-        <w:t xml:space="preserve">63</w:t>
+        <w:t xml:space="preserve">64</w:t>
       </w:r>
     </w:p>
     <w:p>
@@ -647,7 +647,7 @@
         <w:rPr>
           <w:color w:val="8A8A8A"/>
         </w:rPr>
-        <w:t xml:space="preserve">66</w:t>
+        <w:t xml:space="preserve">67</w:t>
       </w:r>
     </w:p>
     <w:p>
@@ -667,7 +667,7 @@
         <w:rPr>
           <w:color w:val="8A8A8A"/>
         </w:rPr>
-        <w:t xml:space="preserve">70</w:t>
+        <w:t xml:space="preserve">71</w:t>
       </w:r>
     </w:p>
     <w:p>
@@ -687,7 +687,7 @@
         <w:rPr>
           <w:color w:val="8A8A8A"/>
         </w:rPr>
-        <w:t xml:space="preserve">76</w:t>
+        <w:t xml:space="preserve">77</w:t>
       </w:r>
     </w:p>
     <w:p>
@@ -707,7 +707,7 @@
         <w:rPr>
           <w:color w:val="8A8A8A"/>
         </w:rPr>
-        <w:t xml:space="preserve">83</w:t>
+        <w:t xml:space="preserve">84</w:t>
       </w:r>
     </w:p>
     <w:p>
@@ -727,7 +727,7 @@
         <w:rPr>
           <w:color w:val="8A8A8A"/>
         </w:rPr>
-        <w:t xml:space="preserve">87</w:t>
+        <w:t xml:space="preserve">88</w:t>
       </w:r>
     </w:p>
     <w:p>
@@ -747,7 +747,7 @@
         <w:rPr>
           <w:color w:val="8A8A8A"/>
         </w:rPr>
-        <w:t xml:space="preserve">89</w:t>
+        <w:t xml:space="preserve">90</w:t>
       </w:r>
     </w:p>
     <w:p>
@@ -767,7 +767,7 @@
         <w:rPr>
           <w:color w:val="8A8A8A"/>
         </w:rPr>
-        <w:t xml:space="preserve">91</w:t>
+        <w:t xml:space="preserve">92</w:t>
       </w:r>
     </w:p>
     <w:p>
@@ -787,7 +787,7 @@
         <w:rPr>
           <w:color w:val="8A8A8A"/>
         </w:rPr>
-        <w:t xml:space="preserve">93</w:t>
+        <w:t xml:space="preserve">94</w:t>
       </w:r>
     </w:p>
     <w:p>
@@ -807,7 +807,7 @@
         <w:rPr>
           <w:color w:val="8A8A8A"/>
         </w:rPr>
-        <w:t xml:space="preserve">95</w:t>
+        <w:t xml:space="preserve">96</w:t>
       </w:r>
     </w:p>
     <w:p>
@@ -827,7 +827,7 @@
         <w:rPr>
           <w:color w:val="8A8A8A"/>
         </w:rPr>
-        <w:t xml:space="preserve">98</w:t>
+        <w:t xml:space="preserve">99</w:t>
       </w:r>
     </w:p>
     <w:p>
@@ -847,7 +847,7 @@
         <w:rPr>
           <w:color w:val="8A8A8A"/>
         </w:rPr>
-        <w:t xml:space="preserve">100</w:t>
+        <w:t xml:space="preserve">101</w:t>
       </w:r>
     </w:p>
     <w:p>
@@ -1141,7 +1141,7 @@
         <w:pStyle w:val="BodyJ"/>
       </w:pPr>
       <w:r>
-        <w:t xml:space="preserve">Esta tensión no es nueva. Alvan Feinstein reclamaba ya en los años sesenta una ciencia del juicio clínico: un examen disciplinado de cómo los médicos observan, clasifican y deciden, en lugar de tratar esas operaciones como talento inefable (Feinstein, 1967). Décadas después, Kathryn Montgomery llamó la atención sobre el carácter de razonamiento práctico de la medicina. No se trata de negar su base científica, sino de reconocer que la decisión clínica no se deduce mecánicamente de una ley general (Montgomery, 2006). La evidencia poblacional informa; no reemplaza el juicio. El caso particular exige seleccionar qué información importa, determinar qué regularidad es pertinente, estimar consecuencias y actuar bajo condiciones de tiempo, recursos, valores y riesgo.</w:t>
+        <w:t xml:space="preserve">Esta tensión no es nueva. Alvan Feinstein reclamaba ya en los años sesenta una ciencia del juicio clínico: un examen disciplinado de cómo los médicos observan, clasifican y deciden, en lugar de tratar esas operaciones como talento inefable (Feinstein, 1967). En español, Alberto Lifshitz ha sostenido la misma causa durante décadas: la tecnología no reemplaza el método clínico sino que lo vuelve más exigente, y la clínica debe reformularse sin renunciar a su núcleo de juicio (Lifshitz, 2014). Kathryn Montgomery, por su parte, llamó la atención sobre el carácter de razonamiento práctico de la medicina. No se trata de negar su base científica, sino de reconocer que la decisión clínica no se deduce mecánicamente de una ley general (Montgomery, 2006). La evidencia poblacional informa; no reemplaza el juicio. El caso particular exige seleccionar qué información importa, determinar qué regularidad es pertinente, estimar consecuencias y actuar bajo condiciones de tiempo, recursos, valores y riesgo.</w:t>
       </w:r>
     </w:p>
     <w:p>
@@ -1518,6 +1518,14 @@
     </w:p>
     <w:p>
       <w:pPr>
+        <w:pStyle w:val="BodyJ"/>
+      </w:pPr>
+      <w:r>
+        <w:t xml:space="preserve">La distinción no es académica. El ensayo ANDROMEDA-SHOCK comparó dos maneras de leer al mismo paciente en shock séptico —guiar la reanimación por la normalización del lactato o por la del relleno capilar— y la estrategia guiada por el marcador de laboratorio no resultó superior a la guiada por la perfusión periférica observada en la piel (Hernández et al., 2019). Cuando dos blancos que supuestamente "miden lo mismo" conducen a conductas y desenlaces distintos, lo que queda expuesto es exactamente la brecha entre el dato y su interpretación: el lactato era un hecho; "el paciente sigue hipoperfundido" era una inferencia que convenía someter a examen.</w:t>
+      </w:r>
+    </w:p>
+    <w:p>
+      <w:pPr>
         <w:pStyle w:val="Heading3"/>
         <w:spacing w:after="120" w:before="280"/>
       </w:pPr>
@@ -2495,7 +2503,7 @@
         <w:pStyle w:val="BodyJ"/>
       </w:pPr>
       <w:r>
-        <w:t xml:space="preserve">La intolerancia puede expresarse como sobreestudio, sobretratamiento, cierre prematuro o derivación defensiva. Curiosamente, conductas opuestas pueden tener la misma raíz: necesidad de escapar de la ambigüedad. Por ello, la pregunta no es sólo cuánta incertidumbre existe, sino qué hacemos emocional y cognitivamente con ella.</w:t>
+        <w:t xml:space="preserve">La intolerancia puede expresarse como sobreestudio, sobretratamiento, cierre prematuro o derivación defensiva. Curiosamente, conductas opuestas pueden tener la misma raíz: necesidad de escapar de la ambigüedad. Gérvas y Pérez Fernández han documentado la versión poblacional de esa intolerancia: cascadas de intervenciones innecesarias que nacen de no soportar la espera vigilante, y que dañan con especial eficacia a los más sanos (Gérvas &amp; Pérez Fernández, 2013). Por ello, la pregunta no es sólo cuánta incertidumbre existe, sino qué hacemos emocional y cognitivamente con ella.</w:t>
       </w:r>
     </w:p>
     <w:p>
@@ -3778,7 +3786,7 @@
         <w:pStyle w:val="BodyJ"/>
       </w:pPr>
       <w:r>
-        <w:t xml:space="preserve">La metacognición clínica necesita sensibilidad a señales de conflicto. Algunas son cognitivas: un dato no encaja, dos hallazgos exigen mecanismos incompatibles, el diagnóstico depende de una sola pieza. Otras son afectivas: incomodidad, sorpresa, irritación con el paciente, deseo de terminar, excesiva tranquilidad ante un caso complejo. Epstein llamó práctica atenta a la capacidad de observar no sólo al paciente, sino las propias categorías, emociones y errores potenciales (Epstein, 1999).</w:t>
+        <w:t xml:space="preserve">La metacognición clínica necesita sensibilidad a señales de conflicto. Algunas son cognitivas: un dato no encaja, dos hallazgos exigen mecanismos incompatibles, el diagnóstico depende de una sola pieza. Otras son afectivas: incomodidad, sorpresa, irritación con el paciente, deseo de terminar, excesiva tranquilidad ante un caso complejo. Las emociones no son ruido del trabajo clínico: son parte de su materia. Tajer ha mostrado cómo atraviesan incluso la fisiopatología de aquello que tratamos —del ánimo al infarto—, y con mayor razón atraviesan a quien trata (Tajer, 2008). Epstein llamó práctica atenta a la capacidad de observar no sólo al paciente, sino las propias categorías, emociones y errores potenciales (Epstein, 1999).</w:t>
       </w:r>
     </w:p>
     <w:p>
@@ -4724,7 +4732,7 @@
         <w:pStyle w:val="BodyJ"/>
       </w:pPr>
       <w:r>
-        <w:t xml:space="preserve">Mamede y colaboradores estudiaron la reflexión deliberada y encontraron que, en ciertos problemas complejos, comparar hipótesis mediante evidencia a favor y en contra puede mejorar la precisión diagnóstica (Mamede et al., 2008). Otros trabajos y revisiones muestran resultados variables, lo que impide convertir la reflexión en una receta universal (Graber et al., 2012; Lambe et al., 2016).</w:t>
+        <w:t xml:space="preserve">Mamede y colaboradores estudiaron la reflexión deliberada y encontraron que, en ciertos problemas complejos, comparar hipótesis mediante evidencia a favor y en contra puede mejorar la precisión diagnóstica (Mamede et al., 2008). El mismo grupo mostró después algo más específico: la exposición reciente a ciertos diagnósticos induce sesgo de disponibilidad en residentes, y la reflexión estructurada revierte ese efecto (Mamede et al., 2010) — la mejor evidencia disponible de que la pausa correcta no es un ritual, sino un antídoto con indicación precisa. Otros trabajos y revisiones muestran resultados variables, lo que impide convertir la reflexión en una receta universal (Graber et al., 2012; Lambe et al., 2016).</w:t>
       </w:r>
     </w:p>
     <w:p>
@@ -5151,7 +5159,7 @@
         <w:pStyle w:val="BodyJ"/>
       </w:pPr>
       <w:r>
-        <w:t xml:space="preserve">Sackett y colaboradores definieron la medicina basada en evidencia como la integración de la mejor evidencia disponible con la experiencia clínica y los valores del paciente (Sackett et al., 1996). La formulación original ya impedía convertir la evidencia en algoritmo autosuficiente. Con el tiempo, sin embargo, la jerarquía de diseños pudo confundirse con una jerarquía completa de decisiones, y varios autores han alertado sobre la reducción de la medicina basada en evidencia a reglas burocráticas y métricas desconectadas del cuidado (Greenhalgh et al., 2014; Djulbegovic &amp; Guyatt, 2017). Un ensayo aleatorizado puede estimar con gran validez interna un efecto promedio y, aun así, no resolver si conviene tratar a una persona con diferente riesgo basal, comorbilidades, expectativas, horizonte temporal o vulnerabilidad a los efectos adversos.</w:t>
+        <w:t xml:space="preserve">Sackett y colaboradores definieron la medicina basada en evidencia como la integración de la mejor evidencia disponible con la experiencia clínica y los valores del paciente (Sackett et al., 1996). La formulación original ya impedía convertir la evidencia en algoritmo autosuficiente. Con el tiempo, sin embargo, la jerarquía de diseños pudo confundirse con una jerarquía completa de decisiones, y varios autores han alertado sobre la reducción de la medicina basada en evidencia a reglas burocráticas y métricas desconectadas del cuidado (Greenhalgh et al., 2014; Djulbegovic &amp; Guyatt, 2017). En español, Novoa ha propuesto para esta corrección el nombre de terapia epistémica: un juicio clínico centrado en la persona, apoyado en pluralismo evidencial y contextualización del conocimiento, contra la tentación de que los números decidan solos (Novoa Jurado, 2025). Un ensayo aleatorizado puede estimar con gran validez interna un efecto promedio y, aun así, no resolver si conviene tratar a una persona con diferente riesgo basal, comorbilidades, expectativas, horizonte temporal o vulnerabilidad a los efectos adversos.</w:t>
       </w:r>
     </w:p>
     <w:p>
@@ -9850,7 +9858,7 @@
         <w:pStyle w:val="BodyJ"/>
       </w:pPr>
       <w:r>
-        <w:t xml:space="preserve">El docente puede pedir al aprendiz que marque cada frase como hecho, inferencia o incertidumbre. Luego puede comparar la versión inicial con una formulación experta, no para imponer estilo, sino para mostrar qué relaciones fueron seleccionadas. El feedback debe ser específico: "presentaste la bacteriuria como infección", "omitiste que la imagen sólo excluye complicación actual", "tu plan no indica qué te haría cambiar".</w:t>
+        <w:t xml:space="preserve">El docente puede pedir al aprendiz que marque cada frase como hecho, inferencia o incertidumbre. Luego puede comparar la versión inicial con una formulación experta, no para imponer estilo, sino para mostrar qué relaciones fueron seleccionadas. El feedback debe ser específico: "presentaste la bacteriuria como infección", "omitiste que la imagen sólo excluye complicación actual", "tu plan no indica qué te haría cambiar". La devolución constructiva tiene técnica y tradición docente propia en nuestra lengua: describir conducta observable en lugar de juzgar a la persona, equilibrar lo logrado con lo corregible y terminar en un plan (Alves de Lima, 2008).</w:t>
       </w:r>
     </w:p>
     <w:p>
@@ -10042,7 +10050,7 @@
         <w:pStyle w:val="BodyJ"/>
       </w:pPr>
       <w:r>
-        <w:t xml:space="preserve">Un portafolio privado puede registrar: hipótesis principal, confianza aproximada, alternativa relevante, desenlace y aprendizaje. No busca puntuar moralmente; busca detectar patrones: exceso de confianza en un dominio, subestimación de recurrencias, tendencia a tratar cultivos sin síndrome o dificultad para reconocer diagnósticos funcionales. El Taller 5 de este libro es su versión mínima.</w:t>
+        <w:t xml:space="preserve">Un portafolio privado puede registrar: hipótesis principal, confianza aproximada, alternativa relevante, desenlace y aprendizaje. No busca puntuar moralmente; busca detectar patrones: exceso de confianza en un dominio, subestimación de recurrencias, tendencia a tratar cultivos sin síndrome o dificultad para reconocer diagnósticos funcionales. El Taller 5 de este libro es su versión mínima. El portafolio como instrumento docente tiene además desarrollo propio en la educación médica latinoamericana, incluida la validación en español de instrumentos para evaluar su uso (Riquelme et al., 2011).</w:t>
       </w:r>
     </w:p>
     <w:p>
@@ -13596,6 +13604,18 @@
         </w:numPr>
       </w:pPr>
       <w:r>
+        <w:t xml:space="preserve">Marcador y enfermedad (lactato, perfusión, ANDROMEDA-SHOCK) — 1</w:t>
+      </w:r>
+    </w:p>
+    <w:p>
+      <w:pPr>
+        <w:pStyle w:val="BodyJ"/>
+        <w:numPr>
+          <w:ilvl w:val="0"/>
+          <w:numId w:val="6"/>
+        </w:numPr>
+      </w:pPr>
+      <w:r>
         <w:t xml:space="preserve">Medicina basada en evidencia — 9</w:t>
       </w:r>
     </w:p>
@@ -13765,6 +13785,18 @@
       </w:pPr>
       <w:r>
         <w:t xml:space="preserve">Sobreconfianza — 5, 7</w:t>
+      </w:r>
+    </w:p>
+    <w:p>
+      <w:pPr>
+        <w:pStyle w:val="BodyJ"/>
+        <w:numPr>
+          <w:ilvl w:val="0"/>
+          <w:numId w:val="6"/>
+        </w:numPr>
+      </w:pPr>
+      <w:r>
+        <w:t xml:space="preserve">Sobreestudio e intervenciones innecesarias — 3</w:t>
       </w:r>
     </w:p>
     <w:p>
@@ -13838,6 +13870,24 @@
         <w:pStyle w:val="BodyJ"/>
       </w:pPr>
       <w:r>
+        <w:t xml:space="preserve">Alves de Lima, A. (2008). Devolución constructiva: Una estrategia para mejorar el aprendizaje. </w:t>
+      </w:r>
+      <w:r>
+        <w:rPr>
+          <w:i/>
+          <w:iCs/>
+        </w:rPr>
+        <w:t xml:space="preserve">Medicina (Buenos Aires), 68</w:t>
+      </w:r>
+      <w:r>
+        <w:t xml:space="preserve">(1), 88–92.</w:t>
+      </w:r>
+    </w:p>
+    <w:p>
+      <w:pPr>
+        <w:pStyle w:val="BodyJ"/>
+      </w:pPr>
+      <w:r>
         <w:t xml:space="preserve">Aristotle. (2009). </w:t>
       </w:r>
       <w:r>
@@ -14486,6 +14536,24 @@
         <w:pStyle w:val="BodyJ"/>
       </w:pPr>
       <w:r>
+        <w:t xml:space="preserve">Gérvas, J., &amp; Pérez Fernández, M. (2013). </w:t>
+      </w:r>
+      <w:r>
+        <w:rPr>
+          <w:i/>
+          <w:iCs/>
+        </w:rPr>
+        <w:t xml:space="preserve">Sano y salvo (y libre de intervenciones médicas innecesarias)</w:t>
+      </w:r>
+      <w:r>
+        <w:t xml:space="preserve">. Los Libros del Lince.</w:t>
+      </w:r>
+    </w:p>
+    <w:p>
+      <w:pPr>
+        <w:pStyle w:val="BodyJ"/>
+      </w:pPr>
+      <w:r>
         <w:t xml:space="preserve">Gigerenzer, G., &amp; Gaissmaier, W. (2011). Heuristic decision making. </w:t>
       </w:r>
       <w:r>
@@ -14648,6 +14716,24 @@
         <w:pStyle w:val="BodyJ"/>
       </w:pPr>
       <w:r>
+        <w:t xml:space="preserve">Hernández, G., Ospina-Tascón, G. A., Damiani, L. P., Estenssoro, E., Dubin, A., Hurtado, J., et al. (2019). Effect of a resuscitation strategy targeting peripheral perfusion status vs serum lactate levels on 28-day mortality among patients with septic shock: The ANDROMEDA-SHOCK randomized clinical trial. </w:t>
+      </w:r>
+      <w:r>
+        <w:rPr>
+          <w:i/>
+          <w:iCs/>
+        </w:rPr>
+        <w:t xml:space="preserve">JAMA, 321</w:t>
+      </w:r>
+      <w:r>
+        <w:t xml:space="preserve">(7), 654–664.</w:t>
+      </w:r>
+    </w:p>
+    <w:p>
+      <w:pPr>
+        <w:pStyle w:val="BodyJ"/>
+      </w:pPr>
+      <w:r>
         <w:t xml:space="preserve">Hoffrage, U., &amp; Gigerenzer, G. (1998). Using natural frequencies to improve diagnostic inferences. </w:t>
       </w:r>
       <w:r>
@@ -14900,6 +14986,24 @@
         <w:pStyle w:val="BodyJ"/>
       </w:pPr>
       <w:r>
+        <w:t xml:space="preserve">Lifshitz, A. (2014). </w:t>
+      </w:r>
+      <w:r>
+        <w:rPr>
+          <w:i/>
+          <w:iCs/>
+        </w:rPr>
+        <w:t xml:space="preserve">La nueva clínica</w:t>
+      </w:r>
+      <w:r>
+        <w:t xml:space="preserve">. Academia Nacional de Medicina de México.</w:t>
+      </w:r>
+    </w:p>
+    <w:p>
+      <w:pPr>
+        <w:pStyle w:val="BodyJ"/>
+      </w:pPr>
+      <w:r>
         <w:t xml:space="preserve">Mamede, S., Schmidt, H. G., &amp; Penaforte, J. C. (2008). Effects of reflective practice on the accuracy of medical diagnoses. </w:t>
       </w:r>
       <w:r>
@@ -14918,6 +15022,24 @@
         <w:pStyle w:val="BodyJ"/>
       </w:pPr>
       <w:r>
+        <w:t xml:space="preserve">Mamede, S., van Gog, T., van den Berge, K., Rikers, R. M. J. P., van Saase, J. L. C. M., van Guldener, C., &amp; Schmidt, H. G. (2010). Effect of availability bias and reflective reasoning on diagnostic accuracy among internal medicine residents. </w:t>
+      </w:r>
+      <w:r>
+        <w:rPr>
+          <w:i/>
+          <w:iCs/>
+        </w:rPr>
+        <w:t xml:space="preserve">JAMA, 304</w:t>
+      </w:r>
+      <w:r>
+        <w:t xml:space="preserve">(11), 1198–1203.</w:t>
+      </w:r>
+    </w:p>
+    <w:p>
+      <w:pPr>
+        <w:pStyle w:val="BodyJ"/>
+      </w:pPr>
+      <w:r>
         <w:t xml:space="preserve">Maniscalco, B., &amp; Lau, H. (2012). A signal detection theoretic approach for estimating metacognitive sensitivity from confidence ratings. </w:t>
       </w:r>
       <w:r>
@@ -15134,6 +15256,24 @@
         <w:pStyle w:val="BodyJ"/>
       </w:pPr>
       <w:r>
+        <w:t xml:space="preserve">Novoa Jurado, A. J. (2025). Terapia epistémica del conocimiento clínico. </w:t>
+      </w:r>
+      <w:r>
+        <w:rPr>
+          <w:i/>
+          <w:iCs/>
+        </w:rPr>
+        <w:t xml:space="preserve">Revista Clínica de Medicina de Familia, 18</w:t>
+      </w:r>
+      <w:r>
+        <w:t xml:space="preserve">(3), 274–282.</w:t>
+      </w:r>
+    </w:p>
+    <w:p>
+      <w:pPr>
+        <w:pStyle w:val="BodyJ"/>
+      </w:pPr>
+      <w:r>
         <w:t xml:space="preserve">Pauker, S. G., &amp; Kassirer, J. P. (1980). The threshold approach to clinical decision making. </w:t>
       </w:r>
       <w:r>
@@ -15260,6 +15400,24 @@
         <w:pStyle w:val="BodyJ"/>
       </w:pPr>
       <w:r>
+        <w:t xml:space="preserve">Riquelme, A., Méndez, B., de la Fuente, P., Padilla, O., Benaglio, C., Sirhan, M., &amp; Labarca, J. (2011). Desarrollo y validación de encuesta de percepción del portafolio en estudiantes de medicina de pregrado. </w:t>
+      </w:r>
+      <w:r>
+        <w:rPr>
+          <w:i/>
+          <w:iCs/>
+        </w:rPr>
+        <w:t xml:space="preserve">Revista Médica de Chile, 139</w:t>
+      </w:r>
+      <w:r>
+        <w:t xml:space="preserve">(1), 45–53.</w:t>
+      </w:r>
+    </w:p>
+    <w:p>
+      <w:pPr>
+        <w:pStyle w:val="BodyJ"/>
+      </w:pPr>
+      <w:r>
         <w:t xml:space="preserve">Rouault, M., McWilliams, A., Allen, M., &amp; Fleming, S. M. (2018). Human metacognition across domains: Insights from individual differences and neuroimaging. </w:t>
       </w:r>
       <w:r>
@@ -15451,6 +15609,24 @@
       </w:r>
       <w:r>
         <w:t xml:space="preserve">, 172–180.</w:t>
+      </w:r>
+    </w:p>
+    <w:p>
+      <w:pPr>
+        <w:pStyle w:val="BodyJ"/>
+      </w:pPr>
+      <w:r>
+        <w:t xml:space="preserve">Tajer, C. (2008). </w:t>
+      </w:r>
+      <w:r>
+        <w:rPr>
+          <w:i/>
+          <w:iCs/>
+        </w:rPr>
+        <w:t xml:space="preserve">El corazón enfermo: Puentes entre las emociones y el infarto</w:t>
+      </w:r>
+      <w:r>
+        <w:t xml:space="preserve">. Libros del Zorzal.</w:t>
       </w:r>
     </w:p>
     <w:p>

</xml_diff>

<commit_message>
libro: 4a ronda — la saga ANDROMEDA con protagonismo (G. Hernández)
Cap. 1: crítica a la 'depuración de lactato' (Hernández, Bellomo & Bakker,
ICM 2019). Cap. 9: sección nueva 'Una década sobre un mismo dato' — ensayo
2019, reanálisis bayesiano 2020 y ANDROMEDA-SHOCK-2 (JAMA 2025) como caso
de lectura de evidencia y riesgo inductivo. Ficha del candidato ampliada.

Co-Authored-By: Claude Fable 5 <noreply@anthropic.com>
Claude-Session: https://claude.ai/code/session_01SPkhDdVzUCxJwqq61ddeLW
</commit_message>
<xml_diff>
--- a/libro/Hechos_inferencias_incertidumbre_edicion_revisada.docx
+++ b/libro/Hechos_inferencias_incertidumbre_edicion_revisada.docx
@@ -527,7 +527,7 @@
         <w:rPr>
           <w:color w:val="8A8A8A"/>
         </w:rPr>
-        <w:t xml:space="preserve">50</w:t>
+        <w:t xml:space="preserve">51</w:t>
       </w:r>
     </w:p>
     <w:p>
@@ -547,7 +547,7 @@
         <w:rPr>
           <w:color w:val="8A8A8A"/>
         </w:rPr>
-        <w:t xml:space="preserve">53</w:t>
+        <w:t xml:space="preserve">54</w:t>
       </w:r>
     </w:p>
     <w:p>
@@ -567,7 +567,7 @@
         <w:rPr>
           <w:color w:val="8A8A8A"/>
         </w:rPr>
-        <w:t xml:space="preserve">57</w:t>
+        <w:t xml:space="preserve">58</w:t>
       </w:r>
     </w:p>
     <w:p>
@@ -587,7 +587,7 @@
         <w:rPr>
           <w:color w:val="8A8A8A"/>
         </w:rPr>
-        <w:t xml:space="preserve">62</w:t>
+        <w:t xml:space="preserve">63</w:t>
       </w:r>
     </w:p>
     <w:p>
@@ -607,7 +607,7 @@
         <w:rPr>
           <w:color w:val="8A8A8A"/>
         </w:rPr>
-        <w:t xml:space="preserve">63</w:t>
+        <w:t xml:space="preserve">64</w:t>
       </w:r>
     </w:p>
     <w:p>
@@ -627,7 +627,7 @@
         <w:rPr>
           <w:color w:val="8A8A8A"/>
         </w:rPr>
-        <w:t xml:space="preserve">64</w:t>
+        <w:t xml:space="preserve">65</w:t>
       </w:r>
     </w:p>
     <w:p>
@@ -647,7 +647,7 @@
         <w:rPr>
           <w:color w:val="8A8A8A"/>
         </w:rPr>
-        <w:t xml:space="preserve">67</w:t>
+        <w:t xml:space="preserve">68</w:t>
       </w:r>
     </w:p>
     <w:p>
@@ -667,7 +667,7 @@
         <w:rPr>
           <w:color w:val="8A8A8A"/>
         </w:rPr>
-        <w:t xml:space="preserve">71</w:t>
+        <w:t xml:space="preserve">72</w:t>
       </w:r>
     </w:p>
     <w:p>
@@ -687,7 +687,7 @@
         <w:rPr>
           <w:color w:val="8A8A8A"/>
         </w:rPr>
-        <w:t xml:space="preserve">77</w:t>
+        <w:t xml:space="preserve">78</w:t>
       </w:r>
     </w:p>
     <w:p>
@@ -707,7 +707,7 @@
         <w:rPr>
           <w:color w:val="8A8A8A"/>
         </w:rPr>
-        <w:t xml:space="preserve">84</w:t>
+        <w:t xml:space="preserve">85</w:t>
       </w:r>
     </w:p>
     <w:p>
@@ -727,7 +727,7 @@
         <w:rPr>
           <w:color w:val="8A8A8A"/>
         </w:rPr>
-        <w:t xml:space="preserve">88</w:t>
+        <w:t xml:space="preserve">89</w:t>
       </w:r>
     </w:p>
     <w:p>
@@ -747,7 +747,7 @@
         <w:rPr>
           <w:color w:val="8A8A8A"/>
         </w:rPr>
-        <w:t xml:space="preserve">90</w:t>
+        <w:t xml:space="preserve">91</w:t>
       </w:r>
     </w:p>
     <w:p>
@@ -767,7 +767,7 @@
         <w:rPr>
           <w:color w:val="8A8A8A"/>
         </w:rPr>
-        <w:t xml:space="preserve">92</w:t>
+        <w:t xml:space="preserve">93</w:t>
       </w:r>
     </w:p>
     <w:p>
@@ -787,7 +787,7 @@
         <w:rPr>
           <w:color w:val="8A8A8A"/>
         </w:rPr>
-        <w:t xml:space="preserve">94</w:t>
+        <w:t xml:space="preserve">95</w:t>
       </w:r>
     </w:p>
     <w:p>
@@ -807,7 +807,7 @@
         <w:rPr>
           <w:color w:val="8A8A8A"/>
         </w:rPr>
-        <w:t xml:space="preserve">96</w:t>
+        <w:t xml:space="preserve">97</w:t>
       </w:r>
     </w:p>
     <w:p>
@@ -827,7 +827,7 @@
         <w:rPr>
           <w:color w:val="8A8A8A"/>
         </w:rPr>
-        <w:t xml:space="preserve">99</w:t>
+        <w:t xml:space="preserve">100</w:t>
       </w:r>
     </w:p>
     <w:p>
@@ -847,7 +847,7 @@
         <w:rPr>
           <w:color w:val="8A8A8A"/>
         </w:rPr>
-        <w:t xml:space="preserve">101</w:t>
+        <w:t xml:space="preserve">102</w:t>
       </w:r>
     </w:p>
     <w:p>
@@ -1526,6 +1526,14 @@
     </w:p>
     <w:p>
       <w:pPr>
+        <w:pStyle w:val="BodyJ"/>
+      </w:pPr>
+      <w:r>
+        <w:t xml:space="preserve">El mismo grupo había advertido antes contra el uso ingenuo de la "depuración de lactato" como blanco terapéutico: la hiperlactatemia que persiste no siempre es hipoperfusión que persiste —puede ser estrés adrenérgico, menor aclaramiento u otra cosa—, y perseguir el número puede inducir más reanimación de la que el paciente tolera (Hernández, Bellomo &amp; Bakker, 2019). Es la lección de este capítulo en versión de cuidados intensivos: tratar el marcador como si fuera el mecanismo no es un refinamiento; es una inferencia disfrazada de hecho, con volumen y vasopresores de por medio.</w:t>
+      </w:r>
+    </w:p>
+    <w:p>
+      <w:pPr>
         <w:pStyle w:val="Heading3"/>
         <w:spacing w:after="120" w:before="280"/>
       </w:pPr>
@@ -5450,6 +5458,39 @@
       </w:pPr>
       <w:r>
         <w:t xml:space="preserve">Esta fundamentación tiene una consecuencia liberadora. Reconocer que hay valores dentro del umbral no corrompe la objetividad clínica; la localiza. Los hechos y las probabilidades se estiman con toda la disciplina de la Parte I; el punto de corte se delibera —con el paciente cuando es posible— y se declara. Lo indefendible no es que haya valores en la decisión: es esconderlos detrás de una retórica de pura evidencia.</w:t>
+      </w:r>
+    </w:p>
+    <w:p>
+      <w:pPr>
+        <w:pStyle w:val="Heading3"/>
+        <w:spacing w:after="120" w:before="280"/>
+      </w:pPr>
+      <w:r>
+        <w:rPr>
+          <w:rFonts w:ascii="Georgia" w:cs="Georgia" w:eastAsia="Georgia" w:hAnsi="Georgia"/>
+          <w:b/>
+          <w:bCs/>
+          <w:color w:val="2B2B2B"/>
+          <w:sz w:val="25"/>
+          <w:szCs w:val="25"/>
+        </w:rPr>
+        <w:t xml:space="preserve">Una década sobre un mismo dato: la saga ANDROMEDA</w:t>
+      </w:r>
+    </w:p>
+    <w:p>
+      <w:pPr>
+        <w:pStyle w:val="BodyJ"/>
+      </w:pPr>
+      <w:r>
+        <w:t xml:space="preserve">Pocas historias recientes muestran mejor cómo se lee —y se relee— la evidencia. En 2019, un ensayo multicéntrico conducido desde una red latinoamericana de investigación en medicina intensiva comparó dos blancos para reanimar el shock séptico: normalizar el lactato o normalizar el relleno capilar. El grupo guiado por la perfusión periférica tuvo una mortalidad absoluta 8,5 puntos menor; el valor p fue 0,06 y el ensayo quedó declarado "negativo" según la convención (Hernández et al., 2019). ¿Qué debía hacer un clínico con ese resultado? El umbral de significación que lo declaró negativo no es una ley de la naturaleza: es una convención comunitaria sobre riesgo inductivo —cuánta evidencia exigimos antes de aceptar un efecto—, exactamente lo que Rudner y Douglas describieron. Un reanálisis bayesiano lo hizo explícito: bajo cualquier prior razonable, la probabilidad de que la estrategia guiada por perfusión fuera superior excedía el 90% (Zampieri et al., 2020). El mismo dato, dos marcos de lectura, dos frases distintas para la ficha.</w:t>
+      </w:r>
+    </w:p>
+    <w:p>
+      <w:pPr>
+        <w:pStyle w:val="BodyJ"/>
+      </w:pPr>
+      <w:r>
+        <w:t xml:space="preserve">La respuesta madura del propio grupo no fue proclamar victoria ni acatar el veredicto: fue refinar la hipótesis —fenotipos hemodinámicos, un algoritmo personalizado— y volver a someterla a una prueba más severa. Seis años después, el segundo ensayo, ahora en 86 centros de 19 países, mostró que la estrategia personalizada guiada por relleno capilar era superior al cuidado habitual (Hernández et al., 2025). La saga deja tres lecciones para este capítulo: un ensayo no se lee solo, porque el marco inferencial es parte de la lectura; "no significativo" no significa "sin efecto", y tratarlos como sinónimos es una decisión con costos; y la incertidumbre residual no se resuelve con retórica, sino con la siguiente pregunta bien diseñada. Hay una cuarta lección que excede la epistemología: esa ciencia de primera línea se hizo desde América Latina, coordinada desde Chile — el mismo continente clínico desde el que este libro escribe.</w:t>
       </w:r>
     </w:p>
     <w:p>
@@ -13592,6 +13633,18 @@
         </w:numPr>
       </w:pPr>
       <w:r>
+        <w:t xml:space="preserve">Lectura de ensayos clínicos (significación, reanálisis bayesiano, saga ANDROMEDA) — 9</w:t>
+      </w:r>
+    </w:p>
+    <w:p>
+      <w:pPr>
+        <w:pStyle w:val="BodyJ"/>
+        <w:numPr>
+          <w:ilvl w:val="0"/>
+          <w:numId w:val="6"/>
+        </w:numPr>
+      </w:pPr>
+      <w:r>
         <w:t xml:space="preserve">Léxico de certeza — 4, Ap B</w:t>
       </w:r>
     </w:p>
@@ -13604,7 +13657,7 @@
         </w:numPr>
       </w:pPr>
       <w:r>
-        <w:t xml:space="preserve">Marcador y enfermedad (lactato, perfusión, ANDROMEDA-SHOCK) — 1</w:t>
+        <w:t xml:space="preserve">Marcador y enfermedad (lactato, perfusión, ANDROMEDA-SHOCK) — 1, 9</w:t>
       </w:r>
     </w:p>
     <w:p>
@@ -14716,6 +14769,24 @@
         <w:pStyle w:val="BodyJ"/>
       </w:pPr>
       <w:r>
+        <w:t xml:space="preserve">Hernández, G., Bellomo, R., &amp; Bakker, J. (2019). The ten pitfalls of lactate clearance in sepsis. </w:t>
+      </w:r>
+      <w:r>
+        <w:rPr>
+          <w:i/>
+          <w:iCs/>
+        </w:rPr>
+        <w:t xml:space="preserve">Intensive Care Medicine, 45</w:t>
+      </w:r>
+      <w:r>
+        <w:t xml:space="preserve">(1), 82–85.</w:t>
+      </w:r>
+    </w:p>
+    <w:p>
+      <w:pPr>
+        <w:pStyle w:val="BodyJ"/>
+      </w:pPr>
+      <w:r>
         <w:t xml:space="preserve">Hernández, G., Ospina-Tascón, G. A., Damiani, L. P., Estenssoro, E., Dubin, A., Hurtado, J., et al. (2019). Effect of a resuscitation strategy targeting peripheral perfusion status vs serum lactate levels on 28-day mortality among patients with septic shock: The ANDROMEDA-SHOCK randomized clinical trial. </w:t>
       </w:r>
       <w:r>
@@ -14734,6 +14805,24 @@
         <w:pStyle w:val="BodyJ"/>
       </w:pPr>
       <w:r>
+        <w:t xml:space="preserve">Hernández, G., Ospina-Tascón, G. A., Kattan, E., et al., por los investigadores de ANDROMEDA-SHOCK-2. (2025). Personalized hemodynamic resuscitation targeting capillary refill time in early septic shock: The ANDROMEDA-SHOCK-2 randomized clinical trial. </w:t>
+      </w:r>
+      <w:r>
+        <w:rPr>
+          <w:i/>
+          <w:iCs/>
+        </w:rPr>
+        <w:t xml:space="preserve">JAMA, 334</w:t>
+      </w:r>
+      <w:r>
+        <w:t xml:space="preserve">(22), 1988–1999.</w:t>
+      </w:r>
+    </w:p>
+    <w:p>
+      <w:pPr>
+        <w:pStyle w:val="BodyJ"/>
+      </w:pPr>
+      <w:r>
         <w:t xml:space="preserve">Hoffrage, U., &amp; Gigerenzer, G. (1998). Using natural frequencies to improve diagnostic inferences. </w:t>
       </w:r>
       <w:r>
@@ -15753,6 +15842,24 @@
       </w:r>
       <w:r>
         <w:t xml:space="preserve">.</w:t>
+      </w:r>
+    </w:p>
+    <w:p>
+      <w:pPr>
+        <w:pStyle w:val="BodyJ"/>
+      </w:pPr>
+      <w:r>
+        <w:t xml:space="preserve">Zampieri, F. G., Damiani, L. P., Bakker, J., Ospina-Tascón, G. A., Castro, R., Cavalcanti, A. B., &amp; Hernández, G. (2020). Effects of a resuscitation strategy targeting peripheral perfusion status versus serum lactate levels among patients with septic shock: A Bayesian reanalysis of the ANDROMEDA-SHOCK trial. </w:t>
+      </w:r>
+      <w:r>
+        <w:rPr>
+          <w:i/>
+          <w:iCs/>
+        </w:rPr>
+        <w:t xml:space="preserve">American Journal of Respiratory and Critical Care Medicine, 201</w:t>
+      </w:r>
+      <w:r>
+        <w:t xml:space="preserve">(4), 423–429.</w:t>
       </w:r>
     </w:p>
     <w:sectPr>

</xml_diff>

<commit_message>
libro: cap. 14 — la humildad epistémica como motor dinámico
Sección nueva 'La humildad como motor: explorar, aprender, reenfocar'
(Whitcomb et al. 2017, humildad como apropiación de límites): tres efectos
dinámicos — seguir explorando, seguir aprendiendo, reubicar foco y manejo.
El anclaje releído como fracaso de humildad; la reevaluación de HII-D como
humildad vuelta procedimiento. Glosario e índice actualizados.

Co-Authored-By: Claude Fable 5 <noreply@anthropic.com>
Claude-Session: https://claude.ai/code/session_01SPkhDdVzUCxJwqq61ddeLW
</commit_message>
<xml_diff>
--- a/libro/Hechos_inferencias_incertidumbre_edicion_revisada.docx
+++ b/libro/Hechos_inferencias_incertidumbre_edicion_revisada.docx
@@ -667,7 +667,7 @@
         <w:rPr>
           <w:color w:val="8A8A8A"/>
         </w:rPr>
-        <w:t xml:space="preserve">72</w:t>
+        <w:t xml:space="preserve">73</w:t>
       </w:r>
     </w:p>
     <w:p>
@@ -687,7 +687,7 @@
         <w:rPr>
           <w:color w:val="8A8A8A"/>
         </w:rPr>
-        <w:t xml:space="preserve">78</w:t>
+        <w:t xml:space="preserve">79</w:t>
       </w:r>
     </w:p>
     <w:p>
@@ -707,7 +707,7 @@
         <w:rPr>
           <w:color w:val="8A8A8A"/>
         </w:rPr>
-        <w:t xml:space="preserve">85</w:t>
+        <w:t xml:space="preserve">86</w:t>
       </w:r>
     </w:p>
     <w:p>
@@ -727,7 +727,7 @@
         <w:rPr>
           <w:color w:val="8A8A8A"/>
         </w:rPr>
-        <w:t xml:space="preserve">89</w:t>
+        <w:t xml:space="preserve">90</w:t>
       </w:r>
     </w:p>
     <w:p>
@@ -747,7 +747,7 @@
         <w:rPr>
           <w:color w:val="8A8A8A"/>
         </w:rPr>
-        <w:t xml:space="preserve">91</w:t>
+        <w:t xml:space="preserve">92</w:t>
       </w:r>
     </w:p>
     <w:p>
@@ -767,7 +767,7 @@
         <w:rPr>
           <w:color w:val="8A8A8A"/>
         </w:rPr>
-        <w:t xml:space="preserve">93</w:t>
+        <w:t xml:space="preserve">94</w:t>
       </w:r>
     </w:p>
     <w:p>
@@ -787,7 +787,7 @@
         <w:rPr>
           <w:color w:val="8A8A8A"/>
         </w:rPr>
-        <w:t xml:space="preserve">95</w:t>
+        <w:t xml:space="preserve">96</w:t>
       </w:r>
     </w:p>
     <w:p>
@@ -807,7 +807,7 @@
         <w:rPr>
           <w:color w:val="8A8A8A"/>
         </w:rPr>
-        <w:t xml:space="preserve">97</w:t>
+        <w:t xml:space="preserve">98</w:t>
       </w:r>
     </w:p>
     <w:p>
@@ -827,7 +827,7 @@
         <w:rPr>
           <w:color w:val="8A8A8A"/>
         </w:rPr>
-        <w:t xml:space="preserve">100</w:t>
+        <w:t xml:space="preserve">101</w:t>
       </w:r>
     </w:p>
     <w:p>
@@ -847,7 +847,7 @@
         <w:rPr>
           <w:color w:val="8A8A8A"/>
         </w:rPr>
-        <w:t xml:space="preserve">102</w:t>
+        <w:t xml:space="preserve">103</w:t>
       </w:r>
     </w:p>
     <w:p>
@@ -7786,6 +7786,63 @@
       </w:pPr>
       <w:r>
         <w:t xml:space="preserve">La falsa seguridad daña porque cierra la revisión y puede engañar al paciente. La duda indiscriminada también daña: transfiere carga, paraliza decisiones o abandona a la persona bajo una apariencia de neutralidad. La virtud está en calibrar. Decir "no lo sé" es profesional cuando se acompaña de qué sí se sabe, qué se hará, qué riesgo se vigila y cuándo se reevaluará.</w:t>
+      </w:r>
+    </w:p>
+    <w:p>
+      <w:pPr>
+        <w:pStyle w:val="Heading3"/>
+        <w:spacing w:after="120" w:before="280"/>
+      </w:pPr>
+      <w:r>
+        <w:rPr>
+          <w:rFonts w:ascii="Georgia" w:cs="Georgia" w:eastAsia="Georgia" w:hAnsi="Georgia"/>
+          <w:b/>
+          <w:bCs/>
+          <w:color w:val="2B2B2B"/>
+          <w:sz w:val="25"/>
+          <w:szCs w:val="25"/>
+        </w:rPr>
+        <w:t xml:space="preserve">La humildad como motor: explorar, aprender, reenfocar</w:t>
+      </w:r>
+    </w:p>
+    <w:p>
+      <w:pPr>
+        <w:pStyle w:val="BodyJ"/>
+      </w:pPr>
+      <w:r>
+        <w:t xml:space="preserve">Hay una caricatura de la humildad epistémica que conviene desactivar: la del médico tibio, que afirma poco por miedo a equivocarse. Esa figura confunde humildad con timidez. La filosofía contemporánea de las virtudes intelectuales ofrece una definición más útil: ser intelectualmente humilde es atender a las propias limitaciones y apropiárselas — saber dónde termina lo que uno sabe, y dejar que ese saber actúe (Whitcomb et al., 2017). Definida así, la humildad no es un freno. Es un motor: la única disposición que mantiene el caso abierto después de que ya tenemos una respuesta que funciona.</w:t>
+      </w:r>
+    </w:p>
+    <w:p>
+      <w:pPr>
+        <w:pStyle w:val="BodyJ"/>
+      </w:pPr>
+      <w:r>
+        <w:t xml:space="preserve">Sus efectos son tres, y los tres son dinámicos. Primero, permite seguir explorando. Quien es dueño de sus límites sigue preguntando cuando la etiqueta ya está puesta: busca el hallazgo que no encaja, pide el examen que podría desmentirlo, vuelve a la cama del paciente sin necesitar que algo se haya complicado para justificar la visita. La exploración no termina cuando aparece una explicación; termina cuando la explicación ha sobrevivido a sus rivales — y saber la diferencia es humildad operando.</w:t>
+      </w:r>
+    </w:p>
+    <w:p>
+      <w:pPr>
+        <w:pStyle w:val="BodyJ"/>
+      </w:pPr>
+      <w:r>
+        <w:t xml:space="preserve">Segundo, permite seguir aprendiendo. El feedback sólo enseña a quien puede recibirlo sin tratarlo como acusación. El portafolio de calibración, la conferencia de morbimortalidad, la corrección venida de cualquier miembro del equipo —de la enfermera de turno al propio paciente— funcionan únicamente sobre esa base. Un médico que no puede ser corregido no es un médico seguro: es un médico que dejó de aprender, con años de práctica acumulándose sobre los mismos errores.</w:t>
+      </w:r>
+    </w:p>
+    <w:p>
+      <w:pPr>
+        <w:pStyle w:val="BodyJ"/>
+      </w:pPr>
+      <w:r>
+        <w:t xml:space="preserve">Tercero —y es el efecto más clínico de todos—, permite reubicar el foco y el manejo. La dirección de la atención diagnóstica no es un voto de por vida: es una asignación provisional de recursos, revisable cuando la trayectoria contradice el mapa. El humilde redirige sin vivirlo como derrota — de lo urinario a lo abdominal, de la lesión estructural al trastorno funcional, del objetivo curativo al de confort — y ajusta el tratamiento con la misma naturalidad con que lo inició. El orgulloso, en cambio, defiende su primera formulación como se defiende una propiedad, y convierte cada dato discordante en un ataque que repeler. El anclaje del capítulo 7 es, visto así, un fracaso de humildad antes que un fallo de memoria: la información nueva estaba disponible; lo que faltó fue la disposición a dejarla mandar.</w:t>
+      </w:r>
+    </w:p>
+    <w:p>
+      <w:pPr>
+        <w:pStyle w:val="BodyJ"/>
+      </w:pPr>
+      <w:r>
+        <w:t xml:space="preserve">Por eso este libro necesita la humildad no como ornamento ético sino como pieza estructural. La reevaluación del método HII-D (capítulo 15) es humildad convertida en procedimiento: la cláusula "qué me haría cambiar", escrita antes de saber si habrá que cambiar, es la forma que toma esta virtud cuando se la obliga a dejar huella en la ficha.</w:t>
       </w:r>
     </w:p>
     <w:p>
@@ -12971,6 +13028,21 @@
           <w:b/>
           <w:bCs/>
         </w:rPr>
+        <w:t xml:space="preserve">Humildad epistémica.</w:t>
+      </w:r>
+      <w:r>
+        <w:t xml:space="preserve"> Atención y apropiación de las propias limitaciones cognitivas (Whitcomb et al.). No es timidez para afirmar: es la disposición que mantiene el caso abierto — permite seguir explorando, seguir aprendiendo y reubicar el foco y el manejo cuando la trayectoria contradice el mapa.</w:t>
+      </w:r>
+    </w:p>
+    <w:p>
+      <w:pPr>
+        <w:pStyle w:val="BodyJ"/>
+      </w:pPr>
+      <w:r>
+        <w:rPr>
+          <w:b/>
+          <w:bCs/>
+        </w:rPr>
         <w:t xml:space="preserve">Illness script.</w:t>
       </w:r>
       <w:r>
@@ -13585,6 +13657,18 @@
         </w:numPr>
       </w:pPr>
       <w:r>
+        <w:t xml:space="preserve">Humildad epistémica como motor (explorar, aprender, reenfocar) — 14</w:t>
+      </w:r>
+    </w:p>
+    <w:p>
+      <w:pPr>
+        <w:pStyle w:val="BodyJ"/>
+        <w:numPr>
+          <w:ilvl w:val="0"/>
+          <w:numId w:val="6"/>
+        </w:numPr>
+      </w:pPr>
+      <w:r>
         <w:t xml:space="preserve">Illness scripts — 2, 6, 16</w:t>
       </w:r>
     </w:p>
@@ -15788,6 +15872,24 @@
       </w:r>
       <w:r>
         <w:t xml:space="preserve">(12), 652–657.</w:t>
+      </w:r>
+    </w:p>
+    <w:p>
+      <w:pPr>
+        <w:pStyle w:val="BodyJ"/>
+      </w:pPr>
+      <w:r>
+        <w:t xml:space="preserve">Whitcomb, D., Battaly, H., Baehr, J., &amp; Howard-Snyder, D. (2017). Intellectual humility: Owning our limitations. </w:t>
+      </w:r>
+      <w:r>
+        <w:rPr>
+          <w:i/>
+          <w:iCs/>
+        </w:rPr>
+        <w:t xml:space="preserve">Philosophy and Phenomenological Research, 94</w:t>
+      </w:r>
+      <w:r>
+        <w:t xml:space="preserve">(3), 509–539.</w:t>
       </w:r>
     </w:p>
     <w:p>

</xml_diff>

<commit_message>
libro: cap. 2 — la creatividad del diagnóstico (Bohm, Boden, Peirce 1903, Schön)
Sección nueva 'La creatividad del diagnóstico: generar antes de podar':
abducción como operación creativa, creatividad psicológica/exploratoria
(Boden 2004), percepción de orden nuevo vs infraestructura tácita (Bohm
1996; Bohm & Peat 1987), problem setting (Schön) y la tercera opción de
manejo. El cierre prematuro releído como fracaso de imaginación.

Co-Authored-By: Claude Fable 5 <noreply@anthropic.com>
Claude-Session: https://claude.ai/code/session_01SPkhDdVzUCxJwqq61ddeLW
</commit_message>
<xml_diff>
--- a/libro/Hechos_inferencias_incertidumbre_edicion_revisada.docx
+++ b/libro/Hechos_inferencias_incertidumbre_edicion_revisada.docx
@@ -307,7 +307,7 @@
         <w:rPr>
           <w:color w:val="8A8A8A"/>
         </w:rPr>
-        <w:t xml:space="preserve">18</w:t>
+        <w:t xml:space="preserve">19</w:t>
       </w:r>
     </w:p>
     <w:p>
@@ -327,7 +327,7 @@
         <w:rPr>
           <w:color w:val="8A8A8A"/>
         </w:rPr>
-        <w:t xml:space="preserve">22</w:t>
+        <w:t xml:space="preserve">23</w:t>
       </w:r>
     </w:p>
     <w:p>
@@ -347,7 +347,7 @@
         <w:rPr>
           <w:color w:val="8A8A8A"/>
         </w:rPr>
-        <w:t xml:space="preserve">26</w:t>
+        <w:t xml:space="preserve">27</w:t>
       </w:r>
     </w:p>
     <w:p>
@@ -367,7 +367,7 @@
         <w:rPr>
           <w:color w:val="8A8A8A"/>
         </w:rPr>
-        <w:t xml:space="preserve">27</w:t>
+        <w:t xml:space="preserve">28</w:t>
       </w:r>
     </w:p>
     <w:p>
@@ -387,7 +387,7 @@
         <w:rPr>
           <w:color w:val="8A8A8A"/>
         </w:rPr>
-        <w:t xml:space="preserve">28</w:t>
+        <w:t xml:space="preserve">29</w:t>
       </w:r>
     </w:p>
     <w:p>
@@ -407,7 +407,7 @@
         <w:rPr>
           <w:color w:val="8A8A8A"/>
         </w:rPr>
-        <w:t xml:space="preserve">33</w:t>
+        <w:t xml:space="preserve">34</w:t>
       </w:r>
     </w:p>
     <w:p>
@@ -427,7 +427,7 @@
         <w:rPr>
           <w:color w:val="8A8A8A"/>
         </w:rPr>
-        <w:t xml:space="preserve">36</w:t>
+        <w:t xml:space="preserve">37</w:t>
       </w:r>
     </w:p>
     <w:p>
@@ -447,7 +447,7 @@
         <w:rPr>
           <w:color w:val="8A8A8A"/>
         </w:rPr>
-        <w:t xml:space="preserve">39</w:t>
+        <w:t xml:space="preserve">40</w:t>
       </w:r>
     </w:p>
     <w:p>
@@ -467,7 +467,7 @@
         <w:rPr>
           <w:color w:val="8A8A8A"/>
         </w:rPr>
-        <w:t xml:space="preserve">42</w:t>
+        <w:t xml:space="preserve">43</w:t>
       </w:r>
     </w:p>
     <w:p>
@@ -487,7 +487,7 @@
         <w:rPr>
           <w:color w:val="8A8A8A"/>
         </w:rPr>
-        <w:t xml:space="preserve">43</w:t>
+        <w:t xml:space="preserve">44</w:t>
       </w:r>
     </w:p>
     <w:p>
@@ -507,7 +507,7 @@
         <w:rPr>
           <w:color w:val="8A8A8A"/>
         </w:rPr>
-        <w:t xml:space="preserve">44</w:t>
+        <w:t xml:space="preserve">45</w:t>
       </w:r>
     </w:p>
     <w:p>
@@ -527,7 +527,7 @@
         <w:rPr>
           <w:color w:val="8A8A8A"/>
         </w:rPr>
-        <w:t xml:space="preserve">51</w:t>
+        <w:t xml:space="preserve">52</w:t>
       </w:r>
     </w:p>
     <w:p>
@@ -547,7 +547,7 @@
         <w:rPr>
           <w:color w:val="8A8A8A"/>
         </w:rPr>
-        <w:t xml:space="preserve">54</w:t>
+        <w:t xml:space="preserve">55</w:t>
       </w:r>
     </w:p>
     <w:p>
@@ -567,7 +567,7 @@
         <w:rPr>
           <w:color w:val="8A8A8A"/>
         </w:rPr>
-        <w:t xml:space="preserve">58</w:t>
+        <w:t xml:space="preserve">59</w:t>
       </w:r>
     </w:p>
     <w:p>
@@ -587,7 +587,7 @@
         <w:rPr>
           <w:color w:val="8A8A8A"/>
         </w:rPr>
-        <w:t xml:space="preserve">63</w:t>
+        <w:t xml:space="preserve">64</w:t>
       </w:r>
     </w:p>
     <w:p>
@@ -607,7 +607,7 @@
         <w:rPr>
           <w:color w:val="8A8A8A"/>
         </w:rPr>
-        <w:t xml:space="preserve">64</w:t>
+        <w:t xml:space="preserve">65</w:t>
       </w:r>
     </w:p>
     <w:p>
@@ -627,7 +627,7 @@
         <w:rPr>
           <w:color w:val="8A8A8A"/>
         </w:rPr>
-        <w:t xml:space="preserve">65</w:t>
+        <w:t xml:space="preserve">66</w:t>
       </w:r>
     </w:p>
     <w:p>
@@ -647,7 +647,7 @@
         <w:rPr>
           <w:color w:val="8A8A8A"/>
         </w:rPr>
-        <w:t xml:space="preserve">68</w:t>
+        <w:t xml:space="preserve">69</w:t>
       </w:r>
     </w:p>
     <w:p>
@@ -667,7 +667,7 @@
         <w:rPr>
           <w:color w:val="8A8A8A"/>
         </w:rPr>
-        <w:t xml:space="preserve">73</w:t>
+        <w:t xml:space="preserve">74</w:t>
       </w:r>
     </w:p>
     <w:p>
@@ -687,7 +687,7 @@
         <w:rPr>
           <w:color w:val="8A8A8A"/>
         </w:rPr>
-        <w:t xml:space="preserve">79</w:t>
+        <w:t xml:space="preserve">80</w:t>
       </w:r>
     </w:p>
     <w:p>
@@ -707,7 +707,7 @@
         <w:rPr>
           <w:color w:val="8A8A8A"/>
         </w:rPr>
-        <w:t xml:space="preserve">86</w:t>
+        <w:t xml:space="preserve">87</w:t>
       </w:r>
     </w:p>
     <w:p>
@@ -727,7 +727,7 @@
         <w:rPr>
           <w:color w:val="8A8A8A"/>
         </w:rPr>
-        <w:t xml:space="preserve">90</w:t>
+        <w:t xml:space="preserve">91</w:t>
       </w:r>
     </w:p>
     <w:p>
@@ -747,7 +747,7 @@
         <w:rPr>
           <w:color w:val="8A8A8A"/>
         </w:rPr>
-        <w:t xml:space="preserve">92</w:t>
+        <w:t xml:space="preserve">93</w:t>
       </w:r>
     </w:p>
     <w:p>
@@ -767,7 +767,7 @@
         <w:rPr>
           <w:color w:val="8A8A8A"/>
         </w:rPr>
-        <w:t xml:space="preserve">94</w:t>
+        <w:t xml:space="preserve">95</w:t>
       </w:r>
     </w:p>
     <w:p>
@@ -787,7 +787,7 @@
         <w:rPr>
           <w:color w:val="8A8A8A"/>
         </w:rPr>
-        <w:t xml:space="preserve">96</w:t>
+        <w:t xml:space="preserve">97</w:t>
       </w:r>
     </w:p>
     <w:p>
@@ -807,7 +807,7 @@
         <w:rPr>
           <w:color w:val="8A8A8A"/>
         </w:rPr>
-        <w:t xml:space="preserve">98</w:t>
+        <w:t xml:space="preserve">99</w:t>
       </w:r>
     </w:p>
     <w:p>
@@ -827,7 +827,7 @@
         <w:rPr>
           <w:color w:val="8A8A8A"/>
         </w:rPr>
-        <w:t xml:space="preserve">101</w:t>
+        <w:t xml:space="preserve">102</w:t>
       </w:r>
     </w:p>
     <w:p>
@@ -847,7 +847,7 @@
         <w:rPr>
           <w:color w:val="8A8A8A"/>
         </w:rPr>
-        <w:t xml:space="preserve">103</w:t>
+        <w:t xml:space="preserve">104</w:t>
       </w:r>
     </w:p>
     <w:p>
@@ -2098,6 +2098,71 @@
       </w:pPr>
       <w:r>
         <w:t xml:space="preserve">El razonamiento bayesiano formaliza parte de este proceso: la evidencia modifica una probabilidad previa según su capacidad discriminativa. Sin embargo, la clínica cotidiana rara vez dispone de probabilidades precisas. Incluso así, el principio permanece: un hallazgo no tiene significado fijo; cambia la plausibilidad de hipótesis en relación con el contexto. Las frecuencias naturales pueden mejorar la comprensión de este cambio y reducir errores intuitivos con probabilidades condicionales (Hoffrage &amp; Gigerenzer, 1998; Gigerenzer et al., 2007).</w:t>
+      </w:r>
+    </w:p>
+    <w:p>
+      <w:pPr>
+        <w:pStyle w:val="Heading3"/>
+        <w:spacing w:after="120" w:before="280"/>
+      </w:pPr>
+      <w:r>
+        <w:rPr>
+          <w:rFonts w:ascii="Georgia" w:cs="Georgia" w:eastAsia="Georgia" w:hAnsi="Georgia"/>
+          <w:b/>
+          <w:bCs/>
+          <w:color w:val="2B2B2B"/>
+          <w:sz w:val="25"/>
+          <w:szCs w:val="25"/>
+        </w:rPr>
+        <w:t xml:space="preserve">La creatividad del diagnóstico: generar antes de podar</w:t>
+      </w:r>
+    </w:p>
+    <w:p>
+      <w:pPr>
+        <w:pStyle w:val="BodyJ"/>
+      </w:pPr>
+      <w:r>
+        <w:t xml:space="preserve">Hay una palabra que la epistemología clínica suele evitar, como si amenazara su seriedad: creatividad. Conviene devolverla al centro. Peirce, al bautizar la abducción en sus lecciones de 1903, la describió como la única operación lógica que introduce ideas nuevas: la deducción prueba lo que ya estaba contenido en las premisas y la inducción generaliza lo ya observado, pero la hipótesis que organiza un caso no se extrae de los datos — se conjetura hacia ellos. Todo diagnóstico contiene, en ese sentido estricto, un momento creativo. La pregunta no es si el clínico crea; es qué tan bien lo hace.</w:t>
+      </w:r>
+    </w:p>
+    <w:p>
+      <w:pPr>
+        <w:pStyle w:val="BodyJ"/>
+      </w:pPr>
+      <w:r>
+        <w:t xml:space="preserve">La investigación sobre creatividad permite precisar qué significa "bien" aquí. Boden distinguió la creatividad histórica —ideas nuevas para la humanidad— de la creatividad psicológica —ideas nuevas para quien las tiene—, y separó tres formas: combinatoria (asociar lo que no solía asociarse), exploratoria (recorrer a fondo un espacio conceptual existente) y transformacional (cambiar las reglas del espacio mismo) (Boden, 2004). La creatividad diagnóstica es casi siempre psicológica y exploratoria: no exige inventar enfermedades; exige recorrer el espacio de hipótesis más allá del primer patrón que se encendió — considerar la colecistitis cuando la etiqueta heredada dice "ITU", el aneurisma cuando el patrón grita cólico renal. Visto así, el cierre prematuro no es sólo un fallo de verificación: es un fracaso de imaginación. Nadie puede descartar la hipótesis que nunca generó.</w:t>
+      </w:r>
+    </w:p>
+    <w:p>
+      <w:pPr>
+        <w:pStyle w:val="BodyJ"/>
+      </w:pPr>
+      <w:r>
+        <w:t xml:space="preserve">Bohm, físico y filósofo, agregó el diagnóstico del bloqueo: la creatividad es ante todo percepción de un orden nuevo en lo que ya está a la vista, y su obstáculo habitual no es la falta de inteligencia sino el apego a la infraestructura tácita de ideas con la que trabajamos sin verla (Bohm, 1996; Bohm &amp; Peat, 1987). Es exactamente el peligro de la fluidez que examinará el capítulo 6: el patrón conocido no sólo responde rápido — también impide percibir. Por eso varias herramientas de este libro que parecen puramente disciplinarias son, además, técnicas de creatividad: reformular el caso sin usar la etiqueta (capítulo 8) es un procedimiento para forzar la percepción de otro orden posible en los mismos hechos.</w:t>
+      </w:r>
+    </w:p>
+    <w:p>
+      <w:pPr>
+        <w:pStyle w:val="BodyJ"/>
+      </w:pPr>
+      <w:r>
+        <w:t xml:space="preserve">Schön mostró, por último, dónde vive la creatividad profesional más frecuente: no en resolver el problema dado, sino en plantearlo de nuevo — el problem setting precede al problem solving (Schön, 1983). "¿Qué antibiótico damos?" y "¿hay una infección que tratar?" son dos problemas distintos armados con los mismos datos, y elegir cuál se resuelve es el acto creativo que decide todo lo demás. Lo mismo vale para el manejo: cuando las dos conductas sobre la mesa son malas, la salida rara vez es elegir mejor entre ellas — es crear una tercera opción: la prueba terapéutica acotada en el tiempo, el puente reversible que compra información, la redefinición de la meta. Solucionar no siempre es responder; a veces es rehacer la pregunta.</w:t>
+      </w:r>
+    </w:p>
+    <w:p>
+      <w:pPr>
+        <w:pStyle w:val="Quote1"/>
+      </w:pPr>
+      <w:r>
+        <w:t xml:space="preserve">La creatividad clínica vive en la generación —de hipótesis, de reformulaciones, de opciones—; la disciplina vive en la selección. Sin la segunda, la ocurrencia se vuelve tratamiento; sin la primera, el diferencial nace muerto.</w:t>
+      </w:r>
+    </w:p>
+    <w:p>
+      <w:pPr>
+        <w:pStyle w:val="BodyJ"/>
+      </w:pPr>
+      <w:r>
+        <w:t xml:space="preserve">Por eso a la generación le sigue, de inmediato, la prueba de resistencia: generar con libertad y podar con severidad no son virtudes rivales, sino las dos mitades del mismo juicio.</w:t>
       </w:r>
     </w:p>
     <w:p>
@@ -12908,6 +12973,21 @@
           <w:b/>
           <w:bCs/>
         </w:rPr>
+        <w:t xml:space="preserve">Creatividad clínica.</w:t>
+      </w:r>
+      <w:r>
+        <w:t xml:space="preserve"> Momento generativo del juicio: conjeturar hipótesis (abducción), re-plantear el problema y crear opciones de manejo. Casi siempre es creatividad psicológica y exploratoria (Boden): nueva para el caso, no para la humanidad. Se ejerce en la generación y se corrige en la selección.</w:t>
+      </w:r>
+    </w:p>
+    <w:p>
+      <w:pPr>
+        <w:pStyle w:val="BodyJ"/>
+      </w:pPr>
+      <w:r>
+        <w:rPr>
+          <w:b/>
+          <w:bCs/>
+        </w:rPr>
         <w:t xml:space="preserve">Decisión compartida.</w:t>
       </w:r>
       <w:r>
@@ -13453,6 +13533,18 @@
         </w:numPr>
       </w:pPr>
       <w:r>
+        <w:t xml:space="preserve">Creatividad en el juicio clínico (abducción, problem setting, tercera opción) — 2</w:t>
+      </w:r>
+    </w:p>
+    <w:p>
+      <w:pPr>
+        <w:pStyle w:val="BodyJ"/>
+        <w:numPr>
+          <w:ilvl w:val="0"/>
+          <w:numId w:val="6"/>
+        </w:numPr>
+      </w:pPr>
+      <w:r>
         <w:t xml:space="preserve">Debate sobre la enseñanza del razonamiento (Croskerry vs. Norman/Monteiro) — 16</w:t>
       </w:r>
     </w:p>
@@ -14072,6 +14164,60 @@
       </w:r>
       <w:r>
         <w:t xml:space="preserve">(5 Suppl), S2–S23.</w:t>
+      </w:r>
+    </w:p>
+    <w:p>
+      <w:pPr>
+        <w:pStyle w:val="BodyJ"/>
+      </w:pPr>
+      <w:r>
+        <w:t xml:space="preserve">Boden, M. A. (2004). </w:t>
+      </w:r>
+      <w:r>
+        <w:rPr>
+          <w:i/>
+          <w:iCs/>
+        </w:rPr>
+        <w:t xml:space="preserve">The Creative Mind: Myths and Mechanisms</w:t>
+      </w:r>
+      <w:r>
+        <w:t xml:space="preserve"> (2.ª ed.). Routledge.</w:t>
+      </w:r>
+    </w:p>
+    <w:p>
+      <w:pPr>
+        <w:pStyle w:val="BodyJ"/>
+      </w:pPr>
+      <w:r>
+        <w:t xml:space="preserve">Bohm, D. (1996). </w:t>
+      </w:r>
+      <w:r>
+        <w:rPr>
+          <w:i/>
+          <w:iCs/>
+        </w:rPr>
+        <w:t xml:space="preserve">On Creativity</w:t>
+      </w:r>
+      <w:r>
+        <w:t xml:space="preserve"> (L. Nichol, Ed.). Routledge.</w:t>
+      </w:r>
+    </w:p>
+    <w:p>
+      <w:pPr>
+        <w:pStyle w:val="BodyJ"/>
+      </w:pPr>
+      <w:r>
+        <w:t xml:space="preserve">Bohm, D., &amp; Peat, F. D. (1987). </w:t>
+      </w:r>
+      <w:r>
+        <w:rPr>
+          <w:i/>
+          <w:iCs/>
+        </w:rPr>
+        <w:t xml:space="preserve">Science, Order, and Creativity</w:t>
+      </w:r>
+      <w:r>
+        <w:t xml:space="preserve">. Bantam Books.</w:t>
       </w:r>
     </w:p>
     <w:p>

</xml_diff>

<commit_message>
libro: tramo 1 — pase de integración, miedo/segunda víctima, viñetas 9-10, fig saga
Cap. 9 dividido en evidencia (9) y decisión (10): 17 capítulos, referencias
cruzadas, talleres e índice renumerados y verificados. Sección 'El miedo
también escribe' (documentación defensiva, segunda víctima; Wu 2000).
Viñetas pediátrica (Van den Bruel 2012) y de salud mental (Thornicroft
2011). Figura de la saga ANDROMEDA y Taller 2B de creatividad.

Co-Authored-By: Claude Fable 5 <noreply@anthropic.com>
Claude-Session: https://claude.ai/code/session_01SPkhDdVzUCxJwqq61ddeLW
</commit_message>
<xml_diff>
--- a/libro/Hechos_inferencias_incertidumbre_edicion_revisada.docx
+++ b/libro/Hechos_inferencias_incertidumbre_edicion_revisada.docx
@@ -498,7 +498,7 @@
         </w:tabs>
       </w:pPr>
       <w:r>
-        <w:t xml:space="preserve">Capítulo 9. De la evidencia a la decisión: poblaciones, umbrales y consecuencias</w:t>
+        <w:t xml:space="preserve">Capítulo 9. La evidencia y el caso singular</w:t>
       </w:r>
       <w:r>
         <w:tab/>
@@ -518,7 +518,7 @@
         </w:tabs>
       </w:pPr>
       <w:r>
-        <w:t xml:space="preserve">Capítulo 10. Temporalidad, trayectoria y razonamiento contrafactual</w:t>
+        <w:t xml:space="preserve">Capítulo 10. Decidir sin certeza: umbrales, valores y lectura de la evidencia</w:t>
       </w:r>
       <w:r>
         <w:tab/>
@@ -527,7 +527,7 @@
         <w:rPr>
           <w:color w:val="8A8A8A"/>
         </w:rPr>
-        <w:t xml:space="preserve">52</w:t>
+        <w:t xml:space="preserve">48</w:t>
       </w:r>
     </w:p>
     <w:p>
@@ -538,7 +538,7 @@
         </w:tabs>
       </w:pPr>
       <w:r>
-        <w:t xml:space="preserve">Capítulo 11. La ficha clínica como instrumento de pensamiento</w:t>
+        <w:t xml:space="preserve">Capítulo 11. Temporalidad, trayectoria y razonamiento contrafactual</w:t>
       </w:r>
       <w:r>
         <w:tab/>
@@ -547,7 +547,7 @@
         <w:rPr>
           <w:color w:val="8A8A8A"/>
         </w:rPr>
-        <w:t xml:space="preserve">55</w:t>
+        <w:t xml:space="preserve">53</w:t>
       </w:r>
     </w:p>
     <w:p>
@@ -558,7 +558,7 @@
         </w:tabs>
       </w:pPr>
       <w:r>
-        <w:t xml:space="preserve">Capítulo 12. Pensar con otros: equipos, desacuerdo y comunicación de la incertidumbre</w:t>
+        <w:t xml:space="preserve">Capítulo 12. La ficha clínica como instrumento de pensamiento</w:t>
       </w:r>
       <w:r>
         <w:tab/>
@@ -567,7 +567,7 @@
         <w:rPr>
           <w:color w:val="8A8A8A"/>
         </w:rPr>
-        <w:t xml:space="preserve">59</w:t>
+        <w:t xml:space="preserve">56</w:t>
       </w:r>
     </w:p>
     <w:p>
@@ -578,6 +578,26 @@
         </w:tabs>
       </w:pPr>
       <w:r>
+        <w:t xml:space="preserve">Capítulo 13. Pensar con otros: equipos, desacuerdo y comunicación de la incertidumbre</w:t>
+      </w:r>
+      <w:r>
+        <w:tab/>
+      </w:r>
+      <w:r>
+        <w:rPr>
+          <w:color w:val="8A8A8A"/>
+        </w:rPr>
+        <w:t xml:space="preserve">60</w:t>
+      </w:r>
+    </w:p>
+    <w:p>
+      <w:pPr>
+        <w:pStyle w:val="TocEntry"/>
+        <w:tabs>
+          <w:tab w:val="right" w:pos="9026" w:leader="dot"/>
+        </w:tabs>
+      </w:pPr>
+      <w:r>
         <w:t xml:space="preserve">Interludio III. La decisión de Carmen</w:t>
       </w:r>
       <w:r>
@@ -587,7 +607,7 @@
         <w:rPr>
           <w:color w:val="8A8A8A"/>
         </w:rPr>
-        <w:t xml:space="preserve">64</w:t>
+        <w:t xml:space="preserve">65</w:t>
       </w:r>
     </w:p>
     <w:p>
@@ -607,7 +627,7 @@
         <w:rPr>
           <w:color w:val="8A8A8A"/>
         </w:rPr>
-        <w:t xml:space="preserve">65</w:t>
+        <w:t xml:space="preserve">66</w:t>
       </w:r>
     </w:p>
     <w:p>
@@ -618,7 +638,7 @@
         </w:tabs>
       </w:pPr>
       <w:r>
-        <w:t xml:space="preserve">Capítulo 13. Inteligencia artificial como espejo del razonamiento</w:t>
+        <w:t xml:space="preserve">Capítulo 14. Inteligencia artificial como espejo del razonamiento</w:t>
       </w:r>
       <w:r>
         <w:tab/>
@@ -627,7 +647,7 @@
         <w:rPr>
           <w:color w:val="8A8A8A"/>
         </w:rPr>
-        <w:t xml:space="preserve">66</w:t>
+        <w:t xml:space="preserve">67</w:t>
       </w:r>
     </w:p>
     <w:p>
@@ -638,7 +658,7 @@
         </w:tabs>
       </w:pPr>
       <w:r>
-        <w:t xml:space="preserve">Capítulo 14. Humildad epistémica y responsabilidad clínica</w:t>
+        <w:t xml:space="preserve">Capítulo 15. Humildad epistémica y responsabilidad clínica</w:t>
       </w:r>
       <w:r>
         <w:tab/>
@@ -647,7 +667,7 @@
         <w:rPr>
           <w:color w:val="8A8A8A"/>
         </w:rPr>
-        <w:t xml:space="preserve">69</w:t>
+        <w:t xml:space="preserve">70</w:t>
       </w:r>
     </w:p>
     <w:p>
@@ -658,7 +678,7 @@
         </w:tabs>
       </w:pPr>
       <w:r>
-        <w:t xml:space="preserve">Capítulo 15. El método HII-D: una epistemología operativa</w:t>
+        <w:t xml:space="preserve">Capítulo 16. El método HII-D: una epistemología operativa</w:t>
       </w:r>
       <w:r>
         <w:tab/>
@@ -667,7 +687,7 @@
         <w:rPr>
           <w:color w:val="8A8A8A"/>
         </w:rPr>
-        <w:t xml:space="preserve">74</w:t>
+        <w:t xml:space="preserve">75</w:t>
       </w:r>
     </w:p>
     <w:p>
@@ -678,7 +698,7 @@
         </w:tabs>
       </w:pPr>
       <w:r>
-        <w:t xml:space="preserve">Cuaderno de casos. Ocho viñetas para una lectura metacognitiva</w:t>
+        <w:t xml:space="preserve">Cuaderno de casos. Diez viñetas para una lectura metacognitiva</w:t>
       </w:r>
       <w:r>
         <w:tab/>
@@ -687,7 +707,7 @@
         <w:rPr>
           <w:color w:val="8A8A8A"/>
         </w:rPr>
-        <w:t xml:space="preserve">80</w:t>
+        <w:t xml:space="preserve">81</w:t>
       </w:r>
     </w:p>
     <w:p>
@@ -698,7 +718,7 @@
         </w:tabs>
       </w:pPr>
       <w:r>
-        <w:t xml:space="preserve">Capítulo 16. Enseñar y organizar la metacognición clínica</w:t>
+        <w:t xml:space="preserve">Capítulo 17. Enseñar y organizar la metacognición clínica</w:t>
       </w:r>
       <w:r>
         <w:tab/>
@@ -707,7 +727,7 @@
         <w:rPr>
           <w:color w:val="8A8A8A"/>
         </w:rPr>
-        <w:t xml:space="preserve">87</w:t>
+        <w:t xml:space="preserve">89</w:t>
       </w:r>
     </w:p>
     <w:p>
@@ -727,7 +747,7 @@
         <w:rPr>
           <w:color w:val="8A8A8A"/>
         </w:rPr>
-        <w:t xml:space="preserve">91</w:t>
+        <w:t xml:space="preserve">93</w:t>
       </w:r>
     </w:p>
     <w:p>
@@ -747,7 +767,7 @@
         <w:rPr>
           <w:color w:val="8A8A8A"/>
         </w:rPr>
-        <w:t xml:space="preserve">93</w:t>
+        <w:t xml:space="preserve">95</w:t>
       </w:r>
     </w:p>
     <w:p>
@@ -767,7 +787,7 @@
         <w:rPr>
           <w:color w:val="8A8A8A"/>
         </w:rPr>
-        <w:t xml:space="preserve">95</w:t>
+        <w:t xml:space="preserve">97</w:t>
       </w:r>
     </w:p>
     <w:p>
@@ -787,7 +807,7 @@
         <w:rPr>
           <w:color w:val="8A8A8A"/>
         </w:rPr>
-        <w:t xml:space="preserve">97</w:t>
+        <w:t xml:space="preserve">99</w:t>
       </w:r>
     </w:p>
     <w:p>
@@ -807,7 +827,7 @@
         <w:rPr>
           <w:color w:val="8A8A8A"/>
         </w:rPr>
-        <w:t xml:space="preserve">99</w:t>
+        <w:t xml:space="preserve">101</w:t>
       </w:r>
     </w:p>
     <w:p>
@@ -827,7 +847,7 @@
         <w:rPr>
           <w:color w:val="8A8A8A"/>
         </w:rPr>
-        <w:t xml:space="preserve">102</w:t>
+        <w:t xml:space="preserve">104</w:t>
       </w:r>
     </w:p>
     <w:p>
@@ -847,7 +867,7 @@
         <w:rPr>
           <w:color w:val="8A8A8A"/>
         </w:rPr>
-        <w:t xml:space="preserve">104</w:t>
+        <w:t xml:space="preserve">107</w:t>
       </w:r>
     </w:p>
     <w:p>
@@ -1019,7 +1039,7 @@
         <w:t xml:space="preserve">Parte III</w:t>
       </w:r>
       <w:r>
-        <w:t xml:space="preserve"> amplía el foco hacia la decisión en el tiempo y con otros: evidencia poblacional y umbrales, trayectoria, ficha clínica, equipos y comunicación de incertidumbre. La </w:t>
+        <w:t xml:space="preserve"> amplía el foco hacia la decisión en el tiempo y con otros: la evidencia poblacional y su traducción al caso singular, los umbrales donde los valores entran al cálculo, la trayectoria temporal, la ficha clínica, y los equipos y la comunicación de la incertidumbre. La </w:t>
       </w:r>
       <w:r>
         <w:rPr>
@@ -1029,7 +1049,7 @@
         <w:t xml:space="preserve">Parte IV</w:t>
       </w:r>
       <w:r>
-        <w:t xml:space="preserve"> propone una epistemología operativa: inteligencia artificial, responsabilidad, el método HII-D, un cuaderno de ocho casos y la enseñanza de la metacognición clínica.</w:t>
+        <w:t xml:space="preserve"> propone una epistemología operativa: inteligencia artificial, responsabilidad —incluido el miedo que también escribe—, el método HII-D, un cuaderno de diez casos y la enseñanza de la metacognición clínica.</w:t>
       </w:r>
     </w:p>
     <w:p>
@@ -2167,6 +2187,37 @@
     </w:p>
     <w:p>
       <w:pPr>
+        <w:pStyle w:val="TallerHead"/>
+      </w:pPr>
+      <w:r>
+        <w:t xml:space="preserve">Taller 2B. Cinco hipótesis en tres minutos</w:t>
+      </w:r>
+    </w:p>
+    <w:p>
+      <w:pPr>
+        <w:pStyle w:val="BodyJ"/>
+      </w:pPr>
+      <w:r>
+        <w:t xml:space="preserve">Un paciente con EPOC conocido consulta por disnea que no ha respondido a dos rondas de broncodilatadores en urgencias. La saturación es 89%, la auscultación muestra escasas sibilancias. Tome tres minutos y un papel: (a) genere al menos cinco hipótesis sin censurar ninguna, (b) escriba una reformulación del problema que no use la palabra "EPOC", (c) recién entonces pode con las cuatro preguntas de la prueba de resistencia.</w:t>
+      </w:r>
+    </w:p>
+    <w:p>
+      <w:pPr>
+        <w:pStyle w:val="BodyJ"/>
+      </w:pPr>
+      <w:r>
+        <w:rPr>
+          <w:i/>
+          <w:iCs/>
+        </w:rPr>
+        <w:t xml:space="preserve">Solución comentada.</w:t>
+      </w:r>
+      <w:r>
+        <w:t xml:space="preserve"> Una lista generativa razonable: tromboembolismo pulmonar (el EPOC es factor de riesgo, y las sibilancias escasas no explican la hipoxemia), neumotórax sobre bulas, insuficiencia cardiaca izquierda, neumonía en evolución, anemia, arritmia, derrame pleural, crisis de pánico superpuesta. La reformulación clave suele ser: "disnea desproporcionada a la obstrucción auscultada" — un problema distinto de "EPOC descompensado que no responde", porque abre el espacio donde viven el TEP y el neumotórax en vez de invitar a subir la dosis de lo mismo. Nótese el orden deliberado: primero volumen sin censura —la censura temprana es el mecanismo íntimo del cierre prematuro—, después poda severa. Tres minutos de generación cuestan menos que un día de anclaje.</w:t>
+      </w:r>
+    </w:p>
+    <w:p>
+      <w:pPr>
         <w:pStyle w:val="Heading3"/>
         <w:spacing w:after="120" w:before="280"/>
       </w:pPr>
@@ -5161,7 +5212,7 @@
         <w:pStyle w:val="PartIntro"/>
       </w:pPr>
       <w:r>
-        <w:t xml:space="preserve">Las dos primeras partes examinaron el conocimiento y la mente que lo maneja. Esta parte los pone en movimiento: la evidencia poblacional que debe traducirse a una persona y convertirse en decisión por umbrales (capítulo 9), el tiempo que transforma el significado de los hechos (capítulo 10), la ficha que piensa o que fosiliza (capítulo 11) y el equipo donde el conocimiento circula, se degrada o se corrige, incluida la conversación con el paciente (capítulo 12). El interludio final encuentra a Carmen frente a una decisión de verdad.</w:t>
+        <w:t xml:space="preserve">Las dos primeras partes examinaron el conocimiento y la mente que lo maneja. Esta parte los pone en movimiento: la evidencia poblacional que debe traducirse a una persona (capítulo 9), la decisión por umbrales donde los valores entran al cálculo y los ensayos se leen con su marco a la vista (capítulo 10), el tiempo que transforma el significado de los hechos (capítulo 11), la ficha que piensa o que fosiliza (capítulo 12) y el equipo donde el conocimiento circula, se degrada o se corrige, incluida la conversación con el paciente (capítulo 13). El interludio final encuentra a Carmen frente a una decisión de verdad.</w:t>
       </w:r>
     </w:p>
     <w:p>
@@ -5191,15 +5242,15 @@
           <w:szCs w:val="32"/>
         </w:rPr>
         <w:br/>
-        <w:t xml:space="preserve">De la evidencia a la decisión: poblaciones, umbrales y consecuencias</w:t>
-      </w:r>
-    </w:p>
-    <w:p>
-      <w:pPr>
-        <w:pStyle w:val="BodyJ"/>
-      </w:pPr>
-      <w:r>
-        <w:t xml:space="preserve">El ensayo clínico dice: "la reparación electiva de hernia incisional reduce la recurrencia obstructiva en pacientes comparables". La paciente de la cama 12 tiene 61 años, una recuperación reciente de un shock séptico, un EPOC moderado y una pregunta simple: "¿Y si no me opero?". Entre el ensayo y la respuesta hay una cadena de inferencias que este capítulo intenta hacer visible.</w:t>
+        <w:t xml:space="preserve">La evidencia y el caso singular</w:t>
+      </w:r>
+    </w:p>
+    <w:p>
+      <w:pPr>
+        <w:pStyle w:val="BodyJ"/>
+      </w:pPr>
+      <w:r>
+        <w:t xml:space="preserve">El ensayo clínico dice: "la reparación electiva de hernia incisional reduce la recurrencia obstructiva en pacientes comparables". La paciente de la cama 7 tiene 61 años, una recuperación reciente de un shock séptico, un EPOC moderado y una pregunta simple: "¿Y si no me opero?". Entre el ensayo y la respuesta hay una cadena de inferencias que este capítulo intenta hacer visible.</w:t>
       </w:r>
     </w:p>
     <w:p>
@@ -5315,6 +5366,157 @@
       </w:pPr>
       <w:r>
         <w:t xml:space="preserve">La medicina clínica utiliza además evidencia que no siempre ocupa la parte superior de una pirámide: evolución temporal, respuesta previa, patrones fisiopatológicos, datos locales, factibilidad y experiencia técnica. Su menor jerarquía para estimar causalidad poblacional no la vuelve irrelevante para una decisión individual. La pregunta correcta es qué función epistémica cumple cada fuente y qué error puede corregir o introducir.</w:t>
+      </w:r>
+    </w:p>
+    <w:p>
+      <w:pPr>
+        <w:pStyle w:val="Heading3"/>
+        <w:spacing w:after="120" w:before="280"/>
+      </w:pPr>
+      <w:r>
+        <w:rPr>
+          <w:rFonts w:ascii="Georgia" w:cs="Georgia" w:eastAsia="Georgia" w:hAnsi="Georgia"/>
+          <w:b/>
+          <w:bCs/>
+          <w:color w:val="2B2B2B"/>
+          <w:sz w:val="25"/>
+          <w:szCs w:val="25"/>
+        </w:rPr>
+        <w:t xml:space="preserve">Evidencia local y aprendizaje del caso</w:t>
+      </w:r>
+    </w:p>
+    <w:p>
+      <w:pPr>
+        <w:pStyle w:val="BodyJ"/>
+      </w:pPr>
+      <w:r>
+        <w:t xml:space="preserve">La evidencia externa convive con conocimiento local: epidemiología, disponibilidad diagnóstica, tiempos de traslado, perfiles de resistencia, experiencia técnica y capacidad de seguimiento. Estos datos pueden modificar la decisión sin contradecir un estudio. Su legitimidad depende de que sean explícitos y actualizables, no simples tradiciones institucionales.</w:t>
+      </w:r>
+    </w:p>
+    <w:p>
+      <w:pPr>
+        <w:pStyle w:val="BodyJ"/>
+      </w:pPr>
+      <w:r>
+        <w:t xml:space="preserve">El paciente también genera evidencia longitudinal sobre sí mismo. Respuestas previas, recurrencias, efectos adversos y preferencias estables constituyen información relevante, aunque no equivalgan a un ensayo N-of-1 formal. El desafío es evitar atribuciones causales fáciles: la mejoría posterior a una intervención no demuestra que haya sido causada por ella, especialmente cuando coexisten historia natural y tratamientos simultáneos.</w:t>
+      </w:r>
+    </w:p>
+    <w:p>
+      <w:pPr>
+        <w:pStyle w:val="BodyJ"/>
+      </w:pPr>
+      <w:r>
+        <w:t xml:space="preserve">Una deliberación bien formulada puede declarar: qué proviene de estudios; qué se extrapola; qué aporta la historia individual; qué depende del contexto local; y qué permanece desconocido. Esa estratificación protege tanto contra la obediencia automática a la evidencia como contra su rechazo anecdótico. La competencia metacognitiva consiste en reconocer cuándo se está citando un resultado, cuándo se está extrapolando, cuándo se está suponiendo un mecanismo y cuándo una preferencia está inclinando la balanza. La pregunta final no es "¿existe evidencia?", sino "¿qué evidencia existe, para qué afirmación, con qué transportabilidad y con qué consecuencias para esta persona?".</w:t>
+      </w:r>
+    </w:p>
+    <w:p>
+      <w:pPr>
+        <w:pStyle w:val="Quote1"/>
+      </w:pPr>
+      <w:r>
+        <w:t xml:space="preserve">La evidencia no desciende intacta desde la población hacia el individuo: debe ser traducida, y esa traducción es una inferencia clínica sometida a incertidumbre.</w:t>
+      </w:r>
+    </w:p>
+    <w:p>
+      <w:pPr>
+        <w:pStyle w:val="EnUnaFrase"/>
+      </w:pPr>
+      <w:r>
+        <w:rPr>
+          <w:b/>
+          <w:bCs/>
+        </w:rPr>
+        <w:t xml:space="preserve">En una frase.</w:t>
+      </w:r>
+      <w:r>
+        <w:t xml:space="preserve"> Un resultado de investigación es un hecho sobre una población; su aplicabilidad a esta persona es una inferencia que debe hacerse explícita — traducir no es obedecer al estudio ni improvisar contra él.</w:t>
+      </w:r>
+    </w:p>
+    <w:p>
+      <w:pPr>
+        <w:pStyle w:val="BodyJ"/>
+        <w:spacing w:after="80" w:before="160"/>
+      </w:pPr>
+      <w:r>
+        <w:rPr>
+          <w:b/>
+          <w:bCs/>
+        </w:rPr>
+        <w:t xml:space="preserve">Tres preguntas para la próxima visita.</w:t>
+      </w:r>
+    </w:p>
+    <w:p>
+      <w:pPr>
+        <w:pStyle w:val="BodyJ"/>
+        <w:numPr>
+          <w:ilvl w:val="0"/>
+          <w:numId w:val="15"/>
+        </w:numPr>
+      </w:pPr>
+      <w:r>
+        <w:t xml:space="preserve">Para mi indicación más importante de hoy: ¿qué demostró exactamente el estudio que la respalda, y en qué se parece mi paciente a esa población?</w:t>
+      </w:r>
+    </w:p>
+    <w:p>
+      <w:pPr>
+        <w:pStyle w:val="BodyJ"/>
+        <w:numPr>
+          <w:ilvl w:val="0"/>
+          <w:numId w:val="15"/>
+        </w:numPr>
+      </w:pPr>
+      <w:r>
+        <w:t xml:space="preserve">¿Qué rasgo concreto de este caso modifica la inferencia poblacional — y puedo nombrarlo, o sólo lo intuyo?</w:t>
+      </w:r>
+    </w:p>
+    <w:p>
+      <w:pPr>
+        <w:pStyle w:val="BodyJ"/>
+        <w:numPr>
+          <w:ilvl w:val="0"/>
+          <w:numId w:val="15"/>
+        </w:numPr>
+      </w:pPr>
+      <w:r>
+        <w:t xml:space="preserve">¿Qué conocimiento local (resistencias, tiempos, capacidad de seguimiento) está modificando mi decisión sin estar declarado en ninguna parte?</w:t>
+      </w:r>
+    </w:p>
+    <w:p>
+      <w:pPr>
+        <w:pStyle w:val="Heading2"/>
+        <w:pageBreakBefore/>
+        <w:spacing w:after="300" w:before="600"/>
+      </w:pPr>
+      <w:r>
+        <w:rPr>
+          <w:rFonts w:ascii="Georgia" w:cs="Georgia" w:eastAsia="Georgia" w:hAnsi="Georgia"/>
+          <w:b/>
+          <w:bCs/>
+          <w:color w:val="8C2F2F"/>
+          <w:sz w:val="22"/>
+          <w:szCs w:val="22"/>
+        </w:rPr>
+        <w:t xml:space="preserve">Capítulo 10</w:t>
+      </w:r>
+      <w:r>
+        <w:rPr>
+          <w:rFonts w:ascii="Georgia" w:cs="Georgia" w:eastAsia="Georgia" w:hAnsi="Georgia"/>
+          <w:b/>
+          <w:bCs/>
+          <w:color w:val="3D5A6C"/>
+          <w:sz w:val="32"/>
+          <w:szCs w:val="32"/>
+        </w:rPr>
+        <w:br/>
+        <w:t xml:space="preserve">Decidir sin certeza: umbrales, valores y lectura de la evidencia</w:t>
+      </w:r>
+    </w:p>
+    <w:p>
+      <w:pPr>
+        <w:pStyle w:val="BodyJ"/>
+      </w:pPr>
+      <w:r>
+        <w:t xml:space="preserve">Supongamos resuelto lo anterior: la evidencia está traducida, la probabilidad estimada, el caso representado. Queda la pregunta que ninguna estimación responde sola: ¿y ahora qué hacemos? Este capítulo trata del tramo final — donde la probabilidad se encuentra con las consecuencias, los valores entran al cálculo sin pedir permiso, y hasta la lectura de un ensayo resulta ser una decisión.</w:t>
       </w:r>
     </w:p>
     <w:p>
@@ -5547,7 +5749,7 @@
         <w:pStyle w:val="BodyJ"/>
       </w:pPr>
       <w:r>
-        <w:t xml:space="preserve">Pocas historias recientes muestran mejor cómo se lee —y se relee— la evidencia. En 2019, un ensayo multicéntrico conducido desde una red latinoamericana de investigación en medicina intensiva comparó dos blancos para reanimar el shock séptico: normalizar el lactato o normalizar el relleno capilar. El grupo guiado por la perfusión periférica tuvo una mortalidad absoluta 8,5 puntos menor; el valor p fue 0,06 y el ensayo quedó declarado "negativo" según la convención (Hernández et al., 2019). ¿Qué debía hacer un clínico con ese resultado? El umbral de significación que lo declaró negativo no es una ley de la naturaleza: es una convención comunitaria sobre riesgo inductivo —cuánta evidencia exigimos antes de aceptar un efecto—, exactamente lo que Rudner y Douglas describieron. Un reanálisis bayesiano lo hizo explícito: bajo cualquier prior razonable, la probabilidad de que la estrategia guiada por perfusión fuera superior excedía el 90% (Zampieri et al., 2020). El mismo dato, dos marcos de lectura, dos frases distintas para la ficha.</w:t>
+        <w:t xml:space="preserve">Pocas historias recientes muestran mejor cómo se lee —y se relee— la evidencia. En 2019, un ensayo multicéntrico conducido desde una red latinoamericana de investigación en medicina intensiva comparó dos blancos para reanimar el shock séptico: normalizar el lactato o normalizar el relleno capilar. El grupo guiado por la perfusión periférica tuvo una mortalidad absoluta 8,5 puntos menor; el valor p fue 0,06 y el ensayo quedó declarado "negativo" según la convención (Hernández et al., 2019). ¿Qué debía hacer un clínico con ese resultado? El umbral de significación que lo declaró negativo no es una ley de la naturaleza: es el riesgo inductivo de la sección anterior, institucionalizado en un número. Un reanálisis bayesiano lo hizo explícito: bajo cualquier prior razonable, la probabilidad de que la estrategia guiada por perfusión fuera superior excedía el 90% (Zampieri et al., 2020). El mismo dato, dos marcos de lectura, dos frases distintas para la ficha.</w:t>
       </w:r>
     </w:p>
     <w:p>
@@ -5557,6 +5759,97 @@
       <w:r>
         <w:t xml:space="preserve">La respuesta madura del propio grupo no fue proclamar victoria ni acatar el veredicto: fue refinar la hipótesis —fenotipos hemodinámicos, un algoritmo personalizado— y volver a someterla a una prueba más severa. Seis años después, el segundo ensayo, ahora en 86 centros de 19 países, mostró que la estrategia personalizada guiada por relleno capilar era superior al cuidado habitual (Hernández et al., 2025). La saga deja tres lecciones para este capítulo: un ensayo no se lee solo, porque el marco inferencial es parte de la lectura; "no significativo" no significa "sin efecto", y tratarlos como sinónimos es una decisión con costos; y la incertidumbre residual no se resuelve con retórica, sino con la siguiente pregunta bien diseñada. Hay una cuarta lección que excede la epistemología: esa ciencia de primera línea se hizo desde América Latina, coordinada desde Chile — el mismo continente clínico desde el que este libro escribe.</w:t>
       </w:r>
+    </w:p>
+    <w:tbl>
+      <w:tblPr>
+        <w:tblW w:type="dxa" w:w="9026"/>
+        <w:tblBorders>
+          <w:top w:val="none" w:color="FFFFFF" w:sz="0"/>
+          <w:left w:val="none" w:color="FFFFFF" w:sz="0"/>
+          <w:bottom w:val="none" w:color="FFFFFF" w:sz="0"/>
+          <w:right w:val="none" w:color="FFFFFF" w:sz="0"/>
+          <w:insideH w:val="none" w:color="FFFFFF" w:sz="0"/>
+          <w:insideV w:val="none" w:color="FFFFFF" w:sz="0"/>
+        </w:tblBorders>
+      </w:tblPr>
+      <w:tblGrid>
+        <w:gridCol w:w="9026"/>
+      </w:tblGrid>
+      <w:tr>
+        <w:trPr>
+          <w:cantSplit/>
+        </w:trPr>
+        <w:tc>
+          <w:tcPr>
+            <w:tcW w:type="dxa" w:w="9026"/>
+            <w:tcBorders>
+              <w:top w:val="none" w:color="FFFFFF" w:sz="0"/>
+              <w:left w:val="none" w:color="FFFFFF" w:sz="0"/>
+              <w:bottom w:val="none" w:color="FFFFFF" w:sz="0"/>
+              <w:right w:val="none" w:color="FFFFFF" w:sz="0"/>
+            </w:tcBorders>
+          </w:tcPr>
+          <w:p>
+            <w:pPr>
+              <w:spacing w:after="40" w:before="200"/>
+              <w:jc w:val="center"/>
+            </w:pPr>
+            <w:r>
+              <w:drawing>
+                <wp:inline distT="0" distB="0" distL="0" distR="0">
+                  <wp:extent cx="5619750" cy="2705100"/>
+                  <wp:effectExtent t="0" r="0" b="0" l="0"/>
+                  <wp:docPr id="1" name="" descr="" title=""/>
+                  <wp:cNvGraphicFramePr>
+                    <a:graphicFrameLocks xmlns:a="http://schemas.openxmlformats.org/drawingml/2006/main" noChangeAspect="1"/>
+                  </wp:cNvGraphicFramePr>
+                  <a:graphic xmlns:a="http://schemas.openxmlformats.org/drawingml/2006/main">
+                    <a:graphicData uri="http://schemas.openxmlformats.org/drawingml/2006/picture">
+                      <pic:pic xmlns:pic="http://schemas.openxmlformats.org/drawingml/2006/picture">
+                        <pic:nvPicPr>
+                          <pic:cNvPr id="0" name="" descr=""/>
+                          <pic:cNvPicPr>
+                            <a:picLocks noChangeAspect="1" noChangeArrowheads="1"/>
+                          </pic:cNvPicPr>
+                        </pic:nvPicPr>
+                        <pic:blipFill>
+                          <a:blip r:embed="rId15" cstate="none"/>
+                          <a:srcRect/>
+                          <a:stretch>
+                            <a:fillRect/>
+                          </a:stretch>
+                        </pic:blipFill>
+                        <pic:spPr bwMode="auto">
+                          <a:xfrm>
+                            <a:off x="0" y="0"/>
+                            <a:ext cx="5619750" cy="2705100"/>
+                          </a:xfrm>
+                          <a:prstGeom prst="rect">
+                            <a:avLst/>
+                          </a:prstGeom>
+                        </pic:spPr>
+                      </pic:pic>
+                    </a:graphicData>
+                  </a:graphic>
+                </wp:inline>
+              </w:drawing>
+            </w:r>
+          </w:p>
+          <w:p>
+            <w:pPr>
+              <w:pStyle w:val="Caption"/>
+            </w:pPr>
+            <w:r>
+              <w:t xml:space="preserve">Figura 7. Una década sobre un mismo dato: la saga ANDROMEDA. El mismo programa de investigación atraviesa un ensayo "negativo", su relectura bayesiana y una segunda prueba más severa — la trayectoria completa que este capítulo propone como modelo de lectura de la evidencia.</w:t>
+            </w:r>
+          </w:p>
+        </w:tc>
+      </w:tr>
+    </w:tbl>
+    <w:p>
+      <w:pPr>
+        <w:spacing w:after="60"/>
+      </w:pPr>
     </w:p>
     <w:p>
       <w:pPr>
@@ -5659,51 +5952,10 @@
     </w:p>
     <w:p>
       <w:pPr>
-        <w:pStyle w:val="Heading3"/>
-        <w:spacing w:after="120" w:before="280"/>
-      </w:pPr>
-      <w:r>
-        <w:rPr>
-          <w:rFonts w:ascii="Georgia" w:cs="Georgia" w:eastAsia="Georgia" w:hAnsi="Georgia"/>
-          <w:b/>
-          <w:bCs/>
-          <w:color w:val="2B2B2B"/>
-          <w:sz w:val="25"/>
-          <w:szCs w:val="25"/>
-        </w:rPr>
-        <w:t xml:space="preserve">Evidencia local y aprendizaje del caso</w:t>
-      </w:r>
-    </w:p>
-    <w:p>
-      <w:pPr>
-        <w:pStyle w:val="BodyJ"/>
-      </w:pPr>
-      <w:r>
-        <w:t xml:space="preserve">La evidencia externa convive con conocimiento local: epidemiología, disponibilidad diagnóstica, tiempos de traslado, perfiles de resistencia, experiencia técnica y capacidad de seguimiento. Estos datos pueden modificar la decisión sin contradecir un estudio. Su legitimidad depende de que sean explícitos y actualizables, no simples tradiciones institucionales.</w:t>
-      </w:r>
-    </w:p>
-    <w:p>
-      <w:pPr>
-        <w:pStyle w:val="BodyJ"/>
-      </w:pPr>
-      <w:r>
-        <w:t xml:space="preserve">El paciente también genera evidencia longitudinal sobre sí mismo. Respuestas previas, recurrencias, efectos adversos y preferencias estables constituyen información relevante, aunque no equivalgan a un ensayo N-of-1 formal. El desafío es evitar atribuciones causales fáciles: la mejoría posterior a una intervención no demuestra que haya sido causada por ella, especialmente cuando coexisten historia natural y tratamientos simultáneos.</w:t>
-      </w:r>
-    </w:p>
-    <w:p>
-      <w:pPr>
-        <w:pStyle w:val="BodyJ"/>
-      </w:pPr>
-      <w:r>
-        <w:t xml:space="preserve">Una deliberación bien formulada puede declarar: qué proviene de estudios; qué se extrapola; qué aporta la historia individual; qué depende del contexto local; y qué permanece desconocido. Esa estratificación protege tanto contra la obediencia automática a la evidencia como contra su rechazo anecdótico. La competencia metacognitiva consiste en reconocer cuándo se está citando un resultado, cuándo se está extrapolando, cuándo se está suponiendo un mecanismo y cuándo una preferencia está inclinando la balanza. La pregunta final no es "¿existe evidencia?", sino "¿qué evidencia existe, para qué afirmación, con qué transportabilidad y con qué consecuencias para esta persona?".</w:t>
-      </w:r>
-    </w:p>
-    <w:p>
-      <w:pPr>
         <w:pStyle w:val="TallerHead"/>
       </w:pPr>
       <w:r>
-        <w:t xml:space="preserve">Taller 9. Frecuencias naturales al lado de la cama</w:t>
+        <w:t xml:space="preserve">Taller 10. Frecuencias naturales al lado de la cama</w:t>
       </w:r>
     </w:p>
     <w:p>
@@ -5782,7 +6034,7 @@
                           </pic:cNvPicPr>
                         </pic:nvPicPr>
                         <pic:blipFill>
-                          <a:blip r:embed="rId15" cstate="none"/>
+                          <a:blip r:embed="rId16" cstate="none"/>
                           <a:srcRect/>
                           <a:stretch>
                             <a:fillRect/>
@@ -5809,7 +6061,7 @@
               <w:pStyle w:val="Caption"/>
             </w:pPr>
             <w:r>
-              <w:t xml:space="preserve">Figura 7. El cálculo del Taller 9 en frecuencias naturales: de 270 resultados positivos, sólo 90 corresponden a la enfermedad. La probabilidad postest (33%) queda lejos de la certeza que la intuición atribuye a una "prueba positiva".</w:t>
+              <w:t xml:space="preserve">Figura 8. El cálculo del Taller 10 en frecuencias naturales: de 270 resultados positivos, sólo 90 corresponden a la enfermedad. La probabilidad postest (33%) queda lejos de la certeza que la intuición atribuye a una "prueba positiva".</w:t>
             </w:r>
           </w:p>
         </w:tc>
@@ -5832,7 +6084,7 @@
         <w:t xml:space="preserve">En una frase.</w:t>
       </w:r>
       <w:r>
-        <w:t xml:space="preserve"> La evidencia no desciende intacta desde la población hacia el individuo: debe traducirse mediante inferencias explícitas, y la decisión final se toma por umbrales y consecuencias, no por certeza.</w:t>
+        <w:t xml:space="preserve"> Decidir sin certeza no es un mal menor: es la forma normal del juicio clínico cuando trabaja bien — umbrales explícitos, valores declarados y ensayos leídos con su marco inferencial a la vista.</w:t>
       </w:r>
     </w:p>
     <w:p>
@@ -5853,19 +6105,7 @@
         <w:pStyle w:val="BodyJ"/>
         <w:numPr>
           <w:ilvl w:val="0"/>
-          <w:numId w:val="15"/>
-        </w:numPr>
-      </w:pPr>
-      <w:r>
-        <w:t xml:space="preserve">Para mi indicación más importante de hoy: ¿qué demostró exactamente el estudio que la respalda, y en qué se parece mi paciente a esa población?</w:t>
-      </w:r>
-    </w:p>
-    <w:p>
-      <w:pPr>
-        <w:pStyle w:val="BodyJ"/>
-        <w:numPr>
-          <w:ilvl w:val="0"/>
-          <w:numId w:val="15"/>
+          <w:numId w:val="16"/>
         </w:numPr>
       </w:pPr>
       <w:r>
@@ -5877,11 +6117,23 @@
         <w:pStyle w:val="BodyJ"/>
         <w:numPr>
           <w:ilvl w:val="0"/>
-          <w:numId w:val="15"/>
+          <w:numId w:val="16"/>
         </w:numPr>
       </w:pPr>
       <w:r>
         <w:t xml:space="preserve">¿Estoy exigiendo certeza diagnóstica donde bastaría compromiso práctico, o actuando para no tolerar una duda?</w:t>
+      </w:r>
+    </w:p>
+    <w:p>
+      <w:pPr>
+        <w:pStyle w:val="BodyJ"/>
+        <w:numPr>
+          <w:ilvl w:val="0"/>
+          <w:numId w:val="16"/>
+        </w:numPr>
+      </w:pPr>
+      <w:r>
+        <w:t xml:space="preserve">El último ensayo "negativo" que cité: ¿mostró ausencia de efecto o ausencia de significación — y traté esa diferencia como si no existiera?</w:t>
       </w:r>
     </w:p>
     <w:p>
@@ -5899,7 +6151,7 @@
           <w:sz w:val="22"/>
           <w:szCs w:val="22"/>
         </w:rPr>
-        <w:t xml:space="preserve">Capítulo 10</w:t>
+        <w:t xml:space="preserve">Capítulo 11</w:t>
       </w:r>
       <w:r>
         <w:rPr>
@@ -6083,7 +6335,7 @@
         <w:pStyle w:val="TallerHead"/>
       </w:pPr>
       <w:r>
-        <w:t xml:space="preserve">Taller 10. La observación activa, por escrito</w:t>
+        <w:t xml:space="preserve">Taller 11. La observación activa, por escrito</w:t>
       </w:r>
     </w:p>
     <w:p>
@@ -6142,7 +6394,7 @@
         <w:pStyle w:val="BodyJ"/>
         <w:numPr>
           <w:ilvl w:val="0"/>
-          <w:numId w:val="16"/>
+          <w:numId w:val="17"/>
         </w:numPr>
       </w:pPr>
       <w:r>
@@ -6154,7 +6406,7 @@
         <w:pStyle w:val="BodyJ"/>
         <w:numPr>
           <w:ilvl w:val="0"/>
-          <w:numId w:val="16"/>
+          <w:numId w:val="17"/>
         </w:numPr>
       </w:pPr>
       <w:r>
@@ -6166,7 +6418,7 @@
         <w:pStyle w:val="BodyJ"/>
         <w:numPr>
           <w:ilvl w:val="0"/>
-          <w:numId w:val="16"/>
+          <w:numId w:val="17"/>
         </w:numPr>
       </w:pPr>
       <w:r>
@@ -6188,7 +6440,7 @@
           <w:sz w:val="22"/>
           <w:szCs w:val="22"/>
         </w:rPr>
-        <w:t xml:space="preserve">Capítulo 11</w:t>
+        <w:t xml:space="preserve">Capítulo 12</w:t>
       </w:r>
       <w:r>
         <w:rPr>
@@ -6582,7 +6834,7 @@
         <w:pStyle w:val="TallerHead"/>
       </w:pPr>
       <w:r>
-        <w:t xml:space="preserve">Taller 11. Desfosilizar una evolución</w:t>
+        <w:t xml:space="preserve">Taller 12. Desfosilizar una evolución</w:t>
       </w:r>
     </w:p>
     <w:p>
@@ -6681,7 +6933,7 @@
         <w:pStyle w:val="BodyJ"/>
         <w:numPr>
           <w:ilvl w:val="0"/>
-          <w:numId w:val="17"/>
+          <w:numId w:val="18"/>
         </w:numPr>
       </w:pPr>
       <w:r>
@@ -6693,7 +6945,7 @@
         <w:pStyle w:val="BodyJ"/>
         <w:numPr>
           <w:ilvl w:val="0"/>
-          <w:numId w:val="17"/>
+          <w:numId w:val="18"/>
         </w:numPr>
       </w:pPr>
       <w:r>
@@ -6705,7 +6957,7 @@
         <w:pStyle w:val="BodyJ"/>
         <w:numPr>
           <w:ilvl w:val="0"/>
-          <w:numId w:val="17"/>
+          <w:numId w:val="18"/>
         </w:numPr>
       </w:pPr>
       <w:r>
@@ -6727,7 +6979,7 @@
           <w:sz w:val="22"/>
           <w:szCs w:val="22"/>
         </w:rPr>
-        <w:t xml:space="preserve">Capítulo 12</w:t>
+        <w:t xml:space="preserve">Capítulo 13</w:t>
       </w:r>
       <w:r>
         <w:rPr>
@@ -6944,7 +7196,7 @@
         <w:pStyle w:val="BodyJ"/>
         <w:numPr>
           <w:ilvl w:val="0"/>
-          <w:numId w:val="18"/>
+          <w:numId w:val="19"/>
         </w:numPr>
       </w:pPr>
       <w:r>
@@ -6963,7 +7215,7 @@
         <w:pStyle w:val="BodyJ"/>
         <w:numPr>
           <w:ilvl w:val="0"/>
-          <w:numId w:val="18"/>
+          <w:numId w:val="19"/>
         </w:numPr>
       </w:pPr>
       <w:r>
@@ -6982,7 +7234,7 @@
         <w:pStyle w:val="BodyJ"/>
         <w:numPr>
           <w:ilvl w:val="0"/>
-          <w:numId w:val="18"/>
+          <w:numId w:val="19"/>
         </w:numPr>
       </w:pPr>
       <w:r>
@@ -7001,7 +7253,7 @@
         <w:pStyle w:val="BodyJ"/>
         <w:numPr>
           <w:ilvl w:val="0"/>
-          <w:numId w:val="18"/>
+          <w:numId w:val="19"/>
         </w:numPr>
       </w:pPr>
       <w:r>
@@ -7143,7 +7395,7 @@
         <w:pStyle w:val="TallerHead"/>
       </w:pPr>
       <w:r>
-        <w:t xml:space="preserve">Taller 12. Traducir un desacuerdo</w:t>
+        <w:t xml:space="preserve">Taller 13. Traducir un desacuerdo</w:t>
       </w:r>
     </w:p>
     <w:p>
@@ -7252,7 +7504,7 @@
         <w:pStyle w:val="BodyJ"/>
         <w:numPr>
           <w:ilvl w:val="0"/>
-          <w:numId w:val="19"/>
+          <w:numId w:val="20"/>
         </w:numPr>
       </w:pPr>
       <w:r>
@@ -7264,7 +7516,7 @@
         <w:pStyle w:val="BodyJ"/>
         <w:numPr>
           <w:ilvl w:val="0"/>
-          <w:numId w:val="19"/>
+          <w:numId w:val="20"/>
         </w:numPr>
       </w:pPr>
       <w:r>
@@ -7276,7 +7528,7 @@
         <w:pStyle w:val="BodyJ"/>
         <w:numPr>
           <w:ilvl w:val="0"/>
-          <w:numId w:val="19"/>
+          <w:numId w:val="20"/>
         </w:numPr>
       </w:pPr>
       <w:r>
@@ -7334,7 +7586,7 @@
         <w:pStyle w:val="BodyJ"/>
       </w:pPr>
       <w:r>
-        <w:t xml:space="preserve">Carmen pregunta lo que casi todos preguntan: "¿Y usted qué haría?". La cirujana responde con la estructura del capítulo 14 en mente: "Yo le recomiendo operarse, y le digo por qué: prefiero un riesgo quirúrgico conocido, con usted optimizada, a un riesgo obstructivo que no controlamos ni podemos programar. Pero la que pasó el shock fue usted, y la que decide cuánto miedo le tiene a cada uno de esos riesgos también es usted".</w:t>
+        <w:t xml:space="preserve">Carmen pregunta lo que casi todos preguntan: "¿Y usted qué haría?". La cirujana responde con la estructura del capítulo 15 en mente: "Yo le recomiendo operarse, y le digo por qué: prefiero un riesgo quirúrgico conocido, con usted optimizada, a un riesgo obstructivo que no controlamos ni podemos programar. Pero la que pasó el shock fue usted, y la que decide cuánto miedo le tiene a cada uno de esos riesgos también es usted".</w:t>
       </w:r>
     </w:p>
     <w:p>
@@ -7383,7 +7635,7 @@
         <w:pStyle w:val="PartIntro"/>
       </w:pPr>
       <w:r>
-        <w:t xml:space="preserve">Las tres primeras partes construyeron las herramientas; esta las pone a trabajar. Primero frente al espejo nuevo de la inteligencia artificial (capítulo 13) y frente a la responsabilidad que ninguna herramienta puede delegar (capítulo 14). Luego, el método HII-D en forma completa y en versión de sesenta segundos (capítulo 15), un cuaderno de ocho casos para leer metacognitivamente —incluida la resolución de la historia de Carmen—, y el problema de enseñar y organizar todo esto (capítulo 16).</w:t>
+        <w:t xml:space="preserve">Las tres primeras partes construyeron las herramientas; esta las pone a trabajar. Primero frente al espejo nuevo de la inteligencia artificial (capítulo 14) y frente a la responsabilidad —y el miedo— que ninguna herramienta puede delegar (capítulo 15). Luego, el método HII-D en forma completa y en versión de sesenta segundos (capítulo 16), un cuaderno de diez casos para leer metacognitivamente —incluida la resolución de la historia de Carmen—, y el problema de enseñar y organizar todo esto (capítulo 17).</w:t>
       </w:r>
     </w:p>
     <w:p>
@@ -7401,7 +7653,7 @@
           <w:sz w:val="22"/>
           <w:szCs w:val="22"/>
         </w:rPr>
-        <w:t xml:space="preserve">Capítulo 13</w:t>
+        <w:t xml:space="preserve">Capítulo 14</w:t>
       </w:r>
       <w:r>
         <w:rPr>
@@ -7718,7 +7970,7 @@
         <w:pStyle w:val="BodyJ"/>
         <w:numPr>
           <w:ilvl w:val="0"/>
-          <w:numId w:val="20"/>
+          <w:numId w:val="21"/>
         </w:numPr>
       </w:pPr>
       <w:r>
@@ -7730,7 +7982,7 @@
         <w:pStyle w:val="BodyJ"/>
         <w:numPr>
           <w:ilvl w:val="0"/>
-          <w:numId w:val="20"/>
+          <w:numId w:val="21"/>
         </w:numPr>
       </w:pPr>
       <w:r>
@@ -7742,7 +7994,7 @@
         <w:pStyle w:val="BodyJ"/>
         <w:numPr>
           <w:ilvl w:val="0"/>
-          <w:numId w:val="20"/>
+          <w:numId w:val="21"/>
         </w:numPr>
       </w:pPr>
       <w:r>
@@ -7764,7 +8016,7 @@
           <w:sz w:val="22"/>
           <w:szCs w:val="22"/>
         </w:rPr>
-        <w:t xml:space="preserve">Capítulo 14</w:t>
+        <w:t xml:space="preserve">Capítulo 15</w:t>
       </w:r>
       <w:r>
         <w:rPr>
@@ -7907,7 +8159,7 @@
         <w:pStyle w:val="BodyJ"/>
       </w:pPr>
       <w:r>
-        <w:t xml:space="preserve">Por eso este libro necesita la humildad no como ornamento ético sino como pieza estructural. La reevaluación del método HII-D (capítulo 15) es humildad convertida en procedimiento: la cláusula "qué me haría cambiar", escrita antes de saber si habrá que cambiar, es la forma que toma esta virtud cuando se la obliga a dejar huella en la ficha.</w:t>
+        <w:t xml:space="preserve">Por eso este libro necesita la humildad no como ornamento ético sino como pieza estructural. La reevaluación del método HII-D (capítulo 16) es humildad convertida en procedimiento: la cláusula "qué me haría cambiar", escrita antes de saber si habrá que cambiar, es la forma que toma esta virtud cuando se la obliga a dejar huella en la ficha.</w:t>
       </w:r>
     </w:p>
     <w:p>
@@ -8014,6 +8266,39 @@
           <w:sz w:val="25"/>
           <w:szCs w:val="25"/>
         </w:rPr>
+        <w:t xml:space="preserve">El miedo también escribe: documentación defensiva y segunda víctima</w:t>
+      </w:r>
+    </w:p>
+    <w:p>
+      <w:pPr>
+        <w:pStyle w:val="BodyJ"/>
+      </w:pPr>
+      <w:r>
+        <w:t xml:space="preserve">Hay una variable que ningún modelo del razonamiento clínico incluye y que opera todos los días: el miedo. Miedo a la demanda, al reclamo, a la auditoría, al pasillo. Ese miedo no se queda en el cuerpo del médico; escribe en la ficha. La documentación defensiva —notas redactadas para un abogado imaginario y no para el siguiente lector clínico— es su síntoma más visible, y es un corruptor epistémico de primer orden: donde la frase medular busca hacer auditable el razonamiento, la nota defensiva busca hacerlo inatacable, que es casi lo contrario. Se omiten las dudas (podrían "usarse en contra"), se multiplican los exámenes cuya única indicación es la constancia, se prefiere la vaguedad que no compromete a la precisión que expone. El resultado es una ficha que protege menos de lo que cree: ante cualquier revisión seria, la nota vaga sin criterios de reapertura parece ocultamiento, mientras que la nota que muestra qué se sabía, qué se dudaba y cuándo se planeó reevaluar demuestra exactamente lo que el derecho sanitario pondera — un proceso razonable con la información disponible. La trazabilidad honesta no es ingenuidad jurídica; es la mejor defensa que la epistemología puede ofrecer, además de la única compatible con seguir pensando.</w:t>
+      </w:r>
+    </w:p>
+    <w:p>
+      <w:pPr>
+        <w:pStyle w:val="BodyJ"/>
+      </w:pPr>
+      <w:r>
+        <w:t xml:space="preserve">El mismo miedo, vuelto hacia adentro, tiene otro nombre. Wu llamó segunda víctima al clínico que, tras un error, queda él mismo dañado: culpa, vergüenza, aislamiento, la revisión obsesiva del momento en que las cosas pudieron ser distintas (Wu, 2000). El punto no es sentimental sino epistemológico: un médico devastado y solo no puede hacer el análisis de trayectoria del capítulo 7 — la vergüenza empuja o al silencio o al relato autoflagelante, y ninguno de los dos produce aprendizaje. Por eso el cuidado del que erró no es blandura institucional: es una condición del circuito de corrección. Un servicio que quiere fichas honestas y morbimortalidades útiles tiene que hacer verosímil una promesa: reconocer un error o una duda aquí no te destruirá. Donde esa promesa no existe, la humildad epistémica se vuelve un lujo peligroso, y el sistema entero paga en errores repetidos lo que ahorra en incomodidad.</w:t>
+      </w:r>
+    </w:p>
+    <w:p>
+      <w:pPr>
+        <w:pStyle w:val="Heading3"/>
+        <w:spacing w:after="120" w:before="280"/>
+      </w:pPr>
+      <w:r>
+        <w:rPr>
+          <w:rFonts w:ascii="Georgia" w:cs="Georgia" w:eastAsia="Georgia" w:hAnsi="Georgia"/>
+          <w:b/>
+          <w:bCs/>
+          <w:color w:val="2B2B2B"/>
+          <w:sz w:val="25"/>
+          <w:szCs w:val="25"/>
+        </w:rPr>
         <w:t xml:space="preserve">Autoridad sin opacidad</w:t>
       </w:r>
     </w:p>
@@ -8098,7 +8383,7 @@
         <w:pStyle w:val="BodyJ"/>
         <w:numPr>
           <w:ilvl w:val="0"/>
-          <w:numId w:val="21"/>
+          <w:numId w:val="22"/>
         </w:numPr>
       </w:pPr>
       <w:r>
@@ -8110,7 +8395,7 @@
         <w:pStyle w:val="BodyJ"/>
         <w:numPr>
           <w:ilvl w:val="0"/>
-          <w:numId w:val="21"/>
+          <w:numId w:val="22"/>
         </w:numPr>
       </w:pPr>
       <w:r>
@@ -8122,7 +8407,7 @@
         <w:pStyle w:val="BodyJ"/>
         <w:numPr>
           <w:ilvl w:val="0"/>
-          <w:numId w:val="21"/>
+          <w:numId w:val="22"/>
         </w:numPr>
       </w:pPr>
       <w:r>
@@ -8144,7 +8429,7 @@
           <w:sz w:val="22"/>
           <w:szCs w:val="22"/>
         </w:rPr>
-        <w:t xml:space="preserve">Capítulo 15</w:t>
+        <w:t xml:space="preserve">Capítulo 16</w:t>
       </w:r>
       <w:r>
         <w:rPr>
@@ -8253,7 +8538,7 @@
                           </pic:cNvPicPr>
                         </pic:nvPicPr>
                         <pic:blipFill>
-                          <a:blip r:embed="rId16" cstate="none"/>
+                          <a:blip r:embed="rId17" cstate="none"/>
                           <a:srcRect/>
                           <a:stretch>
                             <a:fillRect/>
@@ -8578,7 +8863,7 @@
         <w:pStyle w:val="BodyJ"/>
         <w:numPr>
           <w:ilvl w:val="0"/>
-          <w:numId w:val="22"/>
+          <w:numId w:val="23"/>
         </w:numPr>
       </w:pPr>
       <w:r>
@@ -8597,7 +8882,7 @@
         <w:pStyle w:val="BodyJ"/>
         <w:numPr>
           <w:ilvl w:val="0"/>
-          <w:numId w:val="22"/>
+          <w:numId w:val="23"/>
         </w:numPr>
       </w:pPr>
       <w:r>
@@ -8616,7 +8901,7 @@
         <w:pStyle w:val="BodyJ"/>
         <w:numPr>
           <w:ilvl w:val="0"/>
-          <w:numId w:val="22"/>
+          <w:numId w:val="23"/>
         </w:numPr>
       </w:pPr>
       <w:r>
@@ -8635,7 +8920,7 @@
         <w:pStyle w:val="BodyJ"/>
         <w:numPr>
           <w:ilvl w:val="0"/>
-          <w:numId w:val="22"/>
+          <w:numId w:val="23"/>
         </w:numPr>
       </w:pPr>
       <w:r>
@@ -8834,7 +9119,7 @@
         <w:pStyle w:val="TallerHead"/>
       </w:pPr>
       <w:r>
-        <w:t xml:space="preserve">Taller 15. Su paciente, esta semana</w:t>
+        <w:t xml:space="preserve">Taller 16. Su paciente, esta semana</w:t>
       </w:r>
     </w:p>
     <w:p>
@@ -8893,7 +9178,7 @@
         <w:pStyle w:val="BodyJ"/>
         <w:numPr>
           <w:ilvl w:val="0"/>
-          <w:numId w:val="23"/>
+          <w:numId w:val="24"/>
         </w:numPr>
       </w:pPr>
       <w:r>
@@ -8905,7 +9190,7 @@
         <w:pStyle w:val="BodyJ"/>
         <w:numPr>
           <w:ilvl w:val="0"/>
-          <w:numId w:val="23"/>
+          <w:numId w:val="24"/>
         </w:numPr>
       </w:pPr>
       <w:r>
@@ -8917,7 +9202,7 @@
         <w:pStyle w:val="BodyJ"/>
         <w:numPr>
           <w:ilvl w:val="0"/>
-          <w:numId w:val="23"/>
+          <w:numId w:val="24"/>
         </w:numPr>
       </w:pPr>
       <w:r>
@@ -8951,7 +9236,7 @@
           <w:szCs w:val="32"/>
         </w:rPr>
         <w:br/>
-        <w:t xml:space="preserve">Ocho viñetas para una lectura metacognitiva</w:t>
+        <w:t xml:space="preserve">Diez viñetas para una lectura metacognitiva</w:t>
       </w:r>
     </w:p>
     <w:p>
@@ -9909,15 +10194,245 @@
           <w:sz w:val="25"/>
           <w:szCs w:val="25"/>
         </w:rPr>
-        <w:t xml:space="preserve">Lo común a las ocho viñetas</w:t>
-      </w:r>
-    </w:p>
-    <w:p>
-      <w:pPr>
-        <w:pStyle w:val="BodyJ"/>
-      </w:pPr>
-      <w:r>
-        <w:t xml:space="preserve">En cada caso, la buena formulación evita dos extremos: describir sin interpretar o interpretar como si se hubiera observado directamente. El hecho guía la hipótesis; la incertidumbre modula su fuerza; la consecuencia define la decisión; la evolución conserva el derecho a corregir. Y en todas —de la urgencia de las 3:00 al final de la vida— la decisión termina con la misma cláusula: qué la haría cambiar, quién lo detectará y cuándo.</w:t>
+        <w:t xml:space="preserve">Viñeta 9. "Lo veo raro": el testimonio de la madre</w:t>
+      </w:r>
+    </w:p>
+    <w:p>
+      <w:pPr>
+        <w:pStyle w:val="BodyJ"/>
+      </w:pPr>
+      <w:r>
+        <w:t xml:space="preserve">Un lactante de cinco meses llega a urgencias a las 22:30. Afebril tras paracetamol en casa, signos vitales dentro de rangos para la edad, examen segmentario sin foco. La madre insiste: "No es él. No se ríe, no me busca, está como apagado". La sala está llena y el registro de triage dice "lactante febril en buenas condiciones generales".</w:t>
+      </w:r>
+    </w:p>
+    <w:p>
+      <w:pPr>
+        <w:pStyle w:val="BodyJ"/>
+      </w:pPr>
+      <w:r>
+        <w:rPr>
+          <w:i/>
+          <w:iCs/>
+        </w:rPr>
+        <w:t xml:space="preserve">Hechos:</w:t>
+      </w:r>
+      <w:r>
+        <w:t xml:space="preserve"> temperatura normalizada bajo antipirético (dato medido, pero bajo intervención); examen sin foco en una evaluación puntual; y un relato de tercero que describe un cambio conductual respecto del basal — información longitudinal a la que ningún examen de veinte minutos accede.</w:t>
+      </w:r>
+    </w:p>
+    <w:p>
+      <w:pPr>
+        <w:pStyle w:val="BodyJ"/>
+      </w:pPr>
+      <w:r>
+        <w:rPr>
+          <w:i/>
+          <w:iCs/>
+        </w:rPr>
+        <w:t xml:space="preserve">Inferencia:</w:t>
+      </w:r>
+      <w:r>
+        <w:t xml:space="preserve"> cuadro viral banal es lo más probable por prevalencia. Pero la preocupación parental por "no ser él mismo" no es ruido afectivo: es una observación experta sobre el único basal disponible, y la evidencia le da rango de señal — en series de atención primaria, la intuición del clínico de que "algo anda mal", frecuentemente gatillada por la inquietud de los padres, tuvo mayor valor diagnóstico que la mayoría de los signos aislados para detectar infección grave (Van den Bruel et al., 2012).</w:t>
+      </w:r>
+    </w:p>
+    <w:p>
+      <w:pPr>
+        <w:pStyle w:val="BodyJ"/>
+      </w:pPr>
+      <w:r>
+        <w:rPr>
+          <w:i/>
+          <w:iCs/>
+        </w:rPr>
+        <w:t xml:space="preserve">Incertidumbre:</w:t>
+      </w:r>
+      <w:r>
+        <w:t xml:space="preserve"> la peligrosa es una sola: infección bacteriana grave en fase temprana, cuando el examen todavía no la muestra. Reducible sólo parcialmente con laboratorio; la evolución de las próximas horas es la mejor prueba disponible.</w:t>
+      </w:r>
+    </w:p>
+    <w:p>
+      <w:pPr>
+        <w:pStyle w:val="BodyJ"/>
+      </w:pPr>
+      <w:r>
+        <w:rPr>
+          <w:i/>
+          <w:iCs/>
+        </w:rPr>
+        <w:t xml:space="preserve">Decisión:</w:t>
+      </w:r>
+      <w:r>
+        <w:t xml:space="preserve"> el dato que gobierna la conducta no es la temperatura sino el cambio de comportamiento reportado. Observación prolongada en urgencias con reevaluación seriada del estado general, umbral bajo para laboratorio, y —si se decide alta— red de seguridad explícita y verificada con la madre: qué mirar, cuándo volver, por qué vía. "Se va tranquila" no es un criterio de alta; "sabe exactamente qué la haría volver" sí.</w:t>
+      </w:r>
+    </w:p>
+    <w:p>
+      <w:pPr>
+        <w:pStyle w:val="BodyJ"/>
+      </w:pPr>
+      <w:r>
+        <w:rPr>
+          <w:i/>
+          <w:iCs/>
+        </w:rPr>
+        <w:t xml:space="preserve">Frase medular:</w:t>
+      </w:r>
+      <w:r>
+        <w:t xml:space="preserve"> "Lactante afebril bajo antipiréticos y sin foco al examen, con cambio conductual significativo según su madre; el testimonio del cuidador se registra como observación del basal y gobierna la vigilancia: reevaluación seriada antes de decidir alta, con red de seguridad verificada."</w:t>
+      </w:r>
+    </w:p>
+    <w:p>
+      <w:pPr>
+        <w:pStyle w:val="BodyJ"/>
+      </w:pPr>
+      <w:r>
+        <w:rPr>
+          <w:i/>
+          <w:iCs/>
+        </w:rPr>
+        <w:t xml:space="preserve">Lectura metacognitiva.</w:t>
+      </w:r>
+      <w:r>
+        <w:t xml:space="preserve"> La pediatría radicaliza el capítulo 1: el paciente no habla, y el "hecho" más valioso es un testimonio de tercero sobre un basal que el equipo no conoce. Descartar la preocupación materna como ansiedad es el equivalente pediátrico de la injusticia testimonial del capítulo 15 — y además, simplemente, mala medicina: pocas fuentes de información tienen mejor razón señal-ruido que quien mira a ese niño todos los días.</w:t>
+      </w:r>
+    </w:p>
+    <w:p>
+      <w:pPr>
+        <w:pStyle w:val="Heading3"/>
+        <w:spacing w:after="120" w:before="280"/>
+      </w:pPr>
+      <w:r>
+        <w:rPr>
+          <w:rFonts w:ascii="Georgia" w:cs="Georgia" w:eastAsia="Georgia" w:hAnsi="Georgia"/>
+          <w:b/>
+          <w:bCs/>
+          <w:color w:val="2B2B2B"/>
+          <w:sz w:val="25"/>
+          <w:szCs w:val="25"/>
+        </w:rPr>
+        <w:t xml:space="preserve">Viñeta 10. El dolor abdominal de la paciente que "somatiza"</w:t>
+      </w:r>
+    </w:p>
+    <w:p>
+      <w:pPr>
+        <w:pStyle w:val="BodyJ"/>
+      </w:pPr>
+      <w:r>
+        <w:t xml:space="preserve">Una mujer de 34 años con esquizofrenia en tratamiento consulta por dolor abdominal de dos días. En el box, habla poco y evita la mirada; la nota de derivación dice "consultas frecuentes, quejas somáticas múltiples". Taquicardia de 110, abdomen difícil de evaluar — la paciente tolera mal la palpación y su tratamiento antipsicótico puede atenuar la expresión del dolor y enlentecer el tránsito.</w:t>
+      </w:r>
+    </w:p>
+    <w:p>
+      <w:pPr>
+        <w:pStyle w:val="BodyJ"/>
+      </w:pPr>
+      <w:r>
+        <w:rPr>
+          <w:i/>
+          <w:iCs/>
+        </w:rPr>
+        <w:t xml:space="preserve">Hechos:</w:t>
+      </w:r>
+      <w:r>
+        <w:t xml:space="preserve"> taquicardia sostenida (medida, reproducible); dos días de dolor según relato coherente en sus términos; examen abdominal técnicamente limitado —no negativo: limitado—; antecedente psiquiátrico que modifica la expresión clínica y farmacológica del cuadro; una etiqueta heredada ("somatiza") sin procedencia verificable.</w:t>
+      </w:r>
+    </w:p>
+    <w:p>
+      <w:pPr>
+        <w:pStyle w:val="BodyJ"/>
+      </w:pPr>
+      <w:r>
+        <w:rPr>
+          <w:i/>
+          <w:iCs/>
+        </w:rPr>
+        <w:t xml:space="preserve">Inferencia:</w:t>
+      </w:r>
+      <w:r>
+        <w:t xml:space="preserve"> la explicación "queja somática en contexto de patología psiquiátrica" es posible, pero está recibiendo un peso que no proviene de los datos de hoy sino del estigma: nada en la taquicardia es psiquiátrico. El fenómeno tiene nombre —ensombrecimiento diagnóstico: atribuir los síntomas físicos a la enfermedad mental— y consecuencias medibles: las personas con enfermedad mental grave mueren 15 a 20 años antes, en gran parte por enfermedad física subdiagnosticada y subtratada (Thornicroft, 2011).</w:t>
+      </w:r>
+    </w:p>
+    <w:p>
+      <w:pPr>
+        <w:pStyle w:val="BodyJ"/>
+      </w:pPr>
+      <w:r>
+        <w:rPr>
+          <w:i/>
+          <w:iCs/>
+        </w:rPr>
+        <w:t xml:space="preserve">Incertidumbre:</w:t>
+      </w:r>
+      <w:r>
+        <w:t xml:space="preserve"> la peligrosa es un abdomen quirúrgico enmascarado — por el antipsicótico, por la dificultad comunicativa y por la disposición del equipo a cerrar temprano. Es exactamente el caso donde el examen "poco confiable" obliga a más objetividad, no a menos: laboratorio e imagen deciden lo que la palpación no puede.</w:t>
+      </w:r>
+    </w:p>
+    <w:p>
+      <w:pPr>
+        <w:pStyle w:val="BodyJ"/>
+      </w:pPr>
+      <w:r>
+        <w:rPr>
+          <w:i/>
+          <w:iCs/>
+        </w:rPr>
+        <w:t xml:space="preserve">Decisión:</w:t>
+      </w:r>
+      <w:r>
+        <w:t xml:space="preserve"> mismo estándar que para cualquier paciente con dolor abdominal y taquicardia — laboratorio completo, imagen según hallazgos, reevaluación programada— más un estándar adicional: documentar explícitamente que la evaluación fue limitada y por qué, para que el siguiente lector no herede "abdomen negativo" donde hubo "abdomen no evaluable". La etiqueta "somatiza" no entra a la ficha sin procedencia.</w:t>
+      </w:r>
+    </w:p>
+    <w:p>
+      <w:pPr>
+        <w:pStyle w:val="BodyJ"/>
+      </w:pPr>
+      <w:r>
+        <w:rPr>
+          <w:i/>
+          <w:iCs/>
+        </w:rPr>
+        <w:t xml:space="preserve">Frase medular:</w:t>
+      </w:r>
+      <w:r>
+        <w:t xml:space="preserve"> "Dolor abdominal y taquicardia sostenida en paciente con esquizofrenia: examen abdominal limitado —no negativo— y expresión clínica posiblemente atenuada por antipsicóticos; se estudia con el estándar completo, dejando registrado que la atribución psiquiátrica del cuadro exigiría primero excluir lo que la taquicardia sugiere."</w:t>
+      </w:r>
+    </w:p>
+    <w:p>
+      <w:pPr>
+        <w:pStyle w:val="BodyJ"/>
+      </w:pPr>
+      <w:r>
+        <w:rPr>
+          <w:i/>
+          <w:iCs/>
+        </w:rPr>
+        <w:t xml:space="preserve">Lectura metacognitiva.</w:t>
+      </w:r>
+      <w:r>
+        <w:t xml:space="preserve"> Esta viñeta es el capítulo 15 con mortalidad: la injusticia testimonial —descontar el relato por quién lo dice— aquí no es sólo un agravio moral sino un mecanismo causal de la brecha de 15 a 20 años de vida. Nótese el movimiento epistémico central: cuando el testimonio y el examen valen menos de lo habitual, el estándar de estudio objetivo sube en compensación. El ensombrecimiento hace exactamente lo contrario — usa la dificultad como excusa para bajar el estándar — y por eso mata.</w:t>
+      </w:r>
+    </w:p>
+    <w:p>
+      <w:pPr>
+        <w:pStyle w:val="Heading3"/>
+        <w:spacing w:after="120" w:before="280"/>
+      </w:pPr>
+      <w:r>
+        <w:rPr>
+          <w:rFonts w:ascii="Georgia" w:cs="Georgia" w:eastAsia="Georgia" w:hAnsi="Georgia"/>
+          <w:b/>
+          <w:bCs/>
+          <w:color w:val="2B2B2B"/>
+          <w:sz w:val="25"/>
+          <w:szCs w:val="25"/>
+        </w:rPr>
+        <w:t xml:space="preserve">Lo común a las diez viñetas</w:t>
+      </w:r>
+    </w:p>
+    <w:p>
+      <w:pPr>
+        <w:pStyle w:val="BodyJ"/>
+      </w:pPr>
+      <w:r>
+        <w:t xml:space="preserve">En cada caso, la buena formulación evita dos extremos: describir sin interpretar o interpretar como si se hubiera observado directamente. El hecho guía la hipótesis; la incertidumbre modula su fuerza; la consecuencia define la decisión; la evolución conserva el derecho a corregir. Y en todas —de la urgencia de las 3:00 al final de la vida, del lactante que no habla a la paciente a la que no se le cree— la decisión termina con la misma cláusula: qué la haría cambiar, quién lo detectará y cuándo.</w:t>
       </w:r>
     </w:p>
     <w:p>
@@ -9935,7 +10450,7 @@
           <w:sz w:val="22"/>
           <w:szCs w:val="22"/>
         </w:rPr>
-        <w:t xml:space="preserve">Capítulo 16</w:t>
+        <w:t xml:space="preserve">Capítulo 17</w:t>
       </w:r>
       <w:r>
         <w:rPr>
@@ -10054,7 +10569,7 @@
         <w:pStyle w:val="BodyJ"/>
       </w:pPr>
       <w:r>
-        <w:t xml:space="preserve">La posición de este libro es intermedia, pero no equidistante. Con los escépticos: no existe una habilidad general de "pensar bien" que flote por encima del conocimiento; la representación rica del problema —illness scripts, experiencia con feedback— es la condición de todo lo demás, y ningún método, HII-D incluido, compensa no saber medicina. Contra el escepticismo total: de esa evidencia no se sigue que la única intervención posible sea enseñar más contenido. Lo que este libro propone no es vigilancia interna permanente ni listas universales —las versiones que la evidencia ha desinflado—, sino artefactos externos y selectivos: un lenguaje que obliga a graduar afirmaciones, una estructura de nota que conserva las capas, pausas activadas por disparadores definidos y circuitos de feedback que conviertan experiencia en calibración. Es una apuesta con compromisos observables (véase el capítulo 15): si estas herramientas no cambian conductas medibles, deben abandonarse como cualquier hipótesis mimada. Entre tanto, la controversia se enseña mejor de lo que se oculta: un residente que conoce el debate sabrá desconfiar por igual del catálogo de sesgos como solución universal y del nihilismo pedagógico como coartada.</w:t>
+        <w:t xml:space="preserve">La posición de este libro es intermedia, pero no equidistante. Con los escépticos: no existe una habilidad general de "pensar bien" que flote por encima del conocimiento; la representación rica del problema —illness scripts, experiencia con feedback— es la condición de todo lo demás, y ningún método, HII-D incluido, compensa no saber medicina. Contra el escepticismo total: de esa evidencia no se sigue que la única intervención posible sea enseñar más contenido. Lo que este libro propone no es vigilancia interna permanente ni listas universales —las versiones que la evidencia ha desinflado—, sino artefactos externos y selectivos: un lenguaje que obliga a graduar afirmaciones, una estructura de nota que conserva las capas, pausas activadas por disparadores definidos y circuitos de feedback que conviertan experiencia en calibración. Es una apuesta con compromisos observables (véase el capítulo 16): si estas herramientas no cambian conductas medibles, deben abandonarse como cualquier hipótesis mimada. Entre tanto, la controversia se enseña mejor de lo que se oculta: un residente que conoce el debate sabrá desconfiar por igual del catálogo de sesgos como solución universal y del nihilismo pedagógico como coartada.</w:t>
       </w:r>
     </w:p>
     <w:p>
@@ -10372,7 +10887,7 @@
         <w:pStyle w:val="BodyJ"/>
         <w:numPr>
           <w:ilvl w:val="0"/>
-          <w:numId w:val="24"/>
+          <w:numId w:val="25"/>
         </w:numPr>
       </w:pPr>
       <w:r>
@@ -10384,7 +10899,7 @@
         <w:pStyle w:val="BodyJ"/>
         <w:numPr>
           <w:ilvl w:val="0"/>
-          <w:numId w:val="24"/>
+          <w:numId w:val="25"/>
         </w:numPr>
       </w:pPr>
       <w:r>
@@ -10396,7 +10911,7 @@
         <w:pStyle w:val="BodyJ"/>
         <w:numPr>
           <w:ilvl w:val="0"/>
-          <w:numId w:val="24"/>
+          <w:numId w:val="25"/>
         </w:numPr>
       </w:pPr>
       <w:r>
@@ -11031,7 +11546,7 @@
         <w:pStyle w:val="BodyJ"/>
         <w:numPr>
           <w:ilvl w:val="0"/>
-          <w:numId w:val="25"/>
+          <w:numId w:val="26"/>
         </w:numPr>
       </w:pPr>
       <w:r>
@@ -11043,7 +11558,7 @@
         <w:pStyle w:val="BodyJ"/>
         <w:numPr>
           <w:ilvl w:val="0"/>
-          <w:numId w:val="25"/>
+          <w:numId w:val="26"/>
         </w:numPr>
       </w:pPr>
       <w:r>
@@ -11055,7 +11570,7 @@
         <w:pStyle w:val="BodyJ"/>
         <w:numPr>
           <w:ilvl w:val="0"/>
-          <w:numId w:val="25"/>
+          <w:numId w:val="26"/>
         </w:numPr>
       </w:pPr>
       <w:r>
@@ -11067,7 +11582,7 @@
         <w:pStyle w:val="BodyJ"/>
         <w:numPr>
           <w:ilvl w:val="0"/>
-          <w:numId w:val="25"/>
+          <w:numId w:val="26"/>
         </w:numPr>
       </w:pPr>
       <w:r>
@@ -12346,7 +12861,7 @@
         <w:pStyle w:val="BodyJ"/>
         <w:numPr>
           <w:ilvl w:val="0"/>
-          <w:numId w:val="26"/>
+          <w:numId w:val="27"/>
         </w:numPr>
       </w:pPr>
       <w:r>
@@ -12358,7 +12873,7 @@
         <w:pStyle w:val="BodyJ"/>
         <w:numPr>
           <w:ilvl w:val="0"/>
-          <w:numId w:val="26"/>
+          <w:numId w:val="27"/>
         </w:numPr>
       </w:pPr>
       <w:r>
@@ -12370,7 +12885,7 @@
         <w:pStyle w:val="BodyJ"/>
         <w:numPr>
           <w:ilvl w:val="0"/>
-          <w:numId w:val="26"/>
+          <w:numId w:val="27"/>
         </w:numPr>
       </w:pPr>
       <w:r>
@@ -12382,7 +12897,7 @@
         <w:pStyle w:val="BodyJ"/>
         <w:numPr>
           <w:ilvl w:val="0"/>
-          <w:numId w:val="26"/>
+          <w:numId w:val="27"/>
         </w:numPr>
       </w:pPr>
       <w:r>
@@ -12394,7 +12909,7 @@
         <w:pStyle w:val="BodyJ"/>
         <w:numPr>
           <w:ilvl w:val="0"/>
-          <w:numId w:val="26"/>
+          <w:numId w:val="27"/>
         </w:numPr>
       </w:pPr>
       <w:r>
@@ -12406,7 +12921,7 @@
         <w:pStyle w:val="BodyJ"/>
         <w:numPr>
           <w:ilvl w:val="0"/>
-          <w:numId w:val="26"/>
+          <w:numId w:val="27"/>
         </w:numPr>
       </w:pPr>
       <w:r>
@@ -12418,7 +12933,7 @@
         <w:pStyle w:val="BodyJ"/>
         <w:numPr>
           <w:ilvl w:val="0"/>
-          <w:numId w:val="26"/>
+          <w:numId w:val="27"/>
         </w:numPr>
       </w:pPr>
       <w:r>
@@ -12430,7 +12945,7 @@
         <w:pStyle w:val="BodyJ"/>
         <w:numPr>
           <w:ilvl w:val="0"/>
-          <w:numId w:val="26"/>
+          <w:numId w:val="27"/>
         </w:numPr>
       </w:pPr>
       <w:r>
@@ -12442,7 +12957,7 @@
         <w:pStyle w:val="BodyJ"/>
         <w:numPr>
           <w:ilvl w:val="0"/>
-          <w:numId w:val="26"/>
+          <w:numId w:val="27"/>
         </w:numPr>
       </w:pPr>
       <w:r>
@@ -12454,7 +12969,7 @@
         <w:pStyle w:val="BodyJ"/>
         <w:numPr>
           <w:ilvl w:val="0"/>
-          <w:numId w:val="26"/>
+          <w:numId w:val="27"/>
         </w:numPr>
       </w:pPr>
       <w:r>
@@ -12466,7 +12981,7 @@
         <w:pStyle w:val="BodyJ"/>
         <w:numPr>
           <w:ilvl w:val="0"/>
-          <w:numId w:val="26"/>
+          <w:numId w:val="27"/>
         </w:numPr>
       </w:pPr>
       <w:r>
@@ -12478,7 +12993,7 @@
         <w:pStyle w:val="BodyJ"/>
         <w:numPr>
           <w:ilvl w:val="0"/>
-          <w:numId w:val="26"/>
+          <w:numId w:val="27"/>
         </w:numPr>
       </w:pPr>
       <w:r>
@@ -12508,7 +13023,7 @@
         <w:pStyle w:val="BodyJ"/>
       </w:pPr>
       <w:r>
-        <w:t xml:space="preserve">Esta guía condensa el capítulo 16 en un plan concreto para un servicio que quiera adoptar el lenguaje y las prácticas del libro. Está pensada para un jefe de servicio, un programa de residencia o un grupo de clínicos con voluntad y poco tiempo. Tres advertencias previas: nada de esto está validado como tecnología (véase el capítulo 15, "Límites"); todo debe adaptarse al contexto local; y la palanca más barata —cómo se habla en la ronda— es también la más poderosa.</w:t>
+        <w:t xml:space="preserve">Esta guía condensa el capítulo 17 en un plan concreto para un servicio que quiera adoptar el lenguaje y las prácticas del libro. Está pensada para un jefe de servicio, un programa de residencia o un grupo de clínicos con voluntad y poco tiempo. Tres advertencias previas: nada de esto está validado como tecnología (véase el capítulo 16, "Límites"); todo debe adaptarse al contexto local; y la palanca más barata —cómo se habla en la ronda— es también la más poderosa.</w:t>
       </w:r>
     </w:p>
     <w:p>
@@ -13033,6 +13548,21 @@
           <w:b/>
           <w:bCs/>
         </w:rPr>
+        <w:t xml:space="preserve">Documentación defensiva.</w:t>
+      </w:r>
+      <w:r>
+        <w:t xml:space="preserve"> Escritura clínica orientada a un lector jurídico imaginario y no al siguiente clínico: omite dudas, multiplica constancias y prefiere la vaguedad. Corruptor epistémico que, además, protege menos que la trazabilidad honesta.</w:t>
+      </w:r>
+    </w:p>
+    <w:p>
+      <w:pPr>
+        <w:pStyle w:val="BodyJ"/>
+      </w:pPr>
+      <w:r>
+        <w:rPr>
+          <w:b/>
+          <w:bCs/>
+        </w:rPr>
         <w:t xml:space="preserve">Encapsulación.</w:t>
       </w:r>
       <w:r>
@@ -13048,6 +13578,21 @@
           <w:b/>
           <w:bCs/>
         </w:rPr>
+        <w:t xml:space="preserve">Ensombrecimiento diagnóstico.</w:t>
+      </w:r>
+      <w:r>
+        <w:t xml:space="preserve"> Atribución de síntomas físicos a la enfermedad mental de base, con el consiguiente subdiagnóstico somático; contribuye a la mortalidad prematura en salud mental (Thornicroft).</w:t>
+      </w:r>
+    </w:p>
+    <w:p>
+      <w:pPr>
+        <w:pStyle w:val="BodyJ"/>
+      </w:pPr>
+      <w:r>
+        <w:rPr>
+          <w:b/>
+          <w:bCs/>
+        </w:rPr>
         <w:t xml:space="preserve">Frase medular.</w:t>
       </w:r>
       <w:r>
@@ -13292,6 +13837,21 @@
       </w:r>
       <w:r>
         <w:t xml:space="preserve"> Instrucciones explícitas de reconsulta y vigilancia que acompañan una decisión tomada bajo incertidumbre, especialmente en ambulatorio.</w:t>
+      </w:r>
+    </w:p>
+    <w:p>
+      <w:pPr>
+        <w:pStyle w:val="BodyJ"/>
+      </w:pPr>
+      <w:r>
+        <w:rPr>
+          <w:b/>
+          <w:bCs/>
+        </w:rPr>
+        <w:t xml:space="preserve">Segunda víctima.</w:t>
+      </w:r>
+      <w:r>
+        <w:t xml:space="preserve"> El clínico dañado por su propio error —culpa, vergüenza, aislamiento— (Wu). Su cuidado no es indulgencia: sin él no hay análisis de trayectoria ni aprendizaje del error.</w:t>
       </w:r>
     </w:p>
     <w:p>
@@ -13401,7 +13961,7 @@
         </w:numPr>
       </w:pPr>
       <w:r>
-        <w:t xml:space="preserve">Anclaje — 7, 10, CC (viñeta 8)</w:t>
+        <w:t xml:space="preserve">Anclaje — 7, 11, CC (viñeta 8)</w:t>
       </w:r>
     </w:p>
     <w:p>
@@ -13425,7 +13985,7 @@
         </w:numPr>
       </w:pPr>
       <w:r>
-        <w:t xml:space="preserve">Autoridad revisable — 7, 12, 14</w:t>
+        <w:t xml:space="preserve">Autoridad revisable — 7, 13, 15</w:t>
       </w:r>
     </w:p>
     <w:p>
@@ -13437,7 +13997,7 @@
         </w:numPr>
       </w:pPr>
       <w:r>
-        <w:t xml:space="preserve">Calibración — 5, 15, 16, Ap C</w:t>
+        <w:t xml:space="preserve">Calibración — 5, 16, 17, Ap C</w:t>
       </w:r>
     </w:p>
     <w:p>
@@ -13461,7 +14021,7 @@
         </w:numPr>
       </w:pPr>
       <w:r>
-        <w:t xml:space="preserve">Cierre prematuro — 7, CC (viñeta 8)</w:t>
+        <w:t xml:space="preserve">Cierre prematuro — 2, 7, CC (viñeta 8)</w:t>
       </w:r>
     </w:p>
     <w:p>
@@ -13473,7 +14033,7 @@
         </w:numPr>
       </w:pPr>
       <w:r>
-        <w:t xml:space="preserve">Cognición distribuida — 12</w:t>
+        <w:t xml:space="preserve">Cognición distribuida — 13</w:t>
       </w:r>
     </w:p>
     <w:p>
@@ -13485,7 +14045,7 @@
         </w:numPr>
       </w:pPr>
       <w:r>
-        <w:t xml:space="preserve">Comunicación de incertidumbre — 12, 14, CC (viñeta 7)</w:t>
+        <w:t xml:space="preserve">Comunicación de incertidumbre — 13, 15, CC (viñeta 7)</w:t>
       </w:r>
     </w:p>
     <w:p>
@@ -13509,7 +14069,7 @@
         </w:numPr>
       </w:pPr>
       <w:r>
-        <w:t xml:space="preserve">Contrafactuales — 10</w:t>
+        <w:t xml:space="preserve">Contrafactuales — 11</w:t>
       </w:r>
     </w:p>
     <w:p>
@@ -13521,7 +14081,7 @@
         </w:numPr>
       </w:pPr>
       <w:r>
-        <w:t xml:space="preserve">Copiado de notas (fósil narrativo) — 11, Ap C</w:t>
+        <w:t xml:space="preserve">Copiado de notas (fósil narrativo) — 12, Ap C</w:t>
       </w:r>
     </w:p>
     <w:p>
@@ -13545,7 +14105,7 @@
         </w:numPr>
       </w:pPr>
       <w:r>
-        <w:t xml:space="preserve">Debate sobre la enseñanza del razonamiento (Croskerry vs. Norman/Monteiro) — 16</w:t>
+        <w:t xml:space="preserve">Debate sobre la enseñanza del razonamiento (Croskerry vs. Norman/Monteiro) — 17</w:t>
       </w:r>
     </w:p>
     <w:p>
@@ -13557,7 +14117,7 @@
         </w:numPr>
       </w:pPr>
       <w:r>
-        <w:t xml:space="preserve">Decisión compartida — 12, 14, Interludio III</w:t>
+        <w:t xml:space="preserve">Decisión compartida — 13, 15, Interludio III</w:t>
       </w:r>
     </w:p>
     <w:p>
@@ -13593,7 +14153,7 @@
         </w:numPr>
       </w:pPr>
       <w:r>
-        <w:t xml:space="preserve">Desacuerdo clínico — 12, Interludio III</w:t>
+        <w:t xml:space="preserve">Desacuerdo clínico — 13, Interludio III</w:t>
       </w:r>
     </w:p>
     <w:p>
@@ -13617,7 +14177,7 @@
         </w:numPr>
       </w:pPr>
       <w:r>
-        <w:t xml:space="preserve">Errores asimétricos — 9, CC (viñeta 5)</w:t>
+        <w:t xml:space="preserve">Documentación defensiva — 15</w:t>
       </w:r>
     </w:p>
     <w:p>
@@ -13629,7 +14189,7 @@
         </w:numPr>
       </w:pPr>
       <w:r>
-        <w:t xml:space="preserve">Falsabilidad del método HII-D — 15</w:t>
+        <w:t xml:space="preserve">Ensombrecimiento diagnóstico — CC (viñeta 10)</w:t>
       </w:r>
     </w:p>
     <w:p>
@@ -13641,6 +14201,18 @@
         </w:numPr>
       </w:pPr>
       <w:r>
+        <w:t xml:space="preserve">Errores asimétricos — 10, CC (viñeta 5)</w:t>
+      </w:r>
+    </w:p>
+    <w:p>
+      <w:pPr>
+        <w:pStyle w:val="BodyJ"/>
+        <w:numPr>
+          <w:ilvl w:val="0"/>
+          <w:numId w:val="6"/>
+        </w:numPr>
+      </w:pPr>
+      <w:r>
         <w:t xml:space="preserve">Evidencia poblacional y particularización — 9</w:t>
       </w:r>
     </w:p>
@@ -13653,7 +14225,7 @@
         </w:numPr>
       </w:pPr>
       <w:r>
-        <w:t xml:space="preserve">Feedback diagnóstico — 5, 16, Ap C</w:t>
+        <w:t xml:space="preserve">Falsabilidad del método HII-D — 16</w:t>
       </w:r>
     </w:p>
     <w:p>
@@ -13665,7 +14237,7 @@
         </w:numPr>
       </w:pPr>
       <w:r>
-        <w:t xml:space="preserve">Ficha como dispositivo que produce lo visible (Foucault) — 11</w:t>
+        <w:t xml:space="preserve">Feedback diagnóstico — 5, 17, Ap C</w:t>
       </w:r>
     </w:p>
     <w:p>
@@ -13677,7 +14249,7 @@
         </w:numPr>
       </w:pPr>
       <w:r>
-        <w:t xml:space="preserve">Fichas clínicas y plantillas — 11, 16, Ap C</w:t>
+        <w:t xml:space="preserve">Ficha como dispositivo que produce lo visible (Foucault) — 12</w:t>
       </w:r>
     </w:p>
     <w:p>
@@ -13689,7 +14261,7 @@
         </w:numPr>
       </w:pPr>
       <w:r>
-        <w:t xml:space="preserve">Frase medular — 4, 11, C, CC (todas las viñetas)</w:t>
+        <w:t xml:space="preserve">Fichas clínicas y plantillas — 12, 17, Ap C</w:t>
       </w:r>
     </w:p>
     <w:p>
@@ -13701,7 +14273,7 @@
         </w:numPr>
       </w:pPr>
       <w:r>
-        <w:t xml:space="preserve">Frecuencias naturales — 2, 9, 12</w:t>
+        <w:t xml:space="preserve">Frase medular — 4, 12, C, CC (todas las viñetas)</w:t>
       </w:r>
     </w:p>
     <w:p>
@@ -13713,6 +14285,18 @@
         </w:numPr>
       </w:pPr>
       <w:r>
+        <w:t xml:space="preserve">Frecuencias naturales — 2, 10, 13</w:t>
+      </w:r>
+    </w:p>
+    <w:p>
+      <w:pPr>
+        <w:pStyle w:val="BodyJ"/>
+        <w:numPr>
+          <w:ilvl w:val="0"/>
+          <w:numId w:val="6"/>
+        </w:numPr>
+      </w:pPr>
+      <w:r>
         <w:t xml:space="preserve">Grados de facticidad — 1</w:t>
       </w:r>
     </w:p>
@@ -13725,7 +14309,7 @@
         </w:numPr>
       </w:pPr>
       <w:r>
-        <w:t xml:space="preserve">Hindsight bias — 8, 10, 16, CC (viñeta 8)</w:t>
+        <w:t xml:space="preserve">Hindsight bias — 8, 11, 17, CC (viñeta 8)</w:t>
       </w:r>
     </w:p>
     <w:p>
@@ -13737,7 +14321,7 @@
         </w:numPr>
       </w:pPr>
       <w:r>
-        <w:t xml:space="preserve">HII-D (método) — 11, 15, Ap A; auditoría de IA con — 13</w:t>
+        <w:t xml:space="preserve">HII-D (método) — 12, 16, Ap A; auditoría de IA con — 14</w:t>
       </w:r>
     </w:p>
     <w:p>
@@ -13749,7 +14333,7 @@
         </w:numPr>
       </w:pPr>
       <w:r>
-        <w:t xml:space="preserve">Humildad epistémica como motor (explorar, aprender, reenfocar) — 14</w:t>
+        <w:t xml:space="preserve">Humildad epistémica como motor (explorar, aprender, reenfocar) — 15</w:t>
       </w:r>
     </w:p>
     <w:p>
@@ -13761,7 +14345,7 @@
         </w:numPr>
       </w:pPr>
       <w:r>
-        <w:t xml:space="preserve">Illness scripts — 2, 6, 16</w:t>
+        <w:t xml:space="preserve">Illness scripts — 2, 6, 17</w:t>
       </w:r>
     </w:p>
     <w:p>
@@ -13785,7 +14369,7 @@
         </w:numPr>
       </w:pPr>
       <w:r>
-        <w:t xml:space="preserve">Injusticia epistémica — 14</w:t>
+        <w:t xml:space="preserve">Injusticia epistémica — 15, CC (viñeta 10)</w:t>
       </w:r>
     </w:p>
     <w:p>
@@ -13809,7 +14393,7 @@
         </w:numPr>
       </w:pPr>
       <w:r>
-        <w:t xml:space="preserve">Lectura de ensayos clínicos (significación, reanálisis bayesiano, saga ANDROMEDA) — 9</w:t>
+        <w:t xml:space="preserve">Lectura de ensayos clínicos (significación, reanálisis bayesiano, saga ANDROMEDA) — 10</w:t>
       </w:r>
     </w:p>
     <w:p>
@@ -13833,7 +14417,7 @@
         </w:numPr>
       </w:pPr>
       <w:r>
-        <w:t xml:space="preserve">Marcador y enfermedad (lactato, perfusión, ANDROMEDA-SHOCK) — 1, 9</w:t>
+        <w:t xml:space="preserve">Marcador y enfermedad (lactato, perfusión, ANDROMEDA-SHOCK) — 1, 10</w:t>
       </w:r>
     </w:p>
     <w:p>
@@ -13857,7 +14441,7 @@
         </w:numPr>
       </w:pPr>
       <w:r>
-        <w:t xml:space="preserve">Metacognición: definición y niveles — Int, 5; sensibilidad vs. sesgo — Int, 5; artificial — 13</w:t>
+        <w:t xml:space="preserve">Meta-d′ y medición de la metacognición — 5</w:t>
       </w:r>
     </w:p>
     <w:p>
@@ -13869,7 +14453,7 @@
         </w:numPr>
       </w:pPr>
       <w:r>
-        <w:t xml:space="preserve">Meta-d′ y medición de la metacognición — 5</w:t>
+        <w:t xml:space="preserve">Metacognición: definición y niveles — Int, 5; sensibilidad vs. sesgo — Int, 5; artificial — 14</w:t>
       </w:r>
     </w:p>
     <w:p>
@@ -13881,7 +14465,7 @@
         </w:numPr>
       </w:pPr>
       <w:r>
-        <w:t xml:space="preserve">Observación activa — 9, 10</w:t>
+        <w:t xml:space="preserve">Miedo y decisión (documentación defensiva, sobreestudio) — 3, 15</w:t>
       </w:r>
     </w:p>
     <w:p>
@@ -13893,7 +14477,7 @@
         </w:numPr>
       </w:pPr>
       <w:r>
-        <w:t xml:space="preserve">Pausa diagnóstica — 8, 16, Ap B, Ap C</w:t>
+        <w:t xml:space="preserve">Observación activa — 10, 11</w:t>
       </w:r>
     </w:p>
     <w:p>
@@ -13905,6 +14489,18 @@
         </w:numPr>
       </w:pPr>
       <w:r>
+        <w:t xml:space="preserve">Pausa diagnóstica — 8, 17, Ap B, Ap C</w:t>
+      </w:r>
+    </w:p>
+    <w:p>
+      <w:pPr>
+        <w:pStyle w:val="BodyJ"/>
+        <w:numPr>
+          <w:ilvl w:val="0"/>
+          <w:numId w:val="6"/>
+        </w:numPr>
+      </w:pPr>
+      <w:r>
         <w:t xml:space="preserve">Pericia y práctica deliberada — 6</w:t>
       </w:r>
     </w:p>
@@ -13917,7 +14513,7 @@
         </w:numPr>
       </w:pPr>
       <w:r>
-        <w:t xml:space="preserve">Phronesis — 6, 14</w:t>
+        <w:t xml:space="preserve">Phronesis — 6, 15</w:t>
       </w:r>
     </w:p>
     <w:p>
@@ -13953,7 +14549,7 @@
         </w:numPr>
       </w:pPr>
       <w:r>
-        <w:t xml:space="preserve">Puntos de inflexión — 10, Interludio III</w:t>
+        <w:t xml:space="preserve">Puntos de inflexión — 11, Interludio III</w:t>
       </w:r>
     </w:p>
     <w:p>
@@ -13965,7 +14561,7 @@
         </w:numPr>
       </w:pPr>
       <w:r>
-        <w:t xml:space="preserve">Representación del problema — Int, 2, 8, 16</w:t>
+        <w:t xml:space="preserve">Representación del problema — Int, 2, 8, 17</w:t>
       </w:r>
     </w:p>
     <w:p>
@@ -13977,7 +14573,7 @@
         </w:numPr>
       </w:pPr>
       <w:r>
-        <w:t xml:space="preserve">Riesgo inductivo (Rudner, Douglas) — 9</w:t>
+        <w:t xml:space="preserve">Riesgo inductivo (Rudner, Douglas) — 10</w:t>
       </w:r>
     </w:p>
     <w:p>
@@ -13989,7 +14585,7 @@
         </w:numPr>
       </w:pPr>
       <w:r>
-        <w:t xml:space="preserve">Safety-netting — 10, CC (viñetas 5 y 6)</w:t>
+        <w:t xml:space="preserve">Safety-netting — 11, CC (viñetas 5, 6 y 9)</w:t>
       </w:r>
     </w:p>
     <w:p>
@@ -14001,6 +14597,18 @@
         </w:numPr>
       </w:pPr>
       <w:r>
+        <w:t xml:space="preserve">Segunda víctima — 15</w:t>
+      </w:r>
+    </w:p>
+    <w:p>
+      <w:pPr>
+        <w:pStyle w:val="BodyJ"/>
+        <w:numPr>
+          <w:ilvl w:val="0"/>
+          <w:numId w:val="6"/>
+        </w:numPr>
+      </w:pPr>
+      <w:r>
         <w:t xml:space="preserve">Sesgos cognitivos: alcance y límites del vocabulario — 7</w:t>
       </w:r>
     </w:p>
@@ -14037,7 +14645,7 @@
         </w:numPr>
       </w:pPr>
       <w:r>
-        <w:t xml:space="preserve">Testimonio del paciente — 1, 14; epistemología del testimonio (Coady, Lackey) — 14</w:t>
+        <w:t xml:space="preserve">Testimonio del paciente — 1, 15; epistemología del testimonio (Coady, Lackey) — 15; testimonio de terceros y cuidadores — CC (viñeta 9)</w:t>
       </w:r>
     </w:p>
     <w:p>
@@ -14049,7 +14657,7 @@
         </w:numPr>
       </w:pPr>
       <w:r>
-        <w:t xml:space="preserve">Trayectoria y temporalidad — 10, Interludio I</w:t>
+        <w:t xml:space="preserve">Trayectoria y temporalidad — 11, Interludio I</w:t>
       </w:r>
     </w:p>
     <w:p>
@@ -14061,7 +14669,7 @@
         </w:numPr>
       </w:pPr>
       <w:r>
-        <w:t xml:space="preserve">Umbrales de decisión — 9, Interludio III, CC (viñeta 5)</w:t>
+        <w:t xml:space="preserve">Umbrales de decisión — 10, Interludio III, CC (viñeta 5)</w:t>
       </w:r>
     </w:p>
     <w:p>
@@ -15953,6 +16561,24 @@
         <w:pStyle w:val="BodyJ"/>
       </w:pPr>
       <w:r>
+        <w:t xml:space="preserve">Thornicroft, G. (2011). Physical health disparities and mental illness: The scandal of premature mortality. </w:t>
+      </w:r>
+      <w:r>
+        <w:rPr>
+          <w:i/>
+          <w:iCs/>
+        </w:rPr>
+        <w:t xml:space="preserve">British Journal of Psychiatry, 199</w:t>
+      </w:r>
+      <w:r>
+        <w:t xml:space="preserve">(6), 441–442.</w:t>
+      </w:r>
+    </w:p>
+    <w:p>
+      <w:pPr>
+        <w:pStyle w:val="BodyJ"/>
+      </w:pPr>
+      <w:r>
         <w:t xml:space="preserve">Tonelli, M. R. (1998). The philosophical limits of evidence-based medicine. </w:t>
       </w:r>
       <w:r>
@@ -15989,6 +16615,24 @@
         <w:pStyle w:val="BodyJ"/>
       </w:pPr>
       <w:r>
+        <w:t xml:space="preserve">Van den Bruel, A., Thompson, M., Buntinx, F., &amp; Mant, D. (2012). Clinicians' gut feeling about serious infections in children: Observational study. </w:t>
+      </w:r>
+      <w:r>
+        <w:rPr>
+          <w:i/>
+          <w:iCs/>
+        </w:rPr>
+        <w:t xml:space="preserve">BMJ, 345</w:t>
+      </w:r>
+      <w:r>
+        <w:t xml:space="preserve">, e6144.</w:t>
+      </w:r>
+    </w:p>
+    <w:p>
+      <w:pPr>
+        <w:pStyle w:val="BodyJ"/>
+      </w:pPr>
+      <w:r>
         <w:t xml:space="preserve">Weed, L. L. (1968a). Medical records that guide and teach. </w:t>
       </w:r>
       <w:r>
@@ -16072,6 +16716,24 @@
       </w:r>
       <w:r>
         <w:t xml:space="preserve">. World Health Organization.</w:t>
+      </w:r>
+    </w:p>
+    <w:p>
+      <w:pPr>
+        <w:pStyle w:val="BodyJ"/>
+      </w:pPr>
+      <w:r>
+        <w:t xml:space="preserve">Wu, A. W. (2000). Medical error: The second victim. The doctor who makes the mistake needs help too. </w:t>
+      </w:r>
+      <w:r>
+        <w:rPr>
+          <w:i/>
+          <w:iCs/>
+        </w:rPr>
+        <w:t xml:space="preserve">BMJ, 320</w:t>
+      </w:r>
+      <w:r>
+        <w:t xml:space="preserve">(7237), 726–727.</w:t>
       </w:r>
     </w:p>
     <w:p>
@@ -16619,6 +17281,18 @@
     </w:lvl>
   </w:abstractNum>
   <w:abstractNum w:abstractNumId="26" w15:restartNumberingAfterBreak="0">
+    <w:multiLevelType w:val="hybridMultilevel"/>
+    <w:lvl w:ilvl="0" w15:tentative="1">
+      <w:start w:val="1"/>
+      <w:numFmt w:val="decimal"/>
+      <w:lvlText w:val="%1."/>
+      <w:lvlJc w:val="left"/>
+      <w:pPr>
+        <w:ind w:left="560" w:hanging="280"/>
+      </w:pPr>
+    </w:lvl>
+  </w:abstractNum>
+  <w:abstractNum w:abstractNumId="27" w15:restartNumberingAfterBreak="0">
     <w:multiLevelType w:val="hybridMultilevel"/>
     <w:lvl w:ilvl="0" w15:tentative="1">
       <w:start w:val="1"/>
@@ -16782,6 +17456,12 @@
   </w:num>
   <w:num w:numId="26">
     <w:abstractNumId w:val="26"/>
+    <w:lvlOverride w:ilvl="0">
+      <w:startOverride w:val="1"/>
+    </w:lvlOverride>
+  </w:num>
+  <w:num w:numId="27">
+    <w:abstractNumId w:val="27"/>
     <w:lvlOverride w:ilvl="0">
       <w:startOverride w:val="1"/>
     </w:lvlOverride>

</xml_diff>

<commit_message>
libro: cap. 18 — la palabra exacta (poesía y juicio clínico)
Huidobro (Arte poética, 1916: la palabra que crea) contra Parra
(Manifiesto/Obra gruesa: la deflación antipoética) como los dos polos de
lo que la frase clínica puede permitirse; la metáfora como abducción; la
belleza como señal y como trampa; la prueba de Parra como Taller 18.

Co-Authored-By: Claude Fable 5 <noreply@anthropic.com>
Claude-Session: https://claude.ai/code/session_01SPkhDdVzUCxJwqq61ddeLW
</commit_message>
<xml_diff>
--- a/libro/Hechos_inferencias_incertidumbre_edicion_revisada.docx
+++ b/libro/Hechos_inferencias_incertidumbre_edicion_revisada.docx
@@ -732,6 +732,26 @@
     </w:p>
     <w:p>
       <w:pPr>
+        <w:pStyle w:val="TocEntry"/>
+        <w:tabs>
+          <w:tab w:val="right" w:pos="9026" w:leader="dot"/>
+        </w:tabs>
+      </w:pPr>
+      <w:r>
+        <w:t xml:space="preserve">Capítulo 18. La palabra exacta: lo que la poesía sabe del juicio clínico</w:t>
+      </w:r>
+      <w:r>
+        <w:tab/>
+      </w:r>
+      <w:r>
+        <w:rPr>
+          <w:color w:val="8A8A8A"/>
+        </w:rPr>
+        <w:t xml:space="preserve">93</w:t>
+      </w:r>
+    </w:p>
+    <w:p>
+      <w:pPr>
         <w:pStyle w:val="TocPart"/>
         <w:tabs>
           <w:tab w:val="right" w:pos="9026" w:leader="dot"/>
@@ -747,7 +767,7 @@
         <w:rPr>
           <w:color w:val="8A8A8A"/>
         </w:rPr>
-        <w:t xml:space="preserve">93</w:t>
+        <w:t xml:space="preserve">97</w:t>
       </w:r>
     </w:p>
     <w:p>
@@ -767,7 +787,7 @@
         <w:rPr>
           <w:color w:val="8A8A8A"/>
         </w:rPr>
-        <w:t xml:space="preserve">95</w:t>
+        <w:t xml:space="preserve">99</w:t>
       </w:r>
     </w:p>
     <w:p>
@@ -787,7 +807,7 @@
         <w:rPr>
           <w:color w:val="8A8A8A"/>
         </w:rPr>
-        <w:t xml:space="preserve">97</w:t>
+        <w:t xml:space="preserve">101</w:t>
       </w:r>
     </w:p>
     <w:p>
@@ -807,7 +827,7 @@
         <w:rPr>
           <w:color w:val="8A8A8A"/>
         </w:rPr>
-        <w:t xml:space="preserve">99</w:t>
+        <w:t xml:space="preserve">103</w:t>
       </w:r>
     </w:p>
     <w:p>
@@ -827,7 +847,7 @@
         <w:rPr>
           <w:color w:val="8A8A8A"/>
         </w:rPr>
-        <w:t xml:space="preserve">101</w:t>
+        <w:t xml:space="preserve">105</w:t>
       </w:r>
     </w:p>
     <w:p>
@@ -847,7 +867,7 @@
         <w:rPr>
           <w:color w:val="8A8A8A"/>
         </w:rPr>
-        <w:t xml:space="preserve">104</w:t>
+        <w:t xml:space="preserve">108</w:t>
       </w:r>
     </w:p>
     <w:p>
@@ -867,7 +887,7 @@
         <w:rPr>
           <w:color w:val="8A8A8A"/>
         </w:rPr>
-        <w:t xml:space="preserve">107</w:t>
+        <w:t xml:space="preserve">111</w:t>
       </w:r>
     </w:p>
     <w:p>
@@ -1049,7 +1069,7 @@
         <w:t xml:space="preserve">Parte IV</w:t>
       </w:r>
       <w:r>
-        <w:t xml:space="preserve"> propone una epistemología operativa: inteligencia artificial, responsabilidad —incluido el miedo que también escribe—, el método HII-D, un cuaderno de diez casos y la enseñanza de la metacognición clínica.</w:t>
+        <w:t xml:space="preserve"> propone una epistemología operativa: inteligencia artificial, responsabilidad —incluido el miedo que también escribe—, el método HII-D, un cuaderno de diez casos, la enseñanza de la metacognición clínica y un cierre desde la poesía chilena — Huidobro y Parra como los dos polos de lo que la palabra clínica puede y no puede permitirse.</w:t>
       </w:r>
     </w:p>
     <w:p>
@@ -7635,7 +7655,7 @@
         <w:pStyle w:val="PartIntro"/>
       </w:pPr>
       <w:r>
-        <w:t xml:space="preserve">Las tres primeras partes construyeron las herramientas; esta las pone a trabajar. Primero frente al espejo nuevo de la inteligencia artificial (capítulo 14) y frente a la responsabilidad —y el miedo— que ninguna herramienta puede delegar (capítulo 15). Luego, el método HII-D en forma completa y en versión de sesenta segundos (capítulo 16), un cuaderno de diez casos para leer metacognitivamente —incluida la resolución de la historia de Carmen—, y el problema de enseñar y organizar todo esto (capítulo 17).</w:t>
+        <w:t xml:space="preserve">Las tres primeras partes construyeron las herramientas; esta las pone a trabajar. Primero frente al espejo nuevo de la inteligencia artificial (capítulo 14) y frente a la responsabilidad —y el miedo— que ninguna herramienta puede delegar (capítulo 15). Luego, el método HII-D en forma completa y en versión de sesenta segundos (capítulo 16), un cuaderno de diez casos para leer metacognitivamente —incluida la resolución de la historia de Carmen—, el problema de enseñar y organizar todo esto (capítulo 17), y un último capítulo que se permite mirar el oficio desde la poesía — porque el debate sobre lo que la palabra tiene derecho a hacer también se libró en verso, y en Chile (capítulo 18).</w:t>
       </w:r>
     </w:p>
     <w:p>
@@ -10920,6 +10940,320 @@
     </w:p>
     <w:p>
       <w:pPr>
+        <w:pStyle w:val="Heading2"/>
+        <w:pageBreakBefore/>
+        <w:spacing w:after="300" w:before="600"/>
+      </w:pPr>
+      <w:r>
+        <w:rPr>
+          <w:rFonts w:ascii="Georgia" w:cs="Georgia" w:eastAsia="Georgia" w:hAnsi="Georgia"/>
+          <w:b/>
+          <w:bCs/>
+          <w:color w:val="8C2F2F"/>
+          <w:sz w:val="22"/>
+          <w:szCs w:val="22"/>
+        </w:rPr>
+        <w:t xml:space="preserve">Capítulo 18</w:t>
+      </w:r>
+      <w:r>
+        <w:rPr>
+          <w:rFonts w:ascii="Georgia" w:cs="Georgia" w:eastAsia="Georgia" w:hAnsi="Georgia"/>
+          <w:b/>
+          <w:bCs/>
+          <w:color w:val="3D5A6C"/>
+          <w:sz w:val="32"/>
+          <w:szCs w:val="32"/>
+        </w:rPr>
+        <w:br/>
+        <w:t xml:space="preserve">La palabra exacta: lo que la poesía sabe del juicio clínico</w:t>
+      </w:r>
+    </w:p>
+    <w:p>
+      <w:pPr>
+        <w:pStyle w:val="BodyJ"/>
+      </w:pPr>
+      <w:r>
+        <w:t xml:space="preserve">Hay un momento que los tratados no describen y todo clínico conoce: tres hallazgos sueltos —una taquicardia sin fiebre, un abdomen que "no convence", una frase de la hija— se ordenan de golpe bajo una sola explicación, y algo hace clic. El placer de ese instante no es administrativo. Es físico, breve y sospechosamente parecido al de un verso que cae en su lugar. Este capítulo toma ese parecido en serio: no como adorno humanista, sino como información sobre cómo funciona —y cómo falla— el juicio.</w:t>
+      </w:r>
+    </w:p>
+    <w:p>
+      <w:pPr>
+        <w:pStyle w:val="Heading3"/>
+        <w:spacing w:after="120" w:before="280"/>
+      </w:pPr>
+      <w:r>
+        <w:rPr>
+          <w:rFonts w:ascii="Georgia" w:cs="Georgia" w:eastAsia="Georgia" w:hAnsi="Georgia"/>
+          <w:b/>
+          <w:bCs/>
+          <w:color w:val="2B2B2B"/>
+          <w:sz w:val="25"/>
+          <w:szCs w:val="25"/>
+        </w:rPr>
+        <w:t xml:space="preserve">Dos oficios de la conexión</w:t>
+      </w:r>
+    </w:p>
+    <w:p>
+      <w:pPr>
+        <w:pStyle w:val="BodyJ"/>
+      </w:pPr>
+      <w:r>
+        <w:t xml:space="preserve">El poeta trabaja buscando conexiones: entre palabras, entre una palabra y un sentido que todavía no tiene nombre, entre el sonido y aquello que el sonido vuelve visible. Su estado mental característico combina atención flotante, oído para lo que no encaja y una disposición rara: dejar que el material mande sobre el plan. El clínico que razona bien trabaja igual, con otros materiales: entre el hallazgo y el mecanismo, entre el mecanismo y la intervención que estabiliza, busca la conexión que convierta fragmentos en un caso inteligible.</w:t>
+      </w:r>
+    </w:p>
+    <w:p>
+      <w:pPr>
+        <w:pStyle w:val="BodyJ"/>
+      </w:pPr>
+      <w:r>
+        <w:t xml:space="preserve">El parentesco es lógico antes que sentimental. Una metáfora es la hipótesis de que dos cosas lejanas comparten estructura; un diagnóstico es una metáfora que acepta ser puesta a prueba — "este cuadro es una colecistitis" apuesta a que lo que ocurre en este cuerpo comparte estructura con un patrón aprendido. Ambos movimientos son la abducción del capítulo 2, y ambos requieren el mismo estado que el capítulo 15 llamó humildad en funciones: sostener la conjetura con fuerza suficiente para trabajarla y soltura suficiente para dejarla caer. Bohm lo dijo desde la física: el acto creativo central —percibir un orden nuevo en lo que ya estaba a la vista— es el mismo en el arte y en la ciencia; cambian los materiales y el tribunal (Bohm, 1996).</w:t>
+      </w:r>
+    </w:p>
+    <w:p>
+      <w:pPr>
+        <w:pStyle w:val="Heading3"/>
+        <w:spacing w:after="120" w:before="280"/>
+      </w:pPr>
+      <w:r>
+        <w:rPr>
+          <w:rFonts w:ascii="Georgia" w:cs="Georgia" w:eastAsia="Georgia" w:hAnsi="Georgia"/>
+          <w:b/>
+          <w:bCs/>
+          <w:color w:val="2B2B2B"/>
+          <w:sz w:val="25"/>
+          <w:szCs w:val="25"/>
+        </w:rPr>
+        <w:t xml:space="preserve">Huidobro, o la palabra que crea</w:t>
+      </w:r>
+    </w:p>
+    <w:p>
+      <w:pPr>
+        <w:pStyle w:val="BodyJ"/>
+      </w:pPr>
+      <w:r>
+        <w:t xml:space="preserve">En 1916, Vicente Huidobro escribió el manifiesto de una poesía que no quería describir el mundo sino aumentarlo: "Por qué cantáis la rosa, ¡oh Poetas! / Hacedla florecer en el poema". Y remató con la línea más citada del creacionismo: "El poeta es un pequeño Dios" (Huidobro, 1916). El poema no canta la rosa: la crea. Como programa poético es glorioso. Como descripción de lo que el lenguaje puede hacer, es exactamente el peligro contra el que este libro lleva diecisiete capítulos escribiendo.</w:t>
+      </w:r>
+    </w:p>
+    <w:p>
+      <w:pPr>
+        <w:pStyle w:val="BodyJ"/>
+      </w:pPr>
+      <w:r>
+        <w:t xml:space="preserve">Porque la ficha clínica también hace florecer rosas. La "neumonía aspirativa" del prefacio —dos palabras limpias que crearon un antecedente que nadie observó— es creacionismo puro; el "somatiza" de la viñeta 10, también. El capítulo 12 mostró el mecanismo: la ficha produce lo visible, y sus criaturas verbales adquieren vida institucional. La diferencia con la poesía es brutal: las rosas de Huidobro viven en el poema; las nuestras reciben antibióticos, cirugías y altas. El lenguaje clínico descuidado es creacionista por defecto — y un servicio lleno de pequeños dioses es un lugar peligroso para estar enfermo.</w:t>
+      </w:r>
+    </w:p>
+    <w:p>
+      <w:pPr>
+        <w:pStyle w:val="Heading3"/>
+        <w:spacing w:after="120" w:before="280"/>
+      </w:pPr>
+      <w:r>
+        <w:rPr>
+          <w:rFonts w:ascii="Georgia" w:cs="Georgia" w:eastAsia="Georgia" w:hAnsi="Georgia"/>
+          <w:b/>
+          <w:bCs/>
+          <w:color w:val="2B2B2B"/>
+          <w:sz w:val="25"/>
+          <w:szCs w:val="25"/>
+        </w:rPr>
+        <w:t xml:space="preserve">Parra, o la deflación</w:t>
+      </w:r>
+    </w:p>
+    <w:p>
+      <w:pPr>
+        <w:pStyle w:val="BodyJ"/>
+      </w:pPr>
+      <w:r>
+        <w:t xml:space="preserve">El antídoto también lo escribió un chileno, y no uno cualquiera: un profesor de mecánica racional que estudió cosmología en Oxford y sabía, por oficio diurno, lo que cuesta un dato. Nicanor Parra pasó su vida bajándole los humos a la palabra: primero con los antipoemas (Parra, 1954), después con un "Manifiesto" que es casi un léxico de certeza en verso: los poetas bajaron del Olimpo, la poesía debe escribirse en palabras de todos los días — y, con nombre y apellido implícitos, la condena de "la poesía de pequeño dios" (Parra, 1969). La réplica a Huidobro no es una interpretación: está en el texto.</w:t>
+      </w:r>
+    </w:p>
+    <w:p>
+      <w:pPr>
+        <w:pStyle w:val="BodyJ"/>
+      </w:pPr>
+      <w:r>
+        <w:t xml:space="preserve">La antipoesía es un programa epistemológico completo: quitarle a la palabra los poderes que no puede sostener y devolverla al tamaño de la experiencia. Visto desde ahí, el léxico del capítulo 4 es antipoesía aplicada: "sin evidencia actual de" es un verso parriano — feo, honesto, exacto, imposible de recitar con voz engolada. La ficha lúcida se escribe más cerca de Parra que de Huidobro: lengua de todos los días, dignidad del "no sé", desconfianza instintiva de toda frase que suene demasiado bien.</w:t>
+      </w:r>
+    </w:p>
+    <w:p>
+      <w:pPr>
+        <w:pStyle w:val="Heading3"/>
+        <w:spacing w:after="120" w:before="280"/>
+      </w:pPr>
+      <w:r>
+        <w:rPr>
+          <w:rFonts w:ascii="Georgia" w:cs="Georgia" w:eastAsia="Georgia" w:hAnsi="Georgia"/>
+          <w:b/>
+          <w:bCs/>
+          <w:color w:val="2B2B2B"/>
+          <w:sz w:val="25"/>
+          <w:szCs w:val="25"/>
+        </w:rPr>
+        <w:t xml:space="preserve">La belleza como señal y como trampa</w:t>
+      </w:r>
+    </w:p>
+    <w:p>
+      <w:pPr>
+        <w:pStyle w:val="BodyJ"/>
+      </w:pPr>
+      <w:r>
+        <w:t xml:space="preserve">El clic estético del diagnóstico existe y es información. La parsimonia, la convergencia, el encaje sin residuo son la forma sensible de aquello que el capítulo 2 llamó fuerza por convergencia: cuando una explicación ordena todos los hechos sin forzar ninguno, algo en nosotros lo registra como belleza antes de poder justificarlo. Esa señal vale: propone candidatos que el análisis no habría listado.</w:t>
+      </w:r>
+    </w:p>
+    <w:p>
+      <w:pPr>
+        <w:pStyle w:val="BodyJ"/>
+      </w:pPr>
+      <w:r>
+        <w:t xml:space="preserve">Pero este libro ya conoció a la impostora. La historia coherente del hindsight, la narrativa atractiva que infla la confianza (capítulo 5), la prosa fluida de los modelos de lenguaje (capítulo 14): todas son bellas y ninguna es, por serlo, verdadera. La belleza no distingue entre orden hallado y orden impuesto — para eso están las pruebas severas. La regla que concilia ambas caras cabe en una línea: la elegancia selecciona hipótesis; nunca las confirma. El verso puede quedarse bello para siempre; el diagnóstico tiene que amanecer verdadero, y la evolución lo audita cada mañana.</w:t>
+      </w:r>
+    </w:p>
+    <w:p>
+      <w:pPr>
+        <w:pStyle w:val="BodyJ"/>
+      </w:pPr>
+      <w:r>
+        <w:t xml:space="preserve">Queda la belleza final, la que menos se nombra: la de hacer lo correcto en el contexto correcto. Una estabilización bien conducida tiene forma estética — nada sobró, nada faltó, cada intervención llegó a su hora; es la phronesis del capítulo 6 vuelta percepción. Pero es una belleza que sólo puede declararse retrospectivamente, y sólo si el proceso era defendible antes de conocer el desenlace (capítulo 10). En medicina la estética es un subproducto del rigor. Cuando se la busca directamente —el diagnóstico brillante, la frase imponente—, se obtiene Huidobro en la ficha.</w:t>
+      </w:r>
+    </w:p>
+    <w:p>
+      <w:pPr>
+        <w:pStyle w:val="Heading3"/>
+        <w:spacing w:after="120" w:before="280"/>
+      </w:pPr>
+      <w:r>
+        <w:rPr>
+          <w:rFonts w:ascii="Georgia" w:cs="Georgia" w:eastAsia="Georgia" w:hAnsi="Georgia"/>
+          <w:b/>
+          <w:bCs/>
+          <w:color w:val="2B2B2B"/>
+          <w:sz w:val="25"/>
+          <w:szCs w:val="25"/>
+        </w:rPr>
+        <w:t xml:space="preserve">Leer poesía como entrenamiento clínico</w:t>
+      </w:r>
+    </w:p>
+    <w:p>
+      <w:pPr>
+        <w:pStyle w:val="BodyJ"/>
+      </w:pPr>
+      <w:r>
+        <w:t xml:space="preserve">Si el parentesco es real, leer poesía no es un lujo cultural del médico: es gimnasio específico. Entrena la precisión léxica — el poeta agoniza entre dos palabras casi iguales, que es exactamente la distancia entre "descartado" y "sin evidencia actual de". Entrena la tolerancia a la ambigüedad sostenida — un poema no se "resuelve", se habita; como ciertas incertidumbres del capítulo 3. Entrena el oído para el relato: la anamnesis tiene ritmo, silencios y palabras elegidas, y "esta vez la hernia no se dejó acomodar" es, técnicamente, un verso — el capítulo 1 pidió conservarlo textual por razones epistémicas; este capítulo agrega la razón estética, que es la misma. Y entrena, con Parra, la resistencia a la solemnidad: nadie que haya leído antipoesía vuelve a escribir "se procede a realizar manejo multidisciplinario integral" sin sonrojarse.</w:t>
+      </w:r>
+    </w:p>
+    <w:p>
+      <w:pPr>
+        <w:pStyle w:val="BodyJ"/>
+      </w:pPr>
+      <w:r>
+        <w:t xml:space="preserve">No es casualidad que el investigador principal de la saga del capítulo 10 —el ensayo que enseñó a medio mundo a mirar la piel antes que el número— escriba también poesía: el oído que distingue una palabra que trabaja de una palabra que decora es el mismo que distingue un blanco de reanimación que informa de uno que sólo tranquiliza.</w:t>
+      </w:r>
+    </w:p>
+    <w:p>
+      <w:pPr>
+        <w:pStyle w:val="Quote1"/>
+      </w:pPr>
+      <w:r>
+        <w:t xml:space="preserve">El poeta busca la palabra que vuelva visible una conexión; el clínico, la conexión que sobreviva cuando la palabra sea puesta a prueba. Ambos fracasan de la misma manera: cuando la frase queda más bella que verdadera.</w:t>
+      </w:r>
+    </w:p>
+    <w:p>
+      <w:pPr>
+        <w:pStyle w:val="TallerHead"/>
+      </w:pPr>
+      <w:r>
+        <w:t xml:space="preserve">Taller 18. La prueba de Parra</w:t>
+      </w:r>
+    </w:p>
+    <w:p>
+      <w:pPr>
+        <w:pStyle w:val="BodyJ"/>
+      </w:pPr>
+      <w:r>
+        <w:t xml:space="preserve">Tome la frase medular de su paciente más reciente y sométala a dos preguntas. Primera: ¿hay en ella alguna palabra huidobriana — que haga florecer lo que nadie observó (un mecanismo no demostrado, una causal de contrabando, un "descartado" sin método)? Segunda: ¿puede reescribirse en palabras de todos los días sin perder un gramo de precisión — y si al traducirla se desinfla, qué la sostenía: la evidencia o la retórica?</w:t>
+      </w:r>
+    </w:p>
+    <w:p>
+      <w:pPr>
+        <w:pStyle w:val="BodyJ"/>
+      </w:pPr>
+      <w:r>
+        <w:rPr>
+          <w:i/>
+          <w:iCs/>
+        </w:rPr>
+        <w:t xml:space="preserve">Solución comentada.</w:t>
+      </w:r>
+      <w:r>
+        <w:t xml:space="preserve"> Ejemplo: "Shock séptico de foco urinario, descartándose foco abdominal". Prueba uno: "de foco urinario" hace florecer una causal (¿demostrada o presunta?), y "descartándose" es un gerundio que promete lo que todavía no ocurrió — dos rosas creadas en nueve palabras. Prueba dos, en lengua parriana: "Shock con urocultivo positivo; foco urinario probable; abdomen aún sin imagen". La segunda versión es menos imponente y más útil: sobrevive a la visita de la mañana. Si su frase pasa las dos pruebas, tiene lo que este libro entiende por estilo: exactitud que se puede defender en voz alta.</w:t>
+      </w:r>
+    </w:p>
+    <w:p>
+      <w:pPr>
+        <w:pStyle w:val="EnUnaFrase"/>
+      </w:pPr>
+      <w:r>
+        <w:rPr>
+          <w:b/>
+          <w:bCs/>
+        </w:rPr>
+        <w:t xml:space="preserve">En una frase.</w:t>
+      </w:r>
+      <w:r>
+        <w:t xml:space="preserve"> La poesía y el juicio clínico comparten el arte de la conexión exacta y difieren en el tribunal — al poema lo juzga el oído, al diagnóstico lo juzga la evolución — y por eso la ficha lúcida se escribe con Parra, no con Huidobro.</w:t>
+      </w:r>
+    </w:p>
+    <w:p>
+      <w:pPr>
+        <w:pStyle w:val="BodyJ"/>
+        <w:spacing w:after="80" w:before="160"/>
+      </w:pPr>
+      <w:r>
+        <w:rPr>
+          <w:b/>
+          <w:bCs/>
+        </w:rPr>
+        <w:t xml:space="preserve">Tres preguntas para la próxima visita.</w:t>
+      </w:r>
+    </w:p>
+    <w:p>
+      <w:pPr>
+        <w:pStyle w:val="BodyJ"/>
+        <w:numPr>
+          <w:ilvl w:val="0"/>
+          <w:numId w:val="26"/>
+        </w:numPr>
+      </w:pPr>
+      <w:r>
+        <w:t xml:space="preserve">¿Qué palabra de mi última nota está "haciendo florecer" algo que nadie observó?</w:t>
+      </w:r>
+    </w:p>
+    <w:p>
+      <w:pPr>
+        <w:pStyle w:val="BodyJ"/>
+        <w:numPr>
+          <w:ilvl w:val="0"/>
+          <w:numId w:val="26"/>
+        </w:numPr>
+      </w:pPr>
+      <w:r>
+        <w:t xml:space="preserve">El diagnóstico que más me satisface hoy: ¿me convence por la evidencia o por lo bien que cierra la historia?</w:t>
+      </w:r>
+    </w:p>
+    <w:p>
+      <w:pPr>
+        <w:pStyle w:val="BodyJ"/>
+        <w:numPr>
+          <w:ilvl w:val="0"/>
+          <w:numId w:val="26"/>
+        </w:numPr>
+      </w:pPr>
+      <w:r>
+        <w:t xml:space="preserve">¿Cuándo fue la última vez que leí algo —un poema, una página— sólo para afinar el oído con el que después escucho pacientes?</w:t>
+      </w:r>
+    </w:p>
+    <w:p>
+      <w:pPr>
         <w:pStyle w:val="Heading1"/>
         <w:pageBreakBefore/>
         <w:spacing w:after="320" w:before="720"/>
@@ -11546,7 +11880,7 @@
         <w:pStyle w:val="BodyJ"/>
         <w:numPr>
           <w:ilvl w:val="0"/>
-          <w:numId w:val="26"/>
+          <w:numId w:val="27"/>
         </w:numPr>
       </w:pPr>
       <w:r>
@@ -11558,7 +11892,7 @@
         <w:pStyle w:val="BodyJ"/>
         <w:numPr>
           <w:ilvl w:val="0"/>
-          <w:numId w:val="26"/>
+          <w:numId w:val="27"/>
         </w:numPr>
       </w:pPr>
       <w:r>
@@ -11570,7 +11904,7 @@
         <w:pStyle w:val="BodyJ"/>
         <w:numPr>
           <w:ilvl w:val="0"/>
-          <w:numId w:val="26"/>
+          <w:numId w:val="27"/>
         </w:numPr>
       </w:pPr>
       <w:r>
@@ -11582,7 +11916,7 @@
         <w:pStyle w:val="BodyJ"/>
         <w:numPr>
           <w:ilvl w:val="0"/>
-          <w:numId w:val="26"/>
+          <w:numId w:val="27"/>
         </w:numPr>
       </w:pPr>
       <w:r>
@@ -12861,7 +13195,7 @@
         <w:pStyle w:val="BodyJ"/>
         <w:numPr>
           <w:ilvl w:val="0"/>
-          <w:numId w:val="27"/>
+          <w:numId w:val="28"/>
         </w:numPr>
       </w:pPr>
       <w:r>
@@ -12873,7 +13207,7 @@
         <w:pStyle w:val="BodyJ"/>
         <w:numPr>
           <w:ilvl w:val="0"/>
-          <w:numId w:val="27"/>
+          <w:numId w:val="28"/>
         </w:numPr>
       </w:pPr>
       <w:r>
@@ -12885,7 +13219,7 @@
         <w:pStyle w:val="BodyJ"/>
         <w:numPr>
           <w:ilvl w:val="0"/>
-          <w:numId w:val="27"/>
+          <w:numId w:val="28"/>
         </w:numPr>
       </w:pPr>
       <w:r>
@@ -12897,7 +13231,7 @@
         <w:pStyle w:val="BodyJ"/>
         <w:numPr>
           <w:ilvl w:val="0"/>
-          <w:numId w:val="27"/>
+          <w:numId w:val="28"/>
         </w:numPr>
       </w:pPr>
       <w:r>
@@ -12909,7 +13243,7 @@
         <w:pStyle w:val="BodyJ"/>
         <w:numPr>
           <w:ilvl w:val="0"/>
-          <w:numId w:val="27"/>
+          <w:numId w:val="28"/>
         </w:numPr>
       </w:pPr>
       <w:r>
@@ -12921,7 +13255,7 @@
         <w:pStyle w:val="BodyJ"/>
         <w:numPr>
           <w:ilvl w:val="0"/>
-          <w:numId w:val="27"/>
+          <w:numId w:val="28"/>
         </w:numPr>
       </w:pPr>
       <w:r>
@@ -12933,7 +13267,7 @@
         <w:pStyle w:val="BodyJ"/>
         <w:numPr>
           <w:ilvl w:val="0"/>
-          <w:numId w:val="27"/>
+          <w:numId w:val="28"/>
         </w:numPr>
       </w:pPr>
       <w:r>
@@ -12945,7 +13279,7 @@
         <w:pStyle w:val="BodyJ"/>
         <w:numPr>
           <w:ilvl w:val="0"/>
-          <w:numId w:val="27"/>
+          <w:numId w:val="28"/>
         </w:numPr>
       </w:pPr>
       <w:r>
@@ -12957,7 +13291,7 @@
         <w:pStyle w:val="BodyJ"/>
         <w:numPr>
           <w:ilvl w:val="0"/>
-          <w:numId w:val="27"/>
+          <w:numId w:val="28"/>
         </w:numPr>
       </w:pPr>
       <w:r>
@@ -12969,7 +13303,7 @@
         <w:pStyle w:val="BodyJ"/>
         <w:numPr>
           <w:ilvl w:val="0"/>
-          <w:numId w:val="27"/>
+          <w:numId w:val="28"/>
         </w:numPr>
       </w:pPr>
       <w:r>
@@ -12981,7 +13315,7 @@
         <w:pStyle w:val="BodyJ"/>
         <w:numPr>
           <w:ilvl w:val="0"/>
-          <w:numId w:val="27"/>
+          <w:numId w:val="28"/>
         </w:numPr>
       </w:pPr>
       <w:r>
@@ -12993,7 +13327,7 @@
         <w:pStyle w:val="BodyJ"/>
         <w:numPr>
           <w:ilvl w:val="0"/>
-          <w:numId w:val="27"/>
+          <w:numId w:val="28"/>
         </w:numPr>
       </w:pPr>
       <w:r>
@@ -14093,7 +14427,7 @@
         </w:numPr>
       </w:pPr>
       <w:r>
-        <w:t xml:space="preserve">Creatividad en el juicio clínico (abducción, problem setting, tercera opción) — 2</w:t>
+        <w:t xml:space="preserve">Creatividad en el juicio clínico (abducción, problem setting, tercera opción) — 2, 18</w:t>
       </w:r>
     </w:p>
     <w:p>
@@ -14490,6 +14824,18 @@
       </w:pPr>
       <w:r>
         <w:t xml:space="preserve">Pausa diagnóstica — 8, 17, Ap B, Ap C</w:t>
+      </w:r>
+    </w:p>
+    <w:p>
+      <w:pPr>
+        <w:pStyle w:val="BodyJ"/>
+        <w:numPr>
+          <w:ilvl w:val="0"/>
+          <w:numId w:val="6"/>
+        </w:numPr>
+      </w:pPr>
+      <w:r>
+        <w:t xml:space="preserve">Poesía y juicio clínico (Huidobro, Parra; belleza como señal y trampa) — 18</w:t>
       </w:r>
     </w:p>
     <w:p>
@@ -15679,6 +16025,24 @@
         <w:pStyle w:val="BodyJ"/>
       </w:pPr>
       <w:r>
+        <w:t xml:space="preserve">Huidobro, V. (1916). </w:t>
+      </w:r>
+      <w:r>
+        <w:rPr>
+          <w:i/>
+          <w:iCs/>
+        </w:rPr>
+        <w:t xml:space="preserve">El espejo de agua</w:t>
+      </w:r>
+      <w:r>
+        <w:t xml:space="preserve">. Orión.</w:t>
+      </w:r>
+    </w:p>
+    <w:p>
+      <w:pPr>
+        <w:pStyle w:val="BodyJ"/>
+      </w:pPr>
+      <w:r>
         <w:t xml:space="preserve">Hunter, K. M. (1991). </w:t>
       </w:r>
       <w:r>
@@ -16194,6 +16558,42 @@
       </w:r>
       <w:r>
         <w:t xml:space="preserve">(3), 274–282.</w:t>
+      </w:r>
+    </w:p>
+    <w:p>
+      <w:pPr>
+        <w:pStyle w:val="BodyJ"/>
+      </w:pPr>
+      <w:r>
+        <w:t xml:space="preserve">Parra, N. (1954). </w:t>
+      </w:r>
+      <w:r>
+        <w:rPr>
+          <w:i/>
+          <w:iCs/>
+        </w:rPr>
+        <w:t xml:space="preserve">Poemas y antipoemas</w:t>
+      </w:r>
+      <w:r>
+        <w:t xml:space="preserve">. Nascimento.</w:t>
+      </w:r>
+    </w:p>
+    <w:p>
+      <w:pPr>
+        <w:pStyle w:val="BodyJ"/>
+      </w:pPr>
+      <w:r>
+        <w:t xml:space="preserve">Parra, N. (1969). </w:t>
+      </w:r>
+      <w:r>
+        <w:rPr>
+          <w:i/>
+          <w:iCs/>
+        </w:rPr>
+        <w:t xml:space="preserve">Obra gruesa</w:t>
+      </w:r>
+      <w:r>
+        <w:t xml:space="preserve">. Editorial Universitaria.</w:t>
       </w:r>
     </w:p>
     <w:p>
@@ -17293,6 +17693,18 @@
     </w:lvl>
   </w:abstractNum>
   <w:abstractNum w:abstractNumId="27" w15:restartNumberingAfterBreak="0">
+    <w:multiLevelType w:val="hybridMultilevel"/>
+    <w:lvl w:ilvl="0" w15:tentative="1">
+      <w:start w:val="1"/>
+      <w:numFmt w:val="decimal"/>
+      <w:lvlText w:val="%1."/>
+      <w:lvlJc w:val="left"/>
+      <w:pPr>
+        <w:ind w:left="560" w:hanging="280"/>
+      </w:pPr>
+    </w:lvl>
+  </w:abstractNum>
+  <w:abstractNum w:abstractNumId="28" w15:restartNumberingAfterBreak="0">
     <w:multiLevelType w:val="hybridMultilevel"/>
     <w:lvl w:ilvl="0" w15:tentative="1">
       <w:start w:val="1"/>
@@ -17462,6 +17874,12 @@
   </w:num>
   <w:num w:numId="27">
     <w:abstractNumId w:val="27"/>
+    <w:lvlOverride w:ilvl="0">
+      <w:startOverride w:val="1"/>
+    </w:lvlOverride>
+  </w:num>
+  <w:num w:numId="28">
+    <w:abstractNumId w:val="28"/>
     <w:lvlOverride w:ilvl="0">
       <w:startOverride w:val="1"/>
     </w:lvlOverride>

</xml_diff>

<commit_message>
Cap. 10: el cruce del razonamiento médico con la bioética
Sección nueva 'El cruce con la bioética: el contexto global del paciente
como hecho clínico': funcionalidad, pronóstico de fondo y red de apoyo
como hechos de pleno derecho; cuatro tópicos (Jonsen, Siegler y Winslade),
proporcionalidad terapéutica (Taboada), deliberación moral (Gracia) y
fragilidad medible (Rockwood). Taller 10B 'Las cuatro casillas en cinco
minutos'. Capa D del HII-D y Apéndice A ampliados; glosario, índice
analítico y referencias actualizados; TOC verificado (36 entradas).

Co-Authored-By: Claude Fable 5 <noreply@anthropic.com>
Claude-Session: https://claude.ai/code/session_01SPkhDdVzUCxJwqq61ddeLW
</commit_message>
<xml_diff>
--- a/libro/Hechos_inferencias_incertidumbre_edicion_revisada.docx
+++ b/libro/Hechos_inferencias_incertidumbre_edicion_revisada.docx
@@ -547,7 +547,7 @@
         <w:rPr>
           <w:color w:val="8A8A8A"/>
         </w:rPr>
-        <w:t xml:space="preserve">53</w:t>
+        <w:t xml:space="preserve">56</w:t>
       </w:r>
     </w:p>
     <w:p>
@@ -567,7 +567,7 @@
         <w:rPr>
           <w:color w:val="8A8A8A"/>
         </w:rPr>
-        <w:t xml:space="preserve">56</w:t>
+        <w:t xml:space="preserve">59</w:t>
       </w:r>
     </w:p>
     <w:p>
@@ -587,7 +587,7 @@
         <w:rPr>
           <w:color w:val="8A8A8A"/>
         </w:rPr>
-        <w:t xml:space="preserve">60</w:t>
+        <w:t xml:space="preserve">63</w:t>
       </w:r>
     </w:p>
     <w:p>
@@ -607,7 +607,7 @@
         <w:rPr>
           <w:color w:val="8A8A8A"/>
         </w:rPr>
-        <w:t xml:space="preserve">65</w:t>
+        <w:t xml:space="preserve">68</w:t>
       </w:r>
     </w:p>
     <w:p>
@@ -627,7 +627,7 @@
         <w:rPr>
           <w:color w:val="8A8A8A"/>
         </w:rPr>
-        <w:t xml:space="preserve">66</w:t>
+        <w:t xml:space="preserve">69</w:t>
       </w:r>
     </w:p>
     <w:p>
@@ -647,7 +647,7 @@
         <w:rPr>
           <w:color w:val="8A8A8A"/>
         </w:rPr>
-        <w:t xml:space="preserve">67</w:t>
+        <w:t xml:space="preserve">70</w:t>
       </w:r>
     </w:p>
     <w:p>
@@ -667,7 +667,7 @@
         <w:rPr>
           <w:color w:val="8A8A8A"/>
         </w:rPr>
-        <w:t xml:space="preserve">70</w:t>
+        <w:t xml:space="preserve">73</w:t>
       </w:r>
     </w:p>
     <w:p>
@@ -687,7 +687,7 @@
         <w:rPr>
           <w:color w:val="8A8A8A"/>
         </w:rPr>
-        <w:t xml:space="preserve">75</w:t>
+        <w:t xml:space="preserve">78</w:t>
       </w:r>
     </w:p>
     <w:p>
@@ -707,7 +707,7 @@
         <w:rPr>
           <w:color w:val="8A8A8A"/>
         </w:rPr>
-        <w:t xml:space="preserve">81</w:t>
+        <w:t xml:space="preserve">84</w:t>
       </w:r>
     </w:p>
     <w:p>
@@ -727,7 +727,7 @@
         <w:rPr>
           <w:color w:val="8A8A8A"/>
         </w:rPr>
-        <w:t xml:space="preserve">89</w:t>
+        <w:t xml:space="preserve">92</w:t>
       </w:r>
     </w:p>
     <w:p>
@@ -747,7 +747,7 @@
         <w:rPr>
           <w:color w:val="8A8A8A"/>
         </w:rPr>
-        <w:t xml:space="preserve">93</w:t>
+        <w:t xml:space="preserve">96</w:t>
       </w:r>
     </w:p>
     <w:p>
@@ -767,7 +767,7 @@
         <w:rPr>
           <w:color w:val="8A8A8A"/>
         </w:rPr>
-        <w:t xml:space="preserve">97</w:t>
+        <w:t xml:space="preserve">100</w:t>
       </w:r>
     </w:p>
     <w:p>
@@ -787,7 +787,7 @@
         <w:rPr>
           <w:color w:val="8A8A8A"/>
         </w:rPr>
-        <w:t xml:space="preserve">99</w:t>
+        <w:t xml:space="preserve">102</w:t>
       </w:r>
     </w:p>
     <w:p>
@@ -807,7 +807,7 @@
         <w:rPr>
           <w:color w:val="8A8A8A"/>
         </w:rPr>
-        <w:t xml:space="preserve">101</w:t>
+        <w:t xml:space="preserve">104</w:t>
       </w:r>
     </w:p>
     <w:p>
@@ -827,7 +827,7 @@
         <w:rPr>
           <w:color w:val="8A8A8A"/>
         </w:rPr>
-        <w:t xml:space="preserve">103</w:t>
+        <w:t xml:space="preserve">106</w:t>
       </w:r>
     </w:p>
     <w:p>
@@ -847,7 +847,7 @@
         <w:rPr>
           <w:color w:val="8A8A8A"/>
         </w:rPr>
-        <w:t xml:space="preserve">105</w:t>
+        <w:t xml:space="preserve">108</w:t>
       </w:r>
     </w:p>
     <w:p>
@@ -867,7 +867,7 @@
         <w:rPr>
           <w:color w:val="8A8A8A"/>
         </w:rPr>
-        <w:t xml:space="preserve">108</w:t>
+        <w:t xml:space="preserve">112</w:t>
       </w:r>
     </w:p>
     <w:p>
@@ -887,7 +887,7 @@
         <w:rPr>
           <w:color w:val="8A8A8A"/>
         </w:rPr>
-        <w:t xml:space="preserve">111</w:t>
+        <w:t xml:space="preserve">115</w:t>
       </w:r>
     </w:p>
     <w:p>
@@ -1059,7 +1059,7 @@
         <w:t xml:space="preserve">Parte III</w:t>
       </w:r>
       <w:r>
-        <w:t xml:space="preserve"> amplía el foco hacia la decisión en el tiempo y con otros: la evidencia poblacional y su traducción al caso singular, los umbrales donde los valores entran al cálculo, la trayectoria temporal, la ficha clínica, y los equipos y la comunicación de la incertidumbre. La </w:t>
+        <w:t xml:space="preserve"> amplía el foco hacia la decisión en el tiempo y con otros: la evidencia poblacional y su traducción al caso singular, los umbrales donde los valores entran al cálculo y la decisión se cruza con la bioética, la trayectoria temporal, la ficha clínica, y los equipos y la comunicación de la incertidumbre. La </w:t>
       </w:r>
       <w:r>
         <w:rPr>
@@ -5536,7 +5536,7 @@
         <w:pStyle w:val="BodyJ"/>
       </w:pPr>
       <w:r>
-        <w:t xml:space="preserve">Supongamos resuelto lo anterior: la evidencia está traducida, la probabilidad estimada, el caso representado. Queda la pregunta que ninguna estimación responde sola: ¿y ahora qué hacemos? Este capítulo trata del tramo final — donde la probabilidad se encuentra con las consecuencias, los valores entran al cálculo sin pedir permiso, y hasta la lectura de un ensayo resulta ser una decisión.</w:t>
+        <w:t xml:space="preserve">Supongamos resuelto lo anterior: la evidencia está traducida, la probabilidad estimada, el caso representado. Queda la pregunta que ninguna estimación responde sola: ¿y ahora qué hacemos? Este capítulo trata del tramo final — donde la probabilidad se encuentra con las consecuencias, los valores entran al cálculo sin pedir permiso, la decisión técnica se cruza con la bioética, y hasta la lectura de un ensayo resulta ser una decisión.</w:t>
       </w:r>
     </w:p>
     <w:p>
@@ -5951,6 +5951,71 @@
           <w:sz w:val="25"/>
           <w:szCs w:val="25"/>
         </w:rPr>
+        <w:t xml:space="preserve">El cruce con la bioética: el contexto global del paciente como hecho clínico</w:t>
+      </w:r>
+    </w:p>
+    <w:p>
+      <w:pPr>
+        <w:pStyle w:val="BodyJ"/>
+      </w:pPr>
+      <w:r>
+        <w:t xml:space="preserve">Hasta aquí, este capítulo pudo leerse como si decidir fuera un problema de dos variables: probabilidad y consecuencias. La bioética obliga a hacer explícita la pregunta que esa fórmula esconde: ¿consecuencias para quién, medidas en qué moneda? Una intervención terapéutica no actúa sobre una enfermedad; actúa sobre una persona que, además de la enfermedad, tiene una funcionalidad previa, una trayectoria de fondo, una red que la sostiene —o no— y fines propios que nadie puede presumir desde el pasillo. Por eso el razonamiento médico y la bioética no se cruzan al final del proceso, cuando alguien convoca al comité de ética: se cruzan en la premisa, en la decisión previa de qué cuenta como hecho relevante del caso.</w:t>
+      </w:r>
+    </w:p>
+    <w:p>
+      <w:pPr>
+        <w:pStyle w:val="BodyJ"/>
+      </w:pPr>
+      <w:r>
+        <w:t xml:space="preserve">El error más frecuente en ese cruce tiene forma epistémica antes que moral: tratar la indicación como una propiedad de la enfermedad y no como una relación entre la intervención y este enfermo. "La estenosis aórtica severa sintomática tiene indicación de reemplazo valvular" es una frase verdadera sobre una población. Que este hombre de 88 años —frágil, con deterioro cognitivo incipiente, dos hospitalizaciones en el semestre y una hija que ya no puede cuidarlo— vaya a vivir mejor con el reemplazo es otra afirmación, que exige otros hechos. Es la distinción del capítulo 9 entre el efecto promedio y el caso singular, ahora con su carga moral a la vista: lo que se pierde cuando se omite el contexto no es sólo precisión; es el paciente.</w:t>
+      </w:r>
+    </w:p>
+    <w:p>
+      <w:pPr>
+        <w:pStyle w:val="BodyJ"/>
+      </w:pPr>
+      <w:r>
+        <w:t xml:space="preserve">Conviene decirlo con todas sus letras: la funcionalidad, el pronóstico de fondo y el soporte sociofamiliar son hechos clínicos de pleno derecho, no ornamentos "psicosociales" de la anamnesis. La funcionalidad se puede evaluar y graduar en minutos, y predice mortalidad y desenlaces con independencia del diagnóstico que motivó el ingreso (Rockwood et al., 2005). La trayectoria de fondo decide el significado de la enfermedad aguda: la neumonía es la misma bacteria en una curva ascendente que en una descendente, pero no es el mismo problema — la lección del capítulo siguiente, aplicada a los fines del tratamiento. Y la red de apoyo convierte una misma orden de alta en dos intervenciones distintas: "alta a domicilio" con alguien en el domicilio es un plan; sin nadie, es un abandono con firma. Cuando estos datos faltan en la ficha no suele ser porque cuesten mucho: es porque el formato no los pide. Son hechos que la capa H debe registrar para que la capa D pueda usarlos.</w:t>
+      </w:r>
+    </w:p>
+    <w:p>
+      <w:pPr>
+        <w:pStyle w:val="BodyJ"/>
+      </w:pPr>
+      <w:r>
+        <w:t xml:space="preserve">La bioética clínica ofrece herramientas de trabajo para este cruce, y la más difundida tiene un aire de familia con HII-D. Jonsen, Siegler y Winslade propusieron ordenar todo caso en cuatro tópicos: indicaciones médicas, preferencias del paciente, calidad de vida y rasgos contextuales — familia, cultura, recursos, ley (Jonsen, Siegler &amp; Winslade, 2022). El orden importa y no es una jerarquía: las indicaciones van primero porque sin ellas no hay caso, pero nunca van solas. Usado con honestidad, el método funciona como una lista de verificación deliberativa: ningún cuadrante puede quedar vacío sin que la decisión quede coja, y el cuadrante que más cuesta llenar señala exactamente qué conversación falta.</w:t>
+      </w:r>
+    </w:p>
+    <w:p>
+      <w:pPr>
+        <w:pStyle w:val="BodyJ"/>
+      </w:pPr>
+      <w:r>
+        <w:t xml:space="preserve">Dos ideas del mundo hispanohablante completan la caja. La primera es la proporcionalidad terapéutica: la obligación moral de implementar sólo aquellas medidas que guarden debida proporción entre los medios empleados y el resultado previsible (Taboada, 2000). El juicio de proporcionalidad integra pronóstico, cargas de la intervención y fines del paciente — y por eso depende por completo de la calidad epistémica que este libro viene trabajando: un pronóstico inflado por certeza retórica no produce una decisión más esperanzadora; produce un juicio de proporcionalidad falso. La segunda es la deliberación como método (Gracia, 2001): cuando los valores entran en conflicto, la decisión no se calcula, se delibera — identificar qué valores chocan, enumerar los cursos de acción extremos, buscar los intermedios y elegir el curso prudente que pueda defenderse en público. La deliberación es a los valores lo que el diagnóstico diferencial a las hipótesis: un método para no quedarse con la primera respuesta disponible. Los cursos extremos — "hacer todo", "no hacer nada" — casi nunca son los prudentes, y suelen ser los que se eligen cuando nadie deliberó.</w:t>
+      </w:r>
+    </w:p>
+    <w:p>
+      <w:pPr>
+        <w:pStyle w:val="BodyJ"/>
+      </w:pPr>
+      <w:r>
+        <w:t xml:space="preserve">El lector encontrará este cruce ejecutado dos veces en este libro sin la palabra "bioética": en la conversación donde la cirujana recomienda operar a Carmen y le devuelve la decisión (Interludio III), y en la viñeta del final de la vida, donde la incertidumbre que domina no es pronóstica sino de metas (Cuaderno de casos, viñeta 7). En ambas, lo decisivo no fue un principio abstracto: fue que la funcionalidad, la trayectoria y los fines del paciente estuvieran dentro del razonamiento desde el principio. Esa es la tesis de esta sección: la bioética no llega al final a ponerle límites a un razonamiento ya terminado — estaba en el principio, decidiendo qué se mira. Una decisión que ignoró la funcionalidad, el pronóstico de fondo y la red de apoyo no es más "objetiva" por haberse limitado a lo técnico: es más incompleta. Le faltan hechos, no sólo sensibilidad.</w:t>
+      </w:r>
+    </w:p>
+    <w:p>
+      <w:pPr>
+        <w:pStyle w:val="Heading3"/>
+        <w:spacing w:after="120" w:before="280"/>
+      </w:pPr>
+      <w:r>
+        <w:rPr>
+          <w:rFonts w:ascii="Georgia" w:cs="Georgia" w:eastAsia="Georgia" w:hAnsi="Georgia"/>
+          <w:b/>
+          <w:bCs/>
+          <w:color w:val="2B2B2B"/>
+          <w:sz w:val="25"/>
+          <w:szCs w:val="25"/>
+        </w:rPr>
         <w:t xml:space="preserve">Certeza epistémica y compromiso práctico</w:t>
       </w:r>
     </w:p>
@@ -6094,6 +6159,37 @@
     </w:p>
     <w:p>
       <w:pPr>
+        <w:pStyle w:val="TallerHead"/>
+      </w:pPr>
+      <w:r>
+        <w:t xml:space="preserve">Taller 10B. Las cuatro casillas en cinco minutos</w:t>
+      </w:r>
+    </w:p>
+    <w:p>
+      <w:pPr>
+        <w:pStyle w:val="BodyJ"/>
+      </w:pPr>
+      <w:r>
+        <w:t xml:space="preserve">Elija un paciente actual de su servicio con una decisión de intervención pendiente — cirugía, diálisis, ventilación mecánica, nueva línea oncológica. Dibuje cuatro casillas: indicaciones médicas, preferencias del paciente, calidad de vida, rasgos contextuales. Llénelas en cinco minutos con lo que sabe hoy, sin abrir la ficha. Luego ábrala y verifique: ¿qué casilla quedó vacía — y ese vacío es del caso o de su conocimiento del caso?</w:t>
+      </w:r>
+    </w:p>
+    <w:p>
+      <w:pPr>
+        <w:pStyle w:val="BodyJ"/>
+      </w:pPr>
+      <w:r>
+        <w:rPr>
+          <w:i/>
+          <w:iCs/>
+        </w:rPr>
+        <w:t xml:space="preserve">Solución comentada.</w:t>
+      </w:r>
+      <w:r>
+        <w:t xml:space="preserve"> El ejercicio produce dos hallazgos con regularidad. Primero: la casilla de indicaciones se llena sola y las otras tres exhiben lagunas que no son opiniones faltantes sino hechos faltantes — nadie preguntó quién vive con el paciente; la funcionalidad basal dice "previamente autovalente" sin que nadie la haya explorado; las preferencias son una presunción de la familia, no una cita del enfermo. Segundo: las cuatro casillas rara vez cambian la intervención; cambian la conversación — con quién falta hablar, qué falta saber, qué está decidiendo el equipo por inercia. Y cuando las casillas están completas y la decisión sigue en disputa, eso también es información: el caso ya no necesita más exámenes; necesita deliberación y, a veces, tiempo.</w:t>
+      </w:r>
+    </w:p>
+    <w:p>
+      <w:pPr>
         <w:pStyle w:val="EnUnaFrase"/>
       </w:pPr>
       <w:r>
@@ -6104,7 +6200,7 @@
         <w:t xml:space="preserve">En una frase.</w:t>
       </w:r>
       <w:r>
-        <w:t xml:space="preserve"> Decidir sin certeza no es un mal menor: es la forma normal del juicio clínico cuando trabaja bien — umbrales explícitos, valores declarados y ensayos leídos con su marco inferencial a la vista.</w:t>
+        <w:t xml:space="preserve"> Decidir sin certeza no es un mal menor: es la forma normal del juicio clínico cuando trabaja bien — umbrales explícitos, valores declarados, el contexto global del paciente dentro del cálculo y ensayos leídos con su marco inferencial a la vista.</w:t>
       </w:r>
     </w:p>
     <w:p>
@@ -8750,7 +8846,7 @@
         <w:pStyle w:val="BodyJ"/>
       </w:pPr>
       <w:r>
-        <w:t xml:space="preserve">La decisión integra probabilidad, gravedad, tiempo, reversibilidad, capacidad de monitorización y valores. Debe poder formularse: "aunque X no está demostrado, actúo porque…" o "aunque X es posible, no actúo todavía porque…". Esta frase obliga a distinguir compromiso práctico de certeza epistémica.</w:t>
+        <w:t xml:space="preserve">La decisión integra probabilidad, gravedad, tiempo, reversibilidad, capacidad de monitorización y valores — y el contexto global del paciente: funcionalidad basal, pronóstico de fondo, red de apoyo y fines declarados, los hechos que el capítulo 10 llamó de pleno derecho. Debe poder formularse: "aunque X no está demostrado, actúo porque…" o "aunque X es posible, no actúo todavía porque…". Esta frase obliga a distinguir compromiso práctico de certeza epistémica. Y ante intervenciones mayores, la pregunta de proporcionalidad cierra la capa: ¿esta medida guarda proporción con el pronóstico y con los fines de este enfermo?</w:t>
       </w:r>
     </w:p>
     <w:p>
@@ -8847,6 +8943,18 @@
         </w:numPr>
       </w:pPr>
       <w:r>
+        <w:t xml:space="preserve">Contexto global (funcionalidad, pronóstico de fondo, red de apoyo):</w:t>
+      </w:r>
+    </w:p>
+    <w:p>
+      <w:pPr>
+        <w:pStyle w:val="BodyJ"/>
+        <w:numPr>
+          <w:ilvl w:val="0"/>
+          <w:numId w:val="6"/>
+        </w:numPr>
+      </w:pPr>
+      <w:r>
         <w:t xml:space="preserve">Decisión y razón:</w:t>
       </w:r>
     </w:p>
@@ -10032,7 +10140,7 @@
         <w:t xml:space="preserve">Lectura metacognitiva.</w:t>
       </w:r>
       <w:r>
-        <w:t xml:space="preserve"> El final de la vida concentra todos los temas del libro: la tentación de responder "¿cuánto queda?" con una cifra falsa (certeza retórica), la de esconderse en "no se puede saber" (abandono), y la confusión entre lo técnicamente posible y lo indicado. Comunicar dirección y escenarios en vez de plazos, y anclar la decisión en las metas del enfermo, es la forma que toma aquí la incertidumbre bien gobernada.</w:t>
+        <w:t xml:space="preserve"> El final de la vida concentra todos los temas del libro: la tentación de responder "¿cuánto queda?" con una cifra falsa (certeza retórica), la de esconderse en "no se puede saber" (abandono), y la confusión entre lo técnicamente posible y lo proporcionado — el juicio de proporcionalidad del capítulo 10, que aquí exige lo que más cuesta: un pronóstico honesto. Comunicar dirección y escenarios en vez de plazos, y anclar la decisión en las metas del enfermo, es la forma que toma aquí la incertidumbre bien gobernada.</w:t>
       </w:r>
     </w:p>
     <w:p>
@@ -11777,7 +11885,31 @@
         </w:numPr>
       </w:pPr>
       <w:r>
-        <w:t xml:space="preserve">Preferencias del paciente.</w:t>
+        <w:t xml:space="preserve">Contexto global: funcionalidad basal, pronóstico de fondo, red de apoyo social y familiar.</w:t>
+      </w:r>
+    </w:p>
+    <w:p>
+      <w:pPr>
+        <w:pStyle w:val="BodyJ"/>
+        <w:numPr>
+          <w:ilvl w:val="0"/>
+          <w:numId w:val="6"/>
+        </w:numPr>
+      </w:pPr>
+      <w:r>
+        <w:t xml:space="preserve">Preferencias del paciente (citadas, no presumidas).</w:t>
+      </w:r>
+    </w:p>
+    <w:p>
+      <w:pPr>
+        <w:pStyle w:val="BodyJ"/>
+        <w:numPr>
+          <w:ilvl w:val="0"/>
+          <w:numId w:val="6"/>
+        </w:numPr>
+      </w:pPr>
+      <w:r>
+        <w:t xml:space="preserve">Proporcionalidad: ¿la intervención guarda proporción con el pronóstico y los fines del enfermo?</w:t>
       </w:r>
     </w:p>
     <w:p>
@@ -13837,6 +13969,21 @@
           <w:b/>
           <w:bCs/>
         </w:rPr>
+        <w:t xml:space="preserve">Cuatro tópicos (método de los).</w:t>
+      </w:r>
+      <w:r>
+        <w:t xml:space="preserve"> Lista de verificación deliberativa de la ética clínica que ordena todo caso en indicaciones médicas, preferencias del paciente, calidad de vida y rasgos contextuales (Jonsen, Siegler y Winslade). Ningún cuadrante puede quedar vacío sin que la decisión quede incompleta.</w:t>
+      </w:r>
+    </w:p>
+    <w:p>
+      <w:pPr>
+        <w:pStyle w:val="BodyJ"/>
+      </w:pPr>
+      <w:r>
+        <w:rPr>
+          <w:b/>
+          <w:bCs/>
+        </w:rPr>
         <w:t xml:space="preserve">Decisión compartida.</w:t>
       </w:r>
       <w:r>
@@ -13852,6 +13999,21 @@
           <w:b/>
           <w:bCs/>
         </w:rPr>
+        <w:t xml:space="preserve">Deliberación moral.</w:t>
+      </w:r>
+      <w:r>
+        <w:t xml:space="preserve"> Método de la ética clínica para los conflictos de valores: identificar qué valores chocan, enumerar los cursos de acción extremos, buscar los intermedios y elegir el curso prudente y públicamente defendible (Gracia). Es a los valores lo que el diagnóstico diferencial a las hipótesis.</w:t>
+      </w:r>
+    </w:p>
+    <w:p>
+      <w:pPr>
+        <w:pStyle w:val="BodyJ"/>
+      </w:pPr>
+      <w:r>
+        <w:rPr>
+          <w:b/>
+          <w:bCs/>
+        </w:rPr>
         <w:t xml:space="preserve">Densidad epistémica.</w:t>
       </w:r>
       <w:r>
@@ -13927,6 +14089,21 @@
           <w:b/>
           <w:bCs/>
         </w:rPr>
+        <w:t xml:space="preserve">Fragilidad.</w:t>
+      </w:r>
+      <w:r>
+        <w:t xml:space="preserve"> Estado de vulnerabilidad fisiológica multisistémica que predice desenlaces con independencia de la edad y del diagnóstico de ingreso; evaluable clínicamente en minutos (Rockwood et al.). En la decisión terapéutica es un hecho de pleno derecho, no una impresión.</w:t>
+      </w:r>
+    </w:p>
+    <w:p>
+      <w:pPr>
+        <w:pStyle w:val="BodyJ"/>
+      </w:pPr>
+      <w:r>
+        <w:rPr>
+          <w:b/>
+          <w:bCs/>
+        </w:rPr>
         <w:t xml:space="preserve">Frase medular.</w:t>
       </w:r>
       <w:r>
@@ -14126,6 +14303,21 @@
       </w:r>
       <w:r>
         <w:t xml:space="preserve"> Probabilidad de una condición antes y después de incorporar el resultado de una prueba; su relación depende del rendimiento de la prueba y de la prevalencia.</w:t>
+      </w:r>
+    </w:p>
+    <w:p>
+      <w:pPr>
+        <w:pStyle w:val="BodyJ"/>
+      </w:pPr>
+      <w:r>
+        <w:rPr>
+          <w:b/>
+          <w:bCs/>
+        </w:rPr>
+        <w:t xml:space="preserve">Proporcionalidad terapéutica.</w:t>
+      </w:r>
+      <w:r>
+        <w:t xml:space="preserve"> Obligación moral de implementar sólo las medidas que guarden debida proporción entre los medios empleados y el resultado previsible, juzgada desde el pronóstico, las cargas y los fines del paciente (Taboada). Exige un pronóstico honesto: sin buen juicio epistémico no hay juicio de proporcionalidad.</w:t>
       </w:r>
     </w:p>
     <w:p>
@@ -14331,6 +14523,18 @@
         </w:numPr>
       </w:pPr>
       <w:r>
+        <w:t xml:space="preserve">Bioética y razonamiento clínico (cuatro tópicos, proporcionalidad, deliberación) — 10, 16, CC (viñeta 7), Ap A</w:t>
+      </w:r>
+    </w:p>
+    <w:p>
+      <w:pPr>
+        <w:pStyle w:val="BodyJ"/>
+        <w:numPr>
+          <w:ilvl w:val="0"/>
+          <w:numId w:val="6"/>
+        </w:numPr>
+      </w:pPr>
+      <w:r>
         <w:t xml:space="preserve">Calibración — 5, 16, 17, Ap C</w:t>
       </w:r>
     </w:p>
@@ -14403,6 +14607,18 @@
         </w:numPr>
       </w:pPr>
       <w:r>
+        <w:t xml:space="preserve">Contexto global del paciente (funcionalidad, pronóstico de fondo, red de apoyo) — 10, 16, Ap A</w:t>
+      </w:r>
+    </w:p>
+    <w:p>
+      <w:pPr>
+        <w:pStyle w:val="BodyJ"/>
+        <w:numPr>
+          <w:ilvl w:val="0"/>
+          <w:numId w:val="6"/>
+        </w:numPr>
+      </w:pPr>
+      <w:r>
         <w:t xml:space="preserve">Contrafactuales — 11</w:t>
       </w:r>
     </w:p>
@@ -14439,6 +14655,18 @@
         </w:numPr>
       </w:pPr>
       <w:r>
+        <w:t xml:space="preserve">Cuatro tópicos (Jonsen, Siegler y Winslade) — 10, Ap A</w:t>
+      </w:r>
+    </w:p>
+    <w:p>
+      <w:pPr>
+        <w:pStyle w:val="BodyJ"/>
+        <w:numPr>
+          <w:ilvl w:val="0"/>
+          <w:numId w:val="6"/>
+        </w:numPr>
+      </w:pPr>
+      <w:r>
         <w:t xml:space="preserve">Debate sobre la enseñanza del razonamiento (Croskerry vs. Norman/Monteiro) — 17</w:t>
       </w:r>
     </w:p>
@@ -14463,6 +14691,18 @@
         </w:numPr>
       </w:pPr>
       <w:r>
+        <w:t xml:space="preserve">Deliberación moral (Gracia) — 10</w:t>
+      </w:r>
+    </w:p>
+    <w:p>
+      <w:pPr>
+        <w:pStyle w:val="BodyJ"/>
+        <w:numPr>
+          <w:ilvl w:val="0"/>
+          <w:numId w:val="6"/>
+        </w:numPr>
+      </w:pPr>
+      <w:r>
         <w:t xml:space="preserve">Densidad epistémica — 4</w:t>
       </w:r>
     </w:p>
@@ -14607,6 +14847,18 @@
         </w:numPr>
       </w:pPr>
       <w:r>
+        <w:t xml:space="preserve">Fragilidad y funcionalidad como hechos clínicos — 10, 16, Ap A</w:t>
+      </w:r>
+    </w:p>
+    <w:p>
+      <w:pPr>
+        <w:pStyle w:val="BodyJ"/>
+        <w:numPr>
+          <w:ilvl w:val="0"/>
+          <w:numId w:val="6"/>
+        </w:numPr>
+      </w:pPr>
+      <w:r>
         <w:t xml:space="preserve">Frase medular — 4, 12, C, CC (todas las viñetas)</w:t>
       </w:r>
     </w:p>
@@ -14872,6 +15124,18 @@
       </w:pPr>
       <w:r>
         <w:t xml:space="preserve">Pronóstico e incertidumbre de plazo — CC (viñeta 7)</w:t>
+      </w:r>
+    </w:p>
+    <w:p>
+      <w:pPr>
+        <w:pStyle w:val="BodyJ"/>
+        <w:numPr>
+          <w:ilvl w:val="0"/>
+          <w:numId w:val="6"/>
+        </w:numPr>
+      </w:pPr>
+      <w:r>
+        <w:t xml:space="preserve">Proporcionalidad terapéutica (Taboada) — 10, 16, CC (viñeta 7)</w:t>
       </w:r>
     </w:p>
     <w:p>
@@ -15863,6 +16127,24 @@
         <w:pStyle w:val="BodyJ"/>
       </w:pPr>
       <w:r>
+        <w:t xml:space="preserve">Gracia, D. (2001). La deliberación moral: El método de la ética clínica. </w:t>
+      </w:r>
+      <w:r>
+        <w:rPr>
+          <w:i/>
+          <w:iCs/>
+        </w:rPr>
+        <w:t xml:space="preserve">Medicina Clínica, 117</w:t>
+      </w:r>
+      <w:r>
+        <w:t xml:space="preserve">(1), 18–23.</w:t>
+      </w:r>
+    </w:p>
+    <w:p>
+      <w:pPr>
+        <w:pStyle w:val="BodyJ"/>
+      </w:pPr>
+      <w:r>
         <w:t xml:space="preserve">Groopman, J. (2007). </w:t>
       </w:r>
       <w:r>
@@ -16115,6 +16397,24 @@
         <w:pStyle w:val="BodyJ"/>
       </w:pPr>
       <w:r>
+        <w:t xml:space="preserve">Jonsen, A. R., Siegler, M., &amp; Winslade, W. J. (2022). </w:t>
+      </w:r>
+      <w:r>
+        <w:rPr>
+          <w:i/>
+          <w:iCs/>
+        </w:rPr>
+        <w:t xml:space="preserve">Clinical Ethics: A Practical Approach to Ethical Decisions in Clinical Medicine</w:t>
+      </w:r>
+      <w:r>
+        <w:t xml:space="preserve"> (9.ª ed.). McGraw-Hill. (1.ª ed., 1982).</w:t>
+      </w:r>
+    </w:p>
+    <w:p>
+      <w:pPr>
+        <w:pStyle w:val="BodyJ"/>
+      </w:pPr>
+      <w:r>
         <w:t xml:space="preserve">Kadavath, S., Conerly, T., Askell, A., Henighan, T., Drain, D., Perez, E., et al. (2022). Language models (mostly) know what they know. </w:t>
       </w:r>
       <w:r>
@@ -16745,6 +17045,24 @@
         <w:pStyle w:val="BodyJ"/>
       </w:pPr>
       <w:r>
+        <w:t xml:space="preserve">Rockwood, K., Song, X., MacKnight, C., Bergman, H., Hogan, D. B., McDowell, I., &amp; Mitnitski, A. (2005). A global clinical measure of fitness and frailty in elderly people. </w:t>
+      </w:r>
+      <w:r>
+        <w:rPr>
+          <w:i/>
+          <w:iCs/>
+        </w:rPr>
+        <w:t xml:space="preserve">CMAJ, 173</w:t>
+      </w:r>
+      <w:r>
+        <w:t xml:space="preserve">(5), 489–495.</w:t>
+      </w:r>
+    </w:p>
+    <w:p>
+      <w:pPr>
+        <w:pStyle w:val="BodyJ"/>
+      </w:pPr>
+      <w:r>
         <w:t xml:space="preserve">Rouault, M., McWilliams, A., Allen, M., &amp; Fleming, S. M. (2018). Human metacognition across domains: Insights from individual differences and neuroimaging. </w:t>
       </w:r>
       <w:r>
@@ -16936,6 +17254,24 @@
       </w:r>
       <w:r>
         <w:t xml:space="preserve">, 172–180.</w:t>
+      </w:r>
+    </w:p>
+    <w:p>
+      <w:pPr>
+        <w:pStyle w:val="BodyJ"/>
+      </w:pPr>
+      <w:r>
+        <w:t xml:space="preserve">Taboada, P. (2000). El derecho a morir con dignidad. </w:t>
+      </w:r>
+      <w:r>
+        <w:rPr>
+          <w:i/>
+          <w:iCs/>
+        </w:rPr>
+        <w:t xml:space="preserve">Acta Bioethica, 6</w:t>
+      </w:r>
+      <w:r>
+        <w:t xml:space="preserve">(1), 89–101.</w:t>
       </w:r>
     </w:p>
     <w:p>

</xml_diff>

<commit_message>
Cap. 17: la IA en el proceso clínico — roles, riesgos y defensas
El capítulo de inteligencia artificial pasa de abrir la Parte IV (cap. 14)
a ser el penúltimo del libro (cap. 17), expandido: rol en el proceso
diagnóstico (Goh 2024) y terapéutico (Wong 2021), catálogo de seis riesgos
con parentesco epistémico (confabulación, sesgo de automatización
—Goddard 2012—, atrofia de la pericia —Budzyń 2025—, sesgo algorítmico
—Obermeyer 2019—, sobreconfianza no calibrada, degradación silenciosa),
defensas del clínico y de la institución, y Taller 17 'La autopsia de una
respuesta'. Parte IV renumerada (14 humildad, 15 HII-D, 16 enseñar);
referencias cruzadas, talleres, glosario e índice analítico actualizados;
TOC verificado (36 entradas).

Co-Authored-By: Claude Fable 5 <noreply@anthropic.com>
Claude-Session: https://claude.ai/code/session_01SPkhDdVzUCxJwqq61ddeLW
</commit_message>
<xml_diff>
--- a/libro/Hechos_inferencias_incertidumbre_edicion_revisada.docx
+++ b/libro/Hechos_inferencias_incertidumbre_edicion_revisada.docx
@@ -638,7 +638,7 @@
         </w:tabs>
       </w:pPr>
       <w:r>
-        <w:t xml:space="preserve">Capítulo 14. Inteligencia artificial como espejo del razonamiento</w:t>
+        <w:t xml:space="preserve">Capítulo 14. Humildad epistémica y responsabilidad clínica</w:t>
       </w:r>
       <w:r>
         <w:tab/>
@@ -658,7 +658,7 @@
         </w:tabs>
       </w:pPr>
       <w:r>
-        <w:t xml:space="preserve">Capítulo 15. Humildad epistémica y responsabilidad clínica</w:t>
+        <w:t xml:space="preserve">Capítulo 15. El método HII-D: una epistemología operativa</w:t>
       </w:r>
       <w:r>
         <w:tab/>
@@ -667,7 +667,7 @@
         <w:rPr>
           <w:color w:val="8A8A8A"/>
         </w:rPr>
-        <w:t xml:space="preserve">73</w:t>
+        <w:t xml:space="preserve">75</w:t>
       </w:r>
     </w:p>
     <w:p>
@@ -678,7 +678,7 @@
         </w:tabs>
       </w:pPr>
       <w:r>
-        <w:t xml:space="preserve">Capítulo 16. El método HII-D: una epistemología operativa</w:t>
+        <w:t xml:space="preserve">Cuaderno de casos. Diez viñetas para una lectura metacognitiva</w:t>
       </w:r>
       <w:r>
         <w:tab/>
@@ -687,7 +687,7 @@
         <w:rPr>
           <w:color w:val="8A8A8A"/>
         </w:rPr>
-        <w:t xml:space="preserve">78</w:t>
+        <w:t xml:space="preserve">81</w:t>
       </w:r>
     </w:p>
     <w:p>
@@ -698,7 +698,7 @@
         </w:tabs>
       </w:pPr>
       <w:r>
-        <w:t xml:space="preserve">Cuaderno de casos. Diez viñetas para una lectura metacognitiva</w:t>
+        <w:t xml:space="preserve">Capítulo 16. Enseñar y organizar la metacognición clínica</w:t>
       </w:r>
       <w:r>
         <w:tab/>
@@ -707,7 +707,7 @@
         <w:rPr>
           <w:color w:val="8A8A8A"/>
         </w:rPr>
-        <w:t xml:space="preserve">84</w:t>
+        <w:t xml:space="preserve">89</w:t>
       </w:r>
     </w:p>
     <w:p>
@@ -718,7 +718,7 @@
         </w:tabs>
       </w:pPr>
       <w:r>
-        <w:t xml:space="preserve">Capítulo 17. Enseñar y organizar la metacognición clínica</w:t>
+        <w:t xml:space="preserve">Capítulo 17. La inteligencia artificial en el proceso clínico: roles, riesgos y defensas</w:t>
       </w:r>
       <w:r>
         <w:tab/>
@@ -727,7 +727,7 @@
         <w:rPr>
           <w:color w:val="8A8A8A"/>
         </w:rPr>
-        <w:t xml:space="preserve">92</w:t>
+        <w:t xml:space="preserve">93</w:t>
       </w:r>
     </w:p>
     <w:p>
@@ -747,7 +747,7 @@
         <w:rPr>
           <w:color w:val="8A8A8A"/>
         </w:rPr>
-        <w:t xml:space="preserve">96</w:t>
+        <w:t xml:space="preserve">99</w:t>
       </w:r>
     </w:p>
     <w:p>
@@ -767,7 +767,7 @@
         <w:rPr>
           <w:color w:val="8A8A8A"/>
         </w:rPr>
-        <w:t xml:space="preserve">100</w:t>
+        <w:t xml:space="preserve">103</w:t>
       </w:r>
     </w:p>
     <w:p>
@@ -787,7 +787,7 @@
         <w:rPr>
           <w:color w:val="8A8A8A"/>
         </w:rPr>
-        <w:t xml:space="preserve">102</w:t>
+        <w:t xml:space="preserve">105</w:t>
       </w:r>
     </w:p>
     <w:p>
@@ -807,7 +807,7 @@
         <w:rPr>
           <w:color w:val="8A8A8A"/>
         </w:rPr>
-        <w:t xml:space="preserve">104</w:t>
+        <w:t xml:space="preserve">107</w:t>
       </w:r>
     </w:p>
     <w:p>
@@ -827,7 +827,7 @@
         <w:rPr>
           <w:color w:val="8A8A8A"/>
         </w:rPr>
-        <w:t xml:space="preserve">106</w:t>
+        <w:t xml:space="preserve">109</w:t>
       </w:r>
     </w:p>
     <w:p>
@@ -847,7 +847,7 @@
         <w:rPr>
           <w:color w:val="8A8A8A"/>
         </w:rPr>
-        <w:t xml:space="preserve">108</w:t>
+        <w:t xml:space="preserve">111</w:t>
       </w:r>
     </w:p>
     <w:p>
@@ -867,7 +867,7 @@
         <w:rPr>
           <w:color w:val="8A8A8A"/>
         </w:rPr>
-        <w:t xml:space="preserve">112</w:t>
+        <w:t xml:space="preserve">115</w:t>
       </w:r>
     </w:p>
     <w:p>
@@ -887,7 +887,7 @@
         <w:rPr>
           <w:color w:val="8A8A8A"/>
         </w:rPr>
-        <w:t xml:space="preserve">115</w:t>
+        <w:t xml:space="preserve">118</w:t>
       </w:r>
     </w:p>
     <w:p>
@@ -1069,7 +1069,7 @@
         <w:t xml:space="preserve">Parte IV</w:t>
       </w:r>
       <w:r>
-        <w:t xml:space="preserve"> propone una epistemología operativa: inteligencia artificial, responsabilidad —incluido el miedo que también escribe—, el método HII-D, un cuaderno de diez casos, la enseñanza de la metacognición clínica y un cierre desde la poesía chilena — Huidobro y Parra como los dos polos de lo que la palabra clínica puede y no puede permitirse.</w:t>
+        <w:t xml:space="preserve"> propone una epistemología operativa: la responsabilidad —incluido el miedo que también escribe—, el método HII-D, un cuaderno de diez casos, la enseñanza de la metacognición clínica, la inteligencia artificial en el proceso diagnóstico y terapéutico —sus roles, sus riesgos y las defensas frente a ellos— y un cierre desde la poesía chilena — Huidobro y Parra como los dos polos de lo que la palabra clínica puede y no puede permitirse.</w:t>
       </w:r>
     </w:p>
     <w:p>
@@ -7702,7 +7702,7 @@
         <w:pStyle w:val="BodyJ"/>
       </w:pPr>
       <w:r>
-        <w:t xml:space="preserve">Carmen pregunta lo que casi todos preguntan: "¿Y usted qué haría?". La cirujana responde con la estructura del capítulo 15 en mente: "Yo le recomiendo operarse, y le digo por qué: prefiero un riesgo quirúrgico conocido, con usted optimizada, a un riesgo obstructivo que no controlamos ni podemos programar. Pero la que pasó el shock fue usted, y la que decide cuánto miedo le tiene a cada uno de esos riesgos también es usted".</w:t>
+        <w:t xml:space="preserve">Carmen pregunta lo que casi todos preguntan: "¿Y usted qué haría?". La cirujana responde con la estructura del capítulo 14 en mente: "Yo le recomiendo operarse, y le digo por qué: prefiero un riesgo quirúrgico conocido, con usted optimizada, a un riesgo obstructivo que no controlamos ni podemos programar. Pero la que pasó el shock fue usted, y la que decide cuánto miedo le tiene a cada uno de esos riesgos también es usted".</w:t>
       </w:r>
     </w:p>
     <w:p>
@@ -7751,7 +7751,7 @@
         <w:pStyle w:val="PartIntro"/>
       </w:pPr>
       <w:r>
-        <w:t xml:space="preserve">Las tres primeras partes construyeron las herramientas; esta las pone a trabajar. Primero frente al espejo nuevo de la inteligencia artificial (capítulo 14) y frente a la responsabilidad —y el miedo— que ninguna herramienta puede delegar (capítulo 15). Luego, el método HII-D en forma completa y en versión de sesenta segundos (capítulo 16), un cuaderno de diez casos para leer metacognitivamente —incluida la resolución de la historia de Carmen—, el problema de enseñar y organizar todo esto (capítulo 17), y un último capítulo que se permite mirar el oficio desde la poesía — porque el debate sobre lo que la palabra tiene derecho a hacer también se libró en verso, y en Chile (capítulo 18).</w:t>
+        <w:t xml:space="preserve">Las tres primeras partes construyeron las herramientas; esta las pone a trabajar. Primero frente a la responsabilidad —y el miedo— que ninguna herramienta puede delegar (capítulo 14). Luego, el método HII-D en forma completa y en versión de sesenta segundos (capítulo 15), un cuaderno de diez casos para leer metacognitivamente —incluida la resolución de la historia de Carmen— y el problema de enseñar y organizar todo esto (capítulo 16). Cierran el libro dos espejos: la inteligencia artificial en el proceso diagnóstico y terapéutico —qué hace, qué arriesga, cómo se la enfrenta— (capítulo 17), y la poesía — porque el debate sobre lo que la palabra tiene derecho a hacer también se libró en verso, y en Chile (capítulo 18).</w:t>
       </w:r>
     </w:p>
     <w:p>
@@ -7781,15 +7781,15 @@
           <w:szCs w:val="32"/>
         </w:rPr>
         <w:br/>
-        <w:t xml:space="preserve">Inteligencia artificial como espejo del razonamiento</w:t>
-      </w:r>
-    </w:p>
-    <w:p>
-      <w:pPr>
-        <w:pStyle w:val="BodyJ"/>
-      </w:pPr>
-      <w:r>
-        <w:t xml:space="preserve">Un residente pega la historia de un paciente en un asistente de lenguaje y recibe, en ocho segundos, una evaluación impecablemente redactada: diagnóstico probable, diferenciales ordenados, plan sugerido. Todo suena verosímil. La pregunta que este capítulo propone no es "¿acierta la máquina?", sino una más incómoda: ¿en qué se parece esa prosa fluida y segura a la que escribimos nosotros?</w:t>
+        <w:t xml:space="preserve">Humildad epistémica y responsabilidad clínica</w:t>
+      </w:r>
+    </w:p>
+    <w:p>
+      <w:pPr>
+        <w:pStyle w:val="BodyJ"/>
+      </w:pPr>
+      <w:r>
+        <w:t xml:space="preserve">Hay una frase que me costó años aprender a decir delante de una familia: "no lo sé". La primera vez que la dije completa —"no sé todavía por qué empeoró; sé qué descartamos, sé qué vamos a vigilar esta noche y sé cuándo tendremos más información"— esperaba encontrar decepción. Encontré alivio. La familia no necesitaba mi certeza; necesitaba saber que la incertidumbre estaba siendo trabajada. Este capítulo trata de esa diferencia: entre parecer seguro y ser responsable.</w:t>
       </w:r>
     </w:p>
     <w:p>
@@ -7806,23 +7806,23 @@
           <w:sz w:val="25"/>
           <w:szCs w:val="25"/>
         </w:rPr>
-        <w:t xml:space="preserve">Lenguaje plausible y verdad</w:t>
-      </w:r>
-    </w:p>
-    <w:p>
-      <w:pPr>
-        <w:pStyle w:val="BodyJ"/>
-      </w:pPr>
-      <w:r>
-        <w:t xml:space="preserve">Los grandes modelos de lenguaje generan continuaciones plausibles a partir de patrones aprendidos en enormes corpus. Su fluidez puede producir respuestas clínicamente útiles, pero también afirmaciones falsas presentadas con coherencia. La literatura denomina hallucination a contenido no sustentado o inconsistente con la fuente o el mundo (Ji et al., 2023). El término es metafórico: el modelo no tiene una experiencia perceptiva que se desorganice como en la alucinación humana.</w:t>
-      </w:r>
-    </w:p>
-    <w:p>
-      <w:pPr>
-        <w:pStyle w:val="BodyJ"/>
-      </w:pPr>
-      <w:r>
-        <w:t xml:space="preserve">La medicina reconoce el peligro porque también trabaja con narrativas plausibles. Un clínico puede completar huecos, atribuir causalidad o recordar un dato de manera congruente con su hipótesis. La semejanza no implica identidad. El médico posee cuerpo, responsabilidad, acceso al paciente, experiencia situada y capacidad de actuar; el modelo manipula representaciones lingüísticas y depende del contexto que recibe.</w:t>
+        <w:t xml:space="preserve">Afirmar es asumir una responsabilidad</w:t>
+      </w:r>
+    </w:p>
+    <w:p>
+      <w:pPr>
+        <w:pStyle w:val="BodyJ"/>
+      </w:pPr>
+      <w:r>
+        <w:t xml:space="preserve">Una frase clínica no es moralmente neutra. Puede activar una cirugía, justificar aislamiento, etiquetar a una persona, limitar tratamientos o fijar una interpretación que otros repetirán. Cuando escribimos "rechaza", "no adherente", "funcional", "terminal" o "sin indicación", no sólo describimos. Distribuimos credibilidad, urgencia y recursos. La ética del razonamiento comienza antes de la decisión: comienza en la forma en que se recibe un testimonio y se concede fuerza a una afirmación.</w:t>
+      </w:r>
+    </w:p>
+    <w:p>
+      <w:pPr>
+        <w:pStyle w:val="BodyJ"/>
+      </w:pPr>
+      <w:r>
+        <w:t xml:space="preserve">La prudencia aristotélica —phronesis— no es cautela pasiva, sino capacidad de deliberar bien sobre lo que conviene hacer en una situación particular. Pellegrino y Thomasma situaron el juicio clínico en el encuentro entre conocimiento técnico, bien del paciente y obligación moral (Pellegrino &amp; Thomasma, 1981). La decisión médica nunca es únicamente correcta por su coherencia lógica; debe ser justificable para la persona sobre la que actúa.</w:t>
       </w:r>
     </w:p>
     <w:p>
@@ -7839,23 +7839,23 @@
           <w:sz w:val="25"/>
           <w:szCs w:val="25"/>
         </w:rPr>
-        <w:t xml:space="preserve">Competencia sin garantía</w:t>
-      </w:r>
-    </w:p>
-    <w:p>
-      <w:pPr>
-        <w:pStyle w:val="BodyJ"/>
-      </w:pPr>
-      <w:r>
-        <w:t xml:space="preserve">Estudios han mostrado que modelos avanzados codifican conocimiento médico y alcanzan alto rendimiento en preguntas y casos seleccionados (Singhal et al., 2023). Lee, Bubeck y Petro describieron beneficios potenciales junto con límites y riesgos de GPT-4 en medicina (Lee et al., 2023). El rendimiento promedio no garantiza confiabilidad en un caso individual, especialmente cuando faltan datos, hay ambigüedad o la tarea exige conocimiento local. Y las consecuencias no intencionadas del aprendizaje automático en medicina —desde la automatización de sesgos presentes en los datos hasta la erosión de habilidades por deferencia— han sido advertidas desde antes de los modelos generativos (Cabitza et al., 2017).</w:t>
-      </w:r>
-    </w:p>
-    <w:p>
-      <w:pPr>
-        <w:pStyle w:val="BodyJ"/>
-      </w:pPr>
-      <w:r>
-        <w:t xml:space="preserve">La fluidez aumenta el riesgo de automatización: el usuario puede aceptar una respuesta porque está bien estructurada. El problema es metacognitivo. La confianza percibida en el lenguaje no informa necesariamente la probabilidad de corrección. La IA puede parecer mejor calibrada de lo que está.</w:t>
+        <w:t xml:space="preserve">Humildad epistémica</w:t>
+      </w:r>
+    </w:p>
+    <w:p>
+      <w:pPr>
+        <w:pStyle w:val="BodyJ"/>
+      </w:pPr>
+      <w:r>
+        <w:t xml:space="preserve">La humildad epistémica no consiste en disminuir artificialmente la propia competencia ni en presentar todas las hipótesis como equivalentes. Consiste en conocer el alcance y los límites de las razones disponibles, reconocer dependencia de otros y mantener apertura real a corrección. Es compatible con decisiones firmes. Un cirujano puede afirmar que una intervención es urgente y, al mismo tiempo, distinguir qué mecanismo está demostrado, qué riesgo se estima y qué desenlace sigue siendo incierto.</w:t>
+      </w:r>
+    </w:p>
+    <w:p>
+      <w:pPr>
+        <w:pStyle w:val="BodyJ"/>
+      </w:pPr>
+      <w:r>
+        <w:t xml:space="preserve">La falsa seguridad daña porque cierra la revisión y puede engañar al paciente. La duda indiscriminada también daña: transfiere carga, paraliza decisiones o abandona a la persona bajo una apariencia de neutralidad. La virtud está en calibrar. Decir "no lo sé" es profesional cuando se acompaña de qué sí se sabe, qué se hará, qué riesgo se vigila y cuándo se reevaluará.</w:t>
       </w:r>
     </w:p>
     <w:p>
@@ -7872,103 +7872,47 @@
           <w:sz w:val="25"/>
           <w:szCs w:val="25"/>
         </w:rPr>
-        <w:t xml:space="preserve">Una diferencia central</w:t>
-      </w:r>
-    </w:p>
-    <w:p>
-      <w:pPr>
-        <w:pStyle w:val="BodyJ"/>
-      </w:pPr>
-      <w:r>
-        <w:t xml:space="preserve">El clínico responsable puede distinguir "lo vi", "lo infiero" y "no lo sé". Un modelo suele mezclar estas capas si el prompt no exige separación y si no tiene fuentes verificables. Puede transformar ausencia de información en un detalle probable, porque su objetivo generativo favorece continuidad.</w:t>
-      </w:r>
-    </w:p>
-    <w:p>
-      <w:pPr>
-        <w:pStyle w:val="BodyJ"/>
-      </w:pPr>
-      <w:r>
-        <w:t xml:space="preserve">La matriz HII-D permite auditar una respuesta de IA:</w:t>
-      </w:r>
-    </w:p>
-    <w:p>
-      <w:pPr>
-        <w:pStyle w:val="BodyJ"/>
-        <w:numPr>
-          <w:ilvl w:val="0"/>
-          <w:numId w:val="6"/>
-        </w:numPr>
-      </w:pPr>
-      <w:r>
-        <w:t xml:space="preserve">¿qué hechos provienen realmente del caso?;</w:t>
-      </w:r>
-    </w:p>
-    <w:p>
-      <w:pPr>
-        <w:pStyle w:val="BodyJ"/>
-        <w:numPr>
-          <w:ilvl w:val="0"/>
-          <w:numId w:val="6"/>
-        </w:numPr>
-      </w:pPr>
-      <w:r>
-        <w:t xml:space="preserve">¿qué información agregó el modelo?;</w:t>
-      </w:r>
-    </w:p>
-    <w:p>
-      <w:pPr>
-        <w:pStyle w:val="BodyJ"/>
-        <w:numPr>
-          <w:ilvl w:val="0"/>
-          <w:numId w:val="6"/>
-        </w:numPr>
-      </w:pPr>
-      <w:r>
-        <w:t xml:space="preserve">¿qué inferencias formula y con qué respaldo?;</w:t>
-      </w:r>
-    </w:p>
-    <w:p>
-      <w:pPr>
-        <w:pStyle w:val="BodyJ"/>
-        <w:numPr>
-          <w:ilvl w:val="0"/>
-          <w:numId w:val="6"/>
-        </w:numPr>
-      </w:pPr>
-      <w:r>
-        <w:t xml:space="preserve">¿qué incertidumbres omitió?;</w:t>
-      </w:r>
-    </w:p>
-    <w:p>
-      <w:pPr>
-        <w:pStyle w:val="BodyJ"/>
-        <w:numPr>
-          <w:ilvl w:val="0"/>
-          <w:numId w:val="6"/>
-        </w:numPr>
-      </w:pPr>
-      <w:r>
-        <w:t xml:space="preserve">¿qué decisión propone y cuáles serían sus riesgos?;</w:t>
-      </w:r>
-    </w:p>
-    <w:p>
-      <w:pPr>
-        <w:pStyle w:val="BodyJ"/>
-        <w:numPr>
-          <w:ilvl w:val="0"/>
-          <w:numId w:val="6"/>
-        </w:numPr>
-      </w:pPr>
-      <w:r>
-        <w:t xml:space="preserve">¿qué fuente primaria permite verificar la afirmación?</w:t>
-      </w:r>
-    </w:p>
-    <w:p>
-      <w:pPr>
-        <w:pStyle w:val="BodyJ"/>
-      </w:pPr>
-      <w:r>
-        <w:t xml:space="preserve">El modelo puede servir como generador de alternativas, revisor de coherencia, organizador de información o segundo lector. Su valor aumenta cuando el usuario mantiene la responsabilidad de verificación y disminuye cuando se usa como autoridad final.</w:t>
+        <w:t xml:space="preserve">La humildad como motor: explorar, aprender, reenfocar</w:t>
+      </w:r>
+    </w:p>
+    <w:p>
+      <w:pPr>
+        <w:pStyle w:val="BodyJ"/>
+      </w:pPr>
+      <w:r>
+        <w:t xml:space="preserve">Hay una caricatura de la humildad epistémica que conviene desactivar: la del médico tibio, que afirma poco por miedo a equivocarse. Esa figura confunde humildad con timidez. La filosofía contemporánea de las virtudes intelectuales ofrece una definición más útil: ser intelectualmente humilde es atender a las propias limitaciones y apropiárselas — saber dónde termina lo que uno sabe, y dejar que ese saber actúe (Whitcomb et al., 2017). Definida así, la humildad no es un freno. Es un motor: la única disposición que mantiene el caso abierto después de que ya tenemos una respuesta que funciona.</w:t>
+      </w:r>
+    </w:p>
+    <w:p>
+      <w:pPr>
+        <w:pStyle w:val="BodyJ"/>
+      </w:pPr>
+      <w:r>
+        <w:t xml:space="preserve">Sus efectos son tres, y los tres son dinámicos. Primero, permite seguir explorando. Quien es dueño de sus límites sigue preguntando cuando la etiqueta ya está puesta: busca el hallazgo que no encaja, pide el examen que podría desmentirlo, vuelve a la cama del paciente sin necesitar que algo se haya complicado para justificar la visita. La exploración no termina cuando aparece una explicación; termina cuando la explicación ha sobrevivido a sus rivales — y saber la diferencia es humildad operando.</w:t>
+      </w:r>
+    </w:p>
+    <w:p>
+      <w:pPr>
+        <w:pStyle w:val="BodyJ"/>
+      </w:pPr>
+      <w:r>
+        <w:t xml:space="preserve">Segundo, permite seguir aprendiendo. El feedback sólo enseña a quien puede recibirlo sin tratarlo como acusación. El portafolio de calibración, la conferencia de morbimortalidad, la corrección venida de cualquier miembro del equipo —de la enfermera de turno al propio paciente— funcionan únicamente sobre esa base. Un médico que no puede ser corregido no es un médico seguro: es un médico que dejó de aprender, con años de práctica acumulándose sobre los mismos errores.</w:t>
+      </w:r>
+    </w:p>
+    <w:p>
+      <w:pPr>
+        <w:pStyle w:val="BodyJ"/>
+      </w:pPr>
+      <w:r>
+        <w:t xml:space="preserve">Tercero —y es el efecto más clínico de todos—, permite reubicar el foco y el manejo. La dirección de la atención diagnóstica no es un voto de por vida: es una asignación provisional de recursos, revisable cuando la trayectoria contradice el mapa. El humilde redirige sin vivirlo como derrota — de lo urinario a lo abdominal, de la lesión estructural al trastorno funcional, del objetivo curativo al de confort — y ajusta el tratamiento con la misma naturalidad con que lo inició. El orgulloso, en cambio, defiende su primera formulación como se defiende una propiedad, y convierte cada dato discordante en un ataque que repeler. El anclaje del capítulo 7 es, visto así, un fracaso de humildad antes que un fallo de memoria: la información nueva estaba disponible; lo que faltó fue la disposición a dejarla mandar.</w:t>
+      </w:r>
+    </w:p>
+    <w:p>
+      <w:pPr>
+        <w:pStyle w:val="BodyJ"/>
+      </w:pPr>
+      <w:r>
+        <w:t xml:space="preserve">Por eso este libro necesita la humildad no como ornamento ético sino como pieza estructural. La reevaluación del método HII-D (capítulo 15) es humildad convertida en procedimiento: la cláusula "qué me haría cambiar", escrita antes de saber si habrá que cambiar, es la forma que toma esta virtud cuando se la obliga a dejar huella en la ficha.</w:t>
       </w:r>
     </w:p>
     <w:p>
@@ -7985,31 +7929,39 @@
           <w:sz w:val="25"/>
           <w:szCs w:val="25"/>
         </w:rPr>
-        <w:t xml:space="preserve">Metacognición artificial</w:t>
-      </w:r>
-    </w:p>
-    <w:p>
-      <w:pPr>
-        <w:pStyle w:val="BodyJ"/>
-      </w:pPr>
-      <w:r>
-        <w:t xml:space="preserve">Algunos sistemas pueden expresar confianza, criticar una respuesta o revisar pasos. Eso no demuestra autoconocimiento en el sentido humano. Una salida metacognitiva puede ser otra generación entrenada para imitar evaluación. La pregunta práctica no es si el sistema "sabe que sabe", sino si sus señales de confianza están empíricamente calibradas y si el flujo de trabajo detecta fallas.</w:t>
-      </w:r>
-    </w:p>
-    <w:p>
-      <w:pPr>
-        <w:pStyle w:val="BodyJ"/>
-      </w:pPr>
-      <w:r>
-        <w:t xml:space="preserve">Esa pregunta ya tiene datos. La evidencia disponible muestra que la confianza verbalizada de los grandes modelos —el "estoy bastante seguro" que escriben— tiende a la sobreconfianza sistemática y se calibra mal, aun cuando algunas señales internas del modelo discriminan mejor de lo que su prosa deja ver (Kadavath et al., 2022; Xiong et al., 2024). La implicación práctica es idéntica a la del capítulo 5, aplicada ahora a la máquina: preguntarle a un modelo cuán seguro está no sustituye la verificación, igual que la seguridad de un colega no sustituye sus razones. La calibración se demuestra con series de predicciones y desenlaces, no con tono.</w:t>
-      </w:r>
-    </w:p>
-    <w:p>
-      <w:pPr>
-        <w:pStyle w:val="BodyJ"/>
-      </w:pPr>
-      <w:r>
-        <w:t xml:space="preserve">La OMS ha recomendado gobernanza, evaluación, transparencia y supervisión para modelos multimodales en salud, atendiendo riesgos de inexactitud, sesgo, privacidad y dependencia excesiva (World Health Organization, 2024). La supervisión humana no debe ser una firma ritual al final. Debe contar con tiempo, datos y autoridad para cuestionar.</w:t>
+        <w:t xml:space="preserve">Credibilidad y experiencia del paciente</w:t>
+      </w:r>
+    </w:p>
+    <w:p>
+      <w:pPr>
+        <w:pStyle w:val="BodyJ"/>
+      </w:pPr>
+      <w:r>
+        <w:t xml:space="preserve">Miranda Fricker denominó injusticia epistémica al daño cometido contra alguien en su capacidad de sujeto de conocimiento (Fricker, 2007). En salud, Carel y Kidd mostraron cómo el testimonio de pacientes puede recibir menor credibilidad o carecer de categorías interpretativas adecuadas, y cómo la propia experiencia de enfermar agudiza esa vulnerabilidad epistémica (Carel &amp; Kidd, 2014; Kidd &amp; Carel, 2017). El enfermo posee un conocimiento de primera persona sobre dolor, cambio funcional, tolerancia, valores y trayectoria cotidiana que no puede ser sustituido por mediciones externas. Ese conocimiento tampoco es infalible, pero merece evaluación y no descarte reflejo.</w:t>
+      </w:r>
+    </w:p>
+    <w:p>
+      <w:pPr>
+        <w:pStyle w:val="BodyJ"/>
+      </w:pPr>
+      <w:r>
+        <w:t xml:space="preserve">La filosofía del testimonio ayuda a precisar qué significa "evaluar sin descartar". Contra la sospecha heredada del empirismo —que creerle a otro es siempre conocimiento de segunda categoría—, Coady mostró que el testimonio es una fuente básica de conocimiento, tan constitutiva como la percepción o la memoria: sin una confianza por defecto en lo que otros informan, ni la ciencia ni la vida cotidiana serían posibles (Coady, 1992). Lackey corrigió el exceso opuesto: la confianza por defecto no es un cheque en blanco; el oyente responsable mantiene una sensibilidad activa a las señales de error o engaño, y el conocimiento testimonial se logra cuando ambas condiciones —decir fiable y escuchar vigilante— se cumplen a la vez (Lackey, 2008). La anamnesis es exactamente ese contrato epistémico: el paciente aporta un informe que el médico no puede obtener por ninguna otra vía, y el médico aporta el examen de consistencia, forma temporal y relación con otros hallazgos. Ni credulidad ni auditoría hostil: recepción con estándares. La injusticia testimonial es, en estos términos, un fallo del segundo contratante: aplicar a ciertos hablantes un estándar de vigilancia que no se aplica a otros, por razones que nada tienen que ver con la fiabilidad de su informe.</w:t>
+      </w:r>
+    </w:p>
+    <w:p>
+      <w:pPr>
+        <w:pStyle w:val="BodyJ"/>
+      </w:pPr>
+      <w:r>
+        <w:t xml:space="preserve">La injusticia testimonial aparece cuando prejuicios sobre edad, género, origen, diagnóstico psiquiátrico, discapacidad o estilo comunicativo reducen injustificadamente la credibilidad. La injusticia hermenéutica surge cuando faltan conceptos compartidos para expresar una experiencia o cuando la institución sólo admite aquello que cabe en sus formularios. En ambos casos, el problema no es cortesía: se pierde evidencia clínicamente relevante.</w:t>
+      </w:r>
+    </w:p>
+    <w:p>
+      <w:pPr>
+        <w:pStyle w:val="BodyJ"/>
+      </w:pPr>
+      <w:r>
+        <w:t xml:space="preserve">Escuchar de manera epistémica implica preguntar qué sabe esta persona que el equipo no puede observar, qué interpretación atribuye a sus síntomas y qué experiencias anteriores modifican su decisión. También exige distinguir desacuerdo de incapacidad. Un paciente puede comprender la evidencia y valorar de manera diferente los desenlaces. Cuando Carmen dijo "esta vez el dolor era otro", estaba entregando el dato pronóstico más importante del ingreso; la nota que lo hubiera omitido habría cometido, además de una injusticia, un error técnico.</w:t>
       </w:r>
     </w:p>
     <w:p>
@@ -8026,15 +7978,105 @@
           <w:sz w:val="25"/>
           <w:szCs w:val="25"/>
         </w:rPr>
-        <w:t xml:space="preserve">La IA como provocación filosófica</w:t>
-      </w:r>
-    </w:p>
-    <w:p>
-      <w:pPr>
-        <w:pStyle w:val="BodyJ"/>
-      </w:pPr>
-      <w:r>
-        <w:t xml:space="preserve">La IA revela que una frase puede conservar la forma externa del razonamiento sin tener acceso directo al evento. Esto obliga a recordar que la coherencia verbal nunca fue garantía suficiente. También muestra el valor del lenguaje como espacio de prueba: pedir alternativas, contraejemplos y explicitar incertidumbre puede mejorar la deliberación humana, aunque no vuelva verdadero al modelo.</w:t>
+        <w:t xml:space="preserve">La ética de la incertidumbre</w:t>
+      </w:r>
+    </w:p>
+    <w:p>
+      <w:pPr>
+        <w:pStyle w:val="BodyJ"/>
+      </w:pPr>
+      <w:r>
+        <w:t xml:space="preserve">Comunicar incertidumbre es una obligación de veracidad, pero la forma importa. Entregar una lista de posibilidades sin jerarquía puede aumentar angustia sin mejorar autonomía. Ocultar la duda para preservar confianza produce una alianza frágil. La comunicación responsable estructura: qué explicación es más probable, qué alternativas relevantes permanecen, qué riesgos justifican actuar, qué señales deben motivar consulta y qué aspectos dependen de preferencias.</w:t>
+      </w:r>
+    </w:p>
+    <w:p>
+      <w:pPr>
+        <w:pStyle w:val="BodyJ"/>
+      </w:pPr>
+      <w:r>
+        <w:t xml:space="preserve">La decisión compartida no significa que médico y paciente aporten lo mismo. El profesional ofrece conocimiento técnico, estimación de consecuencias y recomendación; el paciente aporta experiencia, objetivos y tolerancia al riesgo (Elwyn et al., 2012).</w:t>
+      </w:r>
+    </w:p>
+    <w:p>
+      <w:pPr>
+        <w:pStyle w:val="BodyJ"/>
+      </w:pPr>
+      <w:r>
+        <w:t xml:space="preserve">Existe además una ética de la revisión. Una hipótesis provisional que se documenta sin plan de seguimiento puede transformarse en daño por inercia. Quien decide bajo incertidumbre adquiere la obligación de definir cómo se reconocerá el error. Los criterios de alarma, controles, responsable y plazo no son tareas administrativas agregadas: completan la racionalidad moral de la decisión.</w:t>
+      </w:r>
+    </w:p>
+    <w:p>
+      <w:pPr>
+        <w:pStyle w:val="Heading3"/>
+        <w:spacing w:after="120" w:before="280"/>
+      </w:pPr>
+      <w:r>
+        <w:rPr>
+          <w:rFonts w:ascii="Georgia" w:cs="Georgia" w:eastAsia="Georgia" w:hAnsi="Georgia"/>
+          <w:b/>
+          <w:bCs/>
+          <w:color w:val="2B2B2B"/>
+          <w:sz w:val="25"/>
+          <w:szCs w:val="25"/>
+        </w:rPr>
+        <w:t xml:space="preserve">El miedo también escribe: documentación defensiva y segunda víctima</w:t>
+      </w:r>
+    </w:p>
+    <w:p>
+      <w:pPr>
+        <w:pStyle w:val="BodyJ"/>
+      </w:pPr>
+      <w:r>
+        <w:t xml:space="preserve">Hay una variable que ningún modelo del razonamiento clínico incluye y que opera todos los días: el miedo. Miedo a la demanda, al reclamo, a la auditoría, al pasillo. Ese miedo no se queda en el cuerpo del médico; escribe en la ficha. La documentación defensiva —notas redactadas para un abogado imaginario y no para el siguiente lector clínico— es su síntoma más visible, y es un corruptor epistémico de primer orden: donde la frase medular busca hacer auditable el razonamiento, la nota defensiva busca hacerlo inatacable, que es casi lo contrario. Se omiten las dudas (podrían "usarse en contra"), se multiplican los exámenes cuya única indicación es la constancia, se prefiere la vaguedad que no compromete a la precisión que expone. El resultado es una ficha que protege menos de lo que cree: ante cualquier revisión seria, la nota vaga sin criterios de reapertura parece ocultamiento, mientras que la nota que muestra qué se sabía, qué se dudaba y cuándo se planeó reevaluar demuestra exactamente lo que el derecho sanitario pondera — un proceso razonable con la información disponible. La trazabilidad honesta no es ingenuidad jurídica; es la mejor defensa que la epistemología puede ofrecer, además de la única compatible con seguir pensando.</w:t>
+      </w:r>
+    </w:p>
+    <w:p>
+      <w:pPr>
+        <w:pStyle w:val="BodyJ"/>
+      </w:pPr>
+      <w:r>
+        <w:t xml:space="preserve">El mismo miedo, vuelto hacia adentro, tiene otro nombre. Wu llamó segunda víctima al clínico que, tras un error, queda él mismo dañado: culpa, vergüenza, aislamiento, la revisión obsesiva del momento en que las cosas pudieron ser distintas (Wu, 2000). El punto no es sentimental sino epistemológico: un médico devastado y solo no puede hacer el análisis de trayectoria del capítulo 7 — la vergüenza empuja o al silencio o al relato autoflagelante, y ninguno de los dos produce aprendizaje. Por eso el cuidado del que erró no es blandura institucional: es una condición del circuito de corrección. Un servicio que quiere fichas honestas y morbimortalidades útiles tiene que hacer verosímil una promesa: reconocer un error o una duda aquí no te destruirá. Donde esa promesa no existe, la humildad epistémica se vuelve un lujo peligroso, y el sistema entero paga en errores repetidos lo que ahorra en incomodidad.</w:t>
+      </w:r>
+    </w:p>
+    <w:p>
+      <w:pPr>
+        <w:pStyle w:val="Heading3"/>
+        <w:spacing w:after="120" w:before="280"/>
+      </w:pPr>
+      <w:r>
+        <w:rPr>
+          <w:rFonts w:ascii="Georgia" w:cs="Georgia" w:eastAsia="Georgia" w:hAnsi="Georgia"/>
+          <w:b/>
+          <w:bCs/>
+          <w:color w:val="2B2B2B"/>
+          <w:sz w:val="25"/>
+          <w:szCs w:val="25"/>
+        </w:rPr>
+        <w:t xml:space="preserve">Autoridad sin opacidad</w:t>
+      </w:r>
+    </w:p>
+    <w:p>
+      <w:pPr>
+        <w:pStyle w:val="BodyJ"/>
+      </w:pPr>
+      <w:r>
+        <w:t xml:space="preserve">La relación clínica es asimétrica: el profesional posee conocimientos, acceso institucional y capacidad de activar intervenciones que el paciente no controla. Esa asimetría hace necesaria la recomendación experta, pero también exige que la autoridad sea explicable. "Yo haría esto" tiene valor cuando resume razones; se vuelve problemática cuando sustituye su examen.</w:t>
+      </w:r>
+    </w:p>
+    <w:p>
+      <w:pPr>
+        <w:pStyle w:val="BodyJ"/>
+      </w:pPr>
+      <w:r>
+        <w:t xml:space="preserve">Recomendar no es imponer ni retirarse. El médico debe señalar qué opción considera preferible, qué hechos sostienen esa preferencia, qué incertidumbres podrían modificarla y qué valores del paciente son decisivos. La neutralidad aparente puede abandonar a una persona precisamente cuando necesita orientación. La autoridad bien ejercida reduce complejidad sin ocultar desacuerdos razonables. La respuesta de la cirujana a Carmen —"yo le recomiendo operarse, y le digo por qué"— es la forma completa del gesto: recomendación, razones, límites y devolución de la decisión.</w:t>
+      </w:r>
+    </w:p>
+    <w:p>
+      <w:pPr>
+        <w:pStyle w:val="BodyJ"/>
+      </w:pPr>
+      <w:r>
+        <w:t xml:space="preserve">También existe responsabilidad sobre las palabras que permanecen. Un diagnóstico inscrito en la ficha puede condicionar futuras interpretaciones incluso después de perder sustento. Corregir, fechar y explicar cambios de hipótesis es una obligación epistémica. No basta con pensar de nuevo; el sistema debe poder reconocer que se pensó de nuevo.</w:t>
       </w:r>
     </w:p>
     <w:p>
@@ -8042,15 +8084,23 @@
         <w:pStyle w:val="Quote1"/>
       </w:pPr>
       <w:r>
-        <w:t xml:space="preserve">La IA puede ampliar el espacio de hipótesis; no puede asumir por sí sola la responsabilidad de transformar una hipótesis en conducta clínica.</w:t>
-      </w:r>
-    </w:p>
-    <w:p>
-      <w:pPr>
-        <w:pStyle w:val="BodyJ"/>
-      </w:pPr>
-      <w:r>
-        <w:t xml:space="preserve">Usada con disciplina, puede ser un instrumento metacognitivo externo. Usada por deferencia, puede reforzar el mismo error que pretendía corregir: convertir plausibilidad en certeza.</w:t>
+        <w:t xml:space="preserve">La humildad clínica no consiste en afirmar menos, sino en no afirmar más de lo que permiten los hechos y no decidir menos de lo que exige el riesgo.</w:t>
+      </w:r>
+    </w:p>
+    <w:p>
+      <w:pPr>
+        <w:pStyle w:val="BodyJ"/>
+      </w:pPr>
+      <w:r>
+        <w:t xml:space="preserve">La lucidez une epistemología y ética. Sobreestimar la certeza puede conducir a intervenciones injustificadas; subestimar la gravedad puede negar protección; desacreditar un relato puede borrar el dato decisivo. Por ello, hechos, inferencias e incertidumbre no son sólo categorías del conocimiento. Son también una disciplina de respeto: permiten que el paciente sepa qué sostiene nuestra recomendación, dónde están sus límites y cómo responderemos si la realidad contradice lo esperado.</w:t>
+      </w:r>
+    </w:p>
+    <w:p>
+      <w:pPr>
+        <w:pStyle w:val="BodyJ"/>
+      </w:pPr>
+      <w:r>
+        <w:t xml:space="preserve">La confianza profesional más robusta no depende de parecer infalible. Se construye cuando el paciente y el equipo pueden reconocer una pauta: afirmaciones proporcionadas, revisión ante nueva evidencia y responsabilidad sobre las consecuencias de la decisión.</w:t>
       </w:r>
     </w:p>
     <w:p>
@@ -8065,7 +8115,7 @@
         <w:t xml:space="preserve">En una frase.</w:t>
       </w:r>
       <w:r>
-        <w:t xml:space="preserve"> La IA generativa produce exactamente aquello contra lo que este libro entrena: prosa fluida donde hechos, inferencias e incertidumbre llegan mezclados — auditarla con HII-D es el mismo ejercicio que auditar la propia escritura.</w:t>
+        <w:t xml:space="preserve"> Afirmar, dudar y recomendar son actos morales: la humildad epistémica bien entendida produce decisiones más firmes, no más tibias, porque cada afirmación carga exactamente el peso que puede sostener.</w:t>
       </w:r>
     </w:p>
     <w:p>
@@ -8090,7 +8140,7 @@
         </w:numPr>
       </w:pPr>
       <w:r>
-        <w:t xml:space="preserve">Si uso IA en este caso, ¿qué dato de su respuesta verifiqué contra una fuente primaria antes de actuar?</w:t>
+        <w:t xml:space="preserve">¿A qué paciente le estoy creyendo menos de lo que su testimonio merece, y por qué?</w:t>
       </w:r>
     </w:p>
     <w:p>
@@ -8102,7 +8152,7 @@
         </w:numPr>
       </w:pPr>
       <w:r>
-        <w:t xml:space="preserve">¿Qué agregó el modelo que el caso no contenía?</w:t>
+        <w:t xml:space="preserve">Mi última recomendación firme: ¿podría explicar qué hechos la sostienen, qué incertidumbres la modificarían y qué valores del paciente pesan?</w:t>
       </w:r>
     </w:p>
     <w:p>
@@ -8114,7 +8164,7 @@
         </w:numPr>
       </w:pPr>
       <w:r>
-        <w:t xml:space="preserve">¿Estoy usando la herramienta para ampliar hipótesis o para confirmar rápido la que ya tenía?</w:t>
+        <w:t xml:space="preserve">¿Hay en mis fichas una etiqueta ("funcional", "no adherente", "poco colaborador") que esté distribuyendo credibilidad en lugar de información?</w:t>
       </w:r>
     </w:p>
     <w:p>
@@ -8133,419 +8183,6 @@
           <w:szCs w:val="22"/>
         </w:rPr>
         <w:t xml:space="preserve">Capítulo 15</w:t>
-      </w:r>
-      <w:r>
-        <w:rPr>
-          <w:rFonts w:ascii="Georgia" w:cs="Georgia" w:eastAsia="Georgia" w:hAnsi="Georgia"/>
-          <w:b/>
-          <w:bCs/>
-          <w:color w:val="3D5A6C"/>
-          <w:sz w:val="32"/>
-          <w:szCs w:val="32"/>
-        </w:rPr>
-        <w:br/>
-        <w:t xml:space="preserve">Humildad epistémica y responsabilidad clínica</w:t>
-      </w:r>
-    </w:p>
-    <w:p>
-      <w:pPr>
-        <w:pStyle w:val="BodyJ"/>
-      </w:pPr>
-      <w:r>
-        <w:t xml:space="preserve">Hay una frase que me costó años aprender a decir delante de una familia: "no lo sé". La primera vez que la dije completa —"no sé todavía por qué empeoró; sé qué descartamos, sé qué vamos a vigilar esta noche y sé cuándo tendremos más información"— esperaba encontrar decepción. Encontré alivio. La familia no necesitaba mi certeza; necesitaba saber que la incertidumbre estaba siendo trabajada. Este capítulo trata de esa diferencia: entre parecer seguro y ser responsable.</w:t>
-      </w:r>
-    </w:p>
-    <w:p>
-      <w:pPr>
-        <w:pStyle w:val="Heading3"/>
-        <w:spacing w:after="120" w:before="280"/>
-      </w:pPr>
-      <w:r>
-        <w:rPr>
-          <w:rFonts w:ascii="Georgia" w:cs="Georgia" w:eastAsia="Georgia" w:hAnsi="Georgia"/>
-          <w:b/>
-          <w:bCs/>
-          <w:color w:val="2B2B2B"/>
-          <w:sz w:val="25"/>
-          <w:szCs w:val="25"/>
-        </w:rPr>
-        <w:t xml:space="preserve">Afirmar es asumir una responsabilidad</w:t>
-      </w:r>
-    </w:p>
-    <w:p>
-      <w:pPr>
-        <w:pStyle w:val="BodyJ"/>
-      </w:pPr>
-      <w:r>
-        <w:t xml:space="preserve">Una frase clínica no es moralmente neutra. Puede activar una cirugía, justificar aislamiento, etiquetar a una persona, limitar tratamientos o fijar una interpretación que otros repetirán. Cuando escribimos "rechaza", "no adherente", "funcional", "terminal" o "sin indicación", no sólo describimos. Distribuimos credibilidad, urgencia y recursos. La ética del razonamiento comienza antes de la decisión: comienza en la forma en que se recibe un testimonio y se concede fuerza a una afirmación.</w:t>
-      </w:r>
-    </w:p>
-    <w:p>
-      <w:pPr>
-        <w:pStyle w:val="BodyJ"/>
-      </w:pPr>
-      <w:r>
-        <w:t xml:space="preserve">La prudencia aristotélica —phronesis— no es cautela pasiva, sino capacidad de deliberar bien sobre lo que conviene hacer en una situación particular. Pellegrino y Thomasma situaron el juicio clínico en el encuentro entre conocimiento técnico, bien del paciente y obligación moral (Pellegrino &amp; Thomasma, 1981). La decisión médica nunca es únicamente correcta por su coherencia lógica; debe ser justificable para la persona sobre la que actúa.</w:t>
-      </w:r>
-    </w:p>
-    <w:p>
-      <w:pPr>
-        <w:pStyle w:val="Heading3"/>
-        <w:spacing w:after="120" w:before="280"/>
-      </w:pPr>
-      <w:r>
-        <w:rPr>
-          <w:rFonts w:ascii="Georgia" w:cs="Georgia" w:eastAsia="Georgia" w:hAnsi="Georgia"/>
-          <w:b/>
-          <w:bCs/>
-          <w:color w:val="2B2B2B"/>
-          <w:sz w:val="25"/>
-          <w:szCs w:val="25"/>
-        </w:rPr>
-        <w:t xml:space="preserve">Humildad epistémica</w:t>
-      </w:r>
-    </w:p>
-    <w:p>
-      <w:pPr>
-        <w:pStyle w:val="BodyJ"/>
-      </w:pPr>
-      <w:r>
-        <w:t xml:space="preserve">La humildad epistémica no consiste en disminuir artificialmente la propia competencia ni en presentar todas las hipótesis como equivalentes. Consiste en conocer el alcance y los límites de las razones disponibles, reconocer dependencia de otros y mantener apertura real a corrección. Es compatible con decisiones firmes. Un cirujano puede afirmar que una intervención es urgente y, al mismo tiempo, distinguir qué mecanismo está demostrado, qué riesgo se estima y qué desenlace sigue siendo incierto.</w:t>
-      </w:r>
-    </w:p>
-    <w:p>
-      <w:pPr>
-        <w:pStyle w:val="BodyJ"/>
-      </w:pPr>
-      <w:r>
-        <w:t xml:space="preserve">La falsa seguridad daña porque cierra la revisión y puede engañar al paciente. La duda indiscriminada también daña: transfiere carga, paraliza decisiones o abandona a la persona bajo una apariencia de neutralidad. La virtud está en calibrar. Decir "no lo sé" es profesional cuando se acompaña de qué sí se sabe, qué se hará, qué riesgo se vigila y cuándo se reevaluará.</w:t>
-      </w:r>
-    </w:p>
-    <w:p>
-      <w:pPr>
-        <w:pStyle w:val="Heading3"/>
-        <w:spacing w:after="120" w:before="280"/>
-      </w:pPr>
-      <w:r>
-        <w:rPr>
-          <w:rFonts w:ascii="Georgia" w:cs="Georgia" w:eastAsia="Georgia" w:hAnsi="Georgia"/>
-          <w:b/>
-          <w:bCs/>
-          <w:color w:val="2B2B2B"/>
-          <w:sz w:val="25"/>
-          <w:szCs w:val="25"/>
-        </w:rPr>
-        <w:t xml:space="preserve">La humildad como motor: explorar, aprender, reenfocar</w:t>
-      </w:r>
-    </w:p>
-    <w:p>
-      <w:pPr>
-        <w:pStyle w:val="BodyJ"/>
-      </w:pPr>
-      <w:r>
-        <w:t xml:space="preserve">Hay una caricatura de la humildad epistémica que conviene desactivar: la del médico tibio, que afirma poco por miedo a equivocarse. Esa figura confunde humildad con timidez. La filosofía contemporánea de las virtudes intelectuales ofrece una definición más útil: ser intelectualmente humilde es atender a las propias limitaciones y apropiárselas — saber dónde termina lo que uno sabe, y dejar que ese saber actúe (Whitcomb et al., 2017). Definida así, la humildad no es un freno. Es un motor: la única disposición que mantiene el caso abierto después de que ya tenemos una respuesta que funciona.</w:t>
-      </w:r>
-    </w:p>
-    <w:p>
-      <w:pPr>
-        <w:pStyle w:val="BodyJ"/>
-      </w:pPr>
-      <w:r>
-        <w:t xml:space="preserve">Sus efectos son tres, y los tres son dinámicos. Primero, permite seguir explorando. Quien es dueño de sus límites sigue preguntando cuando la etiqueta ya está puesta: busca el hallazgo que no encaja, pide el examen que podría desmentirlo, vuelve a la cama del paciente sin necesitar que algo se haya complicado para justificar la visita. La exploración no termina cuando aparece una explicación; termina cuando la explicación ha sobrevivido a sus rivales — y saber la diferencia es humildad operando.</w:t>
-      </w:r>
-    </w:p>
-    <w:p>
-      <w:pPr>
-        <w:pStyle w:val="BodyJ"/>
-      </w:pPr>
-      <w:r>
-        <w:t xml:space="preserve">Segundo, permite seguir aprendiendo. El feedback sólo enseña a quien puede recibirlo sin tratarlo como acusación. El portafolio de calibración, la conferencia de morbimortalidad, la corrección venida de cualquier miembro del equipo —de la enfermera de turno al propio paciente— funcionan únicamente sobre esa base. Un médico que no puede ser corregido no es un médico seguro: es un médico que dejó de aprender, con años de práctica acumulándose sobre los mismos errores.</w:t>
-      </w:r>
-    </w:p>
-    <w:p>
-      <w:pPr>
-        <w:pStyle w:val="BodyJ"/>
-      </w:pPr>
-      <w:r>
-        <w:t xml:space="preserve">Tercero —y es el efecto más clínico de todos—, permite reubicar el foco y el manejo. La dirección de la atención diagnóstica no es un voto de por vida: es una asignación provisional de recursos, revisable cuando la trayectoria contradice el mapa. El humilde redirige sin vivirlo como derrota — de lo urinario a lo abdominal, de la lesión estructural al trastorno funcional, del objetivo curativo al de confort — y ajusta el tratamiento con la misma naturalidad con que lo inició. El orgulloso, en cambio, defiende su primera formulación como se defiende una propiedad, y convierte cada dato discordante en un ataque que repeler. El anclaje del capítulo 7 es, visto así, un fracaso de humildad antes que un fallo de memoria: la información nueva estaba disponible; lo que faltó fue la disposición a dejarla mandar.</w:t>
-      </w:r>
-    </w:p>
-    <w:p>
-      <w:pPr>
-        <w:pStyle w:val="BodyJ"/>
-      </w:pPr>
-      <w:r>
-        <w:t xml:space="preserve">Por eso este libro necesita la humildad no como ornamento ético sino como pieza estructural. La reevaluación del método HII-D (capítulo 16) es humildad convertida en procedimiento: la cláusula "qué me haría cambiar", escrita antes de saber si habrá que cambiar, es la forma que toma esta virtud cuando se la obliga a dejar huella en la ficha.</w:t>
-      </w:r>
-    </w:p>
-    <w:p>
-      <w:pPr>
-        <w:pStyle w:val="Heading3"/>
-        <w:spacing w:after="120" w:before="280"/>
-      </w:pPr>
-      <w:r>
-        <w:rPr>
-          <w:rFonts w:ascii="Georgia" w:cs="Georgia" w:eastAsia="Georgia" w:hAnsi="Georgia"/>
-          <w:b/>
-          <w:bCs/>
-          <w:color w:val="2B2B2B"/>
-          <w:sz w:val="25"/>
-          <w:szCs w:val="25"/>
-        </w:rPr>
-        <w:t xml:space="preserve">Credibilidad y experiencia del paciente</w:t>
-      </w:r>
-    </w:p>
-    <w:p>
-      <w:pPr>
-        <w:pStyle w:val="BodyJ"/>
-      </w:pPr>
-      <w:r>
-        <w:t xml:space="preserve">Miranda Fricker denominó injusticia epistémica al daño cometido contra alguien en su capacidad de sujeto de conocimiento (Fricker, 2007). En salud, Carel y Kidd mostraron cómo el testimonio de pacientes puede recibir menor credibilidad o carecer de categorías interpretativas adecuadas, y cómo la propia experiencia de enfermar agudiza esa vulnerabilidad epistémica (Carel &amp; Kidd, 2014; Kidd &amp; Carel, 2017). El enfermo posee un conocimiento de primera persona sobre dolor, cambio funcional, tolerancia, valores y trayectoria cotidiana que no puede ser sustituido por mediciones externas. Ese conocimiento tampoco es infalible, pero merece evaluación y no descarte reflejo.</w:t>
-      </w:r>
-    </w:p>
-    <w:p>
-      <w:pPr>
-        <w:pStyle w:val="BodyJ"/>
-      </w:pPr>
-      <w:r>
-        <w:t xml:space="preserve">La filosofía del testimonio ayuda a precisar qué significa "evaluar sin descartar". Contra la sospecha heredada del empirismo —que creerle a otro es siempre conocimiento de segunda categoría—, Coady mostró que el testimonio es una fuente básica de conocimiento, tan constitutiva como la percepción o la memoria: sin una confianza por defecto en lo que otros informan, ni la ciencia ni la vida cotidiana serían posibles (Coady, 1992). Lackey corrigió el exceso opuesto: la confianza por defecto no es un cheque en blanco; el oyente responsable mantiene una sensibilidad activa a las señales de error o engaño, y el conocimiento testimonial se logra cuando ambas condiciones —decir fiable y escuchar vigilante— se cumplen a la vez (Lackey, 2008). La anamnesis es exactamente ese contrato epistémico: el paciente aporta un informe que el médico no puede obtener por ninguna otra vía, y el médico aporta el examen de consistencia, forma temporal y relación con otros hallazgos. Ni credulidad ni auditoría hostil: recepción con estándares. La injusticia testimonial es, en estos términos, un fallo del segundo contratante: aplicar a ciertos hablantes un estándar de vigilancia que no se aplica a otros, por razones que nada tienen que ver con la fiabilidad de su informe.</w:t>
-      </w:r>
-    </w:p>
-    <w:p>
-      <w:pPr>
-        <w:pStyle w:val="BodyJ"/>
-      </w:pPr>
-      <w:r>
-        <w:t xml:space="preserve">La injusticia testimonial aparece cuando prejuicios sobre edad, género, origen, diagnóstico psiquiátrico, discapacidad o estilo comunicativo reducen injustificadamente la credibilidad. La injusticia hermenéutica surge cuando faltan conceptos compartidos para expresar una experiencia o cuando la institución sólo admite aquello que cabe en sus formularios. En ambos casos, el problema no es cortesía: se pierde evidencia clínicamente relevante.</w:t>
-      </w:r>
-    </w:p>
-    <w:p>
-      <w:pPr>
-        <w:pStyle w:val="BodyJ"/>
-      </w:pPr>
-      <w:r>
-        <w:t xml:space="preserve">Escuchar de manera epistémica implica preguntar qué sabe esta persona que el equipo no puede observar, qué interpretación atribuye a sus síntomas y qué experiencias anteriores modifican su decisión. También exige distinguir desacuerdo de incapacidad. Un paciente puede comprender la evidencia y valorar de manera diferente los desenlaces. Cuando Carmen dijo "esta vez el dolor era otro", estaba entregando el dato pronóstico más importante del ingreso; la nota que lo hubiera omitido habría cometido, además de una injusticia, un error técnico.</w:t>
-      </w:r>
-    </w:p>
-    <w:p>
-      <w:pPr>
-        <w:pStyle w:val="Heading3"/>
-        <w:spacing w:after="120" w:before="280"/>
-      </w:pPr>
-      <w:r>
-        <w:rPr>
-          <w:rFonts w:ascii="Georgia" w:cs="Georgia" w:eastAsia="Georgia" w:hAnsi="Georgia"/>
-          <w:b/>
-          <w:bCs/>
-          <w:color w:val="2B2B2B"/>
-          <w:sz w:val="25"/>
-          <w:szCs w:val="25"/>
-        </w:rPr>
-        <w:t xml:space="preserve">La ética de la incertidumbre</w:t>
-      </w:r>
-    </w:p>
-    <w:p>
-      <w:pPr>
-        <w:pStyle w:val="BodyJ"/>
-      </w:pPr>
-      <w:r>
-        <w:t xml:space="preserve">Comunicar incertidumbre es una obligación de veracidad, pero la forma importa. Entregar una lista de posibilidades sin jerarquía puede aumentar angustia sin mejorar autonomía. Ocultar la duda para preservar confianza produce una alianza frágil. La comunicación responsable estructura: qué explicación es más probable, qué alternativas relevantes permanecen, qué riesgos justifican actuar, qué señales deben motivar consulta y qué aspectos dependen de preferencias.</w:t>
-      </w:r>
-    </w:p>
-    <w:p>
-      <w:pPr>
-        <w:pStyle w:val="BodyJ"/>
-      </w:pPr>
-      <w:r>
-        <w:t xml:space="preserve">La decisión compartida no significa que médico y paciente aporten lo mismo. El profesional ofrece conocimiento técnico, estimación de consecuencias y recomendación; el paciente aporta experiencia, objetivos y tolerancia al riesgo (Elwyn et al., 2012).</w:t>
-      </w:r>
-    </w:p>
-    <w:p>
-      <w:pPr>
-        <w:pStyle w:val="BodyJ"/>
-      </w:pPr>
-      <w:r>
-        <w:t xml:space="preserve">Existe además una ética de la revisión. Una hipótesis provisional que se documenta sin plan de seguimiento puede transformarse en daño por inercia. Quien decide bajo incertidumbre adquiere la obligación de definir cómo se reconocerá el error. Los criterios de alarma, controles, responsable y plazo no son tareas administrativas agregadas: completan la racionalidad moral de la decisión.</w:t>
-      </w:r>
-    </w:p>
-    <w:p>
-      <w:pPr>
-        <w:pStyle w:val="Heading3"/>
-        <w:spacing w:after="120" w:before="280"/>
-      </w:pPr>
-      <w:r>
-        <w:rPr>
-          <w:rFonts w:ascii="Georgia" w:cs="Georgia" w:eastAsia="Georgia" w:hAnsi="Georgia"/>
-          <w:b/>
-          <w:bCs/>
-          <w:color w:val="2B2B2B"/>
-          <w:sz w:val="25"/>
-          <w:szCs w:val="25"/>
-        </w:rPr>
-        <w:t xml:space="preserve">El miedo también escribe: documentación defensiva y segunda víctima</w:t>
-      </w:r>
-    </w:p>
-    <w:p>
-      <w:pPr>
-        <w:pStyle w:val="BodyJ"/>
-      </w:pPr>
-      <w:r>
-        <w:t xml:space="preserve">Hay una variable que ningún modelo del razonamiento clínico incluye y que opera todos los días: el miedo. Miedo a la demanda, al reclamo, a la auditoría, al pasillo. Ese miedo no se queda en el cuerpo del médico; escribe en la ficha. La documentación defensiva —notas redactadas para un abogado imaginario y no para el siguiente lector clínico— es su síntoma más visible, y es un corruptor epistémico de primer orden: donde la frase medular busca hacer auditable el razonamiento, la nota defensiva busca hacerlo inatacable, que es casi lo contrario. Se omiten las dudas (podrían "usarse en contra"), se multiplican los exámenes cuya única indicación es la constancia, se prefiere la vaguedad que no compromete a la precisión que expone. El resultado es una ficha que protege menos de lo que cree: ante cualquier revisión seria, la nota vaga sin criterios de reapertura parece ocultamiento, mientras que la nota que muestra qué se sabía, qué se dudaba y cuándo se planeó reevaluar demuestra exactamente lo que el derecho sanitario pondera — un proceso razonable con la información disponible. La trazabilidad honesta no es ingenuidad jurídica; es la mejor defensa que la epistemología puede ofrecer, además de la única compatible con seguir pensando.</w:t>
-      </w:r>
-    </w:p>
-    <w:p>
-      <w:pPr>
-        <w:pStyle w:val="BodyJ"/>
-      </w:pPr>
-      <w:r>
-        <w:t xml:space="preserve">El mismo miedo, vuelto hacia adentro, tiene otro nombre. Wu llamó segunda víctima al clínico que, tras un error, queda él mismo dañado: culpa, vergüenza, aislamiento, la revisión obsesiva del momento en que las cosas pudieron ser distintas (Wu, 2000). El punto no es sentimental sino epistemológico: un médico devastado y solo no puede hacer el análisis de trayectoria del capítulo 7 — la vergüenza empuja o al silencio o al relato autoflagelante, y ninguno de los dos produce aprendizaje. Por eso el cuidado del que erró no es blandura institucional: es una condición del circuito de corrección. Un servicio que quiere fichas honestas y morbimortalidades útiles tiene que hacer verosímil una promesa: reconocer un error o una duda aquí no te destruirá. Donde esa promesa no existe, la humildad epistémica se vuelve un lujo peligroso, y el sistema entero paga en errores repetidos lo que ahorra en incomodidad.</w:t>
-      </w:r>
-    </w:p>
-    <w:p>
-      <w:pPr>
-        <w:pStyle w:val="Heading3"/>
-        <w:spacing w:after="120" w:before="280"/>
-      </w:pPr>
-      <w:r>
-        <w:rPr>
-          <w:rFonts w:ascii="Georgia" w:cs="Georgia" w:eastAsia="Georgia" w:hAnsi="Georgia"/>
-          <w:b/>
-          <w:bCs/>
-          <w:color w:val="2B2B2B"/>
-          <w:sz w:val="25"/>
-          <w:szCs w:val="25"/>
-        </w:rPr>
-        <w:t xml:space="preserve">Autoridad sin opacidad</w:t>
-      </w:r>
-    </w:p>
-    <w:p>
-      <w:pPr>
-        <w:pStyle w:val="BodyJ"/>
-      </w:pPr>
-      <w:r>
-        <w:t xml:space="preserve">La relación clínica es asimétrica: el profesional posee conocimientos, acceso institucional y capacidad de activar intervenciones que el paciente no controla. Esa asimetría hace necesaria la recomendación experta, pero también exige que la autoridad sea explicable. "Yo haría esto" tiene valor cuando resume razones; se vuelve problemática cuando sustituye su examen.</w:t>
-      </w:r>
-    </w:p>
-    <w:p>
-      <w:pPr>
-        <w:pStyle w:val="BodyJ"/>
-      </w:pPr>
-      <w:r>
-        <w:t xml:space="preserve">Recomendar no es imponer ni retirarse. El médico debe señalar qué opción considera preferible, qué hechos sostienen esa preferencia, qué incertidumbres podrían modificarla y qué valores del paciente son decisivos. La neutralidad aparente puede abandonar a una persona precisamente cuando necesita orientación. La autoridad bien ejercida reduce complejidad sin ocultar desacuerdos razonables. La respuesta de la cirujana a Carmen —"yo le recomiendo operarse, y le digo por qué"— es la forma completa del gesto: recomendación, razones, límites y devolución de la decisión.</w:t>
-      </w:r>
-    </w:p>
-    <w:p>
-      <w:pPr>
-        <w:pStyle w:val="BodyJ"/>
-      </w:pPr>
-      <w:r>
-        <w:t xml:space="preserve">También existe responsabilidad sobre las palabras que permanecen. Un diagnóstico inscrito en la ficha puede condicionar futuras interpretaciones incluso después de perder sustento. Corregir, fechar y explicar cambios de hipótesis es una obligación epistémica. No basta con pensar de nuevo; el sistema debe poder reconocer que se pensó de nuevo.</w:t>
-      </w:r>
-    </w:p>
-    <w:p>
-      <w:pPr>
-        <w:pStyle w:val="Quote1"/>
-      </w:pPr>
-      <w:r>
-        <w:t xml:space="preserve">La humildad clínica no consiste en afirmar menos, sino en no afirmar más de lo que permiten los hechos y no decidir menos de lo que exige el riesgo.</w:t>
-      </w:r>
-    </w:p>
-    <w:p>
-      <w:pPr>
-        <w:pStyle w:val="BodyJ"/>
-      </w:pPr>
-      <w:r>
-        <w:t xml:space="preserve">La lucidez une epistemología y ética. Sobreestimar la certeza puede conducir a intervenciones injustificadas; subestimar la gravedad puede negar protección; desacreditar un relato puede borrar el dato decisivo. Por ello, hechos, inferencias e incertidumbre no son sólo categorías del conocimiento. Son también una disciplina de respeto: permiten que el paciente sepa qué sostiene nuestra recomendación, dónde están sus límites y cómo responderemos si la realidad contradice lo esperado.</w:t>
-      </w:r>
-    </w:p>
-    <w:p>
-      <w:pPr>
-        <w:pStyle w:val="BodyJ"/>
-      </w:pPr>
-      <w:r>
-        <w:t xml:space="preserve">La confianza profesional más robusta no depende de parecer infalible. Se construye cuando el paciente y el equipo pueden reconocer una pauta: afirmaciones proporcionadas, revisión ante nueva evidencia y responsabilidad sobre las consecuencias de la decisión.</w:t>
-      </w:r>
-    </w:p>
-    <w:p>
-      <w:pPr>
-        <w:pStyle w:val="EnUnaFrase"/>
-      </w:pPr>
-      <w:r>
-        <w:rPr>
-          <w:b/>
-          <w:bCs/>
-        </w:rPr>
-        <w:t xml:space="preserve">En una frase.</w:t>
-      </w:r>
-      <w:r>
-        <w:t xml:space="preserve"> Afirmar, dudar y recomendar son actos morales: la humildad epistémica bien entendida produce decisiones más firmes, no más tibias, porque cada afirmación carga exactamente el peso que puede sostener.</w:t>
-      </w:r>
-    </w:p>
-    <w:p>
-      <w:pPr>
-        <w:pStyle w:val="BodyJ"/>
-        <w:spacing w:after="80" w:before="160"/>
-      </w:pPr>
-      <w:r>
-        <w:rPr>
-          <w:b/>
-          <w:bCs/>
-        </w:rPr>
-        <w:t xml:space="preserve">Tres preguntas para la próxima visita.</w:t>
-      </w:r>
-    </w:p>
-    <w:p>
-      <w:pPr>
-        <w:pStyle w:val="BodyJ"/>
-        <w:numPr>
-          <w:ilvl w:val="0"/>
-          <w:numId w:val="22"/>
-        </w:numPr>
-      </w:pPr>
-      <w:r>
-        <w:t xml:space="preserve">¿A qué paciente le estoy creyendo menos de lo que su testimonio merece, y por qué?</w:t>
-      </w:r>
-    </w:p>
-    <w:p>
-      <w:pPr>
-        <w:pStyle w:val="BodyJ"/>
-        <w:numPr>
-          <w:ilvl w:val="0"/>
-          <w:numId w:val="22"/>
-        </w:numPr>
-      </w:pPr>
-      <w:r>
-        <w:t xml:space="preserve">Mi última recomendación firme: ¿podría explicar qué hechos la sostienen, qué incertidumbres la modificarían y qué valores del paciente pesan?</w:t>
-      </w:r>
-    </w:p>
-    <w:p>
-      <w:pPr>
-        <w:pStyle w:val="BodyJ"/>
-        <w:numPr>
-          <w:ilvl w:val="0"/>
-          <w:numId w:val="22"/>
-        </w:numPr>
-      </w:pPr>
-      <w:r>
-        <w:t xml:space="preserve">¿Hay en mis fichas una etiqueta ("funcional", "no adherente", "poco colaborador") que esté distribuyendo credibilidad en lugar de información?</w:t>
-      </w:r>
-    </w:p>
-    <w:p>
-      <w:pPr>
-        <w:pStyle w:val="Heading2"/>
-        <w:pageBreakBefore/>
-        <w:spacing w:after="300" w:before="600"/>
-      </w:pPr>
-      <w:r>
-        <w:rPr>
-          <w:rFonts w:ascii="Georgia" w:cs="Georgia" w:eastAsia="Georgia" w:hAnsi="Georgia"/>
-          <w:b/>
-          <w:bCs/>
-          <w:color w:val="8C2F2F"/>
-          <w:sz w:val="22"/>
-          <w:szCs w:val="22"/>
-        </w:rPr>
-        <w:t xml:space="preserve">Capítulo 16</w:t>
       </w:r>
       <w:r>
         <w:rPr>
@@ -8991,7 +8628,7 @@
         <w:pStyle w:val="BodyJ"/>
         <w:numPr>
           <w:ilvl w:val="0"/>
-          <w:numId w:val="23"/>
+          <w:numId w:val="22"/>
         </w:numPr>
       </w:pPr>
       <w:r>
@@ -9010,7 +8647,7 @@
         <w:pStyle w:val="BodyJ"/>
         <w:numPr>
           <w:ilvl w:val="0"/>
-          <w:numId w:val="23"/>
+          <w:numId w:val="22"/>
         </w:numPr>
       </w:pPr>
       <w:r>
@@ -9029,7 +8666,7 @@
         <w:pStyle w:val="BodyJ"/>
         <w:numPr>
           <w:ilvl w:val="0"/>
-          <w:numId w:val="23"/>
+          <w:numId w:val="22"/>
         </w:numPr>
       </w:pPr>
       <w:r>
@@ -9048,7 +8685,7 @@
         <w:pStyle w:val="BodyJ"/>
         <w:numPr>
           <w:ilvl w:val="0"/>
-          <w:numId w:val="23"/>
+          <w:numId w:val="22"/>
         </w:numPr>
       </w:pPr>
       <w:r>
@@ -9247,7 +8884,7 @@
         <w:pStyle w:val="TallerHead"/>
       </w:pPr>
       <w:r>
-        <w:t xml:space="preserve">Taller 16. Su paciente, esta semana</w:t>
+        <w:t xml:space="preserve">Taller 15. Su paciente, esta semana</w:t>
       </w:r>
     </w:p>
     <w:p>
@@ -9306,7 +8943,7 @@
         <w:pStyle w:val="BodyJ"/>
         <w:numPr>
           <w:ilvl w:val="0"/>
-          <w:numId w:val="24"/>
+          <w:numId w:val="23"/>
         </w:numPr>
       </w:pPr>
       <w:r>
@@ -9318,7 +8955,7 @@
         <w:pStyle w:val="BodyJ"/>
         <w:numPr>
           <w:ilvl w:val="0"/>
-          <w:numId w:val="24"/>
+          <w:numId w:val="23"/>
         </w:numPr>
       </w:pPr>
       <w:r>
@@ -9330,7 +8967,7 @@
         <w:pStyle w:val="BodyJ"/>
         <w:numPr>
           <w:ilvl w:val="0"/>
-          <w:numId w:val="24"/>
+          <w:numId w:val="23"/>
         </w:numPr>
       </w:pPr>
       <w:r>
@@ -10420,7 +10057,7 @@
         <w:t xml:space="preserve">Lectura metacognitiva.</w:t>
       </w:r>
       <w:r>
-        <w:t xml:space="preserve"> La pediatría radicaliza el capítulo 1: el paciente no habla, y el "hecho" más valioso es un testimonio de tercero sobre un basal que el equipo no conoce. Descartar la preocupación materna como ansiedad es el equivalente pediátrico de la injusticia testimonial del capítulo 15 — y además, simplemente, mala medicina: pocas fuentes de información tienen mejor razón señal-ruido que quien mira a ese niño todos los días.</w:t>
+        <w:t xml:space="preserve"> La pediatría radicaliza el capítulo 1: el paciente no habla, y el "hecho" más valioso es un testimonio de tercero sobre un basal que el equipo no conoce. Descartar la preocupación materna como ansiedad es el equivalente pediátrico de la injusticia testimonial del capítulo 14 — y además, simplemente, mala medicina: pocas fuentes de información tienen mejor razón señal-ruido que quien mira a ese niño todos los días.</w:t>
       </w:r>
     </w:p>
     <w:p>
@@ -10535,7 +10172,7 @@
         <w:t xml:space="preserve">Lectura metacognitiva.</w:t>
       </w:r>
       <w:r>
-        <w:t xml:space="preserve"> Esta viñeta es el capítulo 15 con mortalidad: la injusticia testimonial —descontar el relato por quién lo dice— aquí no es sólo un agravio moral sino un mecanismo causal de la brecha de 15 a 20 años de vida. Nótese el movimiento epistémico central: cuando el testimonio y el examen valen menos de lo habitual, el estándar de estudio objetivo sube en compensación. El ensombrecimiento hace exactamente lo contrario — usa la dificultad como excusa para bajar el estándar — y por eso mata.</w:t>
+        <w:t xml:space="preserve"> Esta viñeta es el capítulo 14 con mortalidad: la injusticia testimonial —descontar el relato por quién lo dice— aquí no es sólo un agravio moral sino un mecanismo causal de la brecha de 15 a 20 años de vida. Nótese el movimiento epistémico central: cuando el testimonio y el examen valen menos de lo habitual, el estándar de estudio objetivo sube en compensación. El ensombrecimiento hace exactamente lo contrario — usa la dificultad como excusa para bajar el estándar — y por eso mata.</w:t>
       </w:r>
     </w:p>
     <w:p>
@@ -10578,7 +10215,7 @@
           <w:sz w:val="22"/>
           <w:szCs w:val="22"/>
         </w:rPr>
-        <w:t xml:space="preserve">Capítulo 17</w:t>
+        <w:t xml:space="preserve">Capítulo 16</w:t>
       </w:r>
       <w:r>
         <w:rPr>
@@ -10697,7 +10334,7 @@
         <w:pStyle w:val="BodyJ"/>
       </w:pPr>
       <w:r>
-        <w:t xml:space="preserve">La posición de este libro es intermedia, pero no equidistante. Con los escépticos: no existe una habilidad general de "pensar bien" que flote por encima del conocimiento; la representación rica del problema —illness scripts, experiencia con feedback— es la condición de todo lo demás, y ningún método, HII-D incluido, compensa no saber medicina. Contra el escepticismo total: de esa evidencia no se sigue que la única intervención posible sea enseñar más contenido. Lo que este libro propone no es vigilancia interna permanente ni listas universales —las versiones que la evidencia ha desinflado—, sino artefactos externos y selectivos: un lenguaje que obliga a graduar afirmaciones, una estructura de nota que conserva las capas, pausas activadas por disparadores definidos y circuitos de feedback que conviertan experiencia en calibración. Es una apuesta con compromisos observables (véase el capítulo 16): si estas herramientas no cambian conductas medibles, deben abandonarse como cualquier hipótesis mimada. Entre tanto, la controversia se enseña mejor de lo que se oculta: un residente que conoce el debate sabrá desconfiar por igual del catálogo de sesgos como solución universal y del nihilismo pedagógico como coartada.</w:t>
+        <w:t xml:space="preserve">La posición de este libro es intermedia, pero no equidistante. Con los escépticos: no existe una habilidad general de "pensar bien" que flote por encima del conocimiento; la representación rica del problema —illness scripts, experiencia con feedback— es la condición de todo lo demás, y ningún método, HII-D incluido, compensa no saber medicina. Contra el escepticismo total: de esa evidencia no se sigue que la única intervención posible sea enseñar más contenido. Lo que este libro propone no es vigilancia interna permanente ni listas universales —las versiones que la evidencia ha desinflado—, sino artefactos externos y selectivos: un lenguaje que obliga a graduar afirmaciones, una estructura de nota que conserva las capas, pausas activadas por disparadores definidos y circuitos de feedback que conviertan experiencia en calibración. Es una apuesta con compromisos observables (véase el capítulo 15): si estas herramientas no cambian conductas medibles, deben abandonarse como cualquier hipótesis mimada. Entre tanto, la controversia se enseña mejor de lo que se oculta: un residente que conoce el debate sabrá desconfiar por igual del catálogo de sesgos como solución universal y del nihilismo pedagógico como coartada.</w:t>
       </w:r>
     </w:p>
     <w:p>
@@ -11015,7 +10652,7 @@
         <w:pStyle w:val="BodyJ"/>
         <w:numPr>
           <w:ilvl w:val="0"/>
-          <w:numId w:val="25"/>
+          <w:numId w:val="24"/>
         </w:numPr>
       </w:pPr>
       <w:r>
@@ -11027,7 +10664,7 @@
         <w:pStyle w:val="BodyJ"/>
         <w:numPr>
           <w:ilvl w:val="0"/>
-          <w:numId w:val="25"/>
+          <w:numId w:val="24"/>
         </w:numPr>
       </w:pPr>
       <w:r>
@@ -11039,7 +10676,7 @@
         <w:pStyle w:val="BodyJ"/>
         <w:numPr>
           <w:ilvl w:val="0"/>
-          <w:numId w:val="25"/>
+          <w:numId w:val="24"/>
         </w:numPr>
       </w:pPr>
       <w:r>
@@ -11061,7 +10698,7 @@
           <w:sz w:val="22"/>
           <w:szCs w:val="22"/>
         </w:rPr>
-        <w:t xml:space="preserve">Capítulo 18</w:t>
+        <w:t xml:space="preserve">Capítulo 17</w:t>
       </w:r>
       <w:r>
         <w:rPr>
@@ -11073,15 +10710,15 @@
           <w:szCs w:val="32"/>
         </w:rPr>
         <w:br/>
-        <w:t xml:space="preserve">La palabra exacta: lo que la poesía sabe del juicio clínico</w:t>
-      </w:r>
-    </w:p>
-    <w:p>
-      <w:pPr>
-        <w:pStyle w:val="BodyJ"/>
-      </w:pPr>
-      <w:r>
-        <w:t xml:space="preserve">Hay un momento que los tratados no describen y todo clínico conoce: tres hallazgos sueltos —una taquicardia sin fiebre, un abdomen que "no convence", una frase de la hija— se ordenan de golpe bajo una sola explicación, y algo hace clic. El placer de ese instante no es administrativo. Es físico, breve y sospechosamente parecido al de un verso que cae en su lugar. Este capítulo toma ese parecido en serio: no como adorno humanista, sino como información sobre cómo funciona —y cómo falla— el juicio.</w:t>
+        <w:t xml:space="preserve">La inteligencia artificial en el proceso clínico: roles, riesgos y defensas</w:t>
+      </w:r>
+    </w:p>
+    <w:p>
+      <w:pPr>
+        <w:pStyle w:val="BodyJ"/>
+      </w:pPr>
+      <w:r>
+        <w:t xml:space="preserve">Un residente pega la historia de un paciente en un asistente de lenguaje y recibe, en ocho segundos, una evaluación impecablemente redactada: diagnóstico probable, diferenciales ordenados, plan sugerido. Todo suena verosímil. Este capítulo hace tres preguntas, en orden: qué puede hacer realmente esta tecnología en el proceso diagnóstico y terapéutico; qué riesgos trae — no en abstracto, sino con la evidencia ya disponible—; y cómo enfrentarlos sin renunciar a la herramienta ni al juicio. Y sostiene una tesis transversal: casi ninguno de estos riesgos es nuevo. Cada uno es un sesgo que este libro ya describió, ahora con amplificador.</w:t>
       </w:r>
     </w:p>
     <w:p>
@@ -11098,23 +10735,23 @@
           <w:sz w:val="25"/>
           <w:szCs w:val="25"/>
         </w:rPr>
-        <w:t xml:space="preserve">Dos oficios de la conexión</w:t>
-      </w:r>
-    </w:p>
-    <w:p>
-      <w:pPr>
-        <w:pStyle w:val="BodyJ"/>
-      </w:pPr>
-      <w:r>
-        <w:t xml:space="preserve">El poeta trabaja buscando conexiones: entre palabras, entre una palabra y un sentido que todavía no tiene nombre, entre el sonido y aquello que el sonido vuelve visible. Su estado mental característico combina atención flotante, oído para lo que no encaja y una disposición rara: dejar que el material mande sobre el plan. El clínico que razona bien trabaja igual, con otros materiales: entre el hallazgo y el mecanismo, entre el mecanismo y la intervención que estabiliza, busca la conexión que convierta fragmentos en un caso inteligible.</w:t>
-      </w:r>
-    </w:p>
-    <w:p>
-      <w:pPr>
-        <w:pStyle w:val="BodyJ"/>
-      </w:pPr>
-      <w:r>
-        <w:t xml:space="preserve">El parentesco es lógico antes que sentimental. Una metáfora es la hipótesis de que dos cosas lejanas comparten estructura; un diagnóstico es una metáfora que acepta ser puesta a prueba — "este cuadro es una colecistitis" apuesta a que lo que ocurre en este cuerpo comparte estructura con un patrón aprendido. Ambos movimientos son la abducción del capítulo 2, y ambos requieren el mismo estado que el capítulo 15 llamó humildad en funciones: sostener la conjetura con fuerza suficiente para trabajarla y soltura suficiente para dejarla caer. Bohm lo dijo desde la física: el acto creativo central —percibir un orden nuevo en lo que ya estaba a la vista— es el mismo en el arte y en la ciencia; cambian los materiales y el tribunal (Bohm, 1996).</w:t>
+        <w:t xml:space="preserve">Lenguaje plausible y verdad</w:t>
+      </w:r>
+    </w:p>
+    <w:p>
+      <w:pPr>
+        <w:pStyle w:val="BodyJ"/>
+      </w:pPr>
+      <w:r>
+        <w:t xml:space="preserve">Los grandes modelos de lenguaje generan continuaciones plausibles a partir de patrones aprendidos en enormes corpus. Su fluidez puede producir respuestas clínicamente útiles, pero también afirmaciones falsas presentadas con coherencia. La literatura denomina hallucination a contenido no sustentado o inconsistente con la fuente o el mundo (Ji et al., 2023). El término es metafórico: el modelo no tiene una experiencia perceptiva que se desorganice como en la alucinación humana.</w:t>
+      </w:r>
+    </w:p>
+    <w:p>
+      <w:pPr>
+        <w:pStyle w:val="BodyJ"/>
+      </w:pPr>
+      <w:r>
+        <w:t xml:space="preserve">La medicina reconoce el peligro porque también trabaja con narrativas plausibles. Un clínico puede completar huecos, atribuir causalidad o recordar un dato de manera congruente con su hipótesis. La semejanza no implica identidad. El médico posee cuerpo, responsabilidad, acceso al paciente, experiencia situada y capacidad de actuar; el modelo manipula representaciones lingüísticas y depende del contexto que recibe.</w:t>
       </w:r>
     </w:p>
     <w:p>
@@ -11131,23 +10768,23 @@
           <w:sz w:val="25"/>
           <w:szCs w:val="25"/>
         </w:rPr>
-        <w:t xml:space="preserve">Huidobro, o la palabra que crea</w:t>
-      </w:r>
-    </w:p>
-    <w:p>
-      <w:pPr>
-        <w:pStyle w:val="BodyJ"/>
-      </w:pPr>
-      <w:r>
-        <w:t xml:space="preserve">En 1916, Vicente Huidobro escribió el manifiesto de una poesía que no quería describir el mundo sino aumentarlo: "Por qué cantáis la rosa, ¡oh Poetas! / Hacedla florecer en el poema". Y remató con la línea más citada del creacionismo: "El poeta es un pequeño Dios" (Huidobro, 1916). El poema no canta la rosa: la crea. Como programa poético es glorioso. Como descripción de lo que el lenguaje puede hacer, es exactamente el peligro contra el que este libro lleva diecisiete capítulos escribiendo.</w:t>
-      </w:r>
-    </w:p>
-    <w:p>
-      <w:pPr>
-        <w:pStyle w:val="BodyJ"/>
-      </w:pPr>
-      <w:r>
-        <w:t xml:space="preserve">Porque la ficha clínica también hace florecer rosas. La "neumonía aspirativa" del prefacio —dos palabras limpias que crearon un antecedente que nadie observó— es creacionismo puro; el "somatiza" de la viñeta 10, también. El capítulo 12 mostró el mecanismo: la ficha produce lo visible, y sus criaturas verbales adquieren vida institucional. La diferencia con la poesía es brutal: las rosas de Huidobro viven en el poema; las nuestras reciben antibióticos, cirugías y altas. El lenguaje clínico descuidado es creacionista por defecto — y un servicio lleno de pequeños dioses es un lugar peligroso para estar enfermo.</w:t>
+        <w:t xml:space="preserve">El rol en el proceso diagnóstico</w:t>
+      </w:r>
+    </w:p>
+    <w:p>
+      <w:pPr>
+        <w:pStyle w:val="BodyJ"/>
+      </w:pPr>
+      <w:r>
+        <w:t xml:space="preserve">Los sistemas actuales hacen bien tareas delimitadas de reconocimiento: señalar pólipos durante una colonoscopía, priorizar radiografías con probable neumotórax, graduar una retinopatía diabética. En esas tareas el patrón está en la imagen y el estándar de referencia es relativamente estable. Los modelos de lenguaje agregaron otra capa: generan diferenciales, resumen historias y responden preguntas clínicas con un conocimiento médico codificado que, en exámenes y casos seleccionados, alcanza rendimiento alto (Singhal et al., 2023; Lee et al., 2023).</w:t>
+      </w:r>
+    </w:p>
+    <w:p>
+      <w:pPr>
+        <w:pStyle w:val="BodyJ"/>
+      </w:pPr>
+      <w:r>
+        <w:t xml:space="preserve">Pero el dato más instructivo sobre el rol diagnóstico real es otro: un ensayo aleatorizado entregó a internistas un modelo de lenguaje como apoyo para resolver casos clínicos. El grupo con el modelo no diagnosticó mejor que el grupo sin él — y el modelo solo, sin médico, superó a ambos (Goh et al., 2024). La lectura fácil ("la máquina ya es mejor") pasa por alto la lección metacognitiva: el eslabón débil no fue el modelo ni el médico, sino la conversación entre ambos. Los clínicos usaron la herramienta como oráculo de confirmación — pegarle el caso y mirar si coincide con lo que ya pensaban — en vez de usarla para lo que mejor hace: ampliar el espacio de hipótesis, proponer el contraejemplo, señalar el dato que no encaja. El capítulo 2 mostró que la generación de alternativas es el momento creativo del diagnóstico; usada ahí, la IA es un multiplicador. Usada como confirmadora rápida, es un espejo del anclaje.</w:t>
       </w:r>
     </w:p>
     <w:p>
@@ -11164,23 +10801,23 @@
           <w:sz w:val="25"/>
           <w:szCs w:val="25"/>
         </w:rPr>
-        <w:t xml:space="preserve">Parra, o la deflación</w:t>
-      </w:r>
-    </w:p>
-    <w:p>
-      <w:pPr>
-        <w:pStyle w:val="BodyJ"/>
-      </w:pPr>
-      <w:r>
-        <w:t xml:space="preserve">El antídoto también lo escribió un chileno, y no uno cualquiera: un profesor de mecánica racional que estudió cosmología en Oxford y sabía, por oficio diurno, lo que cuesta un dato. Nicanor Parra pasó su vida bajándole los humos a la palabra: primero con los antipoemas (Parra, 1954), después con un "Manifiesto" que es casi un léxico de certeza en verso: los poetas bajaron del Olimpo, la poesía debe escribirse en palabras de todos los días — y, con nombre y apellido implícitos, la condena de "la poesía de pequeño dios" (Parra, 1969). La réplica a Huidobro no es una interpretación: está en el texto.</w:t>
-      </w:r>
-    </w:p>
-    <w:p>
-      <w:pPr>
-        <w:pStyle w:val="BodyJ"/>
-      </w:pPr>
-      <w:r>
-        <w:t xml:space="preserve">La antipoesía es un programa epistemológico completo: quitarle a la palabra los poderes que no puede sostener y devolverla al tamaño de la experiencia. Visto desde ahí, el léxico del capítulo 4 es antipoesía aplicada: "sin evidencia actual de" es un verso parriano — feo, honesto, exacto, imposible de recitar con voz engolada. La ficha lúcida se escribe más cerca de Parra que de Huidobro: lengua de todos los días, dignidad del "no sé", desconfianza instintiva de toda frase que suene demasiado bien.</w:t>
+        <w:t xml:space="preserve">El rol en el proceso terapéutico</w:t>
+      </w:r>
+    </w:p>
+    <w:p>
+      <w:pPr>
+        <w:pStyle w:val="BodyJ"/>
+      </w:pPr>
+      <w:r>
+        <w:t xml:space="preserve">En la terapéutica la IA llega antes y por caminos menos visibles: alertas de deterioro, predictores de sepsis, sugerencias de dosis, detección de interacciones, estratificaciones de riesgo que deciden quién entra a un programa de cuidados. Aquí la evidencia ya dejó una parábola completa. Un modelo propietario de predicción de sepsis, desplegado en cientos de hospitales, fue validado externamente recién después de su adopción masiva: discriminaba mal, calibraba peor y generaba una carga de alertas capaz de fatigar a cualquier equipo (Wong et al., 2021). La falla profunda no fue estadística sino epistemológica: el sistema se adoptó sin exigirle la evidencia local que este libro pide para cualquier afirmación — ¿funciona aquí, con estos pacientes, con esta prevalencia? Es la lección de la Parte III aplicada al software: una herramienta no hereda la validez de su marca, y la validación externa no es un trámite — es la diferencia entre una alerta y un ruido.</w:t>
+      </w:r>
+    </w:p>
+    <w:p>
+      <w:pPr>
+        <w:pStyle w:val="BodyJ"/>
+      </w:pPr>
+      <w:r>
+        <w:t xml:space="preserve">Hay un segundo límite terapéutico más silencioso. Una recomendación de intervención generada por IA opera sobre lo que está escrito, y el capítulo 10 mostró que lo menos escrito de la ficha es precisamente el contexto global — funcionalidad basal, pronóstico de fondo, red de apoyo, fines del paciente. Un sistema que no ve esos hechos no puede ponderarlos: recomendará la intervención "indicada" para la enfermedad documentada, que es exactamente el error de la indicación aislada. La IA no exime del cruce con la bioética; lo vuelve más urgente, porque automatiza la mitad técnica del razonamiento y deja la otra mitad — la que juzga si la intervención es proporcionada para este enfermo — enteramente del lado humano.</w:t>
       </w:r>
     </w:p>
     <w:p>
@@ -11197,31 +10834,23 @@
           <w:sz w:val="25"/>
           <w:szCs w:val="25"/>
         </w:rPr>
-        <w:t xml:space="preserve">La belleza como señal y como trampa</w:t>
-      </w:r>
-    </w:p>
-    <w:p>
-      <w:pPr>
-        <w:pStyle w:val="BodyJ"/>
-      </w:pPr>
-      <w:r>
-        <w:t xml:space="preserve">El clic estético del diagnóstico existe y es información. La parsimonia, la convergencia, el encaje sin residuo son la forma sensible de aquello que el capítulo 2 llamó fuerza por convergencia: cuando una explicación ordena todos los hechos sin forzar ninguno, algo en nosotros lo registra como belleza antes de poder justificarlo. Esa señal vale: propone candidatos que el análisis no habría listado.</w:t>
-      </w:r>
-    </w:p>
-    <w:p>
-      <w:pPr>
-        <w:pStyle w:val="BodyJ"/>
-      </w:pPr>
-      <w:r>
-        <w:t xml:space="preserve">Pero este libro ya conoció a la impostora. La historia coherente del hindsight, la narrativa atractiva que infla la confianza (capítulo 5), la prosa fluida de los modelos de lenguaje (capítulo 14): todas son bellas y ninguna es, por serlo, verdadera. La belleza no distingue entre orden hallado y orden impuesto — para eso están las pruebas severas. La regla que concilia ambas caras cabe en una línea: la elegancia selecciona hipótesis; nunca las confirma. El verso puede quedarse bello para siempre; el diagnóstico tiene que amanecer verdadero, y la evolución lo audita cada mañana.</w:t>
-      </w:r>
-    </w:p>
-    <w:p>
-      <w:pPr>
-        <w:pStyle w:val="BodyJ"/>
-      </w:pPr>
-      <w:r>
-        <w:t xml:space="preserve">Queda la belleza final, la que menos se nombra: la de hacer lo correcto en el contexto correcto. Una estabilización bien conducida tiene forma estética — nada sobró, nada faltó, cada intervención llegó a su hora; es la phronesis del capítulo 6 vuelta percepción. Pero es una belleza que sólo puede declararse retrospectivamente, y sólo si el proceso era defendible antes de conocer el desenlace (capítulo 10). En medicina la estética es un subproducto del rigor. Cuando se la busca directamente —el diagnóstico brillante, la frase imponente—, se obtiene Huidobro en la ficha.</w:t>
+        <w:t xml:space="preserve">Competencia sin garantía</w:t>
+      </w:r>
+    </w:p>
+    <w:p>
+      <w:pPr>
+        <w:pStyle w:val="BodyJ"/>
+      </w:pPr>
+      <w:r>
+        <w:t xml:space="preserve">Estudios han mostrado que modelos avanzados codifican conocimiento médico y alcanzan alto rendimiento en preguntas y casos seleccionados (Singhal et al., 2023). Lee, Bubeck y Petro describieron beneficios potenciales junto con límites y riesgos de GPT-4 en medicina (Lee et al., 2023). El rendimiento promedio no garantiza confiabilidad en un caso individual, especialmente cuando faltan datos, hay ambigüedad o la tarea exige conocimiento local. Y las consecuencias no intencionadas del aprendizaje automático en medicina —desde la automatización de sesgos presentes en los datos hasta la erosión de habilidades por deferencia— han sido advertidas desde antes de los modelos generativos (Cabitza et al., 2017).</w:t>
+      </w:r>
+    </w:p>
+    <w:p>
+      <w:pPr>
+        <w:pStyle w:val="BodyJ"/>
+      </w:pPr>
+      <w:r>
+        <w:t xml:space="preserve">La fluidez aumenta el riesgo de automatización: el usuario puede aceptar una respuesta porque está bien estructurada. El problema es metacognitivo. La confianza percibida en el lenguaje no informa necesariamente la probabilidad de corrección. La IA puede parecer mejor calibrada de lo que está.</w:t>
       </w:r>
     </w:p>
     <w:p>
@@ -11238,6 +10867,828 @@
           <w:sz w:val="25"/>
           <w:szCs w:val="25"/>
         </w:rPr>
+        <w:t xml:space="preserve">El catálogo de riesgos</w:t>
+      </w:r>
+    </w:p>
+    <w:p>
+      <w:pPr>
+        <w:pStyle w:val="BodyJ"/>
+      </w:pPr>
+      <w:r>
+        <w:t xml:space="preserve">Los riesgos de la IA clínica ya no son especulación; tienen literatura propia. Conviene tenerlos en catálogo, con su parentesco epistémico a la vista:</w:t>
+      </w:r>
+    </w:p>
+    <w:p>
+      <w:pPr>
+        <w:pStyle w:val="BodyJ"/>
+        <w:numPr>
+          <w:ilvl w:val="0"/>
+          <w:numId w:val="6"/>
+        </w:numPr>
+      </w:pPr>
+      <w:r>
+        <w:rPr>
+          <w:b/>
+          <w:bCs/>
+        </w:rPr>
+        <w:t xml:space="preserve">Confabulación.</w:t>
+      </w:r>
+      <w:r>
+        <w:t xml:space="preserve"> Contenido no sustentado presentado con coherencia (Ji et al., 2023). Es la certeza retórica del capítulo 4, industrializada: prosa donde los hechos, las inferencias y lo inventado llegan con la misma sintaxis.</w:t>
+      </w:r>
+    </w:p>
+    <w:p>
+      <w:pPr>
+        <w:pStyle w:val="BodyJ"/>
+        <w:numPr>
+          <w:ilvl w:val="0"/>
+          <w:numId w:val="6"/>
+        </w:numPr>
+      </w:pPr>
+      <w:r>
+        <w:rPr>
+          <w:b/>
+          <w:bCs/>
+        </w:rPr>
+        <w:t xml:space="preserve">Sesgo de automatización.</w:t>
+      </w:r>
+      <w:r>
+        <w:t xml:space="preserve"> La tendencia a aceptar la salida de un sistema por venir de un sistema, documentada en los apoyos a la decisión clínica desde mucho antes de los modelos generativos: los sistemas corrigen errores humanos e introducen errores nuevos — el usuario que habría acertado solo y se equivoca por deferencia (Goddard et al., 2012). Es el anclaje del capítulo 7 más la autoridad no interrogada, con interfaz.</w:t>
+      </w:r>
+    </w:p>
+    <w:p>
+      <w:pPr>
+        <w:pStyle w:val="BodyJ"/>
+        <w:numPr>
+          <w:ilvl w:val="0"/>
+          <w:numId w:val="6"/>
+        </w:numPr>
+      </w:pPr>
+      <w:r>
+        <w:rPr>
+          <w:b/>
+          <w:bCs/>
+        </w:rPr>
+        <w:t xml:space="preserve">Atrofia de la pericia.</w:t>
+      </w:r>
+      <w:r>
+        <w:t xml:space="preserve"> La evidencia más inquietante es reciente: endoscopistas expuestos durante meses a la detección asistida de pólipos detectaron significativamente menos adenomas al volver a trabajar sin asistencia — seis puntos absolutos menos que antes de la exposición (Budzyń et al., 2025). La pericia perceptual del capítulo 6 se mantiene con práctica; si la máquina practica por nosotros, la cuenta llega en la primera guardia sin máquina.</w:t>
+      </w:r>
+    </w:p>
+    <w:p>
+      <w:pPr>
+        <w:pStyle w:val="BodyJ"/>
+        <w:numPr>
+          <w:ilvl w:val="0"/>
+          <w:numId w:val="6"/>
+        </w:numPr>
+      </w:pPr>
+      <w:r>
+        <w:rPr>
+          <w:b/>
+          <w:bCs/>
+        </w:rPr>
+        <w:t xml:space="preserve">Sesgo algorítmico.</w:t>
+      </w:r>
+      <w:r>
+        <w:t xml:space="preserve"> Un algoritmo aplicado a millones de pacientes en Estados Unidos asignaba menos cuidados a pacientes negros igual de enfermos, porque fue entrenado para predecir gasto sanitario como sustituto de necesidad — y en poblaciones históricamente subatendidas se gasta menos (Obermeyer et al., 2019). El error no estaba en la matemática sino en la elección del sustituto: la carga teórica de la observación del capítulo 1, a escala poblacional. Ningún dato de entrenamiento es neutro; alguien decidió qué medir.</w:t>
+      </w:r>
+    </w:p>
+    <w:p>
+      <w:pPr>
+        <w:pStyle w:val="BodyJ"/>
+        <w:numPr>
+          <w:ilvl w:val="0"/>
+          <w:numId w:val="6"/>
+        </w:numPr>
+      </w:pPr>
+      <w:r>
+        <w:rPr>
+          <w:b/>
+          <w:bCs/>
+        </w:rPr>
+        <w:t xml:space="preserve">Sobreconfianza no calibrada.</w:t>
+      </w:r>
+      <w:r>
+        <w:t xml:space="preserve"> La confianza verbalizada de los modelos tiende a la sobreconfianza sistemática (Kadavath et al., 2022; Xiong et al., 2024): el "estoy bastante seguro" del modelo es tono, no calibración — la sobreconfianza del capítulo 5, sin siquiera un historial propio de errores que la eduque.</w:t>
+      </w:r>
+    </w:p>
+    <w:p>
+      <w:pPr>
+        <w:pStyle w:val="BodyJ"/>
+        <w:numPr>
+          <w:ilvl w:val="0"/>
+          <w:numId w:val="6"/>
+        </w:numPr>
+      </w:pPr>
+      <w:r>
+        <w:rPr>
+          <w:b/>
+          <w:bCs/>
+        </w:rPr>
+        <w:t xml:space="preserve">Degradación silenciosa.</w:t>
+      </w:r>
+      <w:r>
+        <w:t xml:space="preserve"> Los modelos se despliegan sobre poblaciones que cambian: prevalencias, prácticas, codificaciones. El rendimiento decae sin anunciarse, porque el software no siente que está fallando. Sin monitoreo activo, la validación de ayer es la superstición de mañana.</w:t>
+      </w:r>
+    </w:p>
+    <w:p>
+      <w:pPr>
+        <w:pStyle w:val="BodyJ"/>
+      </w:pPr>
+      <w:r>
+        <w:t xml:space="preserve">La columna vertebral del catálogo es una sola observación: la IA no introdujo errores nuevos en la medicina. Automatizó los que ya teníamos y les quitó los frenos naturales — la lentitud, la duda, el cansancio que a veces obligaba a pedir ayuda.</w:t>
+      </w:r>
+    </w:p>
+    <w:p>
+      <w:pPr>
+        <w:pStyle w:val="Heading3"/>
+        <w:spacing w:after="120" w:before="280"/>
+      </w:pPr>
+      <w:r>
+        <w:rPr>
+          <w:rFonts w:ascii="Georgia" w:cs="Georgia" w:eastAsia="Georgia" w:hAnsi="Georgia"/>
+          <w:b/>
+          <w:bCs/>
+          <w:color w:val="2B2B2B"/>
+          <w:sz w:val="25"/>
+          <w:szCs w:val="25"/>
+        </w:rPr>
+        <w:t xml:space="preserve">Cómo enfrentarlos: las defensas del clínico</w:t>
+      </w:r>
+    </w:p>
+    <w:p>
+      <w:pPr>
+        <w:pStyle w:val="BodyJ"/>
+      </w:pPr>
+      <w:r>
+        <w:t xml:space="preserve">La primera defensa ya está en este libro. El clínico responsable puede distinguir "lo vi", "lo infiero" y "no lo sé"; un modelo suele mezclar esas capas si nadie le exige separación, y puede transformar ausencia de información en un detalle probable, porque su objetivo generativo favorece la continuidad. La matriz HII-D funciona entonces como protocolo de auditoría de cualquier salida de IA:</w:t>
+      </w:r>
+    </w:p>
+    <w:p>
+      <w:pPr>
+        <w:pStyle w:val="BodyJ"/>
+        <w:numPr>
+          <w:ilvl w:val="0"/>
+          <w:numId w:val="6"/>
+        </w:numPr>
+      </w:pPr>
+      <w:r>
+        <w:t xml:space="preserve">¿qué hechos provienen realmente del caso?;</w:t>
+      </w:r>
+    </w:p>
+    <w:p>
+      <w:pPr>
+        <w:pStyle w:val="BodyJ"/>
+        <w:numPr>
+          <w:ilvl w:val="0"/>
+          <w:numId w:val="6"/>
+        </w:numPr>
+      </w:pPr>
+      <w:r>
+        <w:t xml:space="preserve">¿qué información agregó el modelo?;</w:t>
+      </w:r>
+    </w:p>
+    <w:p>
+      <w:pPr>
+        <w:pStyle w:val="BodyJ"/>
+        <w:numPr>
+          <w:ilvl w:val="0"/>
+          <w:numId w:val="6"/>
+        </w:numPr>
+      </w:pPr>
+      <w:r>
+        <w:t xml:space="preserve">¿qué inferencias formula y con qué respaldo?;</w:t>
+      </w:r>
+    </w:p>
+    <w:p>
+      <w:pPr>
+        <w:pStyle w:val="BodyJ"/>
+        <w:numPr>
+          <w:ilvl w:val="0"/>
+          <w:numId w:val="6"/>
+        </w:numPr>
+      </w:pPr>
+      <w:r>
+        <w:t xml:space="preserve">¿qué incertidumbres omitió?;</w:t>
+      </w:r>
+    </w:p>
+    <w:p>
+      <w:pPr>
+        <w:pStyle w:val="BodyJ"/>
+        <w:numPr>
+          <w:ilvl w:val="0"/>
+          <w:numId w:val="6"/>
+        </w:numPr>
+      </w:pPr>
+      <w:r>
+        <w:t xml:space="preserve">¿qué decisión propone y cuáles serían sus riesgos?;</w:t>
+      </w:r>
+    </w:p>
+    <w:p>
+      <w:pPr>
+        <w:pStyle w:val="BodyJ"/>
+        <w:numPr>
+          <w:ilvl w:val="0"/>
+          <w:numId w:val="6"/>
+        </w:numPr>
+      </w:pPr>
+      <w:r>
+        <w:t xml:space="preserve">¿qué fuente primaria permite verificar la afirmación?</w:t>
+      </w:r>
+    </w:p>
+    <w:p>
+      <w:pPr>
+        <w:pStyle w:val="BodyJ"/>
+      </w:pPr>
+      <w:r>
+        <w:t xml:space="preserve">De esa auditoría se desprenden reglas de uso que caben en una tarjeta:</w:t>
+      </w:r>
+    </w:p>
+    <w:p>
+      <w:pPr>
+        <w:pStyle w:val="BodyJ"/>
+        <w:numPr>
+          <w:ilvl w:val="0"/>
+          <w:numId w:val="25"/>
+        </w:numPr>
+      </w:pPr>
+      <w:r>
+        <w:rPr>
+          <w:b/>
+          <w:bCs/>
+        </w:rPr>
+        <w:t xml:space="preserve">Verificar la afirmación decisiva contra una fuente primaria antes de actuar.</w:t>
+      </w:r>
+      <w:r>
+        <w:t xml:space="preserve"> No todas: la decisiva — la que, de ser falsa, cambia la conducta.</w:t>
+      </w:r>
+    </w:p>
+    <w:p>
+      <w:pPr>
+        <w:pStyle w:val="BodyJ"/>
+        <w:numPr>
+          <w:ilvl w:val="0"/>
+          <w:numId w:val="25"/>
+        </w:numPr>
+      </w:pPr>
+      <w:r>
+        <w:rPr>
+          <w:b/>
+          <w:bCs/>
+        </w:rPr>
+        <w:t xml:space="preserve">Usar la herramienta para abrir, no para cerrar.</w:t>
+      </w:r>
+      <w:r>
+        <w:t xml:space="preserve"> Pedir alternativas, contraejemplos y "qué no encaja con este diagnóstico" aprovecha exactamente lo que el ensayo de Goh mostró que desaprovechamos; pedirle confirmación de la hipótesis propia industrializa el anclaje.</w:t>
+      </w:r>
+    </w:p>
+    <w:p>
+      <w:pPr>
+        <w:pStyle w:val="BodyJ"/>
+        <w:numPr>
+          <w:ilvl w:val="0"/>
+          <w:numId w:val="25"/>
+        </w:numPr>
+      </w:pPr>
+      <w:r>
+        <w:rPr>
+          <w:b/>
+          <w:bCs/>
+        </w:rPr>
+        <w:t xml:space="preserve">Tratar su confianza como tono, no como evidencia.</w:t>
+      </w:r>
+      <w:r>
+        <w:t xml:space="preserve"> La seguridad de la prosa no informa la probabilidad de corrección — igual que la seguridad de un colega no sustituye sus razones.</w:t>
+      </w:r>
+    </w:p>
+    <w:p>
+      <w:pPr>
+        <w:pStyle w:val="BodyJ"/>
+        <w:numPr>
+          <w:ilvl w:val="0"/>
+          <w:numId w:val="25"/>
+        </w:numPr>
+      </w:pPr>
+      <w:r>
+        <w:rPr>
+          <w:b/>
+          <w:bCs/>
+        </w:rPr>
+        <w:t xml:space="preserve">Nunca pegar y firmar.</w:t>
+      </w:r>
+      <w:r>
+        <w:t xml:space="preserve"> Lo que entra a la ficha bajo la firma propia es afirmación propia; el capítulo 12 mostró que la ficha produce lo visible, y una confabulación copiada se convierte en hecho heredado para el siguiente lector.</w:t>
+      </w:r>
+    </w:p>
+    <w:p>
+      <w:pPr>
+        <w:pStyle w:val="BodyJ"/>
+        <w:numPr>
+          <w:ilvl w:val="0"/>
+          <w:numId w:val="25"/>
+        </w:numPr>
+      </w:pPr>
+      <w:r>
+        <w:rPr>
+          <w:b/>
+          <w:bCs/>
+        </w:rPr>
+        <w:t xml:space="preserve">Conservar práctica sin asistencia.</w:t>
+      </w:r>
+      <w:r>
+        <w:t xml:space="preserve"> La lección de los endoscopistas: alternar deliberadamente el trabajo con y sin la herramienta, como se conserva cualquier destreza que puede necesitarse a las tres de la mañana, con el sistema caído.</w:t>
+      </w:r>
+    </w:p>
+    <w:p>
+      <w:pPr>
+        <w:pStyle w:val="BodyJ"/>
+      </w:pPr>
+      <w:r>
+        <w:t xml:space="preserve">El modelo puede servir como generador de alternativas, revisor de coherencia, organizador de información o segundo lector. Su valor aumenta cuando el usuario mantiene la responsabilidad de verificación y disminuye cuando se usa como autoridad final.</w:t>
+      </w:r>
+    </w:p>
+    <w:p>
+      <w:pPr>
+        <w:pStyle w:val="Heading3"/>
+        <w:spacing w:after="120" w:before="280"/>
+      </w:pPr>
+      <w:r>
+        <w:rPr>
+          <w:rFonts w:ascii="Georgia" w:cs="Georgia" w:eastAsia="Georgia" w:hAnsi="Georgia"/>
+          <w:b/>
+          <w:bCs/>
+          <w:color w:val="2B2B2B"/>
+          <w:sz w:val="25"/>
+          <w:szCs w:val="25"/>
+        </w:rPr>
+        <w:t xml:space="preserve">Cómo enfrentarlos: las defensas de la institución</w:t>
+      </w:r>
+    </w:p>
+    <w:p>
+      <w:pPr>
+        <w:pStyle w:val="BodyJ"/>
+      </w:pPr>
+      <w:r>
+        <w:t xml:space="preserve">Las defensas individuales no bastan, porque varios riesgos del catálogo operan a escala de sistema. Una institución que despliega IA clínica contrae obligaciones epistémicas precisas:</w:t>
+      </w:r>
+    </w:p>
+    <w:p>
+      <w:pPr>
+        <w:pStyle w:val="BodyJ"/>
+        <w:numPr>
+          <w:ilvl w:val="0"/>
+          <w:numId w:val="6"/>
+        </w:numPr>
+      </w:pPr>
+      <w:r>
+        <w:rPr>
+          <w:b/>
+          <w:bCs/>
+        </w:rPr>
+        <w:t xml:space="preserve">Validación local antes de usar.</w:t>
+      </w:r>
+      <w:r>
+        <w:t xml:space="preserve"> El desempeño publicado —o prometido— no es el desempeño aquí; la parábola del predictor de sepsis existe porque nadie hizo esta pregunta a tiempo (Wong et al., 2021).</w:t>
+      </w:r>
+    </w:p>
+    <w:p>
+      <w:pPr>
+        <w:pStyle w:val="BodyJ"/>
+        <w:numPr>
+          <w:ilvl w:val="0"/>
+          <w:numId w:val="6"/>
+        </w:numPr>
+      </w:pPr>
+      <w:r>
+        <w:rPr>
+          <w:b/>
+          <w:bCs/>
+        </w:rPr>
+        <w:t xml:space="preserve">Monitoreo continuo con umbrales de retirada.</w:t>
+      </w:r>
+      <w:r>
+        <w:t xml:space="preserve"> Definir antes del despliegue qué degradación obliga a recalibrar o apagar: la falsabilidad del capítulo 15, aplicada al software.</w:t>
+      </w:r>
+    </w:p>
+    <w:p>
+      <w:pPr>
+        <w:pStyle w:val="BodyJ"/>
+        <w:numPr>
+          <w:ilvl w:val="0"/>
+          <w:numId w:val="6"/>
+        </w:numPr>
+      </w:pPr>
+      <w:r>
+        <w:rPr>
+          <w:b/>
+          <w:bCs/>
+        </w:rPr>
+        <w:t xml:space="preserve">Auditoría de equidad.</w:t>
+      </w:r>
+      <w:r>
+        <w:t xml:space="preserve"> Desagregar el rendimiento por subgrupos y examinar los sustitutos con la pregunta de Obermeyer: ¿qué mide realmente esta variable, y para quién?</w:t>
+      </w:r>
+    </w:p>
+    <w:p>
+      <w:pPr>
+        <w:pStyle w:val="BodyJ"/>
+        <w:numPr>
+          <w:ilvl w:val="0"/>
+          <w:numId w:val="6"/>
+        </w:numPr>
+      </w:pPr>
+      <w:r>
+        <w:rPr>
+          <w:b/>
+          <w:bCs/>
+        </w:rPr>
+        <w:t xml:space="preserve">Presupuesto de alertas.</w:t>
+      </w:r>
+      <w:r>
+        <w:t xml:space="preserve"> Cada alarma nueva compite por la misma atención finita; una alerta de bajo valor predictivo no es inocua — es ruido que entrena a ignorar, y el equipo que aprendió a ignorar no distingue qué está ignorando.</w:t>
+      </w:r>
+    </w:p>
+    <w:p>
+      <w:pPr>
+        <w:pStyle w:val="BodyJ"/>
+        <w:numPr>
+          <w:ilvl w:val="0"/>
+          <w:numId w:val="6"/>
+        </w:numPr>
+      </w:pPr>
+      <w:r>
+        <w:rPr>
+          <w:b/>
+          <w:bCs/>
+        </w:rPr>
+        <w:t xml:space="preserve">Responsabilidad trazable.</w:t>
+      </w:r>
+      <w:r>
+        <w:t xml:space="preserve"> Cada recomendación automatizada necesita un dueño humano identificable, con tiempo, datos y autoridad para contradecirla. La OMS ha recomendado gobernanza, evaluación, transparencia y supervisión humana para estos sistemas, atendiendo riesgos de inexactitud, sesgo, privacidad y dependencia excesiva (World Health Organization, 2024); esa supervisión no puede ser una firma ritual al final del flujo.</w:t>
+      </w:r>
+    </w:p>
+    <w:p>
+      <w:pPr>
+        <w:pStyle w:val="Heading3"/>
+        <w:spacing w:after="120" w:before="280"/>
+      </w:pPr>
+      <w:r>
+        <w:rPr>
+          <w:rFonts w:ascii="Georgia" w:cs="Georgia" w:eastAsia="Georgia" w:hAnsi="Georgia"/>
+          <w:b/>
+          <w:bCs/>
+          <w:color w:val="2B2B2B"/>
+          <w:sz w:val="25"/>
+          <w:szCs w:val="25"/>
+        </w:rPr>
+        <w:t xml:space="preserve">Metacognición artificial</w:t>
+      </w:r>
+    </w:p>
+    <w:p>
+      <w:pPr>
+        <w:pStyle w:val="BodyJ"/>
+      </w:pPr>
+      <w:r>
+        <w:t xml:space="preserve">Algunos sistemas pueden expresar confianza, criticar una respuesta o revisar pasos. Eso no demuestra autoconocimiento en el sentido humano. Una salida metacognitiva puede ser otra generación entrenada para imitar evaluación. La pregunta práctica no es si el sistema "sabe que sabe", sino si sus señales de confianza están empíricamente calibradas y si el flujo de trabajo detecta fallas.</w:t>
+      </w:r>
+    </w:p>
+    <w:p>
+      <w:pPr>
+        <w:pStyle w:val="BodyJ"/>
+      </w:pPr>
+      <w:r>
+        <w:t xml:space="preserve">Esa pregunta ya tiene datos. La evidencia disponible muestra que la confianza verbalizada de los grandes modelos —el "estoy bastante seguro" que escriben— tiende a la sobreconfianza sistemática y se calibra mal, aun cuando algunas señales internas del modelo discriminan mejor de lo que su prosa deja ver (Kadavath et al., 2022; Xiong et al., 2024). La implicación práctica es idéntica a la del capítulo 5, aplicada ahora a la máquina: preguntarle a un modelo cuán seguro está no sustituye la verificación, igual que la seguridad de un colega no sustituye sus razones. La calibración se demuestra con series de predicciones y desenlaces, no con tono.</w:t>
+      </w:r>
+    </w:p>
+    <w:p>
+      <w:pPr>
+        <w:pStyle w:val="Heading3"/>
+        <w:spacing w:after="120" w:before="280"/>
+      </w:pPr>
+      <w:r>
+        <w:rPr>
+          <w:rFonts w:ascii="Georgia" w:cs="Georgia" w:eastAsia="Georgia" w:hAnsi="Georgia"/>
+          <w:b/>
+          <w:bCs/>
+          <w:color w:val="2B2B2B"/>
+          <w:sz w:val="25"/>
+          <w:szCs w:val="25"/>
+        </w:rPr>
+        <w:t xml:space="preserve">La IA como espejo y provocación filosófica</w:t>
+      </w:r>
+    </w:p>
+    <w:p>
+      <w:pPr>
+        <w:pStyle w:val="BodyJ"/>
+      </w:pPr>
+      <w:r>
+        <w:t xml:space="preserve">La IA revela que una frase puede conservar la forma externa del razonamiento sin tener acceso directo al evento. Esto obliga a recordar que la coherencia verbal nunca fue garantía suficiente. También muestra el valor del lenguaje como espacio de prueba: pedir alternativas, contraejemplos y explicitar incertidumbre puede mejorar la deliberación humana, aunque no vuelva verdadero al modelo.</w:t>
+      </w:r>
+    </w:p>
+    <w:p>
+      <w:pPr>
+        <w:pStyle w:val="Quote1"/>
+      </w:pPr>
+      <w:r>
+        <w:t xml:space="preserve">La IA puede ampliar el espacio de hipótesis; no puede asumir por sí sola la responsabilidad de transformar una hipótesis en conducta clínica.</w:t>
+      </w:r>
+    </w:p>
+    <w:p>
+      <w:pPr>
+        <w:pStyle w:val="BodyJ"/>
+      </w:pPr>
+      <w:r>
+        <w:t xml:space="preserve">Usada con disciplina, puede ser un instrumento metacognitivo externo. Usada por deferencia, puede reforzar el mismo error que pretendía corregir: convertir plausibilidad en certeza.</w:t>
+      </w:r>
+    </w:p>
+    <w:p>
+      <w:pPr>
+        <w:pStyle w:val="TallerHead"/>
+      </w:pPr>
+      <w:r>
+        <w:t xml:space="preserve">Taller 17. La autopsia de una respuesta</w:t>
+      </w:r>
+    </w:p>
+    <w:p>
+      <w:pPr>
+        <w:pStyle w:val="BodyJ"/>
+      </w:pPr>
+      <w:r>
+        <w:t xml:space="preserve">Tome un caso real ya resuelto de su servicio —debidamente anonimizado— y péguelo en un asistente de lenguaje pidiendo evaluación y plan. Imprima la respuesta y márquela con tres colores: (1) afirmaciones sustentadas en datos que el caso contenía; (2) contenido que el modelo agregó — detalles "típicos", causalidades, datos que nadie le dio; (3) incertidumbre declarada. Después, haga una segunda pregunta al modelo: "¿qué evidencia haría improbable tu diagnóstico principal?".</w:t>
+      </w:r>
+    </w:p>
+    <w:p>
+      <w:pPr>
+        <w:pStyle w:val="BodyJ"/>
+      </w:pPr>
+      <w:r>
+        <w:rPr>
+          <w:i/>
+          <w:iCs/>
+        </w:rPr>
+        <w:t xml:space="preserve">Solución comentada.</w:t>
+      </w:r>
+      <w:r>
+        <w:t xml:space="preserve"> Tres hallazgos son casi constantes. Primero, el color 2 aparece más de lo esperado: el modelo rellena huecos con verosimilitud — una evolución "esperable", un factor de riesgo "presumible" — y esa es exactamente la definición de confabulación; contarlas cura más que leer sobre ellas. Segundo, el color 3 suele ser genérico ("se sugiere correlacionar con la clínica") y no específico del caso: incertidumbre de fórmula, no de contenido — compárela con la que exige el léxico del capítulo 4. Tercero, la respuesta a la segunda pregunta suele ser mejor que la primera: el modelo enumera con soltura los datos que refutarían su propia propuesta — pero sólo si alguien se lo pide. La herramienta contiene su propio antídoto; la pregunta que lo libera sigue siendo humana.</w:t>
+      </w:r>
+    </w:p>
+    <w:p>
+      <w:pPr>
+        <w:pStyle w:val="EnUnaFrase"/>
+      </w:pPr>
+      <w:r>
+        <w:rPr>
+          <w:b/>
+          <w:bCs/>
+        </w:rPr>
+        <w:t xml:space="preserve">En una frase.</w:t>
+      </w:r>
+      <w:r>
+        <w:t xml:space="preserve"> La IA generativa produce exactamente aquello contra lo que este libro entrena: prosa fluida donde hechos, inferencias e incertidumbre llegan mezclados — auditarla con HII-D es el mismo ejercicio que auditar la propia escritura.</w:t>
+      </w:r>
+    </w:p>
+    <w:p>
+      <w:pPr>
+        <w:pStyle w:val="BodyJ"/>
+        <w:spacing w:after="80" w:before="160"/>
+      </w:pPr>
+      <w:r>
+        <w:rPr>
+          <w:b/>
+          <w:bCs/>
+        </w:rPr>
+        <w:t xml:space="preserve">Tres preguntas para la próxima visita.</w:t>
+      </w:r>
+    </w:p>
+    <w:p>
+      <w:pPr>
+        <w:pStyle w:val="BodyJ"/>
+        <w:numPr>
+          <w:ilvl w:val="0"/>
+          <w:numId w:val="26"/>
+        </w:numPr>
+      </w:pPr>
+      <w:r>
+        <w:t xml:space="preserve">Si uso IA en este caso, ¿qué dato de su respuesta verifiqué contra una fuente primaria antes de actuar?</w:t>
+      </w:r>
+    </w:p>
+    <w:p>
+      <w:pPr>
+        <w:pStyle w:val="BodyJ"/>
+        <w:numPr>
+          <w:ilvl w:val="0"/>
+          <w:numId w:val="26"/>
+        </w:numPr>
+      </w:pPr>
+      <w:r>
+        <w:t xml:space="preserve">¿Qué agregó el modelo que el caso no contenía?</w:t>
+      </w:r>
+    </w:p>
+    <w:p>
+      <w:pPr>
+        <w:pStyle w:val="BodyJ"/>
+        <w:numPr>
+          <w:ilvl w:val="0"/>
+          <w:numId w:val="26"/>
+        </w:numPr>
+      </w:pPr>
+      <w:r>
+        <w:t xml:space="preserve">¿Estoy usando la herramienta para ampliar hipótesis o para confirmar rápido la que ya tenía?</w:t>
+      </w:r>
+    </w:p>
+    <w:p>
+      <w:pPr>
+        <w:pStyle w:val="Heading2"/>
+        <w:pageBreakBefore/>
+        <w:spacing w:after="300" w:before="600"/>
+      </w:pPr>
+      <w:r>
+        <w:rPr>
+          <w:rFonts w:ascii="Georgia" w:cs="Georgia" w:eastAsia="Georgia" w:hAnsi="Georgia"/>
+          <w:b/>
+          <w:bCs/>
+          <w:color w:val="8C2F2F"/>
+          <w:sz w:val="22"/>
+          <w:szCs w:val="22"/>
+        </w:rPr>
+        <w:t xml:space="preserve">Capítulo 18</w:t>
+      </w:r>
+      <w:r>
+        <w:rPr>
+          <w:rFonts w:ascii="Georgia" w:cs="Georgia" w:eastAsia="Georgia" w:hAnsi="Georgia"/>
+          <w:b/>
+          <w:bCs/>
+          <w:color w:val="3D5A6C"/>
+          <w:sz w:val="32"/>
+          <w:szCs w:val="32"/>
+        </w:rPr>
+        <w:br/>
+        <w:t xml:space="preserve">La palabra exacta: lo que la poesía sabe del juicio clínico</w:t>
+      </w:r>
+    </w:p>
+    <w:p>
+      <w:pPr>
+        <w:pStyle w:val="BodyJ"/>
+      </w:pPr>
+      <w:r>
+        <w:t xml:space="preserve">Hay un momento que los tratados no describen y todo clínico conoce: tres hallazgos sueltos —una taquicardia sin fiebre, un abdomen que "no convence", una frase de la hija— se ordenan de golpe bajo una sola explicación, y algo hace clic. El placer de ese instante no es administrativo. Es físico, breve y sospechosamente parecido al de un verso que cae en su lugar. Este capítulo toma ese parecido en serio: no como adorno humanista, sino como información sobre cómo funciona —y cómo falla— el juicio.</w:t>
+      </w:r>
+    </w:p>
+    <w:p>
+      <w:pPr>
+        <w:pStyle w:val="Heading3"/>
+        <w:spacing w:after="120" w:before="280"/>
+      </w:pPr>
+      <w:r>
+        <w:rPr>
+          <w:rFonts w:ascii="Georgia" w:cs="Georgia" w:eastAsia="Georgia" w:hAnsi="Georgia"/>
+          <w:b/>
+          <w:bCs/>
+          <w:color w:val="2B2B2B"/>
+          <w:sz w:val="25"/>
+          <w:szCs w:val="25"/>
+        </w:rPr>
+        <w:t xml:space="preserve">Dos oficios de la conexión</w:t>
+      </w:r>
+    </w:p>
+    <w:p>
+      <w:pPr>
+        <w:pStyle w:val="BodyJ"/>
+      </w:pPr>
+      <w:r>
+        <w:t xml:space="preserve">El poeta trabaja buscando conexiones: entre palabras, entre una palabra y un sentido que todavía no tiene nombre, entre el sonido y aquello que el sonido vuelve visible. Su estado mental característico combina atención flotante, oído para lo que no encaja y una disposición rara: dejar que el material mande sobre el plan. El clínico que razona bien trabaja igual, con otros materiales: entre el hallazgo y el mecanismo, entre el mecanismo y la intervención que estabiliza, busca la conexión que convierta fragmentos en un caso inteligible.</w:t>
+      </w:r>
+    </w:p>
+    <w:p>
+      <w:pPr>
+        <w:pStyle w:val="BodyJ"/>
+      </w:pPr>
+      <w:r>
+        <w:t xml:space="preserve">El parentesco es lógico antes que sentimental. Una metáfora es la hipótesis de que dos cosas lejanas comparten estructura; un diagnóstico es una metáfora que acepta ser puesta a prueba — "este cuadro es una colecistitis" apuesta a que lo que ocurre en este cuerpo comparte estructura con un patrón aprendido. Ambos movimientos son la abducción del capítulo 2, y ambos requieren el mismo estado que el capítulo 14 llamó humildad en funciones: sostener la conjetura con fuerza suficiente para trabajarla y soltura suficiente para dejarla caer. Bohm lo dijo desde la física: el acto creativo central —percibir un orden nuevo en lo que ya estaba a la vista— es el mismo en el arte y en la ciencia; cambian los materiales y el tribunal (Bohm, 1996).</w:t>
+      </w:r>
+    </w:p>
+    <w:p>
+      <w:pPr>
+        <w:pStyle w:val="Heading3"/>
+        <w:spacing w:after="120" w:before="280"/>
+      </w:pPr>
+      <w:r>
+        <w:rPr>
+          <w:rFonts w:ascii="Georgia" w:cs="Georgia" w:eastAsia="Georgia" w:hAnsi="Georgia"/>
+          <w:b/>
+          <w:bCs/>
+          <w:color w:val="2B2B2B"/>
+          <w:sz w:val="25"/>
+          <w:szCs w:val="25"/>
+        </w:rPr>
+        <w:t xml:space="preserve">Huidobro, o la palabra que crea</w:t>
+      </w:r>
+    </w:p>
+    <w:p>
+      <w:pPr>
+        <w:pStyle w:val="BodyJ"/>
+      </w:pPr>
+      <w:r>
+        <w:t xml:space="preserve">En 1916, Vicente Huidobro escribió el manifiesto de una poesía que no quería describir el mundo sino aumentarlo: "Por qué cantáis la rosa, ¡oh Poetas! / Hacedla florecer en el poema". Y remató con la línea más citada del creacionismo: "El poeta es un pequeño Dios" (Huidobro, 1916). El poema no canta la rosa: la crea. Como programa poético es glorioso. Como descripción de lo que el lenguaje puede hacer, es exactamente el peligro contra el que este libro lleva diecisiete capítulos escribiendo.</w:t>
+      </w:r>
+    </w:p>
+    <w:p>
+      <w:pPr>
+        <w:pStyle w:val="BodyJ"/>
+      </w:pPr>
+      <w:r>
+        <w:t xml:space="preserve">Porque la ficha clínica también hace florecer rosas. La "neumonía aspirativa" del prefacio —dos palabras limpias que crearon un antecedente que nadie observó— es creacionismo puro; el "somatiza" de la viñeta 10, también. El capítulo 12 mostró el mecanismo: la ficha produce lo visible, y sus criaturas verbales adquieren vida institucional. La diferencia con la poesía es brutal: las rosas de Huidobro viven en el poema; las nuestras reciben antibióticos, cirugías y altas. El lenguaje clínico descuidado es creacionista por defecto — y un servicio lleno de pequeños dioses es un lugar peligroso para estar enfermo.</w:t>
+      </w:r>
+    </w:p>
+    <w:p>
+      <w:pPr>
+        <w:pStyle w:val="Heading3"/>
+        <w:spacing w:after="120" w:before="280"/>
+      </w:pPr>
+      <w:r>
+        <w:rPr>
+          <w:rFonts w:ascii="Georgia" w:cs="Georgia" w:eastAsia="Georgia" w:hAnsi="Georgia"/>
+          <w:b/>
+          <w:bCs/>
+          <w:color w:val="2B2B2B"/>
+          <w:sz w:val="25"/>
+          <w:szCs w:val="25"/>
+        </w:rPr>
+        <w:t xml:space="preserve">Parra, o la deflación</w:t>
+      </w:r>
+    </w:p>
+    <w:p>
+      <w:pPr>
+        <w:pStyle w:val="BodyJ"/>
+      </w:pPr>
+      <w:r>
+        <w:t xml:space="preserve">El antídoto también lo escribió un chileno, y no uno cualquiera: un profesor de mecánica racional que estudió cosmología en Oxford y sabía, por oficio diurno, lo que cuesta un dato. Nicanor Parra pasó su vida bajándole los humos a la palabra: primero con los antipoemas (Parra, 1954), después con un "Manifiesto" que es casi un léxico de certeza en verso: los poetas bajaron del Olimpo, la poesía debe escribirse en palabras de todos los días — y, con nombre y apellido implícitos, la condena de "la poesía de pequeño dios" (Parra, 1969). La réplica a Huidobro no es una interpretación: está en el texto.</w:t>
+      </w:r>
+    </w:p>
+    <w:p>
+      <w:pPr>
+        <w:pStyle w:val="BodyJ"/>
+      </w:pPr>
+      <w:r>
+        <w:t xml:space="preserve">La antipoesía es un programa epistemológico completo: quitarle a la palabra los poderes que no puede sostener y devolverla al tamaño de la experiencia. Visto desde ahí, el léxico del capítulo 4 es antipoesía aplicada: "sin evidencia actual de" es un verso parriano — feo, honesto, exacto, imposible de recitar con voz engolada. La ficha lúcida se escribe más cerca de Parra que de Huidobro: lengua de todos los días, dignidad del "no sé", desconfianza instintiva de toda frase que suene demasiado bien.</w:t>
+      </w:r>
+    </w:p>
+    <w:p>
+      <w:pPr>
+        <w:pStyle w:val="Heading3"/>
+        <w:spacing w:after="120" w:before="280"/>
+      </w:pPr>
+      <w:r>
+        <w:rPr>
+          <w:rFonts w:ascii="Georgia" w:cs="Georgia" w:eastAsia="Georgia" w:hAnsi="Georgia"/>
+          <w:b/>
+          <w:bCs/>
+          <w:color w:val="2B2B2B"/>
+          <w:sz w:val="25"/>
+          <w:szCs w:val="25"/>
+        </w:rPr>
+        <w:t xml:space="preserve">La belleza como señal y como trampa</w:t>
+      </w:r>
+    </w:p>
+    <w:p>
+      <w:pPr>
+        <w:pStyle w:val="BodyJ"/>
+      </w:pPr>
+      <w:r>
+        <w:t xml:space="preserve">El clic estético del diagnóstico existe y es información. La parsimonia, la convergencia, el encaje sin residuo son la forma sensible de aquello que el capítulo 2 llamó fuerza por convergencia: cuando una explicación ordena todos los hechos sin forzar ninguno, algo en nosotros lo registra como belleza antes de poder justificarlo. Esa señal vale: propone candidatos que el análisis no habría listado.</w:t>
+      </w:r>
+    </w:p>
+    <w:p>
+      <w:pPr>
+        <w:pStyle w:val="BodyJ"/>
+      </w:pPr>
+      <w:r>
+        <w:t xml:space="preserve">Pero este libro ya conoció a la impostora. La historia coherente del hindsight, la narrativa atractiva que infla la confianza (capítulo 5), la prosa fluida de los modelos de lenguaje (capítulo 17): todas son bellas y ninguna es, por serlo, verdadera. La belleza no distingue entre orden hallado y orden impuesto — para eso están las pruebas severas. La regla que concilia ambas caras cabe en una línea: la elegancia selecciona hipótesis; nunca las confirma. El verso puede quedarse bello para siempre; el diagnóstico tiene que amanecer verdadero, y la evolución lo audita cada mañana.</w:t>
+      </w:r>
+    </w:p>
+    <w:p>
+      <w:pPr>
+        <w:pStyle w:val="BodyJ"/>
+      </w:pPr>
+      <w:r>
+        <w:t xml:space="preserve">Queda la belleza final, la que menos se nombra: la de hacer lo correcto en el contexto correcto. Una estabilización bien conducida tiene forma estética — nada sobró, nada faltó, cada intervención llegó a su hora; es la phronesis del capítulo 6 vuelta percepción. Pero es una belleza que sólo puede declararse retrospectivamente, y sólo si el proceso era defendible antes de conocer el desenlace (capítulo 10). En medicina la estética es un subproducto del rigor. Cuando se la busca directamente —el diagnóstico brillante, la frase imponente—, se obtiene Huidobro en la ficha.</w:t>
+      </w:r>
+    </w:p>
+    <w:p>
+      <w:pPr>
+        <w:pStyle w:val="Heading3"/>
+        <w:spacing w:after="120" w:before="280"/>
+      </w:pPr>
+      <w:r>
+        <w:rPr>
+          <w:rFonts w:ascii="Georgia" w:cs="Georgia" w:eastAsia="Georgia" w:hAnsi="Georgia"/>
+          <w:b/>
+          <w:bCs/>
+          <w:color w:val="2B2B2B"/>
+          <w:sz w:val="25"/>
+          <w:szCs w:val="25"/>
+        </w:rPr>
         <w:t xml:space="preserve">Leer poesía como entrenamiento clínico</w:t>
       </w:r>
     </w:p>
@@ -11329,7 +11780,7 @@
         <w:pStyle w:val="BodyJ"/>
         <w:numPr>
           <w:ilvl w:val="0"/>
-          <w:numId w:val="26"/>
+          <w:numId w:val="27"/>
         </w:numPr>
       </w:pPr>
       <w:r>
@@ -11341,7 +11792,7 @@
         <w:pStyle w:val="BodyJ"/>
         <w:numPr>
           <w:ilvl w:val="0"/>
-          <w:numId w:val="26"/>
+          <w:numId w:val="27"/>
         </w:numPr>
       </w:pPr>
       <w:r>
@@ -11353,7 +11804,7 @@
         <w:pStyle w:val="BodyJ"/>
         <w:numPr>
           <w:ilvl w:val="0"/>
-          <w:numId w:val="26"/>
+          <w:numId w:val="27"/>
         </w:numPr>
       </w:pPr>
       <w:r>
@@ -12012,7 +12463,7 @@
         <w:pStyle w:val="BodyJ"/>
         <w:numPr>
           <w:ilvl w:val="0"/>
-          <w:numId w:val="27"/>
+          <w:numId w:val="28"/>
         </w:numPr>
       </w:pPr>
       <w:r>
@@ -12024,7 +12475,7 @@
         <w:pStyle w:val="BodyJ"/>
         <w:numPr>
           <w:ilvl w:val="0"/>
-          <w:numId w:val="27"/>
+          <w:numId w:val="28"/>
         </w:numPr>
       </w:pPr>
       <w:r>
@@ -12036,7 +12487,7 @@
         <w:pStyle w:val="BodyJ"/>
         <w:numPr>
           <w:ilvl w:val="0"/>
-          <w:numId w:val="27"/>
+          <w:numId w:val="28"/>
         </w:numPr>
       </w:pPr>
       <w:r>
@@ -12048,7 +12499,7 @@
         <w:pStyle w:val="BodyJ"/>
         <w:numPr>
           <w:ilvl w:val="0"/>
-          <w:numId w:val="27"/>
+          <w:numId w:val="28"/>
         </w:numPr>
       </w:pPr>
       <w:r>
@@ -13327,7 +13778,7 @@
         <w:pStyle w:val="BodyJ"/>
         <w:numPr>
           <w:ilvl w:val="0"/>
-          <w:numId w:val="28"/>
+          <w:numId w:val="29"/>
         </w:numPr>
       </w:pPr>
       <w:r>
@@ -13339,7 +13790,7 @@
         <w:pStyle w:val="BodyJ"/>
         <w:numPr>
           <w:ilvl w:val="0"/>
-          <w:numId w:val="28"/>
+          <w:numId w:val="29"/>
         </w:numPr>
       </w:pPr>
       <w:r>
@@ -13351,7 +13802,7 @@
         <w:pStyle w:val="BodyJ"/>
         <w:numPr>
           <w:ilvl w:val="0"/>
-          <w:numId w:val="28"/>
+          <w:numId w:val="29"/>
         </w:numPr>
       </w:pPr>
       <w:r>
@@ -13363,7 +13814,7 @@
         <w:pStyle w:val="BodyJ"/>
         <w:numPr>
           <w:ilvl w:val="0"/>
-          <w:numId w:val="28"/>
+          <w:numId w:val="29"/>
         </w:numPr>
       </w:pPr>
       <w:r>
@@ -13375,7 +13826,7 @@
         <w:pStyle w:val="BodyJ"/>
         <w:numPr>
           <w:ilvl w:val="0"/>
-          <w:numId w:val="28"/>
+          <w:numId w:val="29"/>
         </w:numPr>
       </w:pPr>
       <w:r>
@@ -13387,7 +13838,7 @@
         <w:pStyle w:val="BodyJ"/>
         <w:numPr>
           <w:ilvl w:val="0"/>
-          <w:numId w:val="28"/>
+          <w:numId w:val="29"/>
         </w:numPr>
       </w:pPr>
       <w:r>
@@ -13399,7 +13850,7 @@
         <w:pStyle w:val="BodyJ"/>
         <w:numPr>
           <w:ilvl w:val="0"/>
-          <w:numId w:val="28"/>
+          <w:numId w:val="29"/>
         </w:numPr>
       </w:pPr>
       <w:r>
@@ -13411,7 +13862,7 @@
         <w:pStyle w:val="BodyJ"/>
         <w:numPr>
           <w:ilvl w:val="0"/>
-          <w:numId w:val="28"/>
+          <w:numId w:val="29"/>
         </w:numPr>
       </w:pPr>
       <w:r>
@@ -13423,7 +13874,7 @@
         <w:pStyle w:val="BodyJ"/>
         <w:numPr>
           <w:ilvl w:val="0"/>
-          <w:numId w:val="28"/>
+          <w:numId w:val="29"/>
         </w:numPr>
       </w:pPr>
       <w:r>
@@ -13435,7 +13886,7 @@
         <w:pStyle w:val="BodyJ"/>
         <w:numPr>
           <w:ilvl w:val="0"/>
-          <w:numId w:val="28"/>
+          <w:numId w:val="29"/>
         </w:numPr>
       </w:pPr>
       <w:r>
@@ -13447,7 +13898,7 @@
         <w:pStyle w:val="BodyJ"/>
         <w:numPr>
           <w:ilvl w:val="0"/>
-          <w:numId w:val="28"/>
+          <w:numId w:val="29"/>
         </w:numPr>
       </w:pPr>
       <w:r>
@@ -13459,7 +13910,7 @@
         <w:pStyle w:val="BodyJ"/>
         <w:numPr>
           <w:ilvl w:val="0"/>
-          <w:numId w:val="28"/>
+          <w:numId w:val="29"/>
         </w:numPr>
       </w:pPr>
       <w:r>
@@ -13489,7 +13940,7 @@
         <w:pStyle w:val="BodyJ"/>
       </w:pPr>
       <w:r>
-        <w:t xml:space="preserve">Esta guía condensa el capítulo 17 en un plan concreto para un servicio que quiera adoptar el lenguaje y las prácticas del libro. Está pensada para un jefe de servicio, un programa de residencia o un grupo de clínicos con voluntad y poco tiempo. Tres advertencias previas: nada de esto está validado como tecnología (véase el capítulo 16, "Límites"); todo debe adaptarse al contexto local; y la palanca más barata —cómo se habla en la ronda— es también la más poderosa.</w:t>
+        <w:t xml:space="preserve">Esta guía condensa el capítulo 16 en un plan concreto para un servicio que quiera adoptar el lenguaje y las prácticas del libro. Está pensada para un jefe de servicio, un programa de residencia o un grupo de clínicos con voluntad y poco tiempo. Tres advertencias previas: nada de esto está validado como tecnología (véase el capítulo 15, "Límites"); todo debe adaptarse al contexto local; y la palanca más barata —cómo se habla en la ronda— es también la más poderosa.</w:t>
       </w:r>
     </w:p>
     <w:p>
@@ -14404,6 +14855,21 @@
           <w:b/>
           <w:bCs/>
         </w:rPr>
+        <w:t xml:space="preserve">Sesgo de automatización.</w:t>
+      </w:r>
+      <w:r>
+        <w:t xml:space="preserve"> Tendencia a aceptar la recomendación de un sistema automatizado por encima de la propia evidencia o el propio juicio; los apoyos a la decisión corrigen errores humanos e introducen errores nuevos por deferencia (Goddard et al.). Pariente del anclaje, con interfaz.</w:t>
+      </w:r>
+    </w:p>
+    <w:p>
+      <w:pPr>
+        <w:pStyle w:val="BodyJ"/>
+      </w:pPr>
+      <w:r>
+        <w:rPr>
+          <w:b/>
+          <w:bCs/>
+        </w:rPr>
         <w:t xml:space="preserve">Testimonio (epistemología del).</w:t>
       </w:r>
       <w:r>
@@ -14499,6 +14965,18 @@
         </w:numPr>
       </w:pPr>
       <w:r>
+        <w:t xml:space="preserve">Atrofia de la pericia por asistencia de IA (deskilling) — 17</w:t>
+      </w:r>
+    </w:p>
+    <w:p>
+      <w:pPr>
+        <w:pStyle w:val="BodyJ"/>
+        <w:numPr>
+          <w:ilvl w:val="0"/>
+          <w:numId w:val="6"/>
+        </w:numPr>
+      </w:pPr>
+      <w:r>
         <w:t xml:space="preserve">Ausencia de evidencia / evidencia de ausencia — 1, 4, Ap B</w:t>
       </w:r>
     </w:p>
@@ -14511,7 +14989,7 @@
         </w:numPr>
       </w:pPr>
       <w:r>
-        <w:t xml:space="preserve">Autoridad revisable — 7, 13, 15</w:t>
+        <w:t xml:space="preserve">Autoridad revisable — 7, 13, 14</w:t>
       </w:r>
     </w:p>
     <w:p>
@@ -14523,7 +15001,7 @@
         </w:numPr>
       </w:pPr>
       <w:r>
-        <w:t xml:space="preserve">Bioética y razonamiento clínico (cuatro tópicos, proporcionalidad, deliberación) — 10, 16, CC (viñeta 7), Ap A</w:t>
+        <w:t xml:space="preserve">Bioética y razonamiento clínico (cuatro tópicos, proporcionalidad, deliberación) — 10, 15, CC (viñeta 7), Ap A</w:t>
       </w:r>
     </w:p>
     <w:p>
@@ -14535,7 +15013,7 @@
         </w:numPr>
       </w:pPr>
       <w:r>
-        <w:t xml:space="preserve">Calibración — 5, 16, 17, Ap C</w:t>
+        <w:t xml:space="preserve">Calibración — 5, 15, 16, Ap C</w:t>
       </w:r>
     </w:p>
     <w:p>
@@ -14583,7 +15061,7 @@
         </w:numPr>
       </w:pPr>
       <w:r>
-        <w:t xml:space="preserve">Comunicación de incertidumbre — 13, 15, CC (viñeta 7)</w:t>
+        <w:t xml:space="preserve">Comunicación de incertidumbre — 13, 14, CC (viñeta 7)</w:t>
       </w:r>
     </w:p>
     <w:p>
@@ -14607,7 +15085,7 @@
         </w:numPr>
       </w:pPr>
       <w:r>
-        <w:t xml:space="preserve">Contexto global del paciente (funcionalidad, pronóstico de fondo, red de apoyo) — 10, 16, Ap A</w:t>
+        <w:t xml:space="preserve">Contexto global del paciente (funcionalidad, pronóstico de fondo, red de apoyo) — 10, 15, Ap A</w:t>
       </w:r>
     </w:p>
     <w:p>
@@ -14667,7 +15145,7 @@
         </w:numPr>
       </w:pPr>
       <w:r>
-        <w:t xml:space="preserve">Debate sobre la enseñanza del razonamiento (Croskerry vs. Norman/Monteiro) — 17</w:t>
+        <w:t xml:space="preserve">Debate sobre la enseñanza del razonamiento (Croskerry vs. Norman/Monteiro) — 16</w:t>
       </w:r>
     </w:p>
     <w:p>
@@ -14679,7 +15157,7 @@
         </w:numPr>
       </w:pPr>
       <w:r>
-        <w:t xml:space="preserve">Decisión compartida — 13, 15, Interludio III</w:t>
+        <w:t xml:space="preserve">Decisión compartida — 13, 14, Interludio III</w:t>
       </w:r>
     </w:p>
     <w:p>
@@ -14751,7 +15229,7 @@
         </w:numPr>
       </w:pPr>
       <w:r>
-        <w:t xml:space="preserve">Documentación defensiva — 15</w:t>
+        <w:t xml:space="preserve">Documentación defensiva — 14</w:t>
       </w:r>
     </w:p>
     <w:p>
@@ -14799,7 +15277,7 @@
         </w:numPr>
       </w:pPr>
       <w:r>
-        <w:t xml:space="preserve">Falsabilidad del método HII-D — 16</w:t>
+        <w:t xml:space="preserve">Falsabilidad del método HII-D — 15</w:t>
       </w:r>
     </w:p>
     <w:p>
@@ -14811,7 +15289,7 @@
         </w:numPr>
       </w:pPr>
       <w:r>
-        <w:t xml:space="preserve">Feedback diagnóstico — 5, 17, Ap C</w:t>
+        <w:t xml:space="preserve">Feedback diagnóstico — 5, 16, Ap C</w:t>
       </w:r>
     </w:p>
     <w:p>
@@ -14835,7 +15313,7 @@
         </w:numPr>
       </w:pPr>
       <w:r>
-        <w:t xml:space="preserve">Fichas clínicas y plantillas — 12, 17, Ap C</w:t>
+        <w:t xml:space="preserve">Fichas clínicas y plantillas — 12, 16, Ap C</w:t>
       </w:r>
     </w:p>
     <w:p>
@@ -14847,7 +15325,7 @@
         </w:numPr>
       </w:pPr>
       <w:r>
-        <w:t xml:space="preserve">Fragilidad y funcionalidad como hechos clínicos — 10, 16, Ap A</w:t>
+        <w:t xml:space="preserve">Fragilidad y funcionalidad como hechos clínicos — 10, 15, Ap A</w:t>
       </w:r>
     </w:p>
     <w:p>
@@ -14895,7 +15373,7 @@
         </w:numPr>
       </w:pPr>
       <w:r>
-        <w:t xml:space="preserve">Hindsight bias — 8, 11, 17, CC (viñeta 8)</w:t>
+        <w:t xml:space="preserve">Hindsight bias — 8, 11, 16, CC (viñeta 8)</w:t>
       </w:r>
     </w:p>
     <w:p>
@@ -14907,7 +15385,7 @@
         </w:numPr>
       </w:pPr>
       <w:r>
-        <w:t xml:space="preserve">HII-D (método) — 12, 16, Ap A; auditoría de IA con — 14</w:t>
+        <w:t xml:space="preserve">HII-D (método) — 12, 15, Ap A; auditoría de IA con — 17</w:t>
       </w:r>
     </w:p>
     <w:p>
@@ -14919,7 +15397,7 @@
         </w:numPr>
       </w:pPr>
       <w:r>
-        <w:t xml:space="preserve">Humildad epistémica como motor (explorar, aprender, reenfocar) — 15</w:t>
+        <w:t xml:space="preserve">Humildad epistémica como motor (explorar, aprender, reenfocar) — 14</w:t>
       </w:r>
     </w:p>
     <w:p>
@@ -14931,7 +15409,7 @@
         </w:numPr>
       </w:pPr>
       <w:r>
-        <w:t xml:space="preserve">Illness scripts — 2, 6, 17</w:t>
+        <w:t xml:space="preserve">Illness scripts — 2, 6, 16</w:t>
       </w:r>
     </w:p>
     <w:p>
@@ -14955,7 +15433,7 @@
         </w:numPr>
       </w:pPr>
       <w:r>
-        <w:t xml:space="preserve">Injusticia epistémica — 15, CC (viñeta 10)</w:t>
+        <w:t xml:space="preserve">Injusticia epistémica — 14, CC (viñeta 10)</w:t>
       </w:r>
     </w:p>
     <w:p>
@@ -14967,6 +15445,18 @@
         </w:numPr>
       </w:pPr>
       <w:r>
+        <w:t xml:space="preserve">Inteligencia artificial: rol diagnóstico y terapéutico, catálogo de riesgos, defensas — 17</w:t>
+      </w:r>
+    </w:p>
+    <w:p>
+      <w:pPr>
+        <w:pStyle w:val="BodyJ"/>
+        <w:numPr>
+          <w:ilvl w:val="0"/>
+          <w:numId w:val="6"/>
+        </w:numPr>
+      </w:pPr>
+      <w:r>
         <w:t xml:space="preserve">Intuición experta — 5, 6, Interludio II</w:t>
       </w:r>
     </w:p>
@@ -15039,7 +15529,7 @@
         </w:numPr>
       </w:pPr>
       <w:r>
-        <w:t xml:space="preserve">Metacognición: definición y niveles — Int, 5; sensibilidad vs. sesgo — Int, 5; artificial — 14</w:t>
+        <w:t xml:space="preserve">Metacognición: definición y niveles — Int, 5; sensibilidad vs. sesgo — Int, 5; artificial — 17</w:t>
       </w:r>
     </w:p>
     <w:p>
@@ -15051,7 +15541,7 @@
         </w:numPr>
       </w:pPr>
       <w:r>
-        <w:t xml:space="preserve">Miedo y decisión (documentación defensiva, sobreestudio) — 3, 15</w:t>
+        <w:t xml:space="preserve">Miedo y decisión (documentación defensiva, sobreestudio) — 3, 14</w:t>
       </w:r>
     </w:p>
     <w:p>
@@ -15075,7 +15565,7 @@
         </w:numPr>
       </w:pPr>
       <w:r>
-        <w:t xml:space="preserve">Pausa diagnóstica — 8, 17, Ap B, Ap C</w:t>
+        <w:t xml:space="preserve">Pausa diagnóstica — 8, 16, Ap B, Ap C</w:t>
       </w:r>
     </w:p>
     <w:p>
@@ -15111,7 +15601,7 @@
         </w:numPr>
       </w:pPr>
       <w:r>
-        <w:t xml:space="preserve">Phronesis — 6, 15</w:t>
+        <w:t xml:space="preserve">Phronesis — 6, 14</w:t>
       </w:r>
     </w:p>
     <w:p>
@@ -15135,7 +15625,7 @@
         </w:numPr>
       </w:pPr>
       <w:r>
-        <w:t xml:space="preserve">Proporcionalidad terapéutica (Taboada) — 10, 16, CC (viñeta 7)</w:t>
+        <w:t xml:space="preserve">Proporcionalidad terapéutica (Taboada) — 10, 15, CC (viñeta 7)</w:t>
       </w:r>
     </w:p>
     <w:p>
@@ -15171,7 +15661,7 @@
         </w:numPr>
       </w:pPr>
       <w:r>
-        <w:t xml:space="preserve">Representación del problema — Int, 2, 8, 17</w:t>
+        <w:t xml:space="preserve">Representación del problema — Int, 2, 8, 16</w:t>
       </w:r>
     </w:p>
     <w:p>
@@ -15207,7 +15697,7 @@
         </w:numPr>
       </w:pPr>
       <w:r>
-        <w:t xml:space="preserve">Segunda víctima — 15</w:t>
+        <w:t xml:space="preserve">Segunda víctima — 14</w:t>
       </w:r>
     </w:p>
     <w:p>
@@ -15219,6 +15709,30 @@
         </w:numPr>
       </w:pPr>
       <w:r>
+        <w:t xml:space="preserve">Sesgo algorítmico (Obermeyer) — 17</w:t>
+      </w:r>
+    </w:p>
+    <w:p>
+      <w:pPr>
+        <w:pStyle w:val="BodyJ"/>
+        <w:numPr>
+          <w:ilvl w:val="0"/>
+          <w:numId w:val="6"/>
+        </w:numPr>
+      </w:pPr>
+      <w:r>
+        <w:t xml:space="preserve">Sesgo de automatización (Goddard) — 17</w:t>
+      </w:r>
+    </w:p>
+    <w:p>
+      <w:pPr>
+        <w:pStyle w:val="BodyJ"/>
+        <w:numPr>
+          <w:ilvl w:val="0"/>
+          <w:numId w:val="6"/>
+        </w:numPr>
+      </w:pPr>
+      <w:r>
         <w:t xml:space="preserve">Sesgos cognitivos: alcance y límites del vocabulario — 7</w:t>
       </w:r>
     </w:p>
@@ -15255,7 +15769,7 @@
         </w:numPr>
       </w:pPr>
       <w:r>
-        <w:t xml:space="preserve">Testimonio del paciente — 1, 15; epistemología del testimonio (Coady, Lackey) — 15; testimonio de terceros y cuidadores — CC (viñeta 9)</w:t>
+        <w:t xml:space="preserve">Testimonio del paciente — 1, 14; epistemología del testimonio (Coady, Lackey) — 14; testimonio de terceros y cuidadores — CC (viñeta 9)</w:t>
       </w:r>
     </w:p>
     <w:p>
@@ -15280,6 +15794,18 @@
       </w:pPr>
       <w:r>
         <w:t xml:space="preserve">Umbrales de decisión — 10, Interludio III, CC (viñeta 5)</w:t>
+      </w:r>
+    </w:p>
+    <w:p>
+      <w:pPr>
+        <w:pStyle w:val="BodyJ"/>
+        <w:numPr>
+          <w:ilvl w:val="0"/>
+          <w:numId w:val="6"/>
+        </w:numPr>
+      </w:pPr>
+      <w:r>
+        <w:t xml:space="preserve">Validación local y monitoreo de herramientas de IA — 17</w:t>
       </w:r>
     </w:p>
     <w:p>
@@ -15479,6 +16005,24 @@
         <w:pStyle w:val="BodyJ"/>
       </w:pPr>
       <w:r>
+        <w:t xml:space="preserve">Budzyń, K., Romańczyk, M., Kitala, D., et al. (2025). Endoscopist deskilling risk after exposure to artificial intelligence in colonoscopy: A multicentre, observational study. </w:t>
+      </w:r>
+      <w:r>
+        <w:rPr>
+          <w:i/>
+          <w:iCs/>
+        </w:rPr>
+        <w:t xml:space="preserve">The Lancet Gastroenterology &amp; Hepatology, 10</w:t>
+      </w:r>
+      <w:r>
+        <w:t xml:space="preserve">(10), 896–903.</w:t>
+      </w:r>
+    </w:p>
+    <w:p>
+      <w:pPr>
+        <w:pStyle w:val="BodyJ"/>
+      </w:pPr>
+      <w:r>
         <w:t xml:space="preserve">Cabitza, F., Rasoini, R., &amp; Gensini, G. F. (2017). Unintended consequences of machine learning in medicine. </w:t>
       </w:r>
       <w:r>
@@ -16091,6 +16635,42 @@
         <w:pStyle w:val="BodyJ"/>
       </w:pPr>
       <w:r>
+        <w:t xml:space="preserve">Goddard, K., Roudsari, A., &amp; Wyatt, J. C. (2012). Automation bias: A systematic review of frequency, effect mediators, and mitigators. </w:t>
+      </w:r>
+      <w:r>
+        <w:rPr>
+          <w:i/>
+          <w:iCs/>
+        </w:rPr>
+        <w:t xml:space="preserve">Journal of the American Medical Informatics Association, 19</w:t>
+      </w:r>
+      <w:r>
+        <w:t xml:space="preserve">(1), 121–127.</w:t>
+      </w:r>
+    </w:p>
+    <w:p>
+      <w:pPr>
+        <w:pStyle w:val="BodyJ"/>
+      </w:pPr>
+      <w:r>
+        <w:t xml:space="preserve">Goh, E., Gallo, R., Hom, J., et al. (2024). Large language model influence on diagnostic reasoning: A randomized clinical trial. </w:t>
+      </w:r>
+      <w:r>
+        <w:rPr>
+          <w:i/>
+          <w:iCs/>
+        </w:rPr>
+        <w:t xml:space="preserve">JAMA Network Open, 7</w:t>
+      </w:r>
+      <w:r>
+        <w:t xml:space="preserve">(10), e2440969.</w:t>
+      </w:r>
+    </w:p>
+    <w:p>
+      <w:pPr>
+        <w:pStyle w:val="BodyJ"/>
+      </w:pPr>
+      <w:r>
         <w:t xml:space="preserve">Graber, M. L., Franklin, N., &amp; Gordon, R. (2005). Diagnostic error in internal medicine. </w:t>
       </w:r>
       <w:r>
@@ -16865,6 +17445,24 @@
         <w:pStyle w:val="BodyJ"/>
       </w:pPr>
       <w:r>
+        <w:t xml:space="preserve">Obermeyer, Z., Powers, B., Vogeli, C., &amp; Mullainathan, S. (2019). Dissecting racial bias in an algorithm used to manage the health of populations. </w:t>
+      </w:r>
+      <w:r>
+        <w:rPr>
+          <w:i/>
+          <w:iCs/>
+        </w:rPr>
+        <w:t xml:space="preserve">Science, 366</w:t>
+      </w:r>
+      <w:r>
+        <w:t xml:space="preserve">(6464), 447–453.</w:t>
+      </w:r>
+    </w:p>
+    <w:p>
+      <w:pPr>
+        <w:pStyle w:val="BodyJ"/>
+      </w:pPr>
+      <w:r>
         <w:t xml:space="preserve">Parra, N. (1954). </w:t>
       </w:r>
       <w:r>
@@ -17452,6 +18050,24 @@
       </w:r>
       <w:r>
         <w:t xml:space="preserve">. World Health Organization.</w:t>
+      </w:r>
+    </w:p>
+    <w:p>
+      <w:pPr>
+        <w:pStyle w:val="BodyJ"/>
+      </w:pPr>
+      <w:r>
+        <w:t xml:space="preserve">Wong, A., Otles, E., Donnelly, J. P., et al. (2021). External validation of a widely implemented proprietary sepsis prediction model in hospitalized patients. </w:t>
+      </w:r>
+      <w:r>
+        <w:rPr>
+          <w:i/>
+          <w:iCs/>
+        </w:rPr>
+        <w:t xml:space="preserve">JAMA Internal Medicine, 181</w:t>
+      </w:r>
+      <w:r>
+        <w:t xml:space="preserve">(8), 1065–1070.</w:t>
       </w:r>
     </w:p>
     <w:p>
@@ -18041,6 +18657,18 @@
     </w:lvl>
   </w:abstractNum>
   <w:abstractNum w:abstractNumId="28" w15:restartNumberingAfterBreak="0">
+    <w:multiLevelType w:val="hybridMultilevel"/>
+    <w:lvl w:ilvl="0" w15:tentative="1">
+      <w:start w:val="1"/>
+      <w:numFmt w:val="decimal"/>
+      <w:lvlText w:val="%1."/>
+      <w:lvlJc w:val="left"/>
+      <w:pPr>
+        <w:ind w:left="560" w:hanging="280"/>
+      </w:pPr>
+    </w:lvl>
+  </w:abstractNum>
+  <w:abstractNum w:abstractNumId="29" w15:restartNumberingAfterBreak="0">
     <w:multiLevelType w:val="hybridMultilevel"/>
     <w:lvl w:ilvl="0" w15:tentative="1">
       <w:start w:val="1"/>
@@ -18216,6 +18844,12 @@
   </w:num>
   <w:num w:numId="28">
     <w:abstractNumId w:val="28"/>
+    <w:lvlOverride w:ilvl="0">
+      <w:startOverride w:val="1"/>
+    </w:lvlOverride>
+  </w:num>
+  <w:num w:numId="29">
+    <w:abstractNumId w:val="29"/>
     <w:lvlOverride w:ilvl="0">
       <w:startOverride w:val="1"/>
     </w:lvlOverride>

</xml_diff>

<commit_message>
Cap. 17: la formación del razonador — deskilling, captura cognitiva y paradoja de la automatización
Sección nueva 'El riesgo de fondo: la formación del razonador': tríada
deskilling/never-skilling/mis-skilling y supervisión del uso cognitivo de
la IA (Abdulnour, NEJM 2025); la nota clínica como parte del pensar
(McCoy, NEJM 2024); captura cognitiva; ensayo aleatorizado de sesgo de
automatización (Qazi, NEJM AI 2026) y paradoja de la automatización
(Abdulnour, NEJM 2026). Regla nueva 'Razonar antes de consultar', defensa
institucional de formación supervisada, glosario e índice ampliados,
4 referencias nuevas. TOC verificado (36 entradas).

Co-Authored-By: Claude Fable 5 <noreply@anthropic.com>
Claude-Session: https://claude.ai/code/session_01SPkhDdVzUCxJwqq61ddeLW
</commit_message>
<xml_diff>
--- a/libro/Hechos_inferencias_incertidumbre_edicion_revisada.docx
+++ b/libro/Hechos_inferencias_incertidumbre_edicion_revisada.docx
@@ -747,7 +747,7 @@
         <w:rPr>
           <w:color w:val="8A8A8A"/>
         </w:rPr>
-        <w:t xml:space="preserve">99</w:t>
+        <w:t xml:space="preserve">101</w:t>
       </w:r>
     </w:p>
     <w:p>
@@ -767,7 +767,7 @@
         <w:rPr>
           <w:color w:val="8A8A8A"/>
         </w:rPr>
-        <w:t xml:space="preserve">103</w:t>
+        <w:t xml:space="preserve">105</w:t>
       </w:r>
     </w:p>
     <w:p>
@@ -787,7 +787,7 @@
         <w:rPr>
           <w:color w:val="8A8A8A"/>
         </w:rPr>
-        <w:t xml:space="preserve">105</w:t>
+        <w:t xml:space="preserve">107</w:t>
       </w:r>
     </w:p>
     <w:p>
@@ -807,7 +807,7 @@
         <w:rPr>
           <w:color w:val="8A8A8A"/>
         </w:rPr>
-        <w:t xml:space="preserve">107</w:t>
+        <w:t xml:space="preserve">109</w:t>
       </w:r>
     </w:p>
     <w:p>
@@ -827,7 +827,7 @@
         <w:rPr>
           <w:color w:val="8A8A8A"/>
         </w:rPr>
-        <w:t xml:space="preserve">109</w:t>
+        <w:t xml:space="preserve">111</w:t>
       </w:r>
     </w:p>
     <w:p>
@@ -847,7 +847,7 @@
         <w:rPr>
           <w:color w:val="8A8A8A"/>
         </w:rPr>
-        <w:t xml:space="preserve">111</w:t>
+        <w:t xml:space="preserve">113</w:t>
       </w:r>
     </w:p>
     <w:p>
@@ -867,7 +867,7 @@
         <w:rPr>
           <w:color w:val="8A8A8A"/>
         </w:rPr>
-        <w:t xml:space="preserve">115</w:t>
+        <w:t xml:space="preserve">117</w:t>
       </w:r>
     </w:p>
     <w:p>
@@ -887,7 +887,7 @@
         <w:rPr>
           <w:color w:val="8A8A8A"/>
         </w:rPr>
-        <w:t xml:space="preserve">118</w:t>
+        <w:t xml:space="preserve">120</w:t>
       </w:r>
     </w:p>
     <w:p>
@@ -10913,7 +10913,7 @@
         <w:t xml:space="preserve">Sesgo de automatización.</w:t>
       </w:r>
       <w:r>
-        <w:t xml:space="preserve"> La tendencia a aceptar la salida de un sistema por venir de un sistema, documentada en los apoyos a la decisión clínica desde mucho antes de los modelos generativos: los sistemas corrigen errores humanos e introducen errores nuevos — el usuario que habría acertado solo y se equivoca por deferencia (Goddard et al., 2012). Es el anclaje del capítulo 7 más la autoridad no interrogada, con interfaz.</w:t>
+        <w:t xml:space="preserve"> La tendencia a aceptar la salida de un sistema por venir de un sistema, documentada en los apoyos a la decisión clínica desde mucho antes de los modelos generativos: los sistemas corrigen errores humanos e introducen errores nuevos — el usuario que habría acertado solo y se equivoca por deferencia (Goddard et al., 2012). La versión de la era de los modelos de lenguaje ya tiene ensayo aleatorizado: médicos que habían completado veinte horas de alfabetización en IA, expuestos a recomendaciones de un modelo con errores deliberados, perdieron catorce puntos de exactitud diagnóstica frente a quienes recibieron recomendaciones correctas (Qazi et al., 2026). La alfabetización general no inmuniza; la vigilancia caso a caso no se delega en un curso. Es el anclaje del capítulo 7 más la autoridad no interrogada, con interfaz.</w:t>
       </w:r>
     </w:p>
     <w:p>
@@ -11014,198 +11014,69 @@
           <w:sz w:val="25"/>
           <w:szCs w:val="25"/>
         </w:rPr>
-        <w:t xml:space="preserve">Cómo enfrentarlos: las defensas del clínico</w:t>
-      </w:r>
-    </w:p>
-    <w:p>
-      <w:pPr>
-        <w:pStyle w:val="BodyJ"/>
-      </w:pPr>
-      <w:r>
-        <w:t xml:space="preserve">La primera defensa ya está en este libro. El clínico responsable puede distinguir "lo vi", "lo infiero" y "no lo sé"; un modelo suele mezclar esas capas si nadie le exige separación, y puede transformar ausencia de información en un detalle probable, porque su objetivo generativo favorece la continuidad. La matriz HII-D funciona entonces como protocolo de auditoría de cualquier salida de IA:</w:t>
-      </w:r>
-    </w:p>
-    <w:p>
-      <w:pPr>
-        <w:pStyle w:val="BodyJ"/>
-        <w:numPr>
-          <w:ilvl w:val="0"/>
-          <w:numId w:val="6"/>
-        </w:numPr>
-      </w:pPr>
-      <w:r>
-        <w:t xml:space="preserve">¿qué hechos provienen realmente del caso?;</w:t>
-      </w:r>
-    </w:p>
-    <w:p>
-      <w:pPr>
-        <w:pStyle w:val="BodyJ"/>
-        <w:numPr>
-          <w:ilvl w:val="0"/>
-          <w:numId w:val="6"/>
-        </w:numPr>
-      </w:pPr>
-      <w:r>
-        <w:t xml:space="preserve">¿qué información agregó el modelo?;</w:t>
-      </w:r>
-    </w:p>
-    <w:p>
-      <w:pPr>
-        <w:pStyle w:val="BodyJ"/>
-        <w:numPr>
-          <w:ilvl w:val="0"/>
-          <w:numId w:val="6"/>
-        </w:numPr>
-      </w:pPr>
-      <w:r>
-        <w:t xml:space="preserve">¿qué inferencias formula y con qué respaldo?;</w:t>
-      </w:r>
-    </w:p>
-    <w:p>
-      <w:pPr>
-        <w:pStyle w:val="BodyJ"/>
-        <w:numPr>
-          <w:ilvl w:val="0"/>
-          <w:numId w:val="6"/>
-        </w:numPr>
-      </w:pPr>
-      <w:r>
-        <w:t xml:space="preserve">¿qué incertidumbres omitió?;</w:t>
-      </w:r>
-    </w:p>
-    <w:p>
-      <w:pPr>
-        <w:pStyle w:val="BodyJ"/>
-        <w:numPr>
-          <w:ilvl w:val="0"/>
-          <w:numId w:val="6"/>
-        </w:numPr>
-      </w:pPr>
-      <w:r>
-        <w:t xml:space="preserve">¿qué decisión propone y cuáles serían sus riesgos?;</w:t>
-      </w:r>
-    </w:p>
-    <w:p>
-      <w:pPr>
-        <w:pStyle w:val="BodyJ"/>
-        <w:numPr>
-          <w:ilvl w:val="0"/>
-          <w:numId w:val="6"/>
-        </w:numPr>
-      </w:pPr>
-      <w:r>
-        <w:t xml:space="preserve">¿qué fuente primaria permite verificar la afirmación?</w:t>
-      </w:r>
-    </w:p>
-    <w:p>
-      <w:pPr>
-        <w:pStyle w:val="BodyJ"/>
-      </w:pPr>
-      <w:r>
-        <w:t xml:space="preserve">De esa auditoría se desprenden reglas de uso que caben en una tarjeta:</w:t>
-      </w:r>
-    </w:p>
-    <w:p>
-      <w:pPr>
-        <w:pStyle w:val="BodyJ"/>
-        <w:numPr>
-          <w:ilvl w:val="0"/>
-          <w:numId w:val="25"/>
-        </w:numPr>
-      </w:pPr>
-      <w:r>
-        <w:rPr>
-          <w:b/>
-          <w:bCs/>
-        </w:rPr>
-        <w:t xml:space="preserve">Verificar la afirmación decisiva contra una fuente primaria antes de actuar.</w:t>
-      </w:r>
-      <w:r>
-        <w:t xml:space="preserve"> No todas: la decisiva — la que, de ser falsa, cambia la conducta.</w:t>
-      </w:r>
-    </w:p>
-    <w:p>
-      <w:pPr>
-        <w:pStyle w:val="BodyJ"/>
-        <w:numPr>
-          <w:ilvl w:val="0"/>
-          <w:numId w:val="25"/>
-        </w:numPr>
-      </w:pPr>
-      <w:r>
-        <w:rPr>
-          <w:b/>
-          <w:bCs/>
-        </w:rPr>
-        <w:t xml:space="preserve">Usar la herramienta para abrir, no para cerrar.</w:t>
-      </w:r>
-      <w:r>
-        <w:t xml:space="preserve"> Pedir alternativas, contraejemplos y "qué no encaja con este diagnóstico" aprovecha exactamente lo que el ensayo de Goh mostró que desaprovechamos; pedirle confirmación de la hipótesis propia industrializa el anclaje.</w:t>
-      </w:r>
-    </w:p>
-    <w:p>
-      <w:pPr>
-        <w:pStyle w:val="BodyJ"/>
-        <w:numPr>
-          <w:ilvl w:val="0"/>
-          <w:numId w:val="25"/>
-        </w:numPr>
-      </w:pPr>
-      <w:r>
-        <w:rPr>
-          <w:b/>
-          <w:bCs/>
-        </w:rPr>
-        <w:t xml:space="preserve">Tratar su confianza como tono, no como evidencia.</w:t>
-      </w:r>
-      <w:r>
-        <w:t xml:space="preserve"> La seguridad de la prosa no informa la probabilidad de corrección — igual que la seguridad de un colega no sustituye sus razones.</w:t>
-      </w:r>
-    </w:p>
-    <w:p>
-      <w:pPr>
-        <w:pStyle w:val="BodyJ"/>
-        <w:numPr>
-          <w:ilvl w:val="0"/>
-          <w:numId w:val="25"/>
-        </w:numPr>
-      </w:pPr>
-      <w:r>
-        <w:rPr>
-          <w:b/>
-          <w:bCs/>
-        </w:rPr>
-        <w:t xml:space="preserve">Nunca pegar y firmar.</w:t>
-      </w:r>
-      <w:r>
-        <w:t xml:space="preserve"> Lo que entra a la ficha bajo la firma propia es afirmación propia; el capítulo 12 mostró que la ficha produce lo visible, y una confabulación copiada se convierte en hecho heredado para el siguiente lector.</w:t>
-      </w:r>
-    </w:p>
-    <w:p>
-      <w:pPr>
-        <w:pStyle w:val="BodyJ"/>
-        <w:numPr>
-          <w:ilvl w:val="0"/>
-          <w:numId w:val="25"/>
-        </w:numPr>
-      </w:pPr>
-      <w:r>
-        <w:rPr>
-          <w:b/>
-          <w:bCs/>
-        </w:rPr>
-        <w:t xml:space="preserve">Conservar práctica sin asistencia.</w:t>
-      </w:r>
-      <w:r>
-        <w:t xml:space="preserve"> La lección de los endoscopistas: alternar deliberadamente el trabajo con y sin la herramienta, como se conserva cualquier destreza que puede necesitarse a las tres de la mañana, con el sistema caído.</w:t>
-      </w:r>
-    </w:p>
-    <w:p>
-      <w:pPr>
-        <w:pStyle w:val="BodyJ"/>
-      </w:pPr>
-      <w:r>
-        <w:t xml:space="preserve">El modelo puede servir como generador de alternativas, revisor de coherencia, organizador de información o segundo lector. Su valor aumenta cuando el usuario mantiene la responsabilidad de verificación y disminuye cuando se usa como autoridad final.</w:t>
+        <w:t xml:space="preserve">El riesgo de fondo: la formación del razonador</w:t>
+      </w:r>
+    </w:p>
+    <w:p>
+      <w:pPr>
+        <w:pStyle w:val="BodyJ"/>
+      </w:pPr>
+      <w:r>
+        <w:t xml:space="preserve">Hay un riesgo más lento que todos los del catálogo, y puede importar más: el efecto de la IA sobre quien todavía está aprendiendo a razonar. La educación médica ya le puso nombres a la tríada (Abdulnour et al., 2025): </w:t>
+      </w:r>
+      <w:r>
+        <w:rPr>
+          <w:i/>
+          <w:iCs/>
+        </w:rPr>
+        <w:t xml:space="preserve">deskilling</w:t>
+      </w:r>
+      <w:r>
+        <w:t xml:space="preserve"> — sé razonar, delego repetidamente, dejo de ejercitar, la capacidad se deteriora—; </w:t>
+      </w:r>
+      <w:r>
+        <w:rPr>
+          <w:i/>
+          <w:iCs/>
+        </w:rPr>
+        <w:t xml:space="preserve">never-skilling</w:t>
+      </w:r>
+      <w:r>
+        <w:t xml:space="preserve"> — la IA estuvo disponible desde el inicio de la formación, la operación cognitiva nunca se ejecutó las veces necesarias, la competencia nunca se consolidó—; y </w:t>
+      </w:r>
+      <w:r>
+        <w:rPr>
+          <w:i/>
+          <w:iCs/>
+        </w:rPr>
+        <w:t xml:space="preserve">mis-skilling</w:t>
+      </w:r>
+      <w:r>
+        <w:t xml:space="preserve"> — se aprendió, pero patrones incorrectos, imitando salidas que nadie auditaba—. El segundo es el más grave porque es invisible: la habilidad perdida deja un recuerdo y una alarma; la que nunca se construyó no deja nada que echar de menos.</w:t>
+      </w:r>
+    </w:p>
+    <w:p>
+      <w:pPr>
+        <w:pStyle w:val="BodyJ"/>
+      </w:pPr>
+      <w:r>
+        <w:t xml:space="preserve">El mecanismo es preciso, y una parte de este libro ya lo había descrito sin nombrar la IA. Escribir la nota clínica no es registrar un pensamiento terminado: seleccionar qué dato importa, jerarquizarlo y estructurarlo es parte del proceso mismo de pensar — la tesis del capítulo 12, la ficha como instrumento de pensamiento. Por eso la automatización completa de la escritura clínica no ahorra sólo tiempo: puede eliminar la instancia en la que el clínico construye su razonamiento, degradando el registro y al registrador a la vez (McCoy et al., 2024). La ecuación merece escribirse entera: ahorro de trabajo cognitivo inmediato, a cambio de las operaciones mediante las cuales se construye la competencia.</w:t>
+      </w:r>
+    </w:p>
+    <w:p>
+      <w:pPr>
+        <w:pStyle w:val="BodyJ"/>
+      </w:pPr>
+      <w:r>
+        <w:t xml:space="preserve">Hay un tercer fenómeno que ni siquiera exige que la IA se equivoque: la captura cognitiva. Quien ve primero la respuesta del modelo ya no genera hipótesis desde el caso: su búsqueda de alternativas, su lectura de los datos y su ponderación posterior quedan condicionadas por lo que ya leyó — el anclaje del capítulo 7, con la diferencia de que aquí el ancla puede llegar antes que el paciente. Una IA excelente que entrega demasiado pronto la hipótesis, la síntesis o la inferencia que el aprendiz debía producir no daña la respuesta de hoy; daña la arquitectura del aprendizaje. Porque el valor cognitivo de un caso no está sólo en llegar a la conclusión correcta: está en ejecutar las operaciones que permiten llegar a ella, revisarla y, cuando corresponde, abandonarla. Una herramienta que aumenta el porcentaje de respuestas correctas puede, paradójicamente, mejorar el desempeño de hoy mientras empeora al razonador de mañana.</w:t>
+      </w:r>
+    </w:p>
+    <w:p>
+      <w:pPr>
+        <w:pStyle w:val="BodyJ"/>
+      </w:pPr>
+      <w:r>
+        <w:t xml:space="preserve">La aviación conoce esta trampa con nombre propio: la paradoja de la automatización — cuanto más competente es el sistema, menos ejercita el humano las habilidades necesarias para detectar cuándo falla, que es exactamente cuando más se lo necesita (Abdulnour et al., 2026). La respuesta pedagógica propuesta frente a ella coincide, casi palabra por palabra, con la disciplina de este libro: razonar primero de forma independiente, consultar después, y usar la IA para desafiar, ampliar o refinar ese razonamiento — nunca para reemplazar su ejecución.</w:t>
       </w:r>
     </w:p>
     <w:p>
@@ -11222,6 +11093,233 @@
           <w:sz w:val="25"/>
           <w:szCs w:val="25"/>
         </w:rPr>
+        <w:t xml:space="preserve">Cómo enfrentarlos: las defensas del clínico</w:t>
+      </w:r>
+    </w:p>
+    <w:p>
+      <w:pPr>
+        <w:pStyle w:val="BodyJ"/>
+      </w:pPr>
+      <w:r>
+        <w:t xml:space="preserve">La primera defensa ya está en este libro. El clínico responsable puede distinguir "lo vi", "lo infiero" y "no lo sé"; un modelo suele mezclar esas capas si nadie le exige separación, y puede transformar ausencia de información en un detalle probable, porque su objetivo generativo favorece la continuidad. La matriz HII-D funciona entonces como protocolo de auditoría de cualquier salida de IA:</w:t>
+      </w:r>
+    </w:p>
+    <w:p>
+      <w:pPr>
+        <w:pStyle w:val="BodyJ"/>
+        <w:numPr>
+          <w:ilvl w:val="0"/>
+          <w:numId w:val="6"/>
+        </w:numPr>
+      </w:pPr>
+      <w:r>
+        <w:t xml:space="preserve">¿qué hechos provienen realmente del caso?;</w:t>
+      </w:r>
+    </w:p>
+    <w:p>
+      <w:pPr>
+        <w:pStyle w:val="BodyJ"/>
+        <w:numPr>
+          <w:ilvl w:val="0"/>
+          <w:numId w:val="6"/>
+        </w:numPr>
+      </w:pPr>
+      <w:r>
+        <w:t xml:space="preserve">¿qué información agregó el modelo?;</w:t>
+      </w:r>
+    </w:p>
+    <w:p>
+      <w:pPr>
+        <w:pStyle w:val="BodyJ"/>
+        <w:numPr>
+          <w:ilvl w:val="0"/>
+          <w:numId w:val="6"/>
+        </w:numPr>
+      </w:pPr>
+      <w:r>
+        <w:t xml:space="preserve">¿qué inferencias formula y con qué respaldo?;</w:t>
+      </w:r>
+    </w:p>
+    <w:p>
+      <w:pPr>
+        <w:pStyle w:val="BodyJ"/>
+        <w:numPr>
+          <w:ilvl w:val="0"/>
+          <w:numId w:val="6"/>
+        </w:numPr>
+      </w:pPr>
+      <w:r>
+        <w:t xml:space="preserve">¿qué incertidumbres omitió?;</w:t>
+      </w:r>
+    </w:p>
+    <w:p>
+      <w:pPr>
+        <w:pStyle w:val="BodyJ"/>
+        <w:numPr>
+          <w:ilvl w:val="0"/>
+          <w:numId w:val="6"/>
+        </w:numPr>
+      </w:pPr>
+      <w:r>
+        <w:t xml:space="preserve">¿qué decisión propone y cuáles serían sus riesgos?;</w:t>
+      </w:r>
+    </w:p>
+    <w:p>
+      <w:pPr>
+        <w:pStyle w:val="BodyJ"/>
+        <w:numPr>
+          <w:ilvl w:val="0"/>
+          <w:numId w:val="6"/>
+        </w:numPr>
+      </w:pPr>
+      <w:r>
+        <w:t xml:space="preserve">¿qué fuente primaria permite verificar la afirmación?</w:t>
+      </w:r>
+    </w:p>
+    <w:p>
+      <w:pPr>
+        <w:pStyle w:val="BodyJ"/>
+      </w:pPr>
+      <w:r>
+        <w:t xml:space="preserve">De esa auditoría se desprenden reglas de uso que caben en una tarjeta:</w:t>
+      </w:r>
+    </w:p>
+    <w:p>
+      <w:pPr>
+        <w:pStyle w:val="BodyJ"/>
+        <w:numPr>
+          <w:ilvl w:val="0"/>
+          <w:numId w:val="25"/>
+        </w:numPr>
+      </w:pPr>
+      <w:r>
+        <w:rPr>
+          <w:b/>
+          <w:bCs/>
+        </w:rPr>
+        <w:t xml:space="preserve">Razonar antes de consultar.</w:t>
+      </w:r>
+      <w:r>
+        <w:t xml:space="preserve"> Formular la propia hipótesis y el propio plan antes de abrir el asistente: la respuesta vista primero captura la búsqueda posterior. La IA se usa contra un borrador propio, no en su lugar.</w:t>
+      </w:r>
+    </w:p>
+    <w:p>
+      <w:pPr>
+        <w:pStyle w:val="BodyJ"/>
+        <w:numPr>
+          <w:ilvl w:val="0"/>
+          <w:numId w:val="25"/>
+        </w:numPr>
+      </w:pPr>
+      <w:r>
+        <w:rPr>
+          <w:b/>
+          <w:bCs/>
+        </w:rPr>
+        <w:t xml:space="preserve">Verificar la afirmación decisiva contra una fuente primaria antes de actuar.</w:t>
+      </w:r>
+      <w:r>
+        <w:t xml:space="preserve"> No todas: la decisiva — la que, de ser falsa, cambia la conducta.</w:t>
+      </w:r>
+    </w:p>
+    <w:p>
+      <w:pPr>
+        <w:pStyle w:val="BodyJ"/>
+        <w:numPr>
+          <w:ilvl w:val="0"/>
+          <w:numId w:val="25"/>
+        </w:numPr>
+      </w:pPr>
+      <w:r>
+        <w:rPr>
+          <w:b/>
+          <w:bCs/>
+        </w:rPr>
+        <w:t xml:space="preserve">Usar la herramienta para abrir, no para cerrar.</w:t>
+      </w:r>
+      <w:r>
+        <w:t xml:space="preserve"> Pedir alternativas, contraejemplos y "qué no encaja con este diagnóstico" aprovecha exactamente lo que el ensayo de Goh mostró que desaprovechamos; pedirle confirmación de la hipótesis propia industrializa el anclaje.</w:t>
+      </w:r>
+    </w:p>
+    <w:p>
+      <w:pPr>
+        <w:pStyle w:val="BodyJ"/>
+        <w:numPr>
+          <w:ilvl w:val="0"/>
+          <w:numId w:val="25"/>
+        </w:numPr>
+      </w:pPr>
+      <w:r>
+        <w:rPr>
+          <w:b/>
+          <w:bCs/>
+        </w:rPr>
+        <w:t xml:space="preserve">Tratar su confianza como tono, no como evidencia.</w:t>
+      </w:r>
+      <w:r>
+        <w:t xml:space="preserve"> La seguridad de la prosa no informa la probabilidad de corrección — igual que la seguridad de un colega no sustituye sus razones.</w:t>
+      </w:r>
+    </w:p>
+    <w:p>
+      <w:pPr>
+        <w:pStyle w:val="BodyJ"/>
+        <w:numPr>
+          <w:ilvl w:val="0"/>
+          <w:numId w:val="25"/>
+        </w:numPr>
+      </w:pPr>
+      <w:r>
+        <w:rPr>
+          <w:b/>
+          <w:bCs/>
+        </w:rPr>
+        <w:t xml:space="preserve">Nunca pegar y firmar.</w:t>
+      </w:r>
+      <w:r>
+        <w:t xml:space="preserve"> Lo que entra a la ficha bajo la firma propia es afirmación propia; el capítulo 12 mostró que la ficha produce lo visible, y una confabulación copiada se convierte en hecho heredado para el siguiente lector — y la síntesis delegada es, además, pensamiento que no ocurrió (McCoy et al., 2024).</w:t>
+      </w:r>
+    </w:p>
+    <w:p>
+      <w:pPr>
+        <w:pStyle w:val="BodyJ"/>
+        <w:numPr>
+          <w:ilvl w:val="0"/>
+          <w:numId w:val="25"/>
+        </w:numPr>
+      </w:pPr>
+      <w:r>
+        <w:rPr>
+          <w:b/>
+          <w:bCs/>
+        </w:rPr>
+        <w:t xml:space="preserve">Conservar práctica sin asistencia.</w:t>
+      </w:r>
+      <w:r>
+        <w:t xml:space="preserve"> La lección de los endoscopistas: alternar deliberadamente el trabajo con y sin la herramienta, como se conserva cualquier destreza que puede necesitarse a las tres de la mañana, con el sistema caído.</w:t>
+      </w:r>
+    </w:p>
+    <w:p>
+      <w:pPr>
+        <w:pStyle w:val="BodyJ"/>
+      </w:pPr>
+      <w:r>
+        <w:t xml:space="preserve">El modelo puede servir como generador de alternativas, revisor de coherencia, organizador de información o segundo lector. Su valor aumenta cuando el usuario mantiene la responsabilidad de verificación y disminuye cuando se usa como autoridad final.</w:t>
+      </w:r>
+    </w:p>
+    <w:p>
+      <w:pPr>
+        <w:pStyle w:val="Heading3"/>
+        <w:spacing w:after="120" w:before="280"/>
+      </w:pPr>
+      <w:r>
+        <w:rPr>
+          <w:rFonts w:ascii="Georgia" w:cs="Georgia" w:eastAsia="Georgia" w:hAnsi="Georgia"/>
+          <w:b/>
+          <w:bCs/>
+          <w:color w:val="2B2B2B"/>
+          <w:sz w:val="25"/>
+          <w:szCs w:val="25"/>
+        </w:rPr>
         <w:t xml:space="preserve">Cómo enfrentarlos: las defensas de la institución</w:t>
       </w:r>
     </w:p>
@@ -11307,6 +11405,25 @@
       </w:r>
       <w:r>
         <w:t xml:space="preserve"> Cada alarma nueva compite por la misma atención finita; una alerta de bajo valor predictivo no es inocua — es ruido que entrena a ignorar, y el equipo que aprendió a ignorar no distingue qué está ignorando.</w:t>
+      </w:r>
+    </w:p>
+    <w:p>
+      <w:pPr>
+        <w:pStyle w:val="BodyJ"/>
+        <w:numPr>
+          <w:ilvl w:val="0"/>
+          <w:numId w:val="6"/>
+        </w:numPr>
+      </w:pPr>
+      <w:r>
+        <w:rPr>
+          <w:b/>
+          <w:bCs/>
+        </w:rPr>
+        <w:t xml:space="preserve">Formación que supervise el uso, no sólo la respuesta.</w:t>
+      </w:r>
+      <w:r>
+        <w:t xml:space="preserve"> En docencia, observar cómo el aprendiz usa cognitivamente la herramienta — cuándo consulta, qué acepta, qué verifica, qué habría respondido antes de mirar — y proteger espacios deliberados de práctica sin asistencia (Abdulnour et al., 2025): la competencia que nunca se construyó no se puede "recuperar".</w:t>
       </w:r>
     </w:p>
     <w:p>
@@ -14480,6 +14597,21 @@
           <w:b/>
           <w:bCs/>
         </w:rPr>
+        <w:t xml:space="preserve">Deskilling / never-skilling / mis-skilling.</w:t>
+      </w:r>
+      <w:r>
+        <w:t xml:space="preserve"> Tríada de riesgos formativos de la IA clínica: perder por desuso una competencia ya adquirida; no consolidarla nunca porque la herramienta ejecutó la tarea desde el inicio de la formación; o adquirirla mal, imitando salidas no auditadas (Abdulnour et al.). El segundo es el más difícil de detectar: no deja recuerdo de lo perdido.</w:t>
+      </w:r>
+    </w:p>
+    <w:p>
+      <w:pPr>
+        <w:pStyle w:val="BodyJ"/>
+      </w:pPr>
+      <w:r>
+        <w:rPr>
+          <w:b/>
+          <w:bCs/>
+        </w:rPr>
         <w:t xml:space="preserve">Doble proceso.</w:t>
       </w:r>
       <w:r>
@@ -14724,6 +14856,21 @@
       </w:r>
       <w:r>
         <w:t xml:space="preserve"> Recursos del lenguaje que expresan el grado de certeza de una afirmación ("demostrado", "probable", "sin evidencia de").</w:t>
+      </w:r>
+    </w:p>
+    <w:p>
+      <w:pPr>
+        <w:pStyle w:val="BodyJ"/>
+      </w:pPr>
+      <w:r>
+        <w:rPr>
+          <w:b/>
+          <w:bCs/>
+        </w:rPr>
+        <w:t xml:space="preserve">Paradoja de la automatización.</w:t>
+      </w:r>
+      <w:r>
+        <w:t xml:space="preserve"> Cuanto más competente es un sistema automatizado, menos ejercita el humano las habilidades necesarias para detectar sus fallas — que es exactamente cuando más se las necesita (Abdulnour et al.).</w:t>
       </w:r>
     </w:p>
     <w:p>
@@ -15025,6 +15172,18 @@
         </w:numPr>
       </w:pPr>
       <w:r>
+        <w:t xml:space="preserve">Captura cognitiva por IA (la respuesta antes que el caso) — 17</w:t>
+      </w:r>
+    </w:p>
+    <w:p>
+      <w:pPr>
+        <w:pStyle w:val="BodyJ"/>
+        <w:numPr>
+          <w:ilvl w:val="0"/>
+          <w:numId w:val="6"/>
+        </w:numPr>
+      </w:pPr>
+      <w:r>
         <w:t xml:space="preserve">Carga teórica de la observación — 1</w:t>
       </w:r>
     </w:p>
@@ -15325,6 +15484,18 @@
         </w:numPr>
       </w:pPr>
       <w:r>
+        <w:t xml:space="preserve">Formación clínica en la era de la IA (deskilling, never-skilling, mis-skilling) — 17</w:t>
+      </w:r>
+    </w:p>
+    <w:p>
+      <w:pPr>
+        <w:pStyle w:val="BodyJ"/>
+        <w:numPr>
+          <w:ilvl w:val="0"/>
+          <w:numId w:val="6"/>
+        </w:numPr>
+      </w:pPr>
+      <w:r>
         <w:t xml:space="preserve">Fragilidad y funcionalidad como hechos clínicos — 10, 15, Ap A</w:t>
       </w:r>
     </w:p>
@@ -15553,7 +15724,31 @@
         </w:numPr>
       </w:pPr>
       <w:r>
+        <w:t xml:space="preserve">Nota clínica generada por IA (degradación del registro) — 17</w:t>
+      </w:r>
+    </w:p>
+    <w:p>
+      <w:pPr>
+        <w:pStyle w:val="BodyJ"/>
+        <w:numPr>
+          <w:ilvl w:val="0"/>
+          <w:numId w:val="6"/>
+        </w:numPr>
+      </w:pPr>
+      <w:r>
         <w:t xml:space="preserve">Observación activa — 10, 11</w:t>
+      </w:r>
+    </w:p>
+    <w:p>
+      <w:pPr>
+        <w:pStyle w:val="BodyJ"/>
+        <w:numPr>
+          <w:ilvl w:val="0"/>
+          <w:numId w:val="6"/>
+        </w:numPr>
+      </w:pPr>
+      <w:r>
+        <w:t xml:space="preserve">Paradoja de la automatización — 17</w:t>
       </w:r>
     </w:p>
     <w:p>
@@ -15843,6 +16038,42 @@
         <w:pStyle w:val="BodyJ"/>
       </w:pPr>
       <w:r>
+        <w:t xml:space="preserve">Abdulnour, R.-E. E., Gin, B., &amp; Boscardin, C. K. (2025). Educational strategies for clinical supervision of artificial intelligence use. </w:t>
+      </w:r>
+      <w:r>
+        <w:rPr>
+          <w:i/>
+          <w:iCs/>
+        </w:rPr>
+        <w:t xml:space="preserve">New England Journal of Medicine, 393</w:t>
+      </w:r>
+      <w:r>
+        <w:t xml:space="preserve">(8), 786–797.</w:t>
+      </w:r>
+    </w:p>
+    <w:p>
+      <w:pPr>
+        <w:pStyle w:val="BodyJ"/>
+      </w:pPr>
+      <w:r>
+        <w:t xml:space="preserve">Abdulnour, R.-E. E., et al. (2026). Crew resource management — Navigating AI's automation paradox. </w:t>
+      </w:r>
+      <w:r>
+        <w:rPr>
+          <w:i/>
+          <w:iCs/>
+        </w:rPr>
+        <w:t xml:space="preserve">New England Journal of Medicine</w:t>
+      </w:r>
+      <w:r>
+        <w:t xml:space="preserve">. Publicado en línea el 22 de julio de 2026.</w:t>
+      </w:r>
+    </w:p>
+    <w:p>
+      <w:pPr>
+        <w:pStyle w:val="BodyJ"/>
+      </w:pPr>
+      <w:r>
         <w:t xml:space="preserve">Alves de Lima, A. (2008). Devolución constructiva: Una estrategia para mejorar el aprendizaje. </w:t>
       </w:r>
       <w:r>
@@ -17247,6 +17478,24 @@
         <w:pStyle w:val="BodyJ"/>
       </w:pPr>
       <w:r>
+        <w:t xml:space="preserve">McCoy, L. G., Manrai, A. K., &amp; Rodman, A. (2024). Large language models and the degradation of the medical record. </w:t>
+      </w:r>
+      <w:r>
+        <w:rPr>
+          <w:i/>
+          <w:iCs/>
+        </w:rPr>
+        <w:t xml:space="preserve">New England Journal of Medicine, 391</w:t>
+      </w:r>
+      <w:r>
+        <w:t xml:space="preserve">(17), 1561–1564.</w:t>
+      </w:r>
+    </w:p>
+    <w:p>
+      <w:pPr>
+        <w:pStyle w:val="BodyJ"/>
+      </w:pPr>
+      <w:r>
         <w:t xml:space="preserve">Meyer, A. N. D., Payne, V. L., Meeks, D. W., Rao, R., &amp; Singh, H. (2013). Physicians' diagnostic accuracy, confidence, and resource requests: A vignette study. </w:t>
       </w:r>
       <w:r>
@@ -17600,6 +17849,24 @@
       </w:r>
       <w:r>
         <w:t xml:space="preserve">. Hutchinson.</w:t>
+      </w:r>
+    </w:p>
+    <w:p>
+      <w:pPr>
+        <w:pStyle w:val="BodyJ"/>
+      </w:pPr>
+      <w:r>
+        <w:t xml:space="preserve">Qazi, I. A., Ali, A., Khawaja, A. U., Akhtar, M. J., Sheikh, A. Z., &amp; Alizai, M. H. (2026). Automation bias in large language model–assisted diagnostic reasoning among physicians trained in AI literacy: A randomized clinical trial. </w:t>
+      </w:r>
+      <w:r>
+        <w:rPr>
+          <w:i/>
+          <w:iCs/>
+        </w:rPr>
+        <w:t xml:space="preserve">NEJM AI, 3</w:t>
+      </w:r>
+      <w:r>
+        <w:t xml:space="preserve">(5), AIoa2501001.</w:t>
       </w:r>
     </w:p>
     <w:p>

</xml_diff>

<commit_message>
Parte II afinada y arco conceptual explícito (caps. 5, 6 y 14)
Cap. 5: el monitoreo detecta / el control decide, con estrategia según la
fuente de la duda; la metacognición clínica como práctica parcialmente
social (señales del equipo y del paciente como datos del razonamiento).
Cap. 6: tensión Polanyi-Schön (lo tácito debe poder volverse explícito
para ser corregible); condiciones de validez del entorno para confiar en
la intuición (Kahneman & Klein 2009, verificada).
Cap. 14: la humildad como phronesis vuelta sobre sí misma; una ficha que
borra el testimonio del paciente es epistemológicamente más pobre.
Hilo explícito: abducción (2) -> metacognición que la vigila (5) ->
humildad que la mantiene abierta (14).
Glosario, índice y auditoría (26 ítems) actualizados; TOC 37/37.

Co-Authored-By: Claude Fable 5 <noreply@anthropic.com>
Claude-Session: https://claude.ai/code/session_01SPkhDdVzUCxJwqq61ddeLW
</commit_message>
<xml_diff>
--- a/libro/Hechos_inferencias_incertidumbre_edicion_revisada.docx
+++ b/libro/Hechos_inferencias_incertidumbre_edicion_revisada.docx
@@ -407,7 +407,7 @@
         <w:rPr>
           <w:color w:val="8A8A8A"/>
         </w:rPr>
-        <w:t xml:space="preserve">35</w:t>
+        <w:t xml:space="preserve">36</w:t>
       </w:r>
     </w:p>
     <w:p>
@@ -427,7 +427,7 @@
         <w:rPr>
           <w:color w:val="8A8A8A"/>
         </w:rPr>
-        <w:t xml:space="preserve">38</w:t>
+        <w:t xml:space="preserve">39</w:t>
       </w:r>
     </w:p>
     <w:p>
@@ -447,7 +447,7 @@
         <w:rPr>
           <w:color w:val="8A8A8A"/>
         </w:rPr>
-        <w:t xml:space="preserve">41</w:t>
+        <w:t xml:space="preserve">42</w:t>
       </w:r>
     </w:p>
     <w:p>
@@ -467,7 +467,7 @@
         <w:rPr>
           <w:color w:val="8A8A8A"/>
         </w:rPr>
-        <w:t xml:space="preserve">44</w:t>
+        <w:t xml:space="preserve">45</w:t>
       </w:r>
     </w:p>
     <w:p>
@@ -487,7 +487,7 @@
         <w:rPr>
           <w:color w:val="8A8A8A"/>
         </w:rPr>
-        <w:t xml:space="preserve">45</w:t>
+        <w:t xml:space="preserve">46</w:t>
       </w:r>
     </w:p>
     <w:p>
@@ -507,7 +507,7 @@
         <w:rPr>
           <w:color w:val="8A8A8A"/>
         </w:rPr>
-        <w:t xml:space="preserve">46</w:t>
+        <w:t xml:space="preserve">47</w:t>
       </w:r>
     </w:p>
     <w:p>
@@ -527,7 +527,7 @@
         <w:rPr>
           <w:color w:val="8A8A8A"/>
         </w:rPr>
-        <w:t xml:space="preserve">49</w:t>
+        <w:t xml:space="preserve">50</w:t>
       </w:r>
     </w:p>
     <w:p>
@@ -547,7 +547,7 @@
         <w:rPr>
           <w:color w:val="8A8A8A"/>
         </w:rPr>
-        <w:t xml:space="preserve">57</w:t>
+        <w:t xml:space="preserve">58</w:t>
       </w:r>
     </w:p>
     <w:p>
@@ -567,7 +567,7 @@
         <w:rPr>
           <w:color w:val="8A8A8A"/>
         </w:rPr>
-        <w:t xml:space="preserve">60</w:t>
+        <w:t xml:space="preserve">61</w:t>
       </w:r>
     </w:p>
     <w:p>
@@ -587,7 +587,7 @@
         <w:rPr>
           <w:color w:val="8A8A8A"/>
         </w:rPr>
-        <w:t xml:space="preserve">64</w:t>
+        <w:t xml:space="preserve">65</w:t>
       </w:r>
     </w:p>
     <w:p>
@@ -607,7 +607,7 @@
         <w:rPr>
           <w:color w:val="8A8A8A"/>
         </w:rPr>
-        <w:t xml:space="preserve">69</w:t>
+        <w:t xml:space="preserve">70</w:t>
       </w:r>
     </w:p>
     <w:p>
@@ -627,7 +627,7 @@
         <w:rPr>
           <w:color w:val="8A8A8A"/>
         </w:rPr>
-        <w:t xml:space="preserve">70</w:t>
+        <w:t xml:space="preserve">71</w:t>
       </w:r>
     </w:p>
     <w:p>
@@ -647,7 +647,7 @@
         <w:rPr>
           <w:color w:val="8A8A8A"/>
         </w:rPr>
-        <w:t xml:space="preserve">71</w:t>
+        <w:t xml:space="preserve">72</w:t>
       </w:r>
     </w:p>
     <w:p>
@@ -667,7 +667,7 @@
         <w:rPr>
           <w:color w:val="8A8A8A"/>
         </w:rPr>
-        <w:t xml:space="preserve">76</w:t>
+        <w:t xml:space="preserve">78</w:t>
       </w:r>
     </w:p>
     <w:p>
@@ -687,7 +687,7 @@
         <w:rPr>
           <w:color w:val="8A8A8A"/>
         </w:rPr>
-        <w:t xml:space="preserve">83</w:t>
+        <w:t xml:space="preserve">85</w:t>
       </w:r>
     </w:p>
     <w:p>
@@ -707,7 +707,7 @@
         <w:rPr>
           <w:color w:val="8A8A8A"/>
         </w:rPr>
-        <w:t xml:space="preserve">91</w:t>
+        <w:t xml:space="preserve">93</w:t>
       </w:r>
     </w:p>
     <w:p>
@@ -727,7 +727,7 @@
         <w:rPr>
           <w:color w:val="8A8A8A"/>
         </w:rPr>
-        <w:t xml:space="preserve">95</w:t>
+        <w:t xml:space="preserve">97</w:t>
       </w:r>
     </w:p>
     <w:p>
@@ -747,7 +747,7 @@
         <w:rPr>
           <w:color w:val="8A8A8A"/>
         </w:rPr>
-        <w:t xml:space="preserve">103</w:t>
+        <w:t xml:space="preserve">105</w:t>
       </w:r>
     </w:p>
     <w:p>
@@ -767,7 +767,7 @@
         <w:rPr>
           <w:color w:val="8A8A8A"/>
         </w:rPr>
-        <w:t xml:space="preserve">107</w:t>
+        <w:t xml:space="preserve">109</w:t>
       </w:r>
     </w:p>
     <w:p>
@@ -787,7 +787,7 @@
         <w:rPr>
           <w:color w:val="8A8A8A"/>
         </w:rPr>
-        <w:t xml:space="preserve">109</w:t>
+        <w:t xml:space="preserve">111</w:t>
       </w:r>
     </w:p>
     <w:p>
@@ -807,7 +807,7 @@
         <w:rPr>
           <w:color w:val="8A8A8A"/>
         </w:rPr>
-        <w:t xml:space="preserve">111</w:t>
+        <w:t xml:space="preserve">113</w:t>
       </w:r>
     </w:p>
     <w:p>
@@ -827,7 +827,7 @@
         <w:rPr>
           <w:color w:val="8A8A8A"/>
         </w:rPr>
-        <w:t xml:space="preserve">113</w:t>
+        <w:t xml:space="preserve">115</w:t>
       </w:r>
     </w:p>
     <w:p>
@@ -847,7 +847,7 @@
         <w:rPr>
           <w:color w:val="8A8A8A"/>
         </w:rPr>
-        <w:t xml:space="preserve">115</w:t>
+        <w:t xml:space="preserve">117</w:t>
       </w:r>
     </w:p>
     <w:p>
@@ -867,7 +867,7 @@
         <w:rPr>
           <w:color w:val="8A8A8A"/>
         </w:rPr>
-        <w:t xml:space="preserve">119</w:t>
+        <w:t xml:space="preserve">121</w:t>
       </w:r>
     </w:p>
     <w:p>
@@ -887,7 +887,7 @@
         <w:rPr>
           <w:color w:val="8A8A8A"/>
         </w:rPr>
-        <w:t xml:space="preserve">122</w:t>
+        <w:t xml:space="preserve">124</w:t>
       </w:r>
     </w:p>
     <w:p>
@@ -907,7 +907,7 @@
         <w:rPr>
           <w:color w:val="8A8A8A"/>
         </w:rPr>
-        <w:t xml:space="preserve">123</w:t>
+        <w:t xml:space="preserve">125</w:t>
       </w:r>
     </w:p>
     <w:p>
@@ -5187,7 +5187,7 @@
         <w:pStyle w:val="BodyJ"/>
       </w:pPr>
       <w:r>
-        <w:t xml:space="preserve">Estas señales no son pruebas de error. Son indicaciones para revisar. El clínico puede formular disparadores explícitos: discordancia entre gravedad y diagnóstico; reconsulta; evolución inesperada; falta de respuesta; diagnóstico que explica sólo una parte; presión de tiempo; transferencia entre equipos; caso que genera una confianza desproporcionadamente rápida.</w:t>
+        <w:t xml:space="preserve">Estas señales no son pruebas de error. Son indicaciones para revisar. Y vigilan, sobre todo, al momento más fértil y más frágil del razonamiento: la conjetura abductiva del capítulo 2. La abducción propone explicaciones con una velocidad que ningún método iguala; el monitoreo es lo que impide que la primera propuesta cómoda se quede con el caso sin haberlo ganado. El clínico puede formular disparadores explícitos: discordancia entre gravedad y diagnóstico; reconsulta; evolución inesperada; falta de respuesta; diagnóstico que explica sólo una parte; presión de tiempo; transferencia entre equipos; caso que genera una confianza desproporcionadamente rápida.</w:t>
       </w:r>
     </w:p>
     <w:p>
@@ -5212,7 +5212,7 @@
         <w:pStyle w:val="BodyJ"/>
       </w:pPr>
       <w:r>
-        <w:t xml:space="preserve">Monitorear sin regular produce conciencia estéril. El control puede consistir en releer datos, reformular el problema, buscar una alternativa, pedir una segunda opinión, posponer una decisión reversible, intensificar vigilancia o actuar pese a la duda cuando el costo de esperar es alto. La estrategia debe corresponder a la fuente de incertidumbre.</w:t>
+        <w:t xml:space="preserve">Monitorear sin regular produce conciencia estéril. Conviene fijar la división del trabajo: el monitoreo detecta — la fluidez que se rompe, el dato que no encaja, la emoción que desentona con el caso —; el control decide qué hacer con la señal — releer datos, reformular el problema, buscar una alternativa, pedir una segunda opinión, posponer una decisión reversible, intensificar vigilancia o actuar pese a la duda cuando el costo de esperar es alto. Detectar sin decidir es rumia; decidir sin haber detectado es piloto automático. Y la estrategia elegida debe corresponder a la fuente de la incertidumbre: la duda que nace de un dato débil se trata verificando el dato; la que nace de una representación pobre, reformulando el problema; la que nace del cansancio o del apuro, con un segundo lector.</w:t>
       </w:r>
     </w:p>
     <w:p>
@@ -5229,6 +5229,14 @@
       </w:pPr>
       <w:r>
         <w:t xml:space="preserve">La inteligencia médica incluye una habilidad menos visible que acertar: reconocer el grado de fragilidad del propio acierto. Esa fragilidad debe influir en cómo se escribe, cómo se decide y cómo se diseña el seguimiento.</w:t>
+      </w:r>
+    </w:p>
+    <w:p>
+      <w:pPr>
+        <w:pStyle w:val="BodyJ"/>
+      </w:pPr>
+      <w:r>
+        <w:t xml:space="preserve">Hay algo más que la palabra "metacognición" puede ocultar si se la toma demasiado literalmente: la vigilancia del propio juicio es sólo en parte introspectiva. Muchas de sus mejores señales vienen de afuera — la ceja de la enfermera que conoce al paciente hace años, la pregunta del interno que no logró entender la síntesis (y quizá no había nada coherente que entender), la madre que insiste, el kinesiólogo que encuentra "distinto" al señor de la cama 12. Monitorear el propio pensamiento incluye leer esas señales como datos sobre el razonamiento, no como interferencias en él. La metacognición clínica es, en ese sentido, parcialmente social; el capítulo 13 la despliega a escala de equipo.</w:t>
       </w:r>
     </w:p>
     <w:p>
@@ -5440,6 +5448,14 @@
     </w:p>
     <w:p>
       <w:pPr>
+        <w:pStyle w:val="BodyJ"/>
+      </w:pPr>
+      <w:r>
+        <w:t xml:space="preserve">Schön agregó el movimiento que a Polanyi le faltaba nombrar: el profesional competente no sólo actúa desde lo tácito — conversa con la situación y, cuando ésta responde con una sorpresa, reflexiona en plena acción (Schön, 1983). Ahí está la tensión productiva entre ambos: lo tácito es el modo normal de operar de la pericia, pero debe poder volverse explícito a demanda, porque sólo lo explícito puede ser interrogado, enseñado y corregido. Una intuición que no tolera la pregunta "¿qué estás viendo que yo no veo?" no es pericia madura: es autoridad con buena prensa. La intuición experta vale precisamente porque puede ser interrogada — y quien la despliega sin poder desempaquetarla está pidiendo fe, no ofreciendo juicio.</w:t>
+      </w:r>
+    </w:p>
+    <w:p>
+      <w:pPr>
         <w:pStyle w:val="Heading3"/>
         <w:spacing w:after="120" w:before="280"/>
       </w:pPr>
@@ -5527,6 +5543,14 @@
       </w:pPr>
       <w:r>
         <w:t xml:space="preserve">La misma fluidez que hace eficaz al experto puede ocultar supuestos. El patrón familiar reduce carga cognitiva, pero favorece asimilación: lo nuevo se fuerza a encajar en lo conocido. El experto necesita mecanismos para detectar excepciones. Una representación discrepante, una evolución atípica o una consecuencia desproporcionada deben reabrir el caso.</w:t>
+      </w:r>
+    </w:p>
+    <w:p>
+      <w:pPr>
+        <w:pStyle w:val="BodyJ"/>
+      </w:pPr>
+      <w:r>
+        <w:t xml:space="preserve">¿Cuándo confiar, entonces, en la primera impresión? La respuesta menos romántica salió del debate entre el programa de los sesgos y el de la pericia naturalista, que terminó en un acuerdo célebre: la intuición es confiable cuando se formó en un entorno de validez alta — regularidades estables entre señales y desenlaces — y con oportunidad real de aprenderlas, es decir, feedback oportuno y veraz; sin esas dos condiciones la sensación de saber crece igual, pero sin correlato (Kahneman &amp; Klein, 2009). La clínica contiene ambos mundos. La sala de reanimación y la lectura de patrones radiológicos entrenan intuiciones con feedback rápido; la consulta de síntomas inespecíficos cuyos desenlaces nadie vuelve a ver produce fluidez sin calibración — la sobreconfianza del capítulo 5, fabricada por el entorno. La pregunta operativa frente a la propia seguridad no es "¿cuánta experiencia tengo?", sino "¿en qué entorno se formó esta impresión, y quién me avisó cuando fallé?".</w:t>
       </w:r>
     </w:p>
     <w:p>
@@ -9161,6 +9185,14 @@
         <w:pStyle w:val="BodyJ"/>
       </w:pPr>
       <w:r>
+        <w:t xml:space="preserve">Vista así, la humildad no es una virtud separada de la phronesis que este libro viene invocando desde el capítulo 6: es su condición de funcionamiento. La prudencia práctica integra, en el caso particular, lo que ningún algoritmo integra por nosotros — conocimiento causal, emoción leída como dato, valores del paciente y oportunidad: el momento de actuar ahora o esperar. Esa integración sólo permanece honesta si alguien vigila sus límites, y la humildad es exactamente eso: la phronesis vuelta sobre sí misma, la parte de la prudencia que sabe cuánta de la propia prudencia es conjetura. Con ella queda a la vista el hilo que el libro venía tendiendo: el capítulo 2 mostró la abducción — la conjetura que crea explicaciones —; el capítulo 5, la metacognición que la vigila mientras trabaja; la humildad es la disposición que la mantiene abierta cuando ya produjo una respuesta cómoda. Generar, vigilar, mantener abierto: tres nombres de una misma lealtad al caso.</w:t>
+      </w:r>
+    </w:p>
+    <w:p>
+      <w:pPr>
+        <w:pStyle w:val="BodyJ"/>
+      </w:pPr>
+      <w:r>
         <w:t xml:space="preserve">Por eso este libro necesita la humildad no como ornamento ético sino como pieza estructural. La reevaluación del método HII-D (capítulo 15) es humildad convertida en procedimiento: la cláusula "qué me haría cambiar", escrita antes de saber si habrá que cambiar, es la forma que toma esta virtud cuando se la obliga a dejar huella en la ficha.</w:t>
       </w:r>
     </w:p>
@@ -9210,7 +9242,7 @@
         <w:pStyle w:val="BodyJ"/>
       </w:pPr>
       <w:r>
-        <w:t xml:space="preserve">Escuchar de manera epistémica implica preguntar qué sabe esta persona que el equipo no puede observar, qué interpretación atribuye a sus síntomas y qué experiencias anteriores modifican su decisión. También exige distinguir desacuerdo de incapacidad. Un paciente puede comprender la evidencia y valorar de manera diferente los desenlaces. Cuando Carmen dijo "esta vez el dolor era otro", estaba entregando el dato pronóstico más importante del ingreso; la nota que lo hubiera omitido habría cometido, además de una injusticia, un error técnico.</w:t>
+        <w:t xml:space="preserve">Escuchar de manera epistémica implica preguntar qué sabe esta persona que el equipo no puede observar, qué interpretación atribuye a sus síntomas y qué experiencias anteriores modifican su decisión. También exige distinguir desacuerdo de incapacidad. Un paciente puede comprender la evidencia y valorar de manera diferente los desenlaces. Cuando Carmen dijo "esta vez el dolor era otro", estaba entregando el dato pronóstico más importante del ingreso; la nota que lo hubiera omitido habría cometido, además de una injusticia, un error técnico. La regla general merece escribirse: una ficha que borra el testimonio del paciente no es sólo injusta — es epistemológicamente más pobre, y una frase medular que no conserva la voz del enfermo cuando esa voz es el dato está incompleta según su propio estándar.</w:t>
       </w:r>
     </w:p>
     <w:p>
@@ -17250,6 +17282,21 @@
           <w:b/>
           <w:bCs/>
         </w:rPr>
+        <w:t xml:space="preserve">Validez del entorno.</w:t>
+      </w:r>
+      <w:r>
+        <w:t xml:space="preserve"> Grado en que un ambiente de práctica ofrece regularidades estables entre señales y desenlaces, junto a oportunidad de aprenderlas con feedback oportuno; condición para que la intuición experta sea confiable (Kahneman y Klein).</w:t>
+      </w:r>
+    </w:p>
+    <w:p>
+      <w:pPr>
+        <w:pStyle w:val="BodyJ"/>
+      </w:pPr>
+      <w:r>
+        <w:rPr>
+          <w:b/>
+          <w:bCs/>
+        </w:rPr>
         <w:t xml:space="preserve">Validez externa / transportabilidad.</w:t>
       </w:r>
       <w:r>
@@ -17291,7 +17338,7 @@
         </w:numPr>
       </w:pPr>
       <w:r>
-        <w:t xml:space="preserve">Abducción — 2</w:t>
+        <w:t xml:space="preserve">Abducción — 2; vigilada por la metacognición — 5; mantenida abierta por la humildad — 14</w:t>
       </w:r>
     </w:p>
     <w:p>
@@ -17939,7 +17986,7 @@
         </w:numPr>
       </w:pPr>
       <w:r>
-        <w:t xml:space="preserve">Metacognición: definición y niveles — Int, 5; sensibilidad vs. sesgo — Int, 5; artificial — 17</w:t>
+        <w:t xml:space="preserve">Metacognición: definición y niveles — Int, 5; monitoreo y control — 5; social (señales del equipo y del paciente) — 5, 13; sensibilidad vs. sesgo — Int, 5; artificial — 17</w:t>
       </w:r>
     </w:p>
     <w:p>
@@ -18240,6 +18287,18 @@
       </w:pPr>
       <w:r>
         <w:t xml:space="preserve">Umbrales de decisión — 10, Interludio III, CC (viñeta 5)</w:t>
+      </w:r>
+    </w:p>
+    <w:p>
+      <w:pPr>
+        <w:pStyle w:val="BodyJ"/>
+        <w:numPr>
+          <w:ilvl w:val="0"/>
+          <w:numId w:val="6"/>
+        </w:numPr>
+      </w:pPr>
+      <w:r>
+        <w:t xml:space="preserve">Validez del entorno e intuición (Kahneman y Klein) — 6</w:t>
       </w:r>
     </w:p>
     <w:p>
@@ -19668,6 +19727,24 @@
       </w:r>
       <w:r>
         <w:t xml:space="preserve">. Farrar, Straus and Giroux.</w:t>
+      </w:r>
+    </w:p>
+    <w:p>
+      <w:pPr>
+        <w:pStyle w:val="BodyJ"/>
+      </w:pPr>
+      <w:r>
+        <w:t xml:space="preserve">Kahneman, D., &amp; Klein, G. (2009). Conditions for intuitive expertise: A failure to disagree. </w:t>
+      </w:r>
+      <w:r>
+        <w:rPr>
+          <w:i/>
+          <w:iCs/>
+        </w:rPr>
+        <w:t xml:space="preserve">American Psychologist, 64</w:t>
+      </w:r>
+      <w:r>
+        <w:t xml:space="preserve">(6), 515–526.</w:t>
       </w:r>
     </w:p>
     <w:p>

</xml_diff>